<commit_message>
make script executable and add latest renderings
</commit_message>
<xml_diff>
--- a/output/Extending the Desktop into a Personal Knowledge Graph with SEN.docx
+++ b/output/Extending the Desktop into a Personal Knowledge Graph with SEN.docx
@@ -598,7 +598,7 @@
     </w:p>
     <w:bookmarkEnd w:id="26"/>
     <w:bookmarkEnd w:id="27"/>
-    <w:bookmarkStart w:id="43" w:name="X3290e34828dd7663d4aaec316aa67ced6cbb7d6"/>
+    <w:bookmarkStart w:id="48" w:name="X3290e34828dd7663d4aaec316aa67ced6cbb7d6"/>
     <w:p>
       <w:pPr>
         <w:pStyle w:val="Heading2"/>
@@ -1799,7 +1799,7 @@
         <w:t xml:space="preserve"> </w:t>
       </w:r>
       <w:r>
-        <w:t xml:space="preserve">can be stored in and retrieved from file system attribute values by the native API)</w:t>
+        <w:t xml:space="preserve">can be stored in and retrieved from file system attribute values by the native API, see (Haiku, 2022))</w:t>
       </w:r>
     </w:p>
     <w:p>
@@ -1811,13 +1811,13 @@
         <w:pStyle w:val="Compact"/>
       </w:pPr>
       <w:r>
-        <w:t xml:space="preserve">if a relation to a particular target has multiple properties of the same name, they are stored as a list, which</w:t>
-      </w:r>
-      <w:r>
-        <w:t xml:space="preserve"> </w:t>
-      </w:r>
-      <w:r>
-        <w:t xml:space="preserve">is also supported natively in</w:t>
+        <w:t xml:space="preserve">if a relation to a particular target has multiple properties of the same name, e.g. references to several locations</w:t>
+      </w:r>
+      <w:r>
+        <w:t xml:space="preserve"> </w:t>
+      </w:r>
+      <w:r>
+        <w:t xml:space="preserve">in the same book, they are grouped and stored as a list, which is also supported natively by</w:t>
       </w:r>
       <w:r>
         <w:t xml:space="preserve"> </w:t>
@@ -3365,23 +3365,13 @@
       </w:tr>
     </w:tbl>
     <w:bookmarkEnd w:id="42"/>
-    <w:bookmarkEnd w:id="43"/>
-    <w:bookmarkStart w:id="65" w:name="X8618f3316ecdb148ff6ecdd0d632cd5e904caed"/>
-    <w:p>
-      <w:pPr>
-        <w:pStyle w:val="Heading2"/>
-      </w:pPr>
-      <w:r>
-        <w:t xml:space="preserve">Desktop Use Cases and Examples - Re-modelling standard applications with SEN</w:t>
-      </w:r>
-    </w:p>
-    <w:bookmarkStart w:id="44" w:name="base-concepts"/>
+    <w:bookmarkStart w:id="47" w:name="ternary-relations"/>
     <w:p>
       <w:pPr>
         <w:pStyle w:val="Heading3"/>
       </w:pPr>
       <w:r>
-        <w:t xml:space="preserve">Base Concepts</w:t>
+        <w:t xml:space="preserve">Ternary Relations</w:t>
       </w:r>
     </w:p>
     <w:p>
@@ -3393,7 +3383,13 @@
         <w:pStyle w:val="Compact"/>
       </w:pPr>
       <w:r>
-        <w:t xml:space="preserve">Files as Entities</w:t>
+        <w:t xml:space="preserve">A special case but also an important use case is the support for ternary relations, that is when 3 entities are</w:t>
+      </w:r>
+      <w:r>
+        <w:t xml:space="preserve"> </w:t>
+      </w:r>
+      <w:r>
+        <w:t xml:space="preserve">part of a relation.</w:t>
       </w:r>
     </w:p>
     <w:p>
@@ -3405,585 +3401,822 @@
         <w:pStyle w:val="Compact"/>
       </w:pPr>
       <w:r>
-        <w:t xml:space="preserve">Relations grouped by role (Attendee, Contributor) or relation label (attendedBy, contributedBy)</w:t>
-      </w:r>
-    </w:p>
-    <w:p>
-      <w:pPr>
-        <w:numPr>
-          <w:ilvl w:val="0"/>
-          <w:numId w:val="1028"/>
-        </w:numPr>
-        <w:pStyle w:val="Compact"/>
-      </w:pPr>
-      <w:r>
-        <w:t xml:space="preserve">UI: in Haiku (as in BeOS), it is a common desktop metaphor to have clickable menus, e.g. clicking on a folder item</w:t>
-      </w:r>
-      <w:r>
-        <w:t xml:space="preserve"> </w:t>
-      </w:r>
-      <w:r>
-        <w:t xml:space="preserve">in the</w:t>
-      </w:r>
-      <w:r>
-        <w:t xml:space="preserve"> </w:t>
-      </w:r>
-      <w:r>
-        <w:t xml:space="preserve">“</w:t>
-      </w:r>
-      <w:r>
-        <w:t xml:space="preserve">Copy</w:t>
-      </w:r>
-      <w:r>
-        <w:t xml:space="preserve">”</w:t>
-      </w:r>
-      <w:r>
-        <w:t xml:space="preserve"> </w:t>
-      </w:r>
-      <w:r>
-        <w:t xml:space="preserve">menu will open that folder in a new window.</w:t>
-      </w:r>
-    </w:p>
-    <w:p>
-      <w:pPr>
-        <w:numPr>
-          <w:ilvl w:val="1"/>
-          <w:numId w:val="1029"/>
-        </w:numPr>
-        <w:pStyle w:val="Compact"/>
-      </w:pPr>
-      <w:r>
-        <w:t xml:space="preserve">The same metaphor is used for navigating relations: clicking on a sub menu in the</w:t>
-      </w:r>
-      <w:r>
-        <w:t xml:space="preserve"> </w:t>
-      </w:r>
-      <w:r>
-        <w:t xml:space="preserve">“</w:t>
-      </w:r>
-      <w:r>
-        <w:t xml:space="preserve">Open Related…</w:t>
-      </w:r>
-      <w:r>
-        <w:t xml:space="preserve">”</w:t>
-      </w:r>
-      <w:r>
-        <w:t xml:space="preserve"> </w:t>
-      </w:r>
-      <w:r>
-        <w:t xml:space="preserve">menu will open</w:t>
-      </w:r>
-      <w:r>
-        <w:t xml:space="preserve"> </w:t>
-      </w:r>
-      <w:r>
-        <w:t xml:space="preserve">all targets of that relation in a separate window:</w:t>
-      </w:r>
-    </w:p>
-    <w:bookmarkEnd w:id="44"/>
-    <w:bookmarkStart w:id="49" w:name="X3f9509e5bf4b481dc76311344976c6e490be1d6"/>
-    <w:p>
-      <w:pPr>
-        <w:pStyle w:val="Heading3"/>
-      </w:pPr>
-      <w:r>
-        <w:t xml:space="preserve">Visualising and Navigating Relations in Tracker</w:t>
-      </w:r>
-    </w:p>
-    <w:p>
-      <w:pPr>
-        <w:numPr>
-          <w:ilvl w:val="0"/>
-          <w:numId w:val="1030"/>
-        </w:numPr>
-        <w:pStyle w:val="Compact"/>
-      </w:pPr>
-      <w:r>
-        <w:t xml:space="preserve">Because SEN is very user-centric and should not be limited to experts and knowledge workers, the standard file browser,</w:t>
-      </w:r>
-      <w:r>
-        <w:t xml:space="preserve"> </w:t>
-      </w:r>
-      <w:r>
-        <w:t xml:space="preserve">Tracker, is extended (with minimal modifications) so that relations are visible in the context menu, and users can</w:t>
-      </w:r>
-      <w:r>
-        <w:t xml:space="preserve"> </w:t>
-      </w:r>
-      <w:r>
-        <w:t xml:space="preserve">open related files just as they would with normal files, but with some added functionality to support semantic relations.</w:t>
-      </w:r>
-    </w:p>
-    <w:p>
-      <w:pPr>
-        <w:numPr>
-          <w:ilvl w:val="0"/>
-          <w:numId w:val="1030"/>
-        </w:numPr>
-        <w:pStyle w:val="Compact"/>
-      </w:pPr>
-      <w:r>
-        <w:t xml:space="preserve">A special case is the display of all related files for a given relation - here, SEN uses a special</w:t>
-      </w:r>
-      <w:r>
-        <w:t xml:space="preserve"> </w:t>
-      </w:r>
-      <w:r>
-        <w:t xml:space="preserve">“</w:t>
-      </w:r>
-      <w:r>
-        <w:t xml:space="preserve">virtual</w:t>
-      </w:r>
-      <w:r>
-        <w:t xml:space="preserve">”</w:t>
-      </w:r>
-      <w:r>
-        <w:t xml:space="preserve"> </w:t>
-      </w:r>
-      <w:r>
-        <w:t xml:space="preserve">folder</w:t>
-      </w:r>
-      <w:r>
-        <w:t xml:space="preserve"> </w:t>
-      </w:r>
-      <w:r>
-        <w:t xml:space="preserve">(similar to dynamic queries !!ref) to hold relation targets:</w:t>
-      </w:r>
-    </w:p>
-    <w:p>
-      <w:pPr>
-        <w:numPr>
-          <w:ilvl w:val="1"/>
-          <w:numId w:val="1031"/>
-        </w:numPr>
-        <w:pStyle w:val="Compact"/>
-      </w:pPr>
-      <w:r>
-        <w:t xml:space="preserve">Since also menus (holding sub menus) can be invoked in Haiku, users are accustomed to this behavior.</w:t>
-      </w:r>
-    </w:p>
-    <w:p>
-      <w:pPr>
-        <w:numPr>
-          <w:ilvl w:val="1"/>
-          <w:numId w:val="1031"/>
-        </w:numPr>
-        <w:pStyle w:val="Compact"/>
-      </w:pPr>
-      <w:r>
-        <w:t xml:space="preserve">When invoking a</w:t>
-      </w:r>
-      <w:r>
-        <w:t xml:space="preserve"> </w:t>
-      </w:r>
-      <w:r>
-        <w:t xml:space="preserve">“</w:t>
-      </w:r>
-      <w:r>
-        <w:t xml:space="preserve">related entities</w:t>
-      </w:r>
-      <w:r>
-        <w:t xml:space="preserve">”</w:t>
-      </w:r>
-      <w:r>
-        <w:t xml:space="preserve"> </w:t>
-      </w:r>
-      <w:r>
-        <w:t xml:space="preserve">menu, the adapted Tracker calls the SEN API to create and return a reference to</w:t>
-      </w:r>
-      <w:r>
-        <w:t xml:space="preserve"> </w:t>
-      </w:r>
-      <w:r>
-        <w:t xml:space="preserve">a special, temporary folder holding all targets of the selected relation.</w:t>
-      </w:r>
-    </w:p>
-    <w:p>
-      <w:pPr>
-        <w:numPr>
-          <w:ilvl w:val="1"/>
-          <w:numId w:val="1031"/>
-        </w:numPr>
-        <w:pStyle w:val="Compact"/>
-      </w:pPr>
-      <w:r>
-        <w:t xml:space="preserve">These targets are symbolic links acting as placeholders for the related files. SEN stores relation properties</w:t>
-      </w:r>
-      <w:r>
-        <w:t xml:space="preserve"> </w:t>
-      </w:r>
-      <w:r>
-        <w:t xml:space="preserve">as filesystem attributes in these links.</w:t>
-      </w:r>
-    </w:p>
-    <w:p>
-      <w:pPr>
-        <w:numPr>
-          <w:ilvl w:val="1"/>
-          <w:numId w:val="1031"/>
-        </w:numPr>
-        <w:pStyle w:val="Compact"/>
-      </w:pPr>
-      <w:r>
-        <w:t xml:space="preserve">The folder is configured to show all relation property attributes, so that the user can view and handle them just</w:t>
-      </w:r>
-      <w:r>
-        <w:t xml:space="preserve"> </w:t>
-      </w:r>
-      <w:r>
-        <w:t xml:space="preserve">like normal file properties, rearranging and sorting them as needed.</w:t>
-      </w:r>
-    </w:p>
-    <w:p>
-      <w:pPr>
-        <w:numPr>
-          <w:ilvl w:val="1"/>
-          <w:numId w:val="1031"/>
-        </w:numPr>
-        <w:pStyle w:val="Compact"/>
-      </w:pPr>
-      <w:r>
-        <w:t xml:space="preserve">relation properties may be in any format that is best suited for the purpose, from different data types (names,</w:t>
-      </w:r>
-      <w:r>
-        <w:t xml:space="preserve"> </w:t>
-      </w:r>
-      <w:r>
-        <w:t xml:space="preserve">numbers or dates) to individual representations like JSON-LD for WebAnnotations (attached to web links) or</w:t>
-      </w:r>
-      <w:r>
-        <w:t xml:space="preserve"> </w:t>
-      </w:r>
-      <w:r>
-        <w:t xml:space="preserve">time codes for referencing a specific section in a video.</w:t>
-      </w:r>
-    </w:p>
-    <w:p>
-      <w:pPr>
-        <w:numPr>
-          <w:ilvl w:val="1"/>
-          <w:numId w:val="1031"/>
-        </w:numPr>
-        <w:pStyle w:val="Compact"/>
-      </w:pPr>
-      <w:r>
-        <w:t xml:space="preserve">these semantically enriched relation properties can then be used to</w:t>
-      </w:r>
-      <w:r>
-        <w:t xml:space="preserve"> </w:t>
-      </w:r>
-      <w:r>
-        <w:rPr>
-          <w:iCs/>
-          <w:i/>
-        </w:rPr>
-        <w:t xml:space="preserve">navigate</w:t>
-      </w:r>
-      <w:r>
-        <w:t xml:space="preserve"> </w:t>
-      </w:r>
-      <w:r>
-        <w:t xml:space="preserve">the relation, e.g. through a special</w:t>
-      </w:r>
-      <w:r>
-        <w:t xml:space="preserve"> </w:t>
-      </w:r>
-      <w:r>
-        <w:rPr>
-          <w:rStyle w:val="VerbatimChar"/>
-        </w:rPr>
-        <w:t xml:space="preserve">RelationNavigator</w:t>
-      </w:r>
-      <w:r>
-        <w:t xml:space="preserve"> </w:t>
-      </w:r>
-      <w:r>
-        <w:t xml:space="preserve">service provided by the SEN API, which</w:t>
-      </w:r>
-      <w:r>
-        <w:t xml:space="preserve"> </w:t>
-      </w:r>
-      <w:r>
-        <w:t xml:space="preserve">“</w:t>
-      </w:r>
-      <w:r>
-        <w:t xml:space="preserve">opens</w:t>
-      </w:r>
-      <w:r>
-        <w:t xml:space="preserve">”</w:t>
-      </w:r>
-      <w:r>
-        <w:t xml:space="preserve"> </w:t>
-      </w:r>
-      <w:r>
-        <w:t xml:space="preserve">supported relations in a suitable way, e.g.</w:t>
-      </w:r>
-      <w:r>
-        <w:t xml:space="preserve"> </w:t>
-      </w:r>
-      <w:r>
-        <w:t xml:space="preserve">by opening a PDF viewer and jumping to the given page, or by opening a web browser and highlighting the text referenced</w:t>
-      </w:r>
-      <w:r>
-        <w:t xml:space="preserve"> </w:t>
-      </w:r>
-      <w:r>
-        <w:t xml:space="preserve">provided in the</w:t>
-      </w:r>
-      <w:r>
-        <w:t xml:space="preserve"> </w:t>
-      </w:r>
-      <w:r>
-        <w:t xml:space="preserve">“</w:t>
-      </w:r>
-      <w:r>
-        <w:t xml:space="preserve">WebAnnotation</w:t>
-      </w:r>
-      <w:r>
-        <w:t xml:space="preserve">”</w:t>
-      </w:r>
-      <w:r>
-        <w:t xml:space="preserve"> </w:t>
-      </w:r>
-      <w:r>
-        <w:t xml:space="preserve">relation property as a standard WebAnnotation, se (Sporny, 2020).</w:t>
-      </w:r>
-    </w:p>
-    <w:p>
-      <w:pPr>
-        <w:numPr>
-          <w:ilvl w:val="1"/>
-          <w:numId w:val="1031"/>
-        </w:numPr>
-        <w:pStyle w:val="Compact"/>
-      </w:pPr>
-      <w:r>
-        <w:t xml:space="preserve">this kind of</w:t>
-      </w:r>
-      <w:r>
-        <w:t xml:space="preserve"> </w:t>
-      </w:r>
-      <w:r>
-        <w:t xml:space="preserve">“</w:t>
-      </w:r>
-      <w:r>
-        <w:t xml:space="preserve">desktop deep linking</w:t>
-      </w:r>
-      <w:r>
-        <w:t xml:space="preserve">”</w:t>
-      </w:r>
-      <w:r>
-        <w:t xml:space="preserve"> </w:t>
-      </w:r>
-      <w:r>
-        <w:t xml:space="preserve">is supported through the extended scripting functionality in Haiku, which provides</w:t>
-      </w:r>
-      <w:r>
-        <w:t xml:space="preserve"> </w:t>
-      </w:r>
-      <w:r>
-        <w:t xml:space="preserve">a message-based extension mechanism for controlling various aspects of the system itself, and applications.</w:t>
-      </w:r>
-    </w:p>
-    <w:p>
-      <w:pPr>
-        <w:numPr>
-          <w:ilvl w:val="1"/>
-          <w:numId w:val="1031"/>
-        </w:numPr>
-        <w:pStyle w:val="Compact"/>
-      </w:pPr>
-      <w:r>
-        <w:t xml:space="preserve">there are well-defined standard Messages for simple operations like</w:t>
-      </w:r>
-      <w:r>
-        <w:t xml:space="preserve"> </w:t>
-      </w:r>
-      <w:r>
-        <w:rPr>
-          <w:rStyle w:val="VerbatimChar"/>
-        </w:rPr>
-        <w:t xml:space="preserve">OPEN</w:t>
-      </w:r>
-      <w:r>
-        <w:t xml:space="preserve"> </w:t>
-      </w:r>
-      <w:r>
-        <w:t xml:space="preserve">or</w:t>
-      </w:r>
-      <w:r>
-        <w:t xml:space="preserve"> </w:t>
-      </w:r>
-      <w:r>
-        <w:rPr>
-          <w:rStyle w:val="VerbatimChar"/>
-        </w:rPr>
-        <w:t xml:space="preserve">CLOSE</w:t>
-      </w:r>
-      <w:r>
-        <w:t xml:space="preserve">, but applications can support</w:t>
-      </w:r>
-      <w:r>
-        <w:t xml:space="preserve"> </w:t>
-      </w:r>
-      <w:r>
-        <w:t xml:space="preserve">any kind of custom messages, which can then be bundled in the form of</w:t>
-      </w:r>
-      <w:r>
-        <w:t xml:space="preserve"> </w:t>
-      </w:r>
-      <w:r>
-        <w:t xml:space="preserve">“</w:t>
-      </w:r>
-      <w:r>
-        <w:t xml:space="preserve">scripting suites</w:t>
-      </w:r>
-      <w:r>
-        <w:t xml:space="preserve">”</w:t>
-      </w:r>
-      <w:r>
-        <w:t xml:space="preserve">.</w:t>
-      </w:r>
-    </w:p>
-    <w:p>
-      <w:pPr>
-        <w:numPr>
-          <w:ilvl w:val="1"/>
-          <w:numId w:val="1031"/>
-        </w:numPr>
-        <w:pStyle w:val="Compact"/>
-      </w:pPr>
-      <w:r>
-        <w:t xml:space="preserve">to support the kind of navigation above, the standard PDF viewer needs to be extended to support opening a file</w:t>
-      </w:r>
-      <w:r>
-        <w:t xml:space="preserve"> </w:t>
-      </w:r>
-      <w:r>
-        <w:t xml:space="preserve">on a given page (e.g., by adding a property</w:t>
-      </w:r>
-      <w:r>
-        <w:t xml:space="preserve"> </w:t>
-      </w:r>
-      <w:r>
-        <w:rPr>
-          <w:rStyle w:val="VerbatimChar"/>
-        </w:rPr>
-        <w:t xml:space="preserve">page</w:t>
-      </w:r>
-      <w:r>
-        <w:t xml:space="preserve"> </w:t>
-      </w:r>
-      <w:r>
-        <w:t xml:space="preserve">to the standard</w:t>
-      </w:r>
-      <w:r>
-        <w:t xml:space="preserve"> </w:t>
-      </w:r>
-      <w:r>
-        <w:rPr>
-          <w:rStyle w:val="VerbatimChar"/>
-        </w:rPr>
-        <w:t xml:space="preserve">OPEN</w:t>
-      </w:r>
-      <w:r>
-        <w:t xml:space="preserve"> </w:t>
-      </w:r>
-      <w:r>
-        <w:t xml:space="preserve">message already supported), or the</w:t>
-      </w:r>
-      <w:r>
-        <w:t xml:space="preserve"> </w:t>
-      </w:r>
-      <w:r>
-        <w:t xml:space="preserve">web browser needs to support WebAnnotations and a way to show them for a given URL in a similar way, e.g.,</w:t>
-      </w:r>
-      <w:r>
-        <w:t xml:space="preserve"> </w:t>
-      </w:r>
-      <w:r>
-        <w:t xml:space="preserve">using an additional attribute like</w:t>
-      </w:r>
-      <w:r>
-        <w:t xml:space="preserve"> </w:t>
-      </w:r>
-      <w:r>
-        <w:rPr>
-          <w:rStyle w:val="VerbatimChar"/>
-        </w:rPr>
-        <w:t xml:space="preserve">annotation</w:t>
-      </w:r>
-      <w:r>
-        <w:t xml:space="preserve"> </w:t>
-      </w:r>
-      <w:r>
-        <w:t xml:space="preserve">for the</w:t>
-      </w:r>
-      <w:r>
-        <w:t xml:space="preserve"> </w:t>
-      </w:r>
-      <w:r>
-        <w:rPr>
-          <w:rStyle w:val="VerbatimChar"/>
-        </w:rPr>
-        <w:t xml:space="preserve">OPEN</w:t>
-      </w:r>
-      <w:r>
-        <w:t xml:space="preserve"> </w:t>
-      </w:r>
-      <w:r>
-        <w:t xml:space="preserve">message.</w:t>
-      </w:r>
-    </w:p>
-    <w:p>
-      <w:pPr>
-        <w:numPr>
-          <w:ilvl w:val="0"/>
-          <w:numId w:val="1030"/>
-        </w:numPr>
-        <w:pStyle w:val="Compact"/>
-      </w:pPr>
-      <w:r>
-        <w:t xml:space="preserve">The figure below shows a simplified example of how users could navigate all references of a research paper stored as</w:t>
-      </w:r>
-      <w:r>
-        <w:t xml:space="preserve"> </w:t>
-      </w:r>
-      <w:r>
-        <w:t xml:space="preserve">different file types to represent related entities like web pages, PDF documents or video presentations.</w:t>
-      </w:r>
-    </w:p>
-    <w:p>
-      <w:pPr>
-        <w:numPr>
-          <w:ilvl w:val="0"/>
-          <w:numId w:val="1030"/>
-        </w:numPr>
+        <w:t xml:space="preserve">An example would be, extending the notes example above, relations between notes on a movie referencing actors</w:t>
+      </w:r>
+      <w:r>
+        <w:t xml:space="preserve"> </w:t>
+      </w:r>
+      <w:r>
+        <w:t xml:space="preserve">that appear in certain scenes, or locations on specific time codes:</w:t>
+      </w:r>
+    </w:p>
+    <w:p>
+      <w:pPr>
         <w:pStyle w:val="CaptionedFigure"/>
       </w:pPr>
       <w:r>
         <w:drawing>
           <wp:inline>
-            <wp:extent cx="5334000" cy="3149295"/>
+            <wp:extent cx="4219575" cy="2705100"/>
             <wp:effectExtent b="0" l="0" r="0" t="0"/>
-            <wp:docPr descr="Relation Browser" title="browsing relation targets and their properties" id="46" name="Picture"/>
+            <wp:docPr descr="Ternary Relations" title="supporting ternary relations" id="44" name="Picture"/>
             <a:graphic>
               <a:graphicData uri="http://schemas.openxmlformats.org/drawingml/2006/picture">
                 <pic:pic>
                   <pic:nvPicPr>
-                    <pic:cNvPr descr="images/tracker-relations.svg" id="47" name="Picture"/>
+                    <pic:cNvPr descr="images/ternary-relation.svg" id="45" name="Picture"/>
                     <pic:cNvPicPr>
                       <a:picLocks noChangeArrowheads="1" noChangeAspect="1"/>
                     </pic:cNvPicPr>
                   </pic:nvPicPr>
                   <pic:blipFill>
-                    <a:blip r:embed="rId48">
+                    <a:blip r:embed="rId46">
                       <a:extLst>
                         <a:ext uri="{28A0092B-C50C-407E-A947-70E740481C1C}">
                           <a14:useLocalDpi xmlns:a14="http://schemas.microsoft.com/office/drawing/2010/main" val="0"/>
                         </a:ext>
                         <a:ext uri="{96DAC541-7B7A-43D3-8B79-37D633B846F1}">
-                          <asvg:svgBlip xmlns:asvg="http://schemas.microsoft.com/office/drawing/2016/SVG/main" r:embed="rId45"/>
+                          <asvg:svgBlip xmlns:asvg="http://schemas.microsoft.com/office/drawing/2016/SVG/main" r:embed="rId43"/>
+                        </a:ext>
+                      </a:extLst>
+                    </a:blip>
+                    <a:stretch>
+                      <a:fillRect/>
+                    </a:stretch>
+                  </pic:blipFill>
+                  <pic:spPr bwMode="auto">
+                    <a:xfrm>
+                      <a:off x="0" y="0"/>
+                      <a:ext cx="4219575" cy="2705100"/>
+                    </a:xfrm>
+                    <a:prstGeom prst="rect">
+                      <a:avLst/>
+                    </a:prstGeom>
+                    <a:noFill/>
+                    <a:ln w="9525">
+                      <a:noFill/>
+                      <a:headEnd/>
+                      <a:tailEnd/>
+                    </a:ln>
+                  </pic:spPr>
+                </pic:pic>
+              </a:graphicData>
+            </a:graphic>
+          </wp:inline>
+        </w:drawing>
+      </w:r>
+    </w:p>
+    <w:p>
+      <w:pPr>
+        <w:pStyle w:val="ImageCaption"/>
+      </w:pPr>
+      <w:r>
+        <w:t xml:space="preserve">Ternary Relations</w:t>
+      </w:r>
+    </w:p>
+    <w:p>
+      <w:pPr>
+        <w:numPr>
+          <w:ilvl w:val="0"/>
+          <w:numId w:val="1029"/>
+        </w:numPr>
+        <w:pStyle w:val="Compact"/>
+      </w:pPr>
+      <w:r>
+        <w:t xml:space="preserve">To cover this case, and staying consistent with the</w:t>
+      </w:r>
+      <w:r>
+        <w:t xml:space="preserve"> </w:t>
+      </w:r>
+      <w:r>
+        <w:t xml:space="preserve">“</w:t>
+      </w:r>
+      <w:r>
+        <w:t xml:space="preserve">relationships as properties</w:t>
+      </w:r>
+      <w:r>
+        <w:t xml:space="preserve">”</w:t>
+      </w:r>
+      <w:r>
+        <w:t xml:space="preserve"> </w:t>
+      </w:r>
+      <w:r>
+        <w:t xml:space="preserve">concept established above,</w:t>
+      </w:r>
+      <w:r>
+        <w:t xml:space="preserve"> </w:t>
+      </w:r>
+      <w:r>
+        <w:t xml:space="preserve">we can store references to other entities along with normal relationship properties, but with special semantics,</w:t>
+      </w:r>
+      <w:r>
+        <w:t xml:space="preserve"> </w:t>
+      </w:r>
+      <w:r>
+        <w:t xml:space="preserve">e.g. using a reserved label</w:t>
+      </w:r>
+      <w:r>
+        <w:t xml:space="preserve"> </w:t>
+      </w:r>
+      <w:r>
+        <w:rPr>
+          <w:rStyle w:val="VerbatimChar"/>
+        </w:rPr>
+        <w:t xml:space="preserve">SEN_ID</w:t>
+      </w:r>
+      <w:r>
+        <w:t xml:space="preserve"> </w:t>
+      </w:r>
+      <w:r>
+        <w:t xml:space="preserve">as property key, and the ID of the target entity as property value.</w:t>
+      </w:r>
+    </w:p>
+    <w:p>
+      <w:pPr>
+        <w:numPr>
+          <w:ilvl w:val="0"/>
+          <w:numId w:val="1029"/>
+        </w:numPr>
+        <w:pStyle w:val="Compact"/>
+      </w:pPr>
+      <w:r>
+        <w:t xml:space="preserve">For differentiating properties of ternary relations, however, one more abstraction is required, so we need to</w:t>
+      </w:r>
+      <w:r>
+        <w:t xml:space="preserve"> </w:t>
+      </w:r>
+      <w:r>
+        <w:t xml:space="preserve">wrap them into separate, nested</w:t>
+      </w:r>
+      <w:r>
+        <w:t xml:space="preserve"> </w:t>
+      </w:r>
+      <w:r>
+        <w:rPr>
+          <w:rStyle w:val="VerbatimChar"/>
+        </w:rPr>
+        <w:t xml:space="preserve">BMessage</w:t>
+      </w:r>
+      <w:r>
+        <w:t xml:space="preserve"> </w:t>
+      </w:r>
+      <w:r>
+        <w:t xml:space="preserve">objects inside the</w:t>
+      </w:r>
+      <w:r>
+        <w:t xml:space="preserve"> </w:t>
+      </w:r>
+      <w:r>
+        <w:rPr>
+          <w:rStyle w:val="VerbatimChar"/>
+        </w:rPr>
+        <w:t xml:space="preserve">BMessage</w:t>
+      </w:r>
+      <w:r>
+        <w:t xml:space="preserve"> </w:t>
+      </w:r>
+      <w:r>
+        <w:t xml:space="preserve">holding our normal properties, as outlined above.</w:t>
+      </w:r>
+    </w:p>
+    <w:p>
+      <w:pPr>
+        <w:numPr>
+          <w:ilvl w:val="0"/>
+          <w:numId w:val="1029"/>
+        </w:numPr>
+        <w:pStyle w:val="Compact"/>
+      </w:pPr>
+      <w:r>
+        <w:t xml:space="preserve">This would also cover the case of having multiple references to a single entity with different properties, e.g.</w:t>
+      </w:r>
+      <w:r>
+        <w:t xml:space="preserve"> </w:t>
+      </w:r>
+      <w:r>
+        <w:t xml:space="preserve">the same actor in different scenes, or the same location at different time codes.</w:t>
+      </w:r>
+    </w:p>
+    <w:bookmarkEnd w:id="47"/>
+    <w:bookmarkEnd w:id="48"/>
+    <w:bookmarkStart w:id="74" w:name="X8618f3316ecdb148ff6ecdd0d632cd5e904caed"/>
+    <w:p>
+      <w:pPr>
+        <w:pStyle w:val="Heading2"/>
+      </w:pPr>
+      <w:r>
+        <w:t xml:space="preserve">Desktop Use Cases and Examples - Re-modelling standard applications with SEN</w:t>
+      </w:r>
+    </w:p>
+    <w:bookmarkStart w:id="49" w:name="base-concepts"/>
+    <w:p>
+      <w:pPr>
+        <w:pStyle w:val="Heading3"/>
+      </w:pPr>
+      <w:r>
+        <w:t xml:space="preserve">Base Concepts</w:t>
+      </w:r>
+    </w:p>
+    <w:p>
+      <w:pPr>
+        <w:numPr>
+          <w:ilvl w:val="0"/>
+          <w:numId w:val="1030"/>
+        </w:numPr>
+        <w:pStyle w:val="Compact"/>
+      </w:pPr>
+      <w:r>
+        <w:t xml:space="preserve">Files as Entities</w:t>
+      </w:r>
+    </w:p>
+    <w:p>
+      <w:pPr>
+        <w:numPr>
+          <w:ilvl w:val="0"/>
+          <w:numId w:val="1030"/>
+        </w:numPr>
+        <w:pStyle w:val="Compact"/>
+      </w:pPr>
+      <w:r>
+        <w:t xml:space="preserve">Relations grouped by role (Attendee, Contributor) or relation label (attendedBy, contributedBy)</w:t>
+      </w:r>
+    </w:p>
+    <w:p>
+      <w:pPr>
+        <w:numPr>
+          <w:ilvl w:val="0"/>
+          <w:numId w:val="1030"/>
+        </w:numPr>
+        <w:pStyle w:val="Compact"/>
+      </w:pPr>
+      <w:r>
+        <w:t xml:space="preserve">UI: in Haiku (as in BeOS), it is a common desktop metaphor to have clickable menus, e.g. clicking on a folder item</w:t>
+      </w:r>
+      <w:r>
+        <w:t xml:space="preserve"> </w:t>
+      </w:r>
+      <w:r>
+        <w:t xml:space="preserve">in the</w:t>
+      </w:r>
+      <w:r>
+        <w:t xml:space="preserve"> </w:t>
+      </w:r>
+      <w:r>
+        <w:t xml:space="preserve">“</w:t>
+      </w:r>
+      <w:r>
+        <w:t xml:space="preserve">Copy</w:t>
+      </w:r>
+      <w:r>
+        <w:t xml:space="preserve">”</w:t>
+      </w:r>
+      <w:r>
+        <w:t xml:space="preserve"> </w:t>
+      </w:r>
+      <w:r>
+        <w:t xml:space="preserve">menu will open that folder in a new window.</w:t>
+      </w:r>
+    </w:p>
+    <w:p>
+      <w:pPr>
+        <w:numPr>
+          <w:ilvl w:val="1"/>
+          <w:numId w:val="1031"/>
+        </w:numPr>
+        <w:pStyle w:val="Compact"/>
+      </w:pPr>
+      <w:r>
+        <w:t xml:space="preserve">The same metaphor is used for navigating relations: clicking on a sub menu in the</w:t>
+      </w:r>
+      <w:r>
+        <w:t xml:space="preserve"> </w:t>
+      </w:r>
+      <w:r>
+        <w:t xml:space="preserve">“</w:t>
+      </w:r>
+      <w:r>
+        <w:t xml:space="preserve">Open Related…</w:t>
+      </w:r>
+      <w:r>
+        <w:t xml:space="preserve">”</w:t>
+      </w:r>
+      <w:r>
+        <w:t xml:space="preserve"> </w:t>
+      </w:r>
+      <w:r>
+        <w:t xml:space="preserve">menu will open</w:t>
+      </w:r>
+      <w:r>
+        <w:t xml:space="preserve"> </w:t>
+      </w:r>
+      <w:r>
+        <w:t xml:space="preserve">all targets of that relation in a separate window:</w:t>
+      </w:r>
+    </w:p>
+    <w:bookmarkEnd w:id="49"/>
+    <w:bookmarkStart w:id="54" w:name="X3f9509e5bf4b481dc76311344976c6e490be1d6"/>
+    <w:p>
+      <w:pPr>
+        <w:pStyle w:val="Heading3"/>
+      </w:pPr>
+      <w:r>
+        <w:t xml:space="preserve">Visualising and Navigating Relations in Tracker</w:t>
+      </w:r>
+    </w:p>
+    <w:p>
+      <w:pPr>
+        <w:numPr>
+          <w:ilvl w:val="0"/>
+          <w:numId w:val="1032"/>
+        </w:numPr>
+        <w:pStyle w:val="Compact"/>
+      </w:pPr>
+      <w:r>
+        <w:t xml:space="preserve">Because SEN is very user-centric and should not be limited to experts and knowledge workers, the standard file browser,</w:t>
+      </w:r>
+      <w:r>
+        <w:t xml:space="preserve"> </w:t>
+      </w:r>
+      <w:r>
+        <w:t xml:space="preserve">Tracker, is extended (with minimal modifications) so that relations are visible in the context menu, and users can</w:t>
+      </w:r>
+      <w:r>
+        <w:t xml:space="preserve"> </w:t>
+      </w:r>
+      <w:r>
+        <w:t xml:space="preserve">open related files just as they would with normal files, but with some added functionality to support semantic relations.</w:t>
+      </w:r>
+    </w:p>
+    <w:p>
+      <w:pPr>
+        <w:numPr>
+          <w:ilvl w:val="0"/>
+          <w:numId w:val="1032"/>
+        </w:numPr>
+        <w:pStyle w:val="Compact"/>
+      </w:pPr>
+      <w:r>
+        <w:t xml:space="preserve">A special case is the display of all related files for a given relation - here, SEN uses a special</w:t>
+      </w:r>
+      <w:r>
+        <w:t xml:space="preserve"> </w:t>
+      </w:r>
+      <w:r>
+        <w:t xml:space="preserve">“</w:t>
+      </w:r>
+      <w:r>
+        <w:t xml:space="preserve">virtual</w:t>
+      </w:r>
+      <w:r>
+        <w:t xml:space="preserve">”</w:t>
+      </w:r>
+      <w:r>
+        <w:t xml:space="preserve"> </w:t>
+      </w:r>
+      <w:r>
+        <w:t xml:space="preserve">folder</w:t>
+      </w:r>
+      <w:r>
+        <w:t xml:space="preserve"> </w:t>
+      </w:r>
+      <w:r>
+        <w:t xml:space="preserve">(similar to dynamic queries !!ref) to hold relation targets:</w:t>
+      </w:r>
+    </w:p>
+    <w:p>
+      <w:pPr>
+        <w:numPr>
+          <w:ilvl w:val="1"/>
+          <w:numId w:val="1033"/>
+        </w:numPr>
+        <w:pStyle w:val="Compact"/>
+      </w:pPr>
+      <w:r>
+        <w:t xml:space="preserve">Since also menus (holding sub menus) can be invoked in Haiku, users are accustomed to this behavior.</w:t>
+      </w:r>
+    </w:p>
+    <w:p>
+      <w:pPr>
+        <w:numPr>
+          <w:ilvl w:val="1"/>
+          <w:numId w:val="1033"/>
+        </w:numPr>
+        <w:pStyle w:val="Compact"/>
+      </w:pPr>
+      <w:r>
+        <w:t xml:space="preserve">When invoking a</w:t>
+      </w:r>
+      <w:r>
+        <w:t xml:space="preserve"> </w:t>
+      </w:r>
+      <w:r>
+        <w:t xml:space="preserve">“</w:t>
+      </w:r>
+      <w:r>
+        <w:t xml:space="preserve">related entities</w:t>
+      </w:r>
+      <w:r>
+        <w:t xml:space="preserve">”</w:t>
+      </w:r>
+      <w:r>
+        <w:t xml:space="preserve"> </w:t>
+      </w:r>
+      <w:r>
+        <w:t xml:space="preserve">menu, the adapted Tracker calls the SEN API to create and return a reference to</w:t>
+      </w:r>
+      <w:r>
+        <w:t xml:space="preserve"> </w:t>
+      </w:r>
+      <w:r>
+        <w:t xml:space="preserve">a special, temporary folder holding all targets of the selected relation.</w:t>
+      </w:r>
+    </w:p>
+    <w:p>
+      <w:pPr>
+        <w:numPr>
+          <w:ilvl w:val="1"/>
+          <w:numId w:val="1033"/>
+        </w:numPr>
+        <w:pStyle w:val="Compact"/>
+      </w:pPr>
+      <w:r>
+        <w:t xml:space="preserve">These targets are symbolic links acting as placeholders for the related files. SEN stores relation properties</w:t>
+      </w:r>
+      <w:r>
+        <w:t xml:space="preserve"> </w:t>
+      </w:r>
+      <w:r>
+        <w:t xml:space="preserve">as filesystem attributes in these links.</w:t>
+      </w:r>
+    </w:p>
+    <w:p>
+      <w:pPr>
+        <w:numPr>
+          <w:ilvl w:val="1"/>
+          <w:numId w:val="1033"/>
+        </w:numPr>
+        <w:pStyle w:val="Compact"/>
+      </w:pPr>
+      <w:r>
+        <w:t xml:space="preserve">The folder is configured to show all relation property attributes, so that the user can view and handle them just</w:t>
+      </w:r>
+      <w:r>
+        <w:t xml:space="preserve"> </w:t>
+      </w:r>
+      <w:r>
+        <w:t xml:space="preserve">like normal file properties, rearranging and sorting them as needed.</w:t>
+      </w:r>
+    </w:p>
+    <w:p>
+      <w:pPr>
+        <w:numPr>
+          <w:ilvl w:val="1"/>
+          <w:numId w:val="1033"/>
+        </w:numPr>
+        <w:pStyle w:val="Compact"/>
+      </w:pPr>
+      <w:r>
+        <w:t xml:space="preserve">relation properties may be in any format that is best suited for the purpose, from different data types (names,</w:t>
+      </w:r>
+      <w:r>
+        <w:t xml:space="preserve"> </w:t>
+      </w:r>
+      <w:r>
+        <w:t xml:space="preserve">numbers or dates) to individual representations like JSON-LD for WebAnnotations (attached to web links) or</w:t>
+      </w:r>
+      <w:r>
+        <w:t xml:space="preserve"> </w:t>
+      </w:r>
+      <w:r>
+        <w:t xml:space="preserve">time codes for referencing a specific section in a video.</w:t>
+      </w:r>
+    </w:p>
+    <w:p>
+      <w:pPr>
+        <w:numPr>
+          <w:ilvl w:val="1"/>
+          <w:numId w:val="1033"/>
+        </w:numPr>
+        <w:pStyle w:val="Compact"/>
+      </w:pPr>
+      <w:r>
+        <w:t xml:space="preserve">these semantically enriched relation properties can then be used to</w:t>
+      </w:r>
+      <w:r>
+        <w:t xml:space="preserve"> </w:t>
+      </w:r>
+      <w:r>
+        <w:rPr>
+          <w:iCs/>
+          <w:i/>
+        </w:rPr>
+        <w:t xml:space="preserve">navigate</w:t>
+      </w:r>
+      <w:r>
+        <w:t xml:space="preserve"> </w:t>
+      </w:r>
+      <w:r>
+        <w:t xml:space="preserve">the relation, e.g. through a special</w:t>
+      </w:r>
+      <w:r>
+        <w:t xml:space="preserve"> </w:t>
+      </w:r>
+      <w:r>
+        <w:rPr>
+          <w:rStyle w:val="VerbatimChar"/>
+        </w:rPr>
+        <w:t xml:space="preserve">RelationNavigator</w:t>
+      </w:r>
+      <w:r>
+        <w:t xml:space="preserve"> </w:t>
+      </w:r>
+      <w:r>
+        <w:t xml:space="preserve">service provided by the SEN API, which</w:t>
+      </w:r>
+      <w:r>
+        <w:t xml:space="preserve"> </w:t>
+      </w:r>
+      <w:r>
+        <w:t xml:space="preserve">“</w:t>
+      </w:r>
+      <w:r>
+        <w:t xml:space="preserve">opens</w:t>
+      </w:r>
+      <w:r>
+        <w:t xml:space="preserve">”</w:t>
+      </w:r>
+      <w:r>
+        <w:t xml:space="preserve"> </w:t>
+      </w:r>
+      <w:r>
+        <w:t xml:space="preserve">supported relations in a suitable way, e.g.</w:t>
+      </w:r>
+      <w:r>
+        <w:t xml:space="preserve"> </w:t>
+      </w:r>
+      <w:r>
+        <w:t xml:space="preserve">by opening a PDF viewer and jumping to the given page, or by opening a web browser and highlighting the text referenced</w:t>
+      </w:r>
+      <w:r>
+        <w:t xml:space="preserve"> </w:t>
+      </w:r>
+      <w:r>
+        <w:t xml:space="preserve">provided in the</w:t>
+      </w:r>
+      <w:r>
+        <w:t xml:space="preserve"> </w:t>
+      </w:r>
+      <w:r>
+        <w:t xml:space="preserve">“</w:t>
+      </w:r>
+      <w:r>
+        <w:t xml:space="preserve">WebAnnotation</w:t>
+      </w:r>
+      <w:r>
+        <w:t xml:space="preserve">”</w:t>
+      </w:r>
+      <w:r>
+        <w:t xml:space="preserve"> </w:t>
+      </w:r>
+      <w:r>
+        <w:t xml:space="preserve">relation property as a standard WebAnnotation, se (Sporny, 2020).</w:t>
+      </w:r>
+    </w:p>
+    <w:p>
+      <w:pPr>
+        <w:numPr>
+          <w:ilvl w:val="1"/>
+          <w:numId w:val="1033"/>
+        </w:numPr>
+        <w:pStyle w:val="Compact"/>
+      </w:pPr>
+      <w:r>
+        <w:t xml:space="preserve">this kind of</w:t>
+      </w:r>
+      <w:r>
+        <w:t xml:space="preserve"> </w:t>
+      </w:r>
+      <w:r>
+        <w:t xml:space="preserve">“</w:t>
+      </w:r>
+      <w:r>
+        <w:t xml:space="preserve">desktop deep linking</w:t>
+      </w:r>
+      <w:r>
+        <w:t xml:space="preserve">”</w:t>
+      </w:r>
+      <w:r>
+        <w:t xml:space="preserve"> </w:t>
+      </w:r>
+      <w:r>
+        <w:t xml:space="preserve">is supported through the extended scripting functionality in Haiku, which provides</w:t>
+      </w:r>
+      <w:r>
+        <w:t xml:space="preserve"> </w:t>
+      </w:r>
+      <w:r>
+        <w:t xml:space="preserve">a message-based extension mechanism for controlling various aspects of the system itself, and applications.</w:t>
+      </w:r>
+    </w:p>
+    <w:p>
+      <w:pPr>
+        <w:numPr>
+          <w:ilvl w:val="1"/>
+          <w:numId w:val="1033"/>
+        </w:numPr>
+        <w:pStyle w:val="Compact"/>
+      </w:pPr>
+      <w:r>
+        <w:t xml:space="preserve">there are well-defined standard Messages for simple operations like</w:t>
+      </w:r>
+      <w:r>
+        <w:t xml:space="preserve"> </w:t>
+      </w:r>
+      <w:r>
+        <w:rPr>
+          <w:rStyle w:val="VerbatimChar"/>
+        </w:rPr>
+        <w:t xml:space="preserve">OPEN</w:t>
+      </w:r>
+      <w:r>
+        <w:t xml:space="preserve"> </w:t>
+      </w:r>
+      <w:r>
+        <w:t xml:space="preserve">or</w:t>
+      </w:r>
+      <w:r>
+        <w:t xml:space="preserve"> </w:t>
+      </w:r>
+      <w:r>
+        <w:rPr>
+          <w:rStyle w:val="VerbatimChar"/>
+        </w:rPr>
+        <w:t xml:space="preserve">CLOSE</w:t>
+      </w:r>
+      <w:r>
+        <w:t xml:space="preserve">, but applications can support</w:t>
+      </w:r>
+      <w:r>
+        <w:t xml:space="preserve"> </w:t>
+      </w:r>
+      <w:r>
+        <w:t xml:space="preserve">any kind of custom messages, which can then be bundled in the form of</w:t>
+      </w:r>
+      <w:r>
+        <w:t xml:space="preserve"> </w:t>
+      </w:r>
+      <w:r>
+        <w:t xml:space="preserve">“</w:t>
+      </w:r>
+      <w:r>
+        <w:t xml:space="preserve">scripting suites</w:t>
+      </w:r>
+      <w:r>
+        <w:t xml:space="preserve">”</w:t>
+      </w:r>
+      <w:r>
+        <w:t xml:space="preserve">.</w:t>
+      </w:r>
+    </w:p>
+    <w:p>
+      <w:pPr>
+        <w:numPr>
+          <w:ilvl w:val="1"/>
+          <w:numId w:val="1033"/>
+        </w:numPr>
+        <w:pStyle w:val="Compact"/>
+      </w:pPr>
+      <w:r>
+        <w:t xml:space="preserve">to support the kind of navigation above, the standard PDF viewer needs to be extended to support opening a file</w:t>
+      </w:r>
+      <w:r>
+        <w:t xml:space="preserve"> </w:t>
+      </w:r>
+      <w:r>
+        <w:t xml:space="preserve">on a given page (e.g., by adding a property</w:t>
+      </w:r>
+      <w:r>
+        <w:t xml:space="preserve"> </w:t>
+      </w:r>
+      <w:r>
+        <w:rPr>
+          <w:rStyle w:val="VerbatimChar"/>
+        </w:rPr>
+        <w:t xml:space="preserve">page</w:t>
+      </w:r>
+      <w:r>
+        <w:t xml:space="preserve"> </w:t>
+      </w:r>
+      <w:r>
+        <w:t xml:space="preserve">to the standard</w:t>
+      </w:r>
+      <w:r>
+        <w:t xml:space="preserve"> </w:t>
+      </w:r>
+      <w:r>
+        <w:rPr>
+          <w:rStyle w:val="VerbatimChar"/>
+        </w:rPr>
+        <w:t xml:space="preserve">OPEN</w:t>
+      </w:r>
+      <w:r>
+        <w:t xml:space="preserve"> </w:t>
+      </w:r>
+      <w:r>
+        <w:t xml:space="preserve">message already supported), or the</w:t>
+      </w:r>
+      <w:r>
+        <w:t xml:space="preserve"> </w:t>
+      </w:r>
+      <w:r>
+        <w:t xml:space="preserve">web browser needs to support WebAnnotations and a way to show them for a given URL in a similar way, e.g.,</w:t>
+      </w:r>
+      <w:r>
+        <w:t xml:space="preserve"> </w:t>
+      </w:r>
+      <w:r>
+        <w:t xml:space="preserve">using an additional attribute like</w:t>
+      </w:r>
+      <w:r>
+        <w:t xml:space="preserve"> </w:t>
+      </w:r>
+      <w:r>
+        <w:rPr>
+          <w:rStyle w:val="VerbatimChar"/>
+        </w:rPr>
+        <w:t xml:space="preserve">annotation</w:t>
+      </w:r>
+      <w:r>
+        <w:t xml:space="preserve"> </w:t>
+      </w:r>
+      <w:r>
+        <w:t xml:space="preserve">for the</w:t>
+      </w:r>
+      <w:r>
+        <w:t xml:space="preserve"> </w:t>
+      </w:r>
+      <w:r>
+        <w:rPr>
+          <w:rStyle w:val="VerbatimChar"/>
+        </w:rPr>
+        <w:t xml:space="preserve">OPEN</w:t>
+      </w:r>
+      <w:r>
+        <w:t xml:space="preserve"> </w:t>
+      </w:r>
+      <w:r>
+        <w:t xml:space="preserve">message.</w:t>
+      </w:r>
+    </w:p>
+    <w:p>
+      <w:pPr>
+        <w:numPr>
+          <w:ilvl w:val="0"/>
+          <w:numId w:val="1032"/>
+        </w:numPr>
+        <w:pStyle w:val="Compact"/>
+      </w:pPr>
+      <w:r>
+        <w:t xml:space="preserve">The figure below shows a simplified example of how users could navigate all references of a research paper or lecture</w:t>
+      </w:r>
+      <w:r>
+        <w:t xml:space="preserve"> </w:t>
+      </w:r>
+      <w:r>
+        <w:t xml:space="preserve">note, stored as different file types to represent related entities like web pages, PDF documents, books, or video presentations:</w:t>
+      </w:r>
+    </w:p>
+    <w:p>
+      <w:pPr>
+        <w:numPr>
+          <w:ilvl w:val="0"/>
+          <w:numId w:val="1032"/>
+        </w:numPr>
+        <w:pStyle w:val="CaptionedFigure"/>
+      </w:pPr>
+      <w:r>
+        <w:drawing>
+          <wp:inline>
+            <wp:extent cx="5334000" cy="3149295"/>
+            <wp:effectExtent b="0" l="0" r="0" t="0"/>
+            <wp:docPr descr="Relation Browser" title="browsing relation targets and their properties" id="51" name="Picture"/>
+            <a:graphic>
+              <a:graphicData uri="http://schemas.openxmlformats.org/drawingml/2006/picture">
+                <pic:pic>
+                  <pic:nvPicPr>
+                    <pic:cNvPr descr="images/tracker-relations.svg" id="52" name="Picture"/>
+                    <pic:cNvPicPr>
+                      <a:picLocks noChangeArrowheads="1" noChangeAspect="1"/>
+                    </pic:cNvPicPr>
+                  </pic:nvPicPr>
+                  <pic:blipFill>
+                    <a:blip r:embed="rId53">
+                      <a:extLst>
+                        <a:ext uri="{28A0092B-C50C-407E-A947-70E740481C1C}">
+                          <a14:useLocalDpi xmlns:a14="http://schemas.microsoft.com/office/drawing/2010/main" val="0"/>
+                        </a:ext>
+                        <a:ext uri="{96DAC541-7B7A-43D3-8B79-37D633B846F1}">
+                          <asvg:svgBlip xmlns:asvg="http://schemas.microsoft.com/office/drawing/2016/SVG/main" r:embed="rId50"/>
                         </a:ext>
                       </a:extLst>
                     </a:blip>
@@ -4025,8 +4258,8 @@
         <w:t xml:space="preserve">Relation Browser</w:t>
       </w:r>
     </w:p>
-    <w:bookmarkEnd w:id="49"/>
-    <w:bookmarkStart w:id="54" w:name="calendar"/>
+    <w:bookmarkEnd w:id="54"/>
+    <w:bookmarkStart w:id="59" w:name="calendar"/>
     <w:p>
       <w:pPr>
         <w:pStyle w:val="Heading3"/>
@@ -4039,7 +4272,7 @@
       <w:pPr>
         <w:numPr>
           <w:ilvl w:val="0"/>
-          <w:numId w:val="1032"/>
+          <w:numId w:val="1034"/>
         </w:numPr>
         <w:pStyle w:val="Compact"/>
       </w:pPr>
@@ -4051,7 +4284,7 @@
       <w:pPr>
         <w:numPr>
           <w:ilvl w:val="0"/>
-          <w:numId w:val="1032"/>
+          <w:numId w:val="1034"/>
         </w:numPr>
         <w:pStyle w:val="Compact"/>
       </w:pPr>
@@ -4081,7 +4314,7 @@
       <w:pPr>
         <w:numPr>
           <w:ilvl w:val="1"/>
-          <w:numId w:val="1033"/>
+          <w:numId w:val="1035"/>
         </w:numPr>
         <w:pStyle w:val="Compact"/>
       </w:pPr>
@@ -4111,7 +4344,7 @@
       <w:pPr>
         <w:numPr>
           <w:ilvl w:val="0"/>
-          <w:numId w:val="1032"/>
+          <w:numId w:val="1034"/>
         </w:numPr>
         <w:pStyle w:val="CaptionedFigure"/>
       </w:pPr>
@@ -4120,24 +4353,24 @@
           <wp:inline>
             <wp:extent cx="5334000" cy="2538747"/>
             <wp:effectExtent b="0" l="0" r="0" t="0"/>
-            <wp:docPr descr="Calendar Event Browser" title="browsing calendar entries" id="51" name="Picture"/>
+            <wp:docPr descr="Calendar Event Browser" title="browsing calendar entries" id="56" name="Picture"/>
             <a:graphic>
               <a:graphicData uri="http://schemas.openxmlformats.org/drawingml/2006/picture">
                 <pic:pic>
                   <pic:nvPicPr>
-                    <pic:cNvPr descr="images/calendar-browser.svg" id="52" name="Picture"/>
+                    <pic:cNvPr descr="images/calendar-browser.svg" id="57" name="Picture"/>
                     <pic:cNvPicPr>
                       <a:picLocks noChangeArrowheads="1" noChangeAspect="1"/>
                     </pic:cNvPicPr>
                   </pic:nvPicPr>
                   <pic:blipFill>
-                    <a:blip r:embed="rId53">
+                    <a:blip r:embed="rId58">
                       <a:extLst>
                         <a:ext uri="{28A0092B-C50C-407E-A947-70E740481C1C}">
                           <a14:useLocalDpi xmlns:a14="http://schemas.microsoft.com/office/drawing/2010/main" val="0"/>
                         </a:ext>
                         <a:ext uri="{96DAC541-7B7A-43D3-8B79-37D633B846F1}">
-                          <asvg:svgBlip xmlns:asvg="http://schemas.microsoft.com/office/drawing/2016/SVG/main" r:embed="rId50"/>
+                          <asvg:svgBlip xmlns:asvg="http://schemas.microsoft.com/office/drawing/2016/SVG/main" r:embed="rId55"/>
                         </a:ext>
                       </a:extLst>
                     </a:blip>
@@ -4179,8 +4412,8 @@
         <w:t xml:space="preserve">Calendar Event Browser</w:t>
       </w:r>
     </w:p>
-    <w:bookmarkEnd w:id="54"/>
-    <w:bookmarkStart w:id="55" w:name="e-mail"/>
+    <w:bookmarkEnd w:id="59"/>
+    <w:bookmarkStart w:id="60" w:name="e-mail"/>
     <w:p>
       <w:pPr>
         <w:pStyle w:val="Heading3"/>
@@ -4189,8 +4422,8 @@
         <w:t xml:space="preserve">E-Mail</w:t>
       </w:r>
     </w:p>
-    <w:bookmarkEnd w:id="55"/>
-    <w:bookmarkStart w:id="63" w:name="Xa2c87a544cf47e8c39fbecbb781ec174495b7f6"/>
+    <w:bookmarkEnd w:id="60"/>
+    <w:bookmarkStart w:id="68" w:name="Xa2c87a544cf47e8c39fbecbb781ec174495b7f6"/>
     <w:p>
       <w:pPr>
         <w:pStyle w:val="Heading3"/>
@@ -4203,9 +4436,8 @@
       <w:pPr>
         <w:numPr>
           <w:ilvl w:val="0"/>
-          <w:numId w:val="1034"/>
-        </w:numPr>
-        <w:pStyle w:val="Compact"/>
+          <w:numId w:val="1036"/>
+        </w:numPr>
       </w:pPr>
       <w:r>
         <w:t xml:space="preserve">Simple but Semantic</w:t>
@@ -4215,9 +4447,8 @@
       <w:pPr>
         <w:numPr>
           <w:ilvl w:val="0"/>
-          <w:numId w:val="1034"/>
-        </w:numPr>
-        <w:pStyle w:val="Compact"/>
+          <w:numId w:val="1036"/>
+        </w:numPr>
       </w:pPr>
       <w:r>
         <w:t xml:space="preserve">also suitable for story writing: characters, locations and story arch as (self-)references</w:t>
@@ -4227,9 +4458,8 @@
       <w:pPr>
         <w:numPr>
           <w:ilvl w:val="0"/>
-          <w:numId w:val="1034"/>
-        </w:numPr>
-        <w:pStyle w:val="Compact"/>
+          <w:numId w:val="1036"/>
+        </w:numPr>
       </w:pPr>
       <w:r>
         <w:t xml:space="preserve">Features and Use Cases - Authoring system (Relation Views for self-relations (structure, internal links to entities in the text) and external references)</w:t>
@@ -4239,35 +4469,32 @@
       <w:pPr>
         <w:numPr>
           <w:ilvl w:val="0"/>
-          <w:numId w:val="1034"/>
-        </w:numPr>
-        <w:pStyle w:val="Compact"/>
+          <w:numId w:val="1036"/>
+        </w:numPr>
       </w:pPr>
       <w:r>
         <w:t xml:space="preserve">Prototype Concept:</w:t>
       </w:r>
-    </w:p>
-    <w:p>
-      <w:pPr>
-        <w:pStyle w:val="CaptionedFigure"/>
-      </w:pPr>
+      <w:r>
+        <w:t xml:space="preserve"> </w:t>
+      </w:r>
       <w:r>
         <w:drawing>
           <wp:inline>
             <wp:extent cx="5334000" cy="2798089"/>
             <wp:effectExtent b="0" l="0" r="0" t="0"/>
-            <wp:docPr descr="Semantic Editor" title="semantic editor with NER built-in" id="57" name="Picture"/>
+            <wp:docPr descr="Semantic Editor" title="semantic editor with NER built-in" id="62" name="Picture"/>
             <a:graphic>
               <a:graphicData uri="http://schemas.openxmlformats.org/drawingml/2006/picture">
                 <pic:pic>
                   <pic:nvPicPr>
-                    <pic:cNvPr descr="images/editor-ner.png" id="58" name="Picture"/>
+                    <pic:cNvPr descr="images/editor-ner.png" id="63" name="Picture"/>
                     <pic:cNvPicPr>
                       <a:picLocks noChangeArrowheads="1" noChangeAspect="1"/>
                     </pic:cNvPicPr>
                   </pic:nvPicPr>
                   <pic:blipFill>
-                    <a:blip r:embed="rId56"/>
+                    <a:blip r:embed="rId61"/>
                     <a:stretch>
                       <a:fillRect/>
                     </a:stretch>
@@ -4296,51 +4523,40 @@
     </w:p>
     <w:p>
       <w:pPr>
-        <w:pStyle w:val="ImageCaption"/>
-      </w:pPr>
-      <w:r>
-        <w:t xml:space="preserve">Semantic Editor</w:t>
-      </w:r>
-    </w:p>
-    <w:p>
-      <w:pPr>
-        <w:numPr>
-          <w:ilvl w:val="0"/>
-          <w:numId w:val="1035"/>
-        </w:numPr>
-        <w:pStyle w:val="Compact"/>
+        <w:numPr>
+          <w:ilvl w:val="0"/>
+          <w:numId w:val="1036"/>
+        </w:numPr>
       </w:pPr>
       <w:r>
         <w:t xml:space="preserve">in the file-browser, all extracted entities can be browsed by navigating the file’s relations:</w:t>
       </w:r>
-    </w:p>
-    <w:p>
-      <w:pPr>
-        <w:pStyle w:val="CaptionedFigure"/>
-      </w:pPr>
+      <w:r>
+        <w:t xml:space="preserve"> </w:t>
+      </w:r>
       <w:r>
         <w:drawing>
           <wp:inline>
             <wp:extent cx="5334000" cy="2142527"/>
             <wp:effectExtent b="0" l="0" r="0" t="0"/>
-            <wp:docPr descr="Browsing Relations" title="navigating document relations in the file browser" id="60" name="Picture"/>
+            <wp:docPr descr="Browsing Relations" title="navigating document relations in the file browser" id="65" name="Picture"/>
             <a:graphic>
               <a:graphicData uri="http://schemas.openxmlformats.org/drawingml/2006/picture">
                 <pic:pic>
                   <pic:nvPicPr>
-                    <pic:cNvPr descr="images/file-browser-relations.svg" id="61" name="Picture"/>
+                    <pic:cNvPr descr="images/file-browser-relations.svg" id="66" name="Picture"/>
                     <pic:cNvPicPr>
                       <a:picLocks noChangeArrowheads="1" noChangeAspect="1"/>
                     </pic:cNvPicPr>
                   </pic:nvPicPr>
                   <pic:blipFill>
-                    <a:blip r:embed="rId62">
+                    <a:blip r:embed="rId67">
                       <a:extLst>
                         <a:ext uri="{28A0092B-C50C-407E-A947-70E740481C1C}">
                           <a14:useLocalDpi xmlns:a14="http://schemas.microsoft.com/office/drawing/2010/main" val="0"/>
                         </a:ext>
                         <a:ext uri="{96DAC541-7B7A-43D3-8B79-37D633B846F1}">
-                          <asvg:svgBlip xmlns:asvg="http://schemas.microsoft.com/office/drawing/2016/SVG/main" r:embed="rId59"/>
+                          <asvg:svgBlip xmlns:asvg="http://schemas.microsoft.com/office/drawing/2016/SVG/main" r:embed="rId64"/>
                         </a:ext>
                       </a:extLst>
                     </a:blip>
@@ -4370,75 +4586,143 @@
         </w:drawing>
       </w:r>
     </w:p>
+    <w:bookmarkEnd w:id="68"/>
+    <w:bookmarkStart w:id="73" w:name="extending-a-code-editor-into-an-ide"/>
+    <w:p>
+      <w:pPr>
+        <w:pStyle w:val="Heading3"/>
+      </w:pPr>
+      <w:r>
+        <w:t xml:space="preserve">Extending a Code Editor into an IDE</w:t>
+      </w:r>
+    </w:p>
+    <w:p>
+      <w:pPr>
+        <w:numPr>
+          <w:ilvl w:val="0"/>
+          <w:numId w:val="1037"/>
+        </w:numPr>
+        <w:pStyle w:val="Compact"/>
+      </w:pPr>
+      <w:r>
+        <w:t xml:space="preserve">adding semantic structuring and navigation using SEN</w:t>
+      </w:r>
+    </w:p>
+    <w:p>
+      <w:pPr>
+        <w:numPr>
+          <w:ilvl w:val="0"/>
+          <w:numId w:val="1037"/>
+        </w:numPr>
+        <w:pStyle w:val="Compact"/>
+      </w:pPr>
+      <w:r>
+        <w:t xml:space="preserve">self-relations for, e.g., methods and classes</w:t>
+      </w:r>
+    </w:p>
+    <w:p>
+      <w:pPr>
+        <w:numPr>
+          <w:ilvl w:val="0"/>
+          <w:numId w:val="1037"/>
+        </w:numPr>
+        <w:pStyle w:val="Compact"/>
+      </w:pPr>
+      <w:r>
+        <w:t xml:space="preserve">external relations for included files (C/C++) or referenced classes (Java imports)</w:t>
+      </w:r>
+    </w:p>
+    <w:p>
+      <w:pPr>
+        <w:numPr>
+          <w:ilvl w:val="0"/>
+          <w:numId w:val="1037"/>
+        </w:numPr>
+        <w:pStyle w:val="Compact"/>
+      </w:pPr>
+      <w:r>
+        <w:t xml:space="preserve">can be realised on top of existing application(s) using SEN API, or even (more as a showcase) using the SEN enabled file browser.</w:t>
+      </w:r>
+    </w:p>
+    <w:p>
+      <w:pPr>
+        <w:numPr>
+          <w:ilvl w:val="0"/>
+          <w:numId w:val="1037"/>
+        </w:numPr>
+        <w:pStyle w:val="Compact"/>
+      </w:pPr>
+      <w:r>
+        <w:t xml:space="preserve">example:</w:t>
+      </w:r>
+    </w:p>
+    <w:p>
+      <w:pPr>
+        <w:pStyle w:val="CaptionedFigure"/>
+      </w:pPr>
+      <w:r>
+        <w:drawing>
+          <wp:inline>
+            <wp:extent cx="5334000" cy="2701977"/>
+            <wp:effectExtent b="0" l="0" r="0" t="0"/>
+            <wp:docPr descr="SEN-IDE" title="an IDE utilising the SEN API" id="70" name="Picture"/>
+            <a:graphic>
+              <a:graphicData uri="http://schemas.openxmlformats.org/drawingml/2006/picture">
+                <pic:pic>
+                  <pic:nvPicPr>
+                    <pic:cNvPr descr="images/sen-ide.svg" id="71" name="Picture"/>
+                    <pic:cNvPicPr>
+                      <a:picLocks noChangeArrowheads="1" noChangeAspect="1"/>
+                    </pic:cNvPicPr>
+                  </pic:nvPicPr>
+                  <pic:blipFill>
+                    <a:blip r:embed="rId72">
+                      <a:extLst>
+                        <a:ext uri="{28A0092B-C50C-407E-A947-70E740481C1C}">
+                          <a14:useLocalDpi xmlns:a14="http://schemas.microsoft.com/office/drawing/2010/main" val="0"/>
+                        </a:ext>
+                        <a:ext uri="{96DAC541-7B7A-43D3-8B79-37D633B846F1}">
+                          <asvg:svgBlip xmlns:asvg="http://schemas.microsoft.com/office/drawing/2016/SVG/main" r:embed="rId69"/>
+                        </a:ext>
+                      </a:extLst>
+                    </a:blip>
+                    <a:stretch>
+                      <a:fillRect/>
+                    </a:stretch>
+                  </pic:blipFill>
+                  <pic:spPr bwMode="auto">
+                    <a:xfrm>
+                      <a:off x="0" y="0"/>
+                      <a:ext cx="5334000" cy="2701977"/>
+                    </a:xfrm>
+                    <a:prstGeom prst="rect">
+                      <a:avLst/>
+                    </a:prstGeom>
+                    <a:noFill/>
+                    <a:ln w="9525">
+                      <a:noFill/>
+                      <a:headEnd/>
+                      <a:tailEnd/>
+                    </a:ln>
+                  </pic:spPr>
+                </pic:pic>
+              </a:graphicData>
+            </a:graphic>
+          </wp:inline>
+        </w:drawing>
+      </w:r>
+    </w:p>
     <w:p>
       <w:pPr>
         <w:pStyle w:val="ImageCaption"/>
       </w:pPr>
       <w:r>
-        <w:t xml:space="preserve">Browsing Relations</w:t>
-      </w:r>
-    </w:p>
-    <w:bookmarkEnd w:id="63"/>
-    <w:bookmarkStart w:id="64" w:name="extending-a-code-editor-into-an-ide"/>
-    <w:p>
-      <w:pPr>
-        <w:pStyle w:val="Heading3"/>
-      </w:pPr>
-      <w:r>
-        <w:t xml:space="preserve">Extending a Code Editor into an IDE</w:t>
-      </w:r>
-    </w:p>
-    <w:p>
-      <w:pPr>
-        <w:numPr>
-          <w:ilvl w:val="0"/>
-          <w:numId w:val="1036"/>
-        </w:numPr>
-        <w:pStyle w:val="Compact"/>
-      </w:pPr>
-      <w:r>
-        <w:t xml:space="preserve">adding semantic structuring and navigation using SEN</w:t>
-      </w:r>
-    </w:p>
-    <w:p>
-      <w:pPr>
-        <w:numPr>
-          <w:ilvl w:val="0"/>
-          <w:numId w:val="1036"/>
-        </w:numPr>
-        <w:pStyle w:val="Compact"/>
-      </w:pPr>
-      <w:r>
-        <w:t xml:space="preserve">self-relations for, e.g., methods and classes</w:t>
-      </w:r>
-    </w:p>
-    <w:p>
-      <w:pPr>
-        <w:numPr>
-          <w:ilvl w:val="0"/>
-          <w:numId w:val="1036"/>
-        </w:numPr>
-        <w:pStyle w:val="Compact"/>
-      </w:pPr>
-      <w:r>
-        <w:t xml:space="preserve">external relations for included files (C/C++) or referenced classes (Java imports)</w:t>
-      </w:r>
-    </w:p>
-    <w:p>
-      <w:pPr>
-        <w:numPr>
-          <w:ilvl w:val="0"/>
-          <w:numId w:val="1036"/>
-        </w:numPr>
-        <w:pStyle w:val="Compact"/>
-      </w:pPr>
-      <w:r>
-        <w:t xml:space="preserve">can be realised on top of existing application(s) using SEN API, or even (more as a showcase) using the SEN enabled file browser.</w:t>
-      </w:r>
-    </w:p>
-    <w:bookmarkEnd w:id="64"/>
-    <w:bookmarkEnd w:id="65"/>
-    <w:bookmarkStart w:id="66" w:name="outlook-ongoing-and-future-work"/>
+        <w:t xml:space="preserve">SEN-IDE</w:t>
+      </w:r>
+    </w:p>
+    <w:bookmarkEnd w:id="73"/>
+    <w:bookmarkEnd w:id="74"/>
+    <w:bookmarkStart w:id="75" w:name="outlook-ongoing-and-future-work"/>
     <w:p>
       <w:pPr>
         <w:pStyle w:val="Heading2"/>
@@ -4451,7 +4735,7 @@
       <w:pPr>
         <w:numPr>
           <w:ilvl w:val="0"/>
-          <w:numId w:val="1037"/>
+          <w:numId w:val="1038"/>
         </w:numPr>
         <w:pStyle w:val="Compact"/>
       </w:pPr>
@@ -4463,7 +4747,7 @@
       <w:pPr>
         <w:numPr>
           <w:ilvl w:val="0"/>
-          <w:numId w:val="1037"/>
+          <w:numId w:val="1038"/>
         </w:numPr>
         <w:pStyle w:val="Compact"/>
       </w:pPr>
@@ -4493,7 +4777,7 @@
       <w:pPr>
         <w:numPr>
           <w:ilvl w:val="0"/>
-          <w:numId w:val="1037"/>
+          <w:numId w:val="1038"/>
         </w:numPr>
         <w:pStyle w:val="Compact"/>
       </w:pPr>
@@ -4505,7 +4789,7 @@
       <w:pPr>
         <w:numPr>
           <w:ilvl w:val="0"/>
-          <w:numId w:val="1037"/>
+          <w:numId w:val="1038"/>
         </w:numPr>
         <w:pStyle w:val="Compact"/>
       </w:pPr>
@@ -4517,7 +4801,7 @@
       <w:pPr>
         <w:numPr>
           <w:ilvl w:val="1"/>
-          <w:numId w:val="1038"/>
+          <w:numId w:val="1039"/>
         </w:numPr>
         <w:pStyle w:val="Compact"/>
       </w:pPr>
@@ -4525,8 +4809,8 @@
         <w:t xml:space="preserve">rich Tracker views, e.g. 2d-axis view for arranging items on a timeline, or by proximity etc.</w:t>
       </w:r>
     </w:p>
-    <w:bookmarkEnd w:id="66"/>
-    <w:bookmarkStart w:id="67" w:name="references"/>
+    <w:bookmarkEnd w:id="75"/>
+    <w:bookmarkStart w:id="76" w:name="references"/>
     <w:p>
       <w:pPr>
         <w:pStyle w:val="Heading2"/>
@@ -4539,7 +4823,7 @@
       <w:pPr>
         <w:numPr>
           <w:ilvl w:val="0"/>
-          <w:numId w:val="1039"/>
+          <w:numId w:val="1040"/>
         </w:numPr>
       </w:pPr>
       <w:r>
@@ -4550,7 +4834,7 @@
       <w:pPr>
         <w:numPr>
           <w:ilvl w:val="0"/>
-          <w:numId w:val="1039"/>
+          <w:numId w:val="1040"/>
         </w:numPr>
       </w:pPr>
       <w:r>
@@ -4561,7 +4845,7 @@
       <w:pPr>
         <w:numPr>
           <w:ilvl w:val="0"/>
-          <w:numId w:val="1039"/>
+          <w:numId w:val="1040"/>
         </w:numPr>
       </w:pPr>
       <w:r>
@@ -4572,7 +4856,7 @@
       <w:pPr>
         <w:numPr>
           <w:ilvl w:val="0"/>
-          <w:numId w:val="1039"/>
+          <w:numId w:val="1040"/>
         </w:numPr>
       </w:pPr>
       <w:r>
@@ -4583,7 +4867,7 @@
       <w:pPr>
         <w:numPr>
           <w:ilvl w:val="0"/>
-          <w:numId w:val="1039"/>
+          <w:numId w:val="1040"/>
         </w:numPr>
       </w:pPr>
       <w:r>
@@ -4594,7 +4878,7 @@
       <w:pPr>
         <w:numPr>
           <w:ilvl w:val="0"/>
-          <w:numId w:val="1039"/>
+          <w:numId w:val="1040"/>
         </w:numPr>
       </w:pPr>
       <w:r>
@@ -4605,7 +4889,18 @@
       <w:pPr>
         <w:numPr>
           <w:ilvl w:val="0"/>
-          <w:numId w:val="1039"/>
+          <w:numId w:val="1040"/>
+        </w:numPr>
+      </w:pPr>
+      <w:r>
+        <w:t xml:space="preserve">Haiku, V. (2022). The Haiku Book: Messaging Foundations. Retrieved September 25, 2022, from https://www.haiku-os.org/docs/api/app_messaging.html</w:t>
+      </w:r>
+    </w:p>
+    <w:p>
+      <w:pPr>
+        <w:numPr>
+          <w:ilvl w:val="0"/>
+          <w:numId w:val="1040"/>
         </w:numPr>
       </w:pPr>
       <w:r>
@@ -4616,7 +4911,7 @@
       <w:pPr>
         <w:numPr>
           <w:ilvl w:val="0"/>
-          <w:numId w:val="1039"/>
+          <w:numId w:val="1040"/>
         </w:numPr>
       </w:pPr>
       <w:r>
@@ -4627,7 +4922,7 @@
       <w:pPr>
         <w:numPr>
           <w:ilvl w:val="0"/>
-          <w:numId w:val="1039"/>
+          <w:numId w:val="1040"/>
         </w:numPr>
       </w:pPr>
       <w:r>
@@ -4638,7 +4933,7 @@
       <w:pPr>
         <w:numPr>
           <w:ilvl w:val="0"/>
-          <w:numId w:val="1039"/>
+          <w:numId w:val="1040"/>
         </w:numPr>
       </w:pPr>
       <w:r>
@@ -4649,7 +4944,7 @@
       <w:pPr>
         <w:numPr>
           <w:ilvl w:val="0"/>
-          <w:numId w:val="1039"/>
+          <w:numId w:val="1040"/>
         </w:numPr>
       </w:pPr>
       <w:r>
@@ -4660,7 +4955,7 @@
       <w:pPr>
         <w:numPr>
           <w:ilvl w:val="0"/>
-          <w:numId w:val="1039"/>
+          <w:numId w:val="1040"/>
         </w:numPr>
       </w:pPr>
       <w:r>
@@ -4671,7 +4966,7 @@
       <w:pPr>
         <w:numPr>
           <w:ilvl w:val="0"/>
-          <w:numId w:val="1039"/>
+          <w:numId w:val="1040"/>
         </w:numPr>
       </w:pPr>
       <w:r>
@@ -4682,7 +4977,7 @@
       <w:pPr>
         <w:numPr>
           <w:ilvl w:val="0"/>
-          <w:numId w:val="1039"/>
+          <w:numId w:val="1040"/>
         </w:numPr>
       </w:pPr>
       <w:r>
@@ -4693,7 +4988,7 @@
       <w:pPr>
         <w:numPr>
           <w:ilvl w:val="0"/>
-          <w:numId w:val="1039"/>
+          <w:numId w:val="1040"/>
         </w:numPr>
       </w:pPr>
       <w:r>
@@ -4704,7 +4999,7 @@
       <w:pPr>
         <w:numPr>
           <w:ilvl w:val="0"/>
-          <w:numId w:val="1039"/>
+          <w:numId w:val="1040"/>
         </w:numPr>
       </w:pPr>
       <w:r>
@@ -4715,14 +5010,14 @@
       <w:pPr>
         <w:numPr>
           <w:ilvl w:val="0"/>
-          <w:numId w:val="1039"/>
+          <w:numId w:val="1040"/>
         </w:numPr>
       </w:pPr>
       <w:r>
         <w:t xml:space="preserve">W3C. (n.d.). WebAnnotation Home. WebAnnotation: Retrieved September 21, 2022, from http://webannotation.org/</w:t>
       </w:r>
     </w:p>
-    <w:bookmarkEnd w:id="67"/>
+    <w:bookmarkEnd w:id="76"/>
     <w:sectPr/>
   </w:body>
 </w:document>
@@ -5135,6 +5430,9 @@
     <w:abstractNumId w:val="991"/>
   </w:num>
   <w:num w:numId="1039">
+    <w:abstractNumId w:val="991"/>
+  </w:num>
+  <w:num w:numId="1040">
     <w:abstractNumId w:val="991"/>
   </w:num>
 </w:numbering>

</xml_diff>

<commit_message>
add references, semantic desktop section, history, PDF/ODT renders
</commit_message>
<xml_diff>
--- a/output/Extending the Desktop into a Personal Knowledge Graph with SEN.docx
+++ b/output/Extending the Desktop into a Personal Knowledge Graph with SEN.docx
@@ -10,7 +10,7 @@
         <w:t xml:space="preserve">[[Gregor Rosenauer]]</w:t>
       </w:r>
     </w:p>
-    <w:bookmarkStart w:id="21" w:name="motivation-and-vision-statement"/>
+    <w:bookmarkStart w:id="20" w:name="motivation-and-vision-statement"/>
     <w:p>
       <w:pPr>
         <w:pStyle w:val="Heading2"/>
@@ -28,21 +28,19 @@
         <w:pStyle w:val="Compact"/>
       </w:pPr>
       <w:r>
-        <w:t xml:space="preserve">Although the idea behind personal knowledge graphs dates back to the 1960s with the now famous Zettelkasten method by Luhmann</w:t>
-      </w:r>
-      <w:r>
-        <w:t xml:space="preserve"> </w:t>
-      </w:r>
-      <w:hyperlink r:id="rId20">
-        <w:r>
-          <w:rPr>
-            <w:rStyle w:val="Hyperlink"/>
-          </w:rPr>
-          <w:t xml:space="preserve">xx</w:t>
-        </w:r>
-      </w:hyperlink>
-      <w:r>
-        <w:t xml:space="preserve">, it only became popular in recent years with the introduction of connected note taking tools like Evernote, Notion, Roam or Obdisian, to name only a few.</w:t>
+        <w:t xml:space="preserve">Although the idea behind personal knowledge graphs dates back to the 1960s with the now famous Zettelkasten method by</w:t>
+      </w:r>
+      <w:r>
+        <w:t xml:space="preserve"> </w:t>
+      </w:r>
+      <w:r>
+        <w:t xml:space="preserve">Luhmann (Schmidt, 2018), it only became popular in recent years with the introduction of connected note-taking tools</w:t>
+      </w:r>
+      <w:r>
+        <w:t xml:space="preserve"> </w:t>
+      </w:r>
+      <w:r>
+        <w:t xml:space="preserve">like Evernote, Notion, Roam (and its open source cousin Foam (foambubble, 2022)) or Obdisian, to name only a few.</w:t>
       </w:r>
     </w:p>
     <w:p>
@@ -54,21 +52,61 @@
         <w:pStyle w:val="Compact"/>
       </w:pPr>
       <w:r>
-        <w:t xml:space="preserve">On the other hand, there is raising criticism in the usefulness of this approach</w:t>
-      </w:r>
-      <w:r>
-        <w:t xml:space="preserve"> </w:t>
-      </w:r>
-      <w:hyperlink r:id="rId20">
-        <w:r>
-          <w:rPr>
-            <w:rStyle w:val="Hyperlink"/>
-          </w:rPr>
-          <w:t xml:space="preserve">xxx</w:t>
-        </w:r>
-      </w:hyperlink>
-      <w:r>
-        <w:t xml:space="preserve">, as a graph does not make one any wiser per se, and connections alone do not bring much new insights beyond the fact that the linked information is connected somehow. Without an additional classification on how and why some bits of information are connected, users cannot gather meaningful output, as they cannot navigate and query based on the depth of knowledge they gathered, confined to see only on shallow connections on the surface.</w:t>
+        <w:t xml:space="preserve">On the other hand, there is also valid criticism in the usefulness of this approach (see chapter 9 in this book on</w:t>
+      </w:r>
+      <w:r>
+        <w:t xml:space="preserve"> </w:t>
+      </w:r>
+      <w:r>
+        <w:t xml:space="preserve">“</w:t>
+      </w:r>
+      <w:r>
+        <w:t xml:space="preserve">A decentralised social network of Solid-based second brains</w:t>
+      </w:r>
+      <w:r>
+        <w:t xml:space="preserve">”</w:t>
+      </w:r>
+      <w:r>
+        <w:t xml:space="preserve"> </w:t>
+      </w:r>
+      <w:r>
+        <w:t xml:space="preserve">by Mathew Lowry), as a graph does not make one any wiser</w:t>
+      </w:r>
+      <w:r>
+        <w:t xml:space="preserve"> </w:t>
+      </w:r>
+      <w:r>
+        <w:t xml:space="preserve">per se, and connections alone do not bring much new insights beyond the fact that the linked information is connected somehow.</w:t>
+      </w:r>
+      <w:r>
+        <w:t xml:space="preserve"> </w:t>
+      </w:r>
+      <w:r>
+        <w:t xml:space="preserve">Also, current systems of this kind only use tagging, which is the simplest form of classification, but does not hold</w:t>
+      </w:r>
+      <w:r>
+        <w:t xml:space="preserve"> </w:t>
+      </w:r>
+      <w:r>
+        <w:t xml:space="preserve">any deeper semantics to allow meaningful identification of entities and their properties and relations.</w:t>
+      </w:r>
+      <w:r>
+        <w:t xml:space="preserve"> </w:t>
+      </w:r>
+      <w:r>
+        <w:t xml:space="preserve">Without an additional classification on how and why some bits of information are connected, users cannot gather meaningful output,</w:t>
+      </w:r>
+      <w:r>
+        <w:t xml:space="preserve"> </w:t>
+      </w:r>
+      <w:r>
+        <w:t xml:space="preserve">as they cannot navigate and query based on the depth of knowledge they gathered, confined to see only on shallow,</w:t>
+      </w:r>
+      <w:r>
+        <w:t xml:space="preserve"> </w:t>
+      </w:r>
+      <w:r>
+        <w:t xml:space="preserve">labelled connections on the surface.</w:t>
       </w:r>
     </w:p>
     <w:p>
@@ -92,7 +130,13 @@
         <w:pStyle w:val="Compact"/>
       </w:pPr>
       <w:r>
-        <w:t xml:space="preserve">current linked note-management applications mostly rely on simple tagging, which looses semantics and restricts later search and navigation.</w:t>
+        <w:t xml:space="preserve">these services limit what users can do with their data, and without the service, which is bound to a single vendor,</w:t>
+      </w:r>
+      <w:r>
+        <w:t xml:space="preserve"> </w:t>
+      </w:r>
+      <w:r>
+        <w:t xml:space="preserve">the data mey become inaccessible or unusable, at least connections and navigation are then lost.</w:t>
       </w:r>
     </w:p>
     <w:p>
@@ -104,7 +148,19 @@
         <w:pStyle w:val="Compact"/>
       </w:pPr>
       <w:r>
-        <w:t xml:space="preserve">cloud providers either charge recurring fees or utilize user data, which can even pose a threat to users in unsafe environments and is not suitable for sensitive or business data (possible infringement of intellectual property, transfer of copyright to the provider, etc.).</w:t>
+        <w:t xml:space="preserve">cloud providers either charge recurring fees or utilize user data, which can even pose a threat to users in unsafe</w:t>
+      </w:r>
+      <w:r>
+        <w:t xml:space="preserve"> </w:t>
+      </w:r>
+      <w:r>
+        <w:t xml:space="preserve">environments (like journalism or activism), and is not suitable for sensitive or business data (possible infringement</w:t>
+      </w:r>
+      <w:r>
+        <w:t xml:space="preserve"> </w:t>
+      </w:r>
+      <w:r>
+        <w:t xml:space="preserve">of intellectual property, transfer of copyright to the provider, etc.).</w:t>
       </w:r>
     </w:p>
     <w:p>
@@ -116,7 +172,13 @@
         <w:pStyle w:val="Compact"/>
       </w:pPr>
       <w:r>
-        <w:t xml:space="preserve">A lot of valuable information is still locally stored on personal desktop systems in the form of carefully selected documents, ebooks, papers or other media, possibly restricted or private sources, and personal artifacts like project notes, ideas, concepts, or drafts.</w:t>
+        <w:t xml:space="preserve">A lot of valuable information is still locally stored on personal desktop systems in the form of carefully selected documents,</w:t>
+      </w:r>
+      <w:r>
+        <w:t xml:space="preserve"> </w:t>
+      </w:r>
+      <w:r>
+        <w:t xml:space="preserve">ebooks, papers or other media, possibly restricted or private sources, and personal artifacts like project notes, ideas, concepts, or drafts.</w:t>
       </w:r>
     </w:p>
     <w:p>
@@ -128,7 +190,19 @@
         <w:pStyle w:val="Compact"/>
       </w:pPr>
       <w:r>
-        <w:t xml:space="preserve">personal knowledge graphs should also cover all kinds of information, not only document or media entities, but also various communication (mails), contacts and events (conferences, meetings, etc.) already present in the user’s environment, and highly connected to personal data and work that derives from it.</w:t>
+        <w:t xml:space="preserve">personal knowledge graphs should also cover all kinds of information, not only document or media entities, but also various</w:t>
+      </w:r>
+      <w:r>
+        <w:t xml:space="preserve"> </w:t>
+      </w:r>
+      <w:r>
+        <w:t xml:space="preserve">communication (mails), contacts and events (conferences, meetings, etc.) already present in the user’s environment, and</w:t>
+      </w:r>
+      <w:r>
+        <w:t xml:space="preserve"> </w:t>
+      </w:r>
+      <w:r>
+        <w:t xml:space="preserve">highly connected to personal data and work that derives from it.</w:t>
       </w:r>
     </w:p>
     <w:p>
@@ -155,11 +229,17 @@
         <w:t xml:space="preserve">”</w:t>
       </w:r>
       <w:r>
-        <w:t xml:space="preserve">, i.e. the user’s system, it needs to embrace that existing information, understand its connections, make them visible to the user and allow to navigate and query it.</w:t>
-      </w:r>
-    </w:p>
-    <w:bookmarkEnd w:id="21"/>
-    <w:bookmarkStart w:id="24" w:name="X558bff0f62863f34fac60cb2517c2d79da2b05a"/>
+        <w:t xml:space="preserve">, i.e. the user’s system, it needs to embrace that existing</w:t>
+      </w:r>
+      <w:r>
+        <w:t xml:space="preserve"> </w:t>
+      </w:r>
+      <w:r>
+        <w:t xml:space="preserve">information, understand its connections, make them visible to the user and allow to navigate and query it.</w:t>
+      </w:r>
+    </w:p>
+    <w:bookmarkEnd w:id="20"/>
+    <w:bookmarkStart w:id="22" w:name="X558bff0f62863f34fac60cb2517c2d79da2b05a"/>
     <w:p>
       <w:pPr>
         <w:pStyle w:val="Heading2"/>
@@ -170,10 +250,10 @@
     </w:p>
     <w:p>
       <w:pPr>
-        <w:pStyle w:val="FirstParagraph"/>
-      </w:pPr>
-      <w:r>
-        <w:t xml:space="preserve">– Wise up your Workspace - Why a Personal Knowledge Graph should live in your File System</w:t>
+        <w:pStyle w:val="BlockText"/>
+      </w:pPr>
+      <w:r>
+        <w:t xml:space="preserve">Wise up your Workspace - Why a Personal Knowledge Graph should live in your personal desktop system</w:t>
       </w:r>
     </w:p>
     <w:p>
@@ -185,7 +265,13 @@
         <w:pStyle w:val="Compact"/>
       </w:pPr>
       <w:r>
-        <w:t xml:space="preserve">The most natural and feasible way to implement such a system would be to utilize a modern OS that provides a semantic filesystem, with attributes and relations built-in.</w:t>
+        <w:t xml:space="preserve">The most natural and feasible way to implement such a system would be to utilize a modern OS that provides a semantic</w:t>
+      </w:r>
+      <w:r>
+        <w:t xml:space="preserve"> </w:t>
+      </w:r>
+      <w:r>
+        <w:t xml:space="preserve">filesystem, with attributes and relations built-in.</w:t>
       </w:r>
     </w:p>
     <w:p>
@@ -197,7 +283,49 @@
         <w:pStyle w:val="Compact"/>
       </w:pPr>
       <w:r>
-        <w:t xml:space="preserve">Although many modern filesystems now support custom attributes as key/value pairs, they still don’t allow to query for them (there is an experimental patch to make the</w:t>
+        <w:t xml:space="preserve">Although many modern filesystems now support custom attributes as key/value pairs (</w:t>
+      </w:r>
+      <w:r>
+        <w:t xml:space="preserve">“</w:t>
+      </w:r>
+      <w:r>
+        <w:t xml:space="preserve">xattrs</w:t>
+      </w:r>
+      <w:r>
+        <w:t xml:space="preserve">”</w:t>
+      </w:r>
+      <w:r>
+        <w:t xml:space="preserve"> </w:t>
+      </w:r>
+      <w:r>
+        <w:t xml:space="preserve">for</w:t>
+      </w:r>
+      <w:r>
+        <w:t xml:space="preserve"> </w:t>
+      </w:r>
+      <w:r>
+        <w:t xml:space="preserve">“</w:t>
+      </w:r>
+      <w:r>
+        <w:t xml:space="preserve">extended attributes</w:t>
+      </w:r>
+      <w:r>
+        <w:t xml:space="preserve">”</w:t>
+      </w:r>
+      <w:r>
+        <w:t xml:space="preserve">),</w:t>
+      </w:r>
+      <w:r>
+        <w:t xml:space="preserve"> </w:t>
+      </w:r>
+      <w:r>
+        <w:t xml:space="preserve">they still don’t allow to query for them, neither in a simple graphical way for end-users, nor even for advanced users</w:t>
+      </w:r>
+      <w:r>
+        <w:t xml:space="preserve"> </w:t>
+      </w:r>
+      <w:r>
+        <w:t xml:space="preserve">using command-line tools such as UNIX</w:t>
       </w:r>
       <w:r>
         <w:t xml:space="preserve"> </w:t>
@@ -212,7 +340,85 @@
         <w:t xml:space="preserve"> </w:t>
       </w:r>
       <w:r>
-        <w:t xml:space="preserve">command support this &lt;&lt;REF!&gt;&gt;), and there is no support for relations, reducing their use to static metadata for display in info panels.</w:t>
+        <w:t xml:space="preserve">(as an exception, only BSD and hence Darwin/MacOS provide an extended</w:t>
+      </w:r>
+      <w:r>
+        <w:t xml:space="preserve"> </w:t>
+      </w:r>
+      <w:r>
+        <w:rPr>
+          <w:rStyle w:val="VerbatimChar"/>
+        </w:rPr>
+        <w:t xml:space="preserve">find</w:t>
+      </w:r>
+      <w:r>
+        <w:t xml:space="preserve"> </w:t>
+      </w:r>
+      <w:r>
+        <w:t xml:space="preserve">variant that supports searching extended attribute keys and values using an</w:t>
+      </w:r>
+      <w:r>
+        <w:t xml:space="preserve"> </w:t>
+      </w:r>
+      <w:r>
+        <w:rPr>
+          <w:rStyle w:val="VerbatimChar"/>
+        </w:rPr>
+        <w:t xml:space="preserve">-xattr</w:t>
+      </w:r>
+      <w:r>
+        <w:t xml:space="preserve"> </w:t>
+      </w:r>
+      <w:r>
+        <w:t xml:space="preserve">and</w:t>
+      </w:r>
+      <w:r>
+        <w:t xml:space="preserve"> </w:t>
+      </w:r>
+      <w:r>
+        <w:rPr>
+          <w:rStyle w:val="VerbatimChar"/>
+        </w:rPr>
+        <w:t xml:space="preserve">xattrname</w:t>
+      </w:r>
+      <w:r>
+        <w:t xml:space="preserve"> </w:t>
+      </w:r>
+      <w:r>
+        <w:t xml:space="preserve">switch, respectively)</w:t>
+      </w:r>
+    </w:p>
+    <w:p>
+      <w:pPr>
+        <w:numPr>
+          <w:ilvl w:val="1"/>
+          <w:numId w:val="1004"/>
+        </w:numPr>
+        <w:pStyle w:val="Compact"/>
+      </w:pPr>
+      <w:r>
+        <w:t xml:space="preserve">for Linux, there is now an open-source tool (Bhihe, 2022/2022) that supports this as well, providing a shell wrapper for</w:t>
+      </w:r>
+      <w:r>
+        <w:t xml:space="preserve"> </w:t>
+      </w:r>
+      <w:r>
+        <w:t xml:space="preserve">the</w:t>
+      </w:r>
+      <w:r>
+        <w:t xml:space="preserve"> </w:t>
+      </w:r>
+      <w:r>
+        <w:rPr>
+          <w:rStyle w:val="VerbatimChar"/>
+        </w:rPr>
+        <w:t xml:space="preserve">find</w:t>
+      </w:r>
+      <w:r>
+        <w:t xml:space="preserve"> </w:t>
+      </w:r>
+      <w:r>
+        <w:t xml:space="preserve">command with xattr extensions.</w:t>
       </w:r>
     </w:p>
     <w:p>
@@ -224,7 +430,29 @@
         <w:pStyle w:val="Compact"/>
       </w:pPr>
       <w:r>
-        <w:t xml:space="preserve">Instead of implementing query support and native support for relations beyond simple links directly in the filesystem layer, current semantic desktop solutions introduce a separate data storage like embedded sql databases, adding a lot of overhead and introducing data synchronization issues. They often introduce complex API`s that are more aligned to the semantic web than the desktop, which makes development harder than needed and slows down adoption and user acceptance &lt;&lt;REF!&gt;&gt;.</w:t>
+        <w:t xml:space="preserve">Still, there is no support for semantic</w:t>
+      </w:r>
+      <w:r>
+        <w:t xml:space="preserve"> </w:t>
+      </w:r>
+      <w:r>
+        <w:rPr>
+          <w:iCs/>
+          <w:i/>
+        </w:rPr>
+        <w:t xml:space="preserve">relations</w:t>
+      </w:r>
+      <w:r>
+        <w:t xml:space="preserve"> </w:t>
+      </w:r>
+      <w:r>
+        <w:t xml:space="preserve">in any modern desktop system, reducing the use of desktop semantics</w:t>
+      </w:r>
+      <w:r>
+        <w:t xml:space="preserve"> </w:t>
+      </w:r>
+      <w:r>
+        <w:t xml:space="preserve">to static metadata for display in info panels (like a details view in file browsers).</w:t>
       </w:r>
     </w:p>
     <w:p>
@@ -236,14 +464,25 @@
         <w:pStyle w:val="Compact"/>
       </w:pPr>
       <w:r>
-        <w:t xml:space="preserve">More ambitious efforts in file system development failed because of similar complexity</w:t>
-      </w:r>
-      <w:r>
-        <w:t xml:space="preserve"> </w:t>
-      </w:r>
-      <w:hyperlink r:id="rId22"/>
-      <w:r>
-        <w:t xml:space="preserve">, trying to integrate a full-fledged database into a desktop OS intended for everyday use.</w:t>
+        <w:t xml:space="preserve">Instead of implementing query support and native support for relations beyond simple links directly in the filesystem layer,</w:t>
+      </w:r>
+      <w:r>
+        <w:t xml:space="preserve"> </w:t>
+      </w:r>
+      <w:r>
+        <w:t xml:space="preserve">current semantic desktop solutions introduce a separate data storage like embedded SQL databases, adding a lot of overhead</w:t>
+      </w:r>
+      <w:r>
+        <w:t xml:space="preserve"> </w:t>
+      </w:r>
+      <w:r>
+        <w:t xml:space="preserve">and introducing data synchronization issues. They often introduce complex API`s that are more aligned to the semantic web</w:t>
+      </w:r>
+      <w:r>
+        <w:t xml:space="preserve"> </w:t>
+      </w:r>
+      <w:r>
+        <w:t xml:space="preserve">than the desktop, which makes development harder than needed and slows down adoption and user acceptance &lt;&lt;REF!&gt;&gt;.</w:t>
       </w:r>
     </w:p>
     <w:p>
@@ -255,7 +494,31 @@
         <w:pStyle w:val="Compact"/>
       </w:pPr>
       <w:r>
-        <w:t xml:space="preserve">So an ideal solution should be lightweight and integrate transparently and naturally with the desktop the user knows and operates daily, built on a file system that supports semantic queries or can be extended with minimum overhead.</w:t>
+        <w:t xml:space="preserve">More ambitious efforts in file system development failed because of similar complexity, trying to integrate</w:t>
+      </w:r>
+      <w:r>
+        <w:t xml:space="preserve"> </w:t>
+      </w:r>
+      <w:r>
+        <w:t xml:space="preserve">a full-fledged database into a desktop OS intended for everyday use (see</w:t>
+      </w:r>
+      <w:r>
+        <w:t xml:space="preserve"> </w:t>
+      </w:r>
+      <w:r>
+        <w:t xml:space="preserve">“</w:t>
+      </w:r>
+      <w:r>
+        <w:t xml:space="preserve">History</w:t>
+      </w:r>
+      <w:r>
+        <w:t xml:space="preserve">”</w:t>
+      </w:r>
+      <w:r>
+        <w:t xml:space="preserve"> </w:t>
+      </w:r>
+      <w:r>
+        <w:t xml:space="preserve">section below).</w:t>
       </w:r>
     </w:p>
     <w:p>
@@ -267,6 +530,24 @@
         <w:pStyle w:val="Compact"/>
       </w:pPr>
       <w:r>
+        <w:t xml:space="preserve">So an ideal solution should be lightweight and integrate transparently and naturally with the desktop the user knows</w:t>
+      </w:r>
+      <w:r>
+        <w:t xml:space="preserve"> </w:t>
+      </w:r>
+      <w:r>
+        <w:t xml:space="preserve">and operates daily, built on a file system that supports semantic queries or can be extended with minimum overhead.</w:t>
+      </w:r>
+    </w:p>
+    <w:p>
+      <w:pPr>
+        <w:numPr>
+          <w:ilvl w:val="0"/>
+          <w:numId w:val="1003"/>
+        </w:numPr>
+        <w:pStyle w:val="Compact"/>
+      </w:pPr>
+      <w:r>
         <w:t xml:space="preserve">SEN (</w:t>
       </w:r>
       <w:r>
@@ -279,14 +560,38 @@
         <w:t xml:space="preserve">”</w:t>
       </w:r>
       <w:r>
-        <w:t xml:space="preserve">) follows this approach by utilizing and extending the rich infrastructure and API already provided by Haiku, the most prominent open-source descendant of BeOS</w:t>
-      </w:r>
-      <w:r>
-        <w:t xml:space="preserve"> </w:t>
-      </w:r>
-      <w:hyperlink r:id="rId23"/>
-      <w:r>
-        <w:t xml:space="preserve">. Files naturally represent entities, as the type system is based on MIME types, properties of entities are stored in custom filesystem attributes, only relations have been omitted because the original creators of BeOS identified the same fallacies outlined above (the first version of the OS still had a Table and Relations API though).</w:t>
+        <w:t xml:space="preserve">) follows this approach by utilizing and extending the rich infrastructure and API already</w:t>
+      </w:r>
+      <w:r>
+        <w:t xml:space="preserve"> </w:t>
+      </w:r>
+      <w:r>
+        <w:t xml:space="preserve">provided by Haiku, the most prominent open-source descendant of BeOS</w:t>
+      </w:r>
+      <w:r>
+        <w:t xml:space="preserve"> </w:t>
+      </w:r>
+      <w:hyperlink r:id="rId21"/>
+      <w:r>
+        <w:t xml:space="preserve">. Files naturally represent entities, as the</w:t>
+      </w:r>
+      <w:r>
+        <w:t xml:space="preserve"> </w:t>
+      </w:r>
+      <w:r>
+        <w:t xml:space="preserve">type system is based on MIME types, properties of entities are stored in custom filesystem attributes, only relations</w:t>
+      </w:r>
+      <w:r>
+        <w:t xml:space="preserve"> </w:t>
+      </w:r>
+      <w:r>
+        <w:t xml:space="preserve">have been omitted because the original creators of BeOS identified the same fallacies outlined above (the first version</w:t>
+      </w:r>
+      <w:r>
+        <w:t xml:space="preserve"> </w:t>
+      </w:r>
+      <w:r>
+        <w:t xml:space="preserve">of the OS still had a Table and Relations API though).</w:t>
       </w:r>
     </w:p>
     <w:p>
@@ -298,7 +603,13 @@
         <w:pStyle w:val="Compact"/>
       </w:pPr>
       <w:r>
-        <w:t xml:space="preserve">SEN circumvents this by also storing relations in file system attributes, similar to properties, and providing a very thin, message-based API to bridge this extension of the base OS.</w:t>
+        <w:t xml:space="preserve">SEN circumvents this by also storing relations in file system attributes, similar to properties, and providing a very</w:t>
+      </w:r>
+      <w:r>
+        <w:t xml:space="preserve"> </w:t>
+      </w:r>
+      <w:r>
+        <w:t xml:space="preserve">thin, message-based API to bridge this extension of the base OS.</w:t>
       </w:r>
     </w:p>
     <w:p>
@@ -310,7 +621,19 @@
         <w:pStyle w:val="Compact"/>
       </w:pPr>
       <w:r>
-        <w:t xml:space="preserve">For performance, any file that is part of a relation gets a unique and stable identifier (like an object ID), and relations reference this ID in a single custom attribute. Because both the object ID of the source (file) and the relation IDs of the target files are stored in indexed attributes, they can be queried very efficiently.</w:t>
+        <w:t xml:space="preserve">For performance, any file that is part of a relation gets a unique and stable identifier (like an Object ID in a</w:t>
+      </w:r>
+      <w:r>
+        <w:t xml:space="preserve"> </w:t>
+      </w:r>
+      <w:r>
+        <w:t xml:space="preserve">document management system or database), and relations reference this ID in a single custom attribute. Because both the</w:t>
+      </w:r>
+      <w:r>
+        <w:t xml:space="preserve"> </w:t>
+      </w:r>
+      <w:r>
+        <w:t xml:space="preserve">Object ID of the source (file) and the relation IDs of the target files are stored in indexed attributes, they can be queried very efficiently.</w:t>
       </w:r>
     </w:p>
     <w:p>
@@ -322,11 +645,17 @@
         <w:pStyle w:val="Compact"/>
       </w:pPr>
       <w:r>
-        <w:t xml:space="preserve">Relation properties are stored in additional attributes that need not be indexed, as they are retrieved on demand in near real time. They are stored in separate attributes as a map of relation property key/values for each relation.</w:t>
-      </w:r>
-    </w:p>
-    <w:bookmarkEnd w:id="24"/>
-    <w:bookmarkStart w:id="27" w:name="X1d487602dbfc3bea2a485e10ad64f2eff313ae5"/>
+        <w:t xml:space="preserve">Relation properties are stored in additional attributes that need not be indexed, as they are retrieved on demand in near</w:t>
+      </w:r>
+      <w:r>
+        <w:t xml:space="preserve"> </w:t>
+      </w:r>
+      <w:r>
+        <w:t xml:space="preserve">real time. They are stored in separate attributes as a map of relation property key/values for each relation.</w:t>
+      </w:r>
+    </w:p>
+    <w:bookmarkEnd w:id="22"/>
+    <w:bookmarkStart w:id="26" w:name="X1d487602dbfc3bea2a485e10ad64f2eff313ae5"/>
     <w:p>
       <w:pPr>
         <w:pStyle w:val="Heading2"/>
@@ -335,7 +664,7 @@
         <w:t xml:space="preserve">How to Build it: The Pillars of the Proposed Solution</w:t>
       </w:r>
     </w:p>
-    <w:bookmarkStart w:id="25" w:name="design-philosophy-and-core-principles"/>
+    <w:bookmarkStart w:id="23" w:name="design-philosophy-and-core-principles"/>
     <w:p>
       <w:pPr>
         <w:pStyle w:val="Heading3"/>
@@ -348,7 +677,7 @@
       <w:pPr>
         <w:numPr>
           <w:ilvl w:val="0"/>
-          <w:numId w:val="1004"/>
+          <w:numId w:val="1005"/>
         </w:numPr>
         <w:pStyle w:val="Compact"/>
       </w:pPr>
@@ -370,7 +699,7 @@
       <w:pPr>
         <w:numPr>
           <w:ilvl w:val="0"/>
-          <w:numId w:val="1004"/>
+          <w:numId w:val="1005"/>
         </w:numPr>
         <w:pStyle w:val="Compact"/>
       </w:pPr>
@@ -392,7 +721,7 @@
       <w:pPr>
         <w:numPr>
           <w:ilvl w:val="0"/>
-          <w:numId w:val="1004"/>
+          <w:numId w:val="1005"/>
         </w:numPr>
         <w:pStyle w:val="Compact"/>
       </w:pPr>
@@ -414,7 +743,7 @@
       <w:pPr>
         <w:numPr>
           <w:ilvl w:val="0"/>
-          <w:numId w:val="1004"/>
+          <w:numId w:val="1005"/>
         </w:numPr>
         <w:pStyle w:val="Compact"/>
       </w:pPr>
@@ -432,8 +761,8 @@
         <w:t xml:space="preserve">system should be open for extension, but personal data is kept private and does not leave the personal system: extension through plugins (e.g., for extracting attributes and entities from files), for importing data (e.g., ontologies or individual entities from schema.org), and for exchanging data where explicitly requested (linked data between users).</w:t>
       </w:r>
     </w:p>
-    <w:bookmarkEnd w:id="25"/>
-    <w:bookmarkStart w:id="26" w:name="X0c0852df9f5b074af908037b0f0d4b18454c32b"/>
+    <w:bookmarkEnd w:id="23"/>
+    <w:bookmarkStart w:id="24" w:name="X0c0852df9f5b074af908037b0f0d4b18454c32b"/>
     <w:p>
       <w:pPr>
         <w:pStyle w:val="Heading3"/>
@@ -444,230 +773,26 @@
     </w:p>
     <w:p>
       <w:pPr>
-        <w:pStyle w:val="FirstParagraph"/>
-      </w:pPr>
-      <w:r>
-        <w:t xml:space="preserve">-&gt; will be largely rewritten and compacted to focus on current solution and only refer to past or related projects where needed.</w:t>
-      </w:r>
-    </w:p>
-    <w:p>
-      <w:pPr>
-        <w:pStyle w:val="SourceCode"/>
-      </w:pPr>
-      <w:r>
-        <w:rPr>
-          <w:rStyle w:val="VerbatimChar"/>
-        </w:rPr>
-        <w:t xml:space="preserve">* The Role of Metadata in Filesystem Design - From Acorn to UNIX</w:t>
-      </w:r>
-      <w:r>
-        <w:br/>
-      </w:r>
-      <w:r>
-        <w:rPr>
-          <w:rStyle w:val="VerbatimChar"/>
-        </w:rPr>
-        <w:t xml:space="preserve">basic support and OS usage of metadata was already there in the 1990s, cf Amiga FileNotes used in web browser IBrowse for storing originating web site for downloads</w:t>
-      </w:r>
-      <w:r>
-        <w:br/>
-      </w:r>
-      <w:r>
-        <w:rPr>
-          <w:rStyle w:val="VerbatimChar"/>
-        </w:rPr>
-        <w:t xml:space="preserve">* Promising Concepts: Nepomuk and Baloo</w:t>
-      </w:r>
-      <w:r>
-        <w:br/>
-      </w:r>
-      <w:r>
-        <w:rPr>
-          <w:rStyle w:val="VerbatimChar"/>
-        </w:rPr>
-        <w:t xml:space="preserve">* Problems with Current Solutions</w:t>
-      </w:r>
-      <w:r>
-        <w:br/>
-      </w:r>
-      <w:r>
-        <w:rPr>
-          <w:rStyle w:val="VerbatimChar"/>
-        </w:rPr>
-        <w:t xml:space="preserve">    * Falling into the Complexity Trap</w:t>
-      </w:r>
-      <w:r>
-        <w:br/>
-      </w:r>
-      <w:r>
-        <w:rPr>
-          <w:rStyle w:val="VerbatimChar"/>
-        </w:rPr>
-        <w:t xml:space="preserve">        * Applying Semantic Web Standards to the Desktop</w:t>
-      </w:r>
-      <w:r>
-        <w:br/>
-      </w:r>
-      <w:r>
-        <w:rPr>
-          <w:rStyle w:val="VerbatimChar"/>
-        </w:rPr>
-        <w:t xml:space="preserve">        many projects failed because they tried to build the entire complexity of the semantic web for personal knowledgge graphs, which is not really feasible or sustainable, see e.g. https://www.gnu.org/software/gnowsys/</w:t>
-      </w:r>
-      <w:r>
-        <w:br/>
-      </w:r>
-      <w:r>
-        <w:rPr>
-          <w:rStyle w:val="VerbatimChar"/>
-        </w:rPr>
-        <w:t xml:space="preserve">        * Leaky Abstractions: Missing Usability</w:t>
-      </w:r>
-      <w:r>
-        <w:br/>
-      </w:r>
-      <w:r>
-        <w:rPr>
-          <w:rStyle w:val="VerbatimChar"/>
-        </w:rPr>
-        <w:t xml:space="preserve">    * Neglecting the Performance Impact</w:t>
-      </w:r>
-      <w:r>
-        <w:br/>
-      </w:r>
-      <w:r>
-        <w:rPr>
-          <w:rStyle w:val="VerbatimChar"/>
-        </w:rPr>
-        <w:t xml:space="preserve">    * Missing Query Functionality</w:t>
-      </w:r>
-      <w:r>
-        <w:br/>
-      </w:r>
-      <w:r>
-        <w:rPr>
-          <w:rStyle w:val="VerbatimChar"/>
-        </w:rPr>
-        <w:t xml:space="preserve">* BeOS - The First Entity-Based Desktop</w:t>
-      </w:r>
-      <w:r>
-        <w:br/>
-      </w:r>
-      <w:r>
-        <w:rPr>
-          <w:rStyle w:val="VerbatimChar"/>
-        </w:rPr>
-        <w:t xml:space="preserve">    * "GraphOS"</w:t>
-      </w:r>
-      <w:r>
-        <w:br/>
-      </w:r>
-      <w:r>
-        <w:rPr>
-          <w:rStyle w:val="VerbatimChar"/>
-        </w:rPr>
-        <w:t xml:space="preserve">    * Entities, not Files</w:t>
-      </w:r>
-      <w:r>
-        <w:br/>
-      </w:r>
-      <w:r>
-        <w:rPr>
-          <w:rStyle w:val="VerbatimChar"/>
-        </w:rPr>
-        <w:t xml:space="preserve">    * Universal Interoperability through Custom Attributes</w:t>
-      </w:r>
-      <w:r>
-        <w:br/>
-      </w:r>
-      <w:r>
-        <w:rPr>
-          <w:rStyle w:val="VerbatimChar"/>
-        </w:rPr>
-        <w:t xml:space="preserve">    * Metadata Queries</w:t>
-      </w:r>
-      <w:r>
-        <w:br/>
-      </w:r>
-      <w:r>
-        <w:rPr>
-          <w:rStyle w:val="VerbatimChar"/>
-        </w:rPr>
-        <w:t xml:space="preserve">    * already very advanced user-centric, worked well in everyday use, but failed to gain enough traction to survive</w:t>
-      </w:r>
-    </w:p>
-    <w:bookmarkEnd w:id="26"/>
-    <w:bookmarkEnd w:id="27"/>
-    <w:bookmarkStart w:id="48" w:name="X3290e34828dd7663d4aaec316aa67ced6cbb7d6"/>
-    <w:p>
-      <w:pPr>
-        <w:pStyle w:val="Heading2"/>
-      </w:pPr>
-      <w:r>
-        <w:t xml:space="preserve">Introducing SEN - a modern minimalist user-centric approach</w:t>
-      </w:r>
-    </w:p>
-    <w:bookmarkStart w:id="28" w:name="X2b4ec292cff56f8479ccbef6a9920c8b5d9564d"/>
-    <w:p>
-      <w:pPr>
-        <w:pStyle w:val="Heading3"/>
-      </w:pPr>
-      <w:r>
-        <w:t xml:space="preserve">Haiku - the Perfect Prototyping Environment</w:t>
-      </w:r>
-    </w:p>
-    <w:p>
-      <w:pPr>
-        <w:numPr>
-          <w:ilvl w:val="0"/>
-          <w:numId w:val="1005"/>
-        </w:numPr>
-        <w:pStyle w:val="Compact"/>
-      </w:pPr>
-      <w:r>
-        <w:t xml:space="preserve">short description with references</w:t>
-      </w:r>
-    </w:p>
-    <w:p>
-      <w:pPr>
-        <w:numPr>
-          <w:ilvl w:val="0"/>
-          <w:numId w:val="1005"/>
-        </w:numPr>
-        <w:pStyle w:val="Compact"/>
-      </w:pPr>
-      <w:r>
-        <w:t xml:space="preserve">A good introduction to Haiku OS and its still innovative concepts utilised by SEN can be found in (Revol, 2017).</w:t>
-      </w:r>
-    </w:p>
-    <w:p>
-      <w:pPr>
-        <w:numPr>
-          <w:ilvl w:val="1"/>
+        <w:numPr>
+          <w:ilvl w:val="0"/>
           <w:numId w:val="1006"/>
         </w:numPr>
         <w:pStyle w:val="Compact"/>
       </w:pPr>
       <w:r>
-        <w:t xml:space="preserve">(Google, 2007) provides an insightful presentation with the Ex-CEO of Be, Inc., who created BeOS, the original</w:t>
-      </w:r>
-      <w:r>
-        <w:t xml:space="preserve"> </w:t>
-      </w:r>
-      <w:r>
-        <w:t xml:space="preserve">commercial OS created in 1996 after which Haiku is modelled.</w:t>
-      </w:r>
-    </w:p>
-    <w:p>
-      <w:pPr>
-        <w:numPr>
-          <w:ilvl w:val="0"/>
-          <w:numId w:val="1005"/>
-        </w:numPr>
-        <w:pStyle w:val="Compact"/>
-      </w:pPr>
-      <w:r>
-        <w:t xml:space="preserve">components used by SEN:</w:t>
+        <w:t xml:space="preserve">(Sauermann et al., 2009) introduced an innovative concept for a semantic desktop and semantic applications, or even just</w:t>
+      </w:r>
+      <w:r>
+        <w:t xml:space="preserve"> </w:t>
+      </w:r>
+      <w:r>
+        <w:t xml:space="preserve">simple extensions and mashups, enriching existing applications (a concept shared by SEN). It was realized as part of the KDE Linux desktop in the</w:t>
+      </w:r>
+      <w:r>
+        <w:t xml:space="preserve"> </w:t>
+      </w:r>
+      <w:r>
+        <w:t xml:space="preserve">form of NEPOMUK (Bernardi et al., 2011), an ambitious EU funded research project.</w:t>
       </w:r>
     </w:p>
     <w:p>
@@ -679,7 +804,25 @@
         <w:pStyle w:val="Compact"/>
       </w:pPr>
       <w:r>
-        <w:t xml:space="preserve">Tracker</w:t>
+        <w:t xml:space="preserve">Over the course of the project lifetime, however, it quickly became a problem to use a full-fledged database and full-blown</w:t>
+      </w:r>
+      <w:r>
+        <w:t xml:space="preserve"> </w:t>
+      </w:r>
+      <w:r>
+        <w:t xml:space="preserve">standards like RDF even for simple files and metadata, and so a new generation of KDE search was realized (KDE’s Next Generation Semantic Search, 2014):</w:t>
+      </w:r>
+      <w:r>
+        <w:t xml:space="preserve"> </w:t>
+      </w:r>
+      <w:r>
+        <w:t xml:space="preserve">&gt; Instead of having a single RDF-based database for all information, Semantic Search now provides separate data stores</w:t>
+      </w:r>
+      <w:r>
+        <w:t xml:space="preserve"> </w:t>
+      </w:r>
+      <w:r>
+        <w:t xml:space="preserve">&gt; and search interfaces. This allows it to store and search each type of content in an optimal way.</w:t>
       </w:r>
     </w:p>
     <w:p>
@@ -691,19 +834,88 @@
         <w:pStyle w:val="Compact"/>
       </w:pPr>
       <w:r>
-        <w:t xml:space="preserve">FileTypes</w:t>
-      </w:r>
-    </w:p>
-    <w:p>
-      <w:pPr>
-        <w:numPr>
-          <w:ilvl w:val="0"/>
-          <w:numId w:val="1005"/>
-        </w:numPr>
-        <w:pStyle w:val="Compact"/>
-      </w:pPr>
-      <w:r>
-        <w:t xml:space="preserve">mapping SEN concepts</w:t>
+        <w:t xml:space="preserve">The latest incarnation follows a more lightweight and flexible architecture and uses a file indexing and search framework</w:t>
+      </w:r>
+      <w:r>
+        <w:t xml:space="preserve"> </w:t>
+      </w:r>
+      <w:r>
+        <w:t xml:space="preserve">called</w:t>
+      </w:r>
+      <w:r>
+        <w:t xml:space="preserve"> </w:t>
+      </w:r>
+      <w:r>
+        <w:t xml:space="preserve">“</w:t>
+      </w:r>
+      <w:r>
+        <w:t xml:space="preserve">Baloo</w:t>
+      </w:r>
+      <w:r>
+        <w:t xml:space="preserve">”</w:t>
+      </w:r>
+      <w:r>
+        <w:t xml:space="preserve"> </w:t>
+      </w:r>
+      <w:r>
+        <w:t xml:space="preserve">(Baloo - KDE Community Wiki, 2022)</w:t>
+      </w:r>
+      <w:r>
+        <w:t xml:space="preserve"> </w:t>
+      </w:r>
+      <w:r>
+        <w:t xml:space="preserve">“</w:t>
+      </w:r>
+      <w:r>
+        <w:t xml:space="preserve">with a focus on providing a very small memory footprint along with extremely fast searching.</w:t>
+      </w:r>
+      <w:r>
+        <w:t xml:space="preserve">”</w:t>
+      </w:r>
+      <w:r>
+        <w:t xml:space="preserve">,</w:t>
+      </w:r>
+      <w:r>
+        <w:t xml:space="preserve"> </w:t>
+      </w:r>
+      <w:r>
+        <w:t xml:space="preserve">indicating and fixing one of the major obstacles of semantic desktop adoption of previous efforts.</w:t>
+      </w:r>
+    </w:p>
+    <w:p>
+      <w:pPr>
+        <w:numPr>
+          <w:ilvl w:val="0"/>
+          <w:numId w:val="1006"/>
+        </w:numPr>
+        <w:pStyle w:val="Compact"/>
+      </w:pPr>
+      <w:r>
+        <w:t xml:space="preserve">Similar approaches were also tried in mainstream OS’s but failed, e.g., Microsoft’s WinFS (LSoft Technologies Inc., 2022) -</w:t>
+      </w:r>
+      <w:r>
+        <w:t xml:space="preserve"> </w:t>
+      </w:r>
+      <w:r>
+        <w:t xml:space="preserve">see also a critical but insightful discussion in (Orlowski, 2002) by the developers of the more successful and actually</w:t>
+      </w:r>
+      <w:r>
+        <w:t xml:space="preserve"> </w:t>
+      </w:r>
+      <w:r>
+        <w:t xml:space="preserve">fully realised BeOS File System BFS, which is detailed in the next section.</w:t>
+      </w:r>
+    </w:p>
+    <w:p>
+      <w:pPr>
+        <w:numPr>
+          <w:ilvl w:val="0"/>
+          <w:numId w:val="1006"/>
+        </w:numPr>
+        <w:pStyle w:val="Compact"/>
+      </w:pPr>
+      <w:r>
+        <w:t xml:space="preserve">To summarize, problems with current solutions can be roughly divided into the following categories:</w:t>
       </w:r>
     </w:p>
     <w:p>
@@ -715,7 +927,50 @@
         <w:pStyle w:val="Compact"/>
       </w:pPr>
       <w:r>
-        <w:t xml:space="preserve">File types</w:t>
+        <w:rPr>
+          <w:iCs/>
+          <w:i/>
+        </w:rPr>
+        <w:t xml:space="preserve">Falling into the Complexity Trap:</w:t>
+      </w:r>
+      <w:r>
+        <w:t xml:space="preserve"> </w:t>
+      </w:r>
+      <w:r>
+        <w:t xml:space="preserve">requiring users to categorise and connect all their data by hand, or applying the fulls set of</w:t>
+      </w:r>
+      <w:r>
+        <w:t xml:space="preserve"> </w:t>
+      </w:r>
+      <w:r>
+        <w:t xml:space="preserve">semantic web standards to the desktop: many projects failed because they tried to build the entire complexity</w:t>
+      </w:r>
+      <w:r>
+        <w:t xml:space="preserve"> </w:t>
+      </w:r>
+      <w:r>
+        <w:t xml:space="preserve">of the semantic web for personal knowledge graphs, which is not really feasible or sustainable, see e.g. Gnowsys (Nagarjuna, 2013)</w:t>
+      </w:r>
+      <w:r>
+        <w:t xml:space="preserve"> </w:t>
+      </w:r>
+      <w:r>
+        <w:t xml:space="preserve">for an ambitious project that wanted to build a</w:t>
+      </w:r>
+      <w:r>
+        <w:t xml:space="preserve"> </w:t>
+      </w:r>
+      <w:r>
+        <w:t xml:space="preserve">“</w:t>
+      </w:r>
+      <w:r>
+        <w:t xml:space="preserve">A Kernel for Semantic Computing</w:t>
+      </w:r>
+      <w:r>
+        <w:t xml:space="preserve">”</w:t>
+      </w:r>
+      <w:r>
+        <w:t xml:space="preserve">, but is dormant since 2013.</w:t>
       </w:r>
     </w:p>
     <w:p>
@@ -727,7 +982,35 @@
         <w:pStyle w:val="Compact"/>
       </w:pPr>
       <w:r>
-        <w:t xml:space="preserve">Attributes</w:t>
+        <w:rPr>
+          <w:iCs/>
+          <w:i/>
+        </w:rPr>
+        <w:t xml:space="preserve">Leaky Abstractions:</w:t>
+      </w:r>
+      <w:r>
+        <w:t xml:space="preserve"> </w:t>
+      </w:r>
+      <w:r>
+        <w:t xml:space="preserve">by exposing the full breadth of semantic (web) standards and concepts, and requiring familiarity</w:t>
+      </w:r>
+      <w:r>
+        <w:t xml:space="preserve"> </w:t>
+      </w:r>
+      <w:r>
+        <w:t xml:space="preserve">with them, including SPARQL for search, or RDF for storage and manipulation, implicitly targeting expert users and</w:t>
+      </w:r>
+      <w:r>
+        <w:t xml:space="preserve"> </w:t>
+      </w:r>
+      <w:r>
+        <w:t xml:space="preserve">neglecting usability and graphical support, everyday users are left behind, severely hindering widespread adoption</w:t>
+      </w:r>
+      <w:r>
+        <w:t xml:space="preserve"> </w:t>
+      </w:r>
+      <w:r>
+        <w:t xml:space="preserve">and thus market adoption and in turn developer support, which would be needed to extend and integrate applications.</w:t>
       </w:r>
     </w:p>
     <w:p>
@@ -739,6 +1022,392 @@
         <w:pStyle w:val="Compact"/>
       </w:pPr>
       <w:r>
+        <w:rPr>
+          <w:iCs/>
+          <w:i/>
+        </w:rPr>
+        <w:t xml:space="preserve">Neglecting the Performance Impact:</w:t>
+      </w:r>
+      <w:r>
+        <w:t xml:space="preserve"> </w:t>
+      </w:r>
+      <w:r>
+        <w:t xml:space="preserve">as outlined above, previous semantic desktop efforts failed because the resource impact</w:t>
+      </w:r>
+      <w:r>
+        <w:t xml:space="preserve"> </w:t>
+      </w:r>
+      <w:r>
+        <w:t xml:space="preserve">caused by indexing and metadata extraction was simply too high and not deemed worth the effort by many users, because</w:t>
+      </w:r>
+      <w:r>
+        <w:t xml:space="preserve"> </w:t>
+      </w:r>
+      <w:r>
+        <w:t xml:space="preserve">of the other problems mentioned here.</w:t>
+      </w:r>
+    </w:p>
+    <w:p>
+      <w:pPr>
+        <w:numPr>
+          <w:ilvl w:val="1"/>
+          <w:numId w:val="1008"/>
+        </w:numPr>
+        <w:pStyle w:val="Compact"/>
+      </w:pPr>
+      <w:r>
+        <w:rPr>
+          <w:iCs/>
+          <w:i/>
+        </w:rPr>
+        <w:t xml:space="preserve">Missing Query and Navigation Support:</w:t>
+      </w:r>
+      <w:r>
+        <w:t xml:space="preserve"> </w:t>
+      </w:r>
+      <w:r>
+        <w:t xml:space="preserve">semantic desktop solutions should provide additional benefit beyond simple</w:t>
+      </w:r>
+      <w:r>
+        <w:t xml:space="preserve"> </w:t>
+      </w:r>
+      <w:r>
+        <w:t xml:space="preserve">metadata storage to be really useful and accepted by end users. Explicit and implicit relations should be navigable</w:t>
+      </w:r>
+      <w:r>
+        <w:t xml:space="preserve"> </w:t>
+      </w:r>
+      <w:r>
+        <w:t xml:space="preserve">and exposed throughout the system, including supported applications, and powerful search on semantically linked data</w:t>
+      </w:r>
+      <w:r>
+        <w:t xml:space="preserve"> </w:t>
+      </w:r>
+      <w:r>
+        <w:t xml:space="preserve">should be supported in a simple and intuitive way.</w:t>
+      </w:r>
+    </w:p>
+    <w:bookmarkEnd w:id="24"/>
+    <w:bookmarkStart w:id="25" w:name="beos---the-first-semantic-desktop-os"/>
+    <w:p>
+      <w:pPr>
+        <w:pStyle w:val="Heading3"/>
+      </w:pPr>
+      <w:r>
+        <w:t xml:space="preserve">BeOS - The First Semantic Desktop OS</w:t>
+      </w:r>
+    </w:p>
+    <w:p>
+      <w:pPr>
+        <w:numPr>
+          <w:ilvl w:val="0"/>
+          <w:numId w:val="1009"/>
+        </w:numPr>
+        <w:pStyle w:val="Compact"/>
+      </w:pPr>
+      <w:r>
+        <w:t xml:space="preserve">history (Pinheiro, 2020)</w:t>
+      </w:r>
+    </w:p>
+    <w:p>
+      <w:pPr>
+        <w:numPr>
+          <w:ilvl w:val="0"/>
+          <w:numId w:val="1009"/>
+        </w:numPr>
+        <w:pStyle w:val="Compact"/>
+      </w:pPr>
+      <w:r>
+        <w:t xml:space="preserve">Entities, not Files</w:t>
+      </w:r>
+    </w:p>
+    <w:p>
+      <w:pPr>
+        <w:numPr>
+          <w:ilvl w:val="0"/>
+          <w:numId w:val="1009"/>
+        </w:numPr>
+        <w:pStyle w:val="Compact"/>
+      </w:pPr>
+      <w:r>
+        <w:t xml:space="preserve">Universal Interoperability through Custom Attributes - no specialised applications needed for simple CRUD operations</w:t>
+      </w:r>
+    </w:p>
+    <w:p>
+      <w:pPr>
+        <w:numPr>
+          <w:ilvl w:val="0"/>
+          <w:numId w:val="1009"/>
+        </w:numPr>
+        <w:pStyle w:val="Compact"/>
+      </w:pPr>
+      <w:r>
+        <w:t xml:space="preserve">Metadata Queries</w:t>
+      </w:r>
+    </w:p>
+    <w:p>
+      <w:pPr>
+        <w:numPr>
+          <w:ilvl w:val="0"/>
+          <w:numId w:val="1009"/>
+        </w:numPr>
+        <w:pStyle w:val="Compact"/>
+      </w:pPr>
+      <w:r>
+        <w:t xml:space="preserve">already very advanced user-centric, worked well in everyday use, but failed to gain enough traction to survive</w:t>
+      </w:r>
+    </w:p>
+    <w:p>
+      <w:pPr>
+        <w:numPr>
+          <w:ilvl w:val="0"/>
+          <w:numId w:val="1009"/>
+        </w:numPr>
+        <w:pStyle w:val="Compact"/>
+      </w:pPr>
+      <w:r>
+        <w:t xml:space="preserve">rather unknown niche OS, but closest to the</w:t>
+      </w:r>
+      <w:r>
+        <w:t xml:space="preserve"> </w:t>
+      </w:r>
+      <w:r>
+        <w:t xml:space="preserve">“</w:t>
+      </w:r>
+      <w:r>
+        <w:t xml:space="preserve">GraphOS</w:t>
+      </w:r>
+      <w:r>
+        <w:t xml:space="preserve">”</w:t>
+      </w:r>
+      <w:r>
+        <w:t xml:space="preserve"> </w:t>
+      </w:r>
+      <w:r>
+        <w:t xml:space="preserve">outlined in (Alexander Obenauer, 2021), which proposes an</w:t>
+      </w:r>
+      <w:r>
+        <w:t xml:space="preserve"> </w:t>
+      </w:r>
+      <w:r>
+        <w:t xml:space="preserve">“</w:t>
+      </w:r>
+      <w:r>
+        <w:t xml:space="preserve">entity-first</w:t>
+      </w:r>
+      <w:r>
+        <w:t xml:space="preserve">”</w:t>
+      </w:r>
+      <w:r>
+        <w:t xml:space="preserve"> </w:t>
+      </w:r>
+      <w:r>
+        <w:t xml:space="preserve">operating system with related concepts:</w:t>
+      </w:r>
+      <w:r>
+        <w:t xml:space="preserve"> </w:t>
+      </w:r>
+      <w:r>
+        <w:t xml:space="preserve">&gt; In the Graph OS, all of your things are within your system as nodes, or items, within your graph. Emails, calendar events,</w:t>
+      </w:r>
+      <w:r>
+        <w:t xml:space="preserve"> </w:t>
+      </w:r>
+      <w:r>
+        <w:t xml:space="preserve">&gt; articles, web pages, podcast episodes, to do lists as well as the to dos inside them; everything. And each thing may have</w:t>
+      </w:r>
+      <w:r>
+        <w:t xml:space="preserve"> </w:t>
+      </w:r>
+      <w:r>
+        <w:t xml:space="preserve">&gt; references to, or be referenced by, any other thing.</w:t>
+      </w:r>
+    </w:p>
+    <w:bookmarkEnd w:id="25"/>
+    <w:bookmarkEnd w:id="26"/>
+    <w:bookmarkStart w:id="54" w:name="X3290e34828dd7663d4aaec316aa67ced6cbb7d6"/>
+    <w:p>
+      <w:pPr>
+        <w:pStyle w:val="Heading2"/>
+      </w:pPr>
+      <w:r>
+        <w:t xml:space="preserve">Introducing SEN - a modern minimalist user-centric approach</w:t>
+      </w:r>
+    </w:p>
+    <w:p>
+      <w:pPr>
+        <w:numPr>
+          <w:ilvl w:val="0"/>
+          <w:numId w:val="1010"/>
+        </w:numPr>
+        <w:pStyle w:val="Compact"/>
+      </w:pPr>
+      <w:r>
+        <w:t xml:space="preserve">BeOS already supported a lot of use cases for a semantic desktop, as can be seen in the workshop provided in Humdinger, B. (2019)</w:t>
+      </w:r>
+    </w:p>
+    <w:p>
+      <w:pPr>
+        <w:numPr>
+          <w:ilvl w:val="0"/>
+          <w:numId w:val="1010"/>
+        </w:numPr>
+        <w:pStyle w:val="Compact"/>
+      </w:pPr>
+      <w:r>
+        <w:t xml:space="preserve">However, to keep the system and API design simple and efficient, a necessity in the time of its making (late 1990s),</w:t>
+      </w:r>
+      <w:r>
+        <w:t xml:space="preserve"> </w:t>
+      </w:r>
+      <w:r>
+        <w:t xml:space="preserve">the concept of relations was deliberately omitted completely.</w:t>
+      </w:r>
+    </w:p>
+    <w:bookmarkStart w:id="27" w:name="X2b4ec292cff56f8479ccbef6a9920c8b5d9564d"/>
+    <w:p>
+      <w:pPr>
+        <w:pStyle w:val="Heading3"/>
+      </w:pPr>
+      <w:r>
+        <w:t xml:space="preserve">Haiku - the Perfect Prototyping Environment</w:t>
+      </w:r>
+    </w:p>
+    <w:p>
+      <w:pPr>
+        <w:numPr>
+          <w:ilvl w:val="0"/>
+          <w:numId w:val="1011"/>
+        </w:numPr>
+        <w:pStyle w:val="Compact"/>
+      </w:pPr>
+      <w:r>
+        <w:t xml:space="preserve">short description with references</w:t>
+      </w:r>
+    </w:p>
+    <w:p>
+      <w:pPr>
+        <w:numPr>
+          <w:ilvl w:val="0"/>
+          <w:numId w:val="1011"/>
+        </w:numPr>
+        <w:pStyle w:val="Compact"/>
+      </w:pPr>
+      <w:r>
+        <w:t xml:space="preserve">A good introduction to Haiku OS and its still innovative concepts utilised by SEN can be found in (Revol, 2017).</w:t>
+      </w:r>
+    </w:p>
+    <w:p>
+      <w:pPr>
+        <w:numPr>
+          <w:ilvl w:val="0"/>
+          <w:numId w:val="1011"/>
+        </w:numPr>
+        <w:pStyle w:val="Compact"/>
+      </w:pPr>
+      <w:r>
+        <w:t xml:space="preserve">(Google, 2007) provides an insightful presentation with the Ex-CEO of Be, Inc., who created BeOS, the original</w:t>
+      </w:r>
+      <w:r>
+        <w:t xml:space="preserve"> </w:t>
+      </w:r>
+      <w:r>
+        <w:t xml:space="preserve">commercial OS created in 1996 after which Haiku is modelled.</w:t>
+      </w:r>
+    </w:p>
+    <w:p>
+      <w:pPr>
+        <w:numPr>
+          <w:ilvl w:val="0"/>
+          <w:numId w:val="1011"/>
+        </w:numPr>
+        <w:pStyle w:val="Compact"/>
+      </w:pPr>
+      <w:r>
+        <w:t xml:space="preserve">components used by SEN:</w:t>
+      </w:r>
+    </w:p>
+    <w:p>
+      <w:pPr>
+        <w:numPr>
+          <w:ilvl w:val="1"/>
+          <w:numId w:val="1012"/>
+        </w:numPr>
+        <w:pStyle w:val="Compact"/>
+      </w:pPr>
+      <w:r>
+        <w:t xml:space="preserve">Tracker</w:t>
+      </w:r>
+    </w:p>
+    <w:p>
+      <w:pPr>
+        <w:numPr>
+          <w:ilvl w:val="1"/>
+          <w:numId w:val="1012"/>
+        </w:numPr>
+        <w:pStyle w:val="Compact"/>
+      </w:pPr>
+      <w:r>
+        <w:t xml:space="preserve">FileTypes</w:t>
+      </w:r>
+    </w:p>
+    <w:p>
+      <w:pPr>
+        <w:numPr>
+          <w:ilvl w:val="1"/>
+          <w:numId w:val="1012"/>
+        </w:numPr>
+        <w:pStyle w:val="Compact"/>
+      </w:pPr>
+      <w:r>
+        <w:t xml:space="preserve">Filesystem API</w:t>
+      </w:r>
+    </w:p>
+    <w:p>
+      <w:pPr>
+        <w:numPr>
+          <w:ilvl w:val="0"/>
+          <w:numId w:val="1011"/>
+        </w:numPr>
+        <w:pStyle w:val="Compact"/>
+      </w:pPr>
+      <w:r>
+        <w:t xml:space="preserve">mapping SEN concepts</w:t>
+      </w:r>
+    </w:p>
+    <w:p>
+      <w:pPr>
+        <w:numPr>
+          <w:ilvl w:val="1"/>
+          <w:numId w:val="1013"/>
+        </w:numPr>
+        <w:pStyle w:val="Compact"/>
+      </w:pPr>
+      <w:r>
+        <w:t xml:space="preserve">File types</w:t>
+      </w:r>
+    </w:p>
+    <w:p>
+      <w:pPr>
+        <w:numPr>
+          <w:ilvl w:val="1"/>
+          <w:numId w:val="1013"/>
+        </w:numPr>
+        <w:pStyle w:val="Compact"/>
+      </w:pPr>
+      <w:r>
+        <w:t xml:space="preserve">Attributes</w:t>
+      </w:r>
+    </w:p>
+    <w:p>
+      <w:pPr>
+        <w:numPr>
+          <w:ilvl w:val="1"/>
+          <w:numId w:val="1013"/>
+        </w:numPr>
+        <w:pStyle w:val="Compact"/>
+      </w:pPr>
+      <w:r>
         <w:t xml:space="preserve">Queries</w:t>
       </w:r>
     </w:p>
@@ -746,7 +1415,7 @@
       <w:pPr>
         <w:numPr>
           <w:ilvl w:val="0"/>
-          <w:numId w:val="1005"/>
+          <w:numId w:val="1011"/>
         </w:numPr>
         <w:pStyle w:val="Compact"/>
       </w:pPr>
@@ -754,16 +1423,31 @@
         <w:t xml:space="preserve">picks up concepts from BeOS for filesystem based metadata handling and search</w:t>
       </w:r>
     </w:p>
-    <w:p>
-      <w:pPr>
-        <w:numPr>
-          <w:ilvl w:val="0"/>
-          <w:numId w:val="1005"/>
-        </w:numPr>
-        <w:pStyle w:val="Compact"/>
-      </w:pPr>
-      <w:r>
-        <w:t xml:space="preserve">see also (Alexander Obenauer, 2021) for related concepts of a</w:t>
+    <w:bookmarkEnd w:id="27"/>
+    <w:bookmarkStart w:id="32" w:name="basic-architecture"/>
+    <w:p>
+      <w:pPr>
+        <w:pStyle w:val="Heading3"/>
+      </w:pPr>
+      <w:r>
+        <w:t xml:space="preserve">Basic Architecture</w:t>
+      </w:r>
+    </w:p>
+    <w:p>
+      <w:pPr>
+        <w:numPr>
+          <w:ilvl w:val="0"/>
+          <w:numId w:val="1014"/>
+        </w:numPr>
+      </w:pPr>
+      <w:r>
+        <w:t xml:space="preserve">system daemon and core implementation for interacting with file system, integrating with existing OS components, API’s</w:t>
+      </w:r>
+      <w:r>
+        <w:t xml:space="preserve"> </w:t>
+      </w:r>
+      <w:r>
+        <w:t xml:space="preserve">and applications like the file browser</w:t>
       </w:r>
       <w:r>
         <w:t xml:space="preserve"> </w:t>
@@ -772,7 +1456,7 @@
         <w:t xml:space="preserve">“</w:t>
       </w:r>
       <w:r>
-        <w:t xml:space="preserve">GraphOS</w:t>
+        <w:t xml:space="preserve">Tracker</w:t>
       </w:r>
       <w:r>
         <w:t xml:space="preserve">”</w:t>
@@ -781,68 +1465,117 @@
         <w:t xml:space="preserve"> </w:t>
       </w:r>
       <w:r>
-        <w:t xml:space="preserve">that puts entities first</w:t>
-      </w:r>
-    </w:p>
-    <w:bookmarkEnd w:id="28"/>
-    <w:bookmarkStart w:id="29" w:name="basic-architecture"/>
+        <w:t xml:space="preserve">and the desktop search</w:t>
+      </w:r>
+      <w:r>
+        <w:t xml:space="preserve"> </w:t>
+      </w:r>
+      <w:r>
+        <w:t xml:space="preserve">“</w:t>
+      </w:r>
+      <w:r>
+        <w:t xml:space="preserve">Query</w:t>
+      </w:r>
+      <w:r>
+        <w:t xml:space="preserve">”</w:t>
+      </w:r>
+      <w:r>
+        <w:t xml:space="preserve"> </w:t>
+      </w:r>
+      <w:r>
+        <w:t xml:space="preserve">application:</w:t>
+      </w:r>
+      <w:r>
+        <w:t xml:space="preserve"> </w:t>
+      </w:r>
+      <w:r>
+        <w:drawing>
+          <wp:inline>
+            <wp:extent cx="5334000" cy="3192000"/>
+            <wp:effectExtent b="0" l="0" r="0" t="0"/>
+            <wp:docPr descr="SEN-Haiku Integration" title="simple overview on integration of SEN into Haiku" id="29" name="Picture"/>
+            <a:graphic>
+              <a:graphicData uri="http://schemas.openxmlformats.org/drawingml/2006/picture">
+                <pic:pic>
+                  <pic:nvPicPr>
+                    <pic:cNvPr descr="images/sen-os-app-integration.svg" id="30" name="Picture"/>
+                    <pic:cNvPicPr>
+                      <a:picLocks noChangeArrowheads="1" noChangeAspect="1"/>
+                    </pic:cNvPicPr>
+                  </pic:nvPicPr>
+                  <pic:blipFill>
+                    <a:blip r:embed="rId31">
+                      <a:extLst>
+                        <a:ext uri="{28A0092B-C50C-407E-A947-70E740481C1C}">
+                          <a14:useLocalDpi xmlns:a14="http://schemas.microsoft.com/office/drawing/2010/main" val="0"/>
+                        </a:ext>
+                        <a:ext uri="{96DAC541-7B7A-43D3-8B79-37D633B846F1}">
+                          <asvg:svgBlip xmlns:asvg="http://schemas.microsoft.com/office/drawing/2016/SVG/main" r:embed="rId28"/>
+                        </a:ext>
+                      </a:extLst>
+                    </a:blip>
+                    <a:stretch>
+                      <a:fillRect/>
+                    </a:stretch>
+                  </pic:blipFill>
+                  <pic:spPr bwMode="auto">
+                    <a:xfrm>
+                      <a:off x="0" y="0"/>
+                      <a:ext cx="5334000" cy="3192000"/>
+                    </a:xfrm>
+                    <a:prstGeom prst="rect">
+                      <a:avLst/>
+                    </a:prstGeom>
+                    <a:noFill/>
+                    <a:ln w="9525">
+                      <a:noFill/>
+                      <a:headEnd/>
+                      <a:tailEnd/>
+                    </a:ln>
+                  </pic:spPr>
+                </pic:pic>
+              </a:graphicData>
+            </a:graphic>
+          </wp:inline>
+        </w:drawing>
+      </w:r>
+    </w:p>
+    <w:p>
+      <w:pPr>
+        <w:numPr>
+          <w:ilvl w:val="0"/>
+          <w:numId w:val="1014"/>
+        </w:numPr>
+      </w:pPr>
+      <w:r>
+        <w:t xml:space="preserve">thin message-based API for integrating with applications including the standard file browser (called</w:t>
+      </w:r>
+      <w:r>
+        <w:t xml:space="preserve"> </w:t>
+      </w:r>
+      <w:r>
+        <w:t xml:space="preserve">“</w:t>
+      </w:r>
+      <w:r>
+        <w:t xml:space="preserve">Tracker</w:t>
+      </w:r>
+      <w:r>
+        <w:t xml:space="preserve">”</w:t>
+      </w:r>
+      <w:r>
+        <w:t xml:space="preserve"> </w:t>
+      </w:r>
+      <w:r>
+        <w:t xml:space="preserve">in Haiku)</w:t>
+      </w:r>
+    </w:p>
+    <w:bookmarkEnd w:id="32"/>
+    <w:bookmarkStart w:id="33" w:name="relations---the-missing-link"/>
     <w:p>
       <w:pPr>
         <w:pStyle w:val="Heading3"/>
       </w:pPr>
       <w:r>
-        <w:t xml:space="preserve">Basic Architecture</w:t>
-      </w:r>
-    </w:p>
-    <w:p>
-      <w:pPr>
-        <w:numPr>
-          <w:ilvl w:val="0"/>
-          <w:numId w:val="1009"/>
-        </w:numPr>
-        <w:pStyle w:val="Compact"/>
-      </w:pPr>
-      <w:r>
-        <w:t xml:space="preserve">system daemon and core implementation for interacting with file system</w:t>
-      </w:r>
-    </w:p>
-    <w:p>
-      <w:pPr>
-        <w:numPr>
-          <w:ilvl w:val="0"/>
-          <w:numId w:val="1009"/>
-        </w:numPr>
-        <w:pStyle w:val="Compact"/>
-      </w:pPr>
-      <w:r>
-        <w:t xml:space="preserve">thin message-based API for integrating with applications including the standard file browser (called</w:t>
-      </w:r>
-      <w:r>
-        <w:t xml:space="preserve"> </w:t>
-      </w:r>
-      <w:r>
-        <w:t xml:space="preserve">“</w:t>
-      </w:r>
-      <w:r>
-        <w:t xml:space="preserve">Tracker</w:t>
-      </w:r>
-      <w:r>
-        <w:t xml:space="preserve">”</w:t>
-      </w:r>
-      <w:r>
-        <w:t xml:space="preserve"> </w:t>
-      </w:r>
-      <w:r>
-        <w:t xml:space="preserve">in Haiku)</w:t>
-      </w:r>
-    </w:p>
-    <w:bookmarkEnd w:id="29"/>
-    <w:bookmarkStart w:id="30" w:name="relations---the-missing-link"/>
-    <w:p>
-      <w:pPr>
-        <w:pStyle w:val="Heading3"/>
-      </w:pPr>
-      <w:r>
         <w:t xml:space="preserve">Relations - the missing Link</w:t>
       </w:r>
     </w:p>
@@ -850,7 +1583,7 @@
       <w:pPr>
         <w:numPr>
           <w:ilvl w:val="0"/>
-          <w:numId w:val="1010"/>
+          <w:numId w:val="1015"/>
         </w:numPr>
         <w:pStyle w:val="Compact"/>
       </w:pPr>
@@ -862,7 +1595,7 @@
       <w:pPr>
         <w:numPr>
           <w:ilvl w:val="1"/>
-          <w:numId w:val="1011"/>
+          <w:numId w:val="1016"/>
         </w:numPr>
         <w:pStyle w:val="Compact"/>
       </w:pPr>
@@ -873,14 +1606,14 @@
         <w:t xml:space="preserve">SEN_ID</w:t>
       </w:r>
       <w:r>
-        <w:t xml:space="preserve">: unique ID (like an Object ID in document storage systems), simplified as small numbers below, but is really a UUID.</w:t>
+        <w:t xml:space="preserve">: a unique ID (like an Object ID in document storage systems), simplified as small numbers below, but is really a UUID (dashes could be omitted for compactness).</w:t>
       </w:r>
     </w:p>
     <w:p>
       <w:pPr>
         <w:numPr>
           <w:ilvl w:val="1"/>
-          <w:numId w:val="1011"/>
+          <w:numId w:val="1016"/>
         </w:numPr>
         <w:pStyle w:val="Compact"/>
       </w:pPr>
@@ -898,7 +1631,7 @@
       <w:pPr>
         <w:numPr>
           <w:ilvl w:val="1"/>
-          <w:numId w:val="1011"/>
+          <w:numId w:val="1016"/>
         </w:numPr>
         <w:pStyle w:val="Compact"/>
       </w:pPr>
@@ -963,8 +1696,8 @@
         <w:t xml:space="preserve">type in Haiku)</w:t>
       </w:r>
     </w:p>
-    <w:bookmarkEnd w:id="30"/>
-    <w:bookmarkStart w:id="31" w:name="queries---resolving-relations"/>
+    <w:bookmarkEnd w:id="33"/>
+    <w:bookmarkStart w:id="34" w:name="queries---resolving-relations"/>
     <w:p>
       <w:pPr>
         <w:pStyle w:val="Heading3"/>
@@ -977,7 +1710,7 @@
       <w:pPr>
         <w:numPr>
           <w:ilvl w:val="0"/>
-          <w:numId w:val="1012"/>
+          <w:numId w:val="1017"/>
         </w:numPr>
         <w:pStyle w:val="Compact"/>
       </w:pPr>
@@ -1025,7 +1758,7 @@
       <w:pPr>
         <w:numPr>
           <w:ilvl w:val="1"/>
-          <w:numId w:val="1013"/>
+          <w:numId w:val="1018"/>
         </w:numPr>
         <w:pStyle w:val="Compact"/>
       </w:pPr>
@@ -1118,7 +1851,7 @@
       <w:pPr>
         <w:numPr>
           <w:ilvl w:val="0"/>
-          <w:numId w:val="1012"/>
+          <w:numId w:val="1017"/>
         </w:numPr>
         <w:pStyle w:val="Compact"/>
       </w:pPr>
@@ -1136,7 +1869,7 @@
       <w:pPr>
         <w:numPr>
           <w:ilvl w:val="0"/>
-          <w:numId w:val="1012"/>
+          <w:numId w:val="1017"/>
         </w:numPr>
         <w:pStyle w:val="Compact"/>
       </w:pPr>
@@ -1148,7 +1881,7 @@
       <w:pPr>
         <w:numPr>
           <w:ilvl w:val="1"/>
-          <w:numId w:val="1014"/>
+          <w:numId w:val="1019"/>
         </w:numPr>
         <w:pStyle w:val="Compact"/>
       </w:pPr>
@@ -1196,7 +1929,7 @@
       <w:pPr>
         <w:numPr>
           <w:ilvl w:val="1"/>
-          <w:numId w:val="1014"/>
+          <w:numId w:val="1019"/>
         </w:numPr>
         <w:pStyle w:val="Compact"/>
       </w:pPr>
@@ -1234,21 +1967,21 @@
         <w:t xml:space="preserve">efficient naming scheme and structure for attribute values, as detailed below).</w:t>
       </w:r>
     </w:p>
-    <w:bookmarkEnd w:id="31"/>
-    <w:bookmarkStart w:id="32" w:name="X30d304d418c3d877584cf7cfe38b0da65396fcb"/>
+    <w:bookmarkEnd w:id="34"/>
+    <w:bookmarkStart w:id="38" w:name="X184f3310ddaf22c0c8c2996a143d967cfebb1e6"/>
     <w:p>
       <w:pPr>
         <w:pStyle w:val="Heading3"/>
       </w:pPr>
       <w:r>
-        <w:t xml:space="preserve">Mapping SEN’s conceptual model to OS and desktop concepts</w:t>
-      </w:r>
-    </w:p>
-    <w:p>
-      <w:pPr>
-        <w:numPr>
-          <w:ilvl w:val="0"/>
-          <w:numId w:val="1015"/>
+        <w:t xml:space="preserve">Mapping the conceptual model of SEN to OS and desktop concepts</w:t>
+      </w:r>
+    </w:p>
+    <w:p>
+      <w:pPr>
+        <w:numPr>
+          <w:ilvl w:val="0"/>
+          <w:numId w:val="1020"/>
         </w:numPr>
         <w:pStyle w:val="Compact"/>
       </w:pPr>
@@ -1266,7 +1999,7 @@
       <w:pPr>
         <w:numPr>
           <w:ilvl w:val="0"/>
-          <w:numId w:val="1015"/>
+          <w:numId w:val="1020"/>
         </w:numPr>
         <w:pStyle w:val="Compact"/>
       </w:pPr>
@@ -1288,7 +2021,7 @@
       <w:pPr>
         <w:numPr>
           <w:ilvl w:val="1"/>
-          <w:numId w:val="1016"/>
+          <w:numId w:val="1021"/>
         </w:numPr>
         <w:pStyle w:val="Compact"/>
       </w:pPr>
@@ -1326,7 +2059,7 @@
       <w:pPr>
         <w:numPr>
           <w:ilvl w:val="2"/>
-          <w:numId w:val="1017"/>
+          <w:numId w:val="1022"/>
         </w:numPr>
         <w:pStyle w:val="Compact"/>
       </w:pPr>
@@ -1359,7 +2092,7 @@
       <w:pPr>
         <w:numPr>
           <w:ilvl w:val="2"/>
-          <w:numId w:val="1017"/>
+          <w:numId w:val="1022"/>
         </w:numPr>
         <w:pStyle w:val="Compact"/>
       </w:pPr>
@@ -1377,7 +2110,7 @@
       <w:pPr>
         <w:numPr>
           <w:ilvl w:val="2"/>
-          <w:numId w:val="1017"/>
+          <w:numId w:val="1022"/>
         </w:numPr>
         <w:pStyle w:val="Compact"/>
       </w:pPr>
@@ -1395,7 +2128,7 @@
       <w:pPr>
         <w:numPr>
           <w:ilvl w:val="2"/>
-          <w:numId w:val="1017"/>
+          <w:numId w:val="1022"/>
         </w:numPr>
         <w:pStyle w:val="Compact"/>
       </w:pPr>
@@ -1413,7 +2146,7 @@
       <w:pPr>
         <w:numPr>
           <w:ilvl w:val="2"/>
-          <w:numId w:val="1017"/>
+          <w:numId w:val="1022"/>
         </w:numPr>
         <w:pStyle w:val="Compact"/>
       </w:pPr>
@@ -1431,7 +2164,7 @@
       <w:pPr>
         <w:numPr>
           <w:ilvl w:val="2"/>
-          <w:numId w:val="1017"/>
+          <w:numId w:val="1022"/>
         </w:numPr>
         <w:pStyle w:val="Compact"/>
       </w:pPr>
@@ -1464,7 +2197,7 @@
       <w:pPr>
         <w:numPr>
           <w:ilvl w:val="1"/>
-          <w:numId w:val="1016"/>
+          <w:numId w:val="1021"/>
         </w:numPr>
         <w:pStyle w:val="Compact"/>
       </w:pPr>
@@ -1503,20 +2236,282 @@
     <w:p>
       <w:pPr>
         <w:numPr>
-          <w:ilvl w:val="0"/>
-          <w:numId w:val="1015"/>
-        </w:numPr>
-        <w:pStyle w:val="Compact"/>
-      </w:pPr>
-      <w:r>
-        <w:t xml:space="preserve">SEN provides an API to filter suitable relations based on the source file type and relation configuration.</w:t>
-      </w:r>
-    </w:p>
-    <w:p>
-      <w:pPr>
-        <w:numPr>
-          <w:ilvl w:val="0"/>
-          <w:numId w:val="1015"/>
+          <w:ilvl w:val="1"/>
+          <w:numId w:val="1021"/>
+        </w:numPr>
+        <w:pStyle w:val="Compact"/>
+      </w:pPr>
+      <w:r>
+        <w:t xml:space="preserve">a formal</w:t>
+      </w:r>
+      <w:r>
+        <w:t xml:space="preserve"> </w:t>
+      </w:r>
+      <w:r>
+        <w:rPr>
+          <w:iCs/>
+          <w:i/>
+        </w:rPr>
+        <w:t xml:space="preserve">Schema</w:t>
+      </w:r>
+      <w:r>
+        <w:t xml:space="preserve"> </w:t>
+      </w:r>
+      <w:r>
+        <w:t xml:space="preserve">is deliberately not endorsed to keep the system practical and approachable for non-expert users,</w:t>
+      </w:r>
+      <w:r>
+        <w:t xml:space="preserve"> </w:t>
+      </w:r>
+      <w:r>
+        <w:t xml:space="preserve">who might not be familiar with semantic concepts. SEN tries to lower the barrier to entry and bring semantics to the</w:t>
+      </w:r>
+      <w:r>
+        <w:t xml:space="preserve"> </w:t>
+      </w:r>
+      <w:r>
+        <w:t xml:space="preserve">average desktop user. However,</w:t>
+      </w:r>
+      <w:r>
+        <w:t xml:space="preserve"> </w:t>
+      </w:r>
+      <w:r>
+        <w:rPr>
+          <w:iCs/>
+          <w:i/>
+        </w:rPr>
+        <w:t xml:space="preserve">Relations</w:t>
+      </w:r>
+      <w:r>
+        <w:t xml:space="preserve"> </w:t>
+      </w:r>
+      <w:r>
+        <w:t xml:space="preserve">and</w:t>
+      </w:r>
+      <w:r>
+        <w:t xml:space="preserve"> </w:t>
+      </w:r>
+      <w:r>
+        <w:rPr>
+          <w:iCs/>
+          <w:i/>
+        </w:rPr>
+        <w:t xml:space="preserve">FileTypes</w:t>
+      </w:r>
+      <w:r>
+        <w:t xml:space="preserve"> </w:t>
+      </w:r>
+      <w:r>
+        <w:t xml:space="preserve">may be defined by more advanced users and even bundled with SEN,</w:t>
+      </w:r>
+      <w:r>
+        <w:t xml:space="preserve"> </w:t>
+      </w:r>
+      <w:r>
+        <w:t xml:space="preserve">sot hat reuse, exchange and interoperability is maximized. E.g., as mentioned above, file types should use standard</w:t>
+      </w:r>
+      <w:r>
+        <w:t xml:space="preserve"> </w:t>
+      </w:r>
+      <w:r>
+        <w:rPr>
+          <w:iCs/>
+          <w:i/>
+        </w:rPr>
+        <w:t xml:space="preserve">MIME</w:t>
+      </w:r>
+      <w:r>
+        <w:t xml:space="preserve"> </w:t>
+      </w:r>
+      <w:r>
+        <w:t xml:space="preserve">types, and file attributes used for properties, as well as relation names and attributes, should stick to</w:t>
+      </w:r>
+      <w:r>
+        <w:t xml:space="preserve"> </w:t>
+      </w:r>
+      <w:r>
+        <w:t xml:space="preserve">established standards like (schema.org, 2022) or Wikidata (Wikidata, 2019), including their syntax and semantics,</w:t>
+      </w:r>
+      <w:r>
+        <w:t xml:space="preserve"> </w:t>
+      </w:r>
+      <w:r>
+        <w:t xml:space="preserve">as far as possible, so they can be interpreted in a common way by plugins (such as</w:t>
+      </w:r>
+      <w:r>
+        <w:t xml:space="preserve"> </w:t>
+      </w:r>
+      <w:r>
+        <w:rPr>
+          <w:rStyle w:val="VerbatimChar"/>
+        </w:rPr>
+        <w:t xml:space="preserve">Extractors</w:t>
+      </w:r>
+      <w:r>
+        <w:t xml:space="preserve"> </w:t>
+      </w:r>
+      <w:r>
+        <w:t xml:space="preserve">XXX, which can then</w:t>
+      </w:r>
+      <w:r>
+        <w:t xml:space="preserve"> </w:t>
+      </w:r>
+      <w:r>
+        <w:t xml:space="preserve">use common attribute names to store extracted information, which can then be easily picked up by other SEN services</w:t>
+      </w:r>
+      <w:r>
+        <w:t xml:space="preserve"> </w:t>
+      </w:r>
+      <w:r>
+        <w:t xml:space="preserve">or applications), and</w:t>
+      </w:r>
+      <w:r>
+        <w:t xml:space="preserve"> </w:t>
+      </w:r>
+      <w:r>
+        <w:rPr>
+          <w:rStyle w:val="VerbatimChar"/>
+        </w:rPr>
+        <w:t xml:space="preserve">RelationHelpers</w:t>
+      </w:r>
+      <w:r>
+        <w:t xml:space="preserve">, which can then rely on common attributes for navigation and highlighting.</w:t>
+      </w:r>
+    </w:p>
+    <w:p>
+      <w:pPr>
+        <w:numPr>
+          <w:ilvl w:val="1"/>
+          <w:numId w:val="1021"/>
+        </w:numPr>
+        <w:pStyle w:val="Compact"/>
+      </w:pPr>
+      <w:r>
+        <w:t xml:space="preserve">E.g.,</w:t>
+      </w:r>
+      <w:r>
+        <w:t xml:space="preserve"> </w:t>
+      </w:r>
+      <w:hyperlink r:id="rId35">
+        <w:r>
+          <w:rPr>
+            <w:rStyle w:val="Hyperlink"/>
+          </w:rPr>
+          <w:t xml:space="preserve">Book</w:t>
+        </w:r>
+      </w:hyperlink>
+      <w:r>
+        <w:t xml:space="preserve"> </w:t>
+      </w:r>
+      <w:r>
+        <w:t xml:space="preserve">should be used as a reference for Book entities in SEN. The well-defined attribute</w:t>
+      </w:r>
+      <w:r>
+        <w:t xml:space="preserve"> </w:t>
+      </w:r>
+      <w:r>
+        <w:rPr>
+          <w:rStyle w:val="VerbatimChar"/>
+        </w:rPr>
+        <w:t xml:space="preserve">keywords</w:t>
+      </w:r>
+      <w:r>
+        <w:t xml:space="preserve"> </w:t>
+      </w:r>
+      <w:r>
+        <w:t xml:space="preserve">can then be used by</w:t>
+      </w:r>
+      <w:r>
+        <w:t xml:space="preserve"> </w:t>
+      </w:r>
+      <w:r>
+        <w:rPr>
+          <w:rStyle w:val="VerbatimChar"/>
+        </w:rPr>
+        <w:t xml:space="preserve">Extractor</w:t>
+      </w:r>
+      <w:r>
+        <w:t xml:space="preserve"> </w:t>
+      </w:r>
+      <w:r>
+        <w:t xml:space="preserve">plugins to store tags and keywords extracted from documents, and the</w:t>
+      </w:r>
+      <w:r>
+        <w:t xml:space="preserve"> </w:t>
+      </w:r>
+      <w:r>
+        <w:t xml:space="preserve">standard</w:t>
+      </w:r>
+      <w:r>
+        <w:t xml:space="preserve"> </w:t>
+      </w:r>
+      <w:hyperlink r:id="rId36">
+        <w:r>
+          <w:rPr>
+            <w:rStyle w:val="Hyperlink"/>
+          </w:rPr>
+          <w:t xml:space="preserve">startOffset</w:t>
+        </w:r>
+      </w:hyperlink>
+      <w:r>
+        <w:t xml:space="preserve"> </w:t>
+      </w:r>
+      <w:r>
+        <w:t xml:space="preserve">attribute is used for navigating to a specific position.</w:t>
+      </w:r>
+    </w:p>
+    <w:p>
+      <w:pPr>
+        <w:numPr>
+          <w:ilvl w:val="1"/>
+          <w:numId w:val="1021"/>
+        </w:numPr>
+        <w:pStyle w:val="Compact"/>
+      </w:pPr>
+      <w:r>
+        <w:t xml:space="preserve">Schema.org defines a set of</w:t>
+      </w:r>
+      <w:r>
+        <w:t xml:space="preserve"> </w:t>
+      </w:r>
+      <w:hyperlink r:id="rId37">
+        <w:r>
+          <w:rPr>
+            <w:rStyle w:val="Hyperlink"/>
+          </w:rPr>
+          <w:t xml:space="preserve">standard properties</w:t>
+        </w:r>
+      </w:hyperlink>
+      <w:r>
+        <w:t xml:space="preserve"> </w:t>
+      </w:r>
+      <w:r>
+        <w:t xml:space="preserve">that SEN tries to adhere to.</w:t>
+      </w:r>
+    </w:p>
+    <w:p>
+      <w:pPr>
+        <w:numPr>
+          <w:ilvl w:val="0"/>
+          <w:numId w:val="1020"/>
+        </w:numPr>
+        <w:pStyle w:val="Compact"/>
+      </w:pPr>
+      <w:r>
+        <w:t xml:space="preserve">for internal use, but also for interaction with desktop applications, SEN provides an API to filter suitable relations</w:t>
+      </w:r>
+      <w:r>
+        <w:t xml:space="preserve"> </w:t>
+      </w:r>
+      <w:r>
+        <w:t xml:space="preserve">based on the source file type and relation configuration.</w:t>
+      </w:r>
+    </w:p>
+    <w:p>
+      <w:pPr>
+        <w:numPr>
+          <w:ilvl w:val="0"/>
+          <w:numId w:val="1020"/>
         </w:numPr>
         <w:pStyle w:val="Compact"/>
       </w:pPr>
@@ -1534,7 +2529,7 @@
       <w:pPr>
         <w:numPr>
           <w:ilvl w:val="1"/>
-          <w:numId w:val="1018"/>
+          <w:numId w:val="1023"/>
         </w:numPr>
         <w:pStyle w:val="Compact"/>
       </w:pPr>
@@ -1552,7 +2547,7 @@
       <w:pPr>
         <w:numPr>
           <w:ilvl w:val="1"/>
-          <w:numId w:val="1018"/>
+          <w:numId w:val="1023"/>
         </w:numPr>
         <w:pStyle w:val="Compact"/>
       </w:pPr>
@@ -1564,7 +2559,7 @@
       <w:pPr>
         <w:numPr>
           <w:ilvl w:val="2"/>
-          <w:numId w:val="1019"/>
+          <w:numId w:val="1024"/>
         </w:numPr>
         <w:pStyle w:val="Compact"/>
       </w:pPr>
@@ -1576,7 +2571,7 @@
       <w:pPr>
         <w:numPr>
           <w:ilvl w:val="2"/>
-          <w:numId w:val="1019"/>
+          <w:numId w:val="1024"/>
         </w:numPr>
         <w:pStyle w:val="Compact"/>
       </w:pPr>
@@ -1584,8 +2579,8 @@
         <w:t xml:space="preserve">references to other text files, people, locations, concepts or media sources (like books, movies, or songs).</w:t>
       </w:r>
     </w:p>
-    <w:bookmarkEnd w:id="32"/>
-    <w:bookmarkStart w:id="37" w:name="example-pkg-books-authors-and-publishers"/>
+    <w:bookmarkEnd w:id="38"/>
+    <w:bookmarkStart w:id="43" w:name="example-pkg-books-authors-and-publishers"/>
     <w:p>
       <w:pPr>
         <w:pStyle w:val="Heading3"/>
@@ -1598,7 +2593,7 @@
       <w:pPr>
         <w:numPr>
           <w:ilvl w:val="0"/>
-          <w:numId w:val="1020"/>
+          <w:numId w:val="1025"/>
         </w:numPr>
         <w:pStyle w:val="Compact"/>
       </w:pPr>
@@ -1649,7 +2644,7 @@
       <w:pPr>
         <w:numPr>
           <w:ilvl w:val="0"/>
-          <w:numId w:val="1020"/>
+          <w:numId w:val="1025"/>
         </w:numPr>
         <w:pStyle w:val="Compact"/>
       </w:pPr>
@@ -1722,7 +2717,7 @@
       <w:pPr>
         <w:numPr>
           <w:ilvl w:val="0"/>
-          <w:numId w:val="1020"/>
+          <w:numId w:val="1025"/>
         </w:numPr>
         <w:pStyle w:val="Compact"/>
       </w:pPr>
@@ -1734,7 +2729,7 @@
       <w:pPr>
         <w:numPr>
           <w:ilvl w:val="0"/>
-          <w:numId w:val="1020"/>
+          <w:numId w:val="1025"/>
         </w:numPr>
         <w:pStyle w:val="Compact"/>
       </w:pPr>
@@ -1752,7 +2747,7 @@
       <w:pPr>
         <w:numPr>
           <w:ilvl w:val="1"/>
-          <w:numId w:val="1021"/>
+          <w:numId w:val="1026"/>
         </w:numPr>
         <w:pStyle w:val="Compact"/>
       </w:pPr>
@@ -1776,7 +2771,7 @@
       <w:pPr>
         <w:numPr>
           <w:ilvl w:val="1"/>
-          <w:numId w:val="1021"/>
+          <w:numId w:val="1026"/>
         </w:numPr>
         <w:pStyle w:val="Compact"/>
       </w:pPr>
@@ -1806,7 +2801,7 @@
       <w:pPr>
         <w:numPr>
           <w:ilvl w:val="1"/>
-          <w:numId w:val="1021"/>
+          <w:numId w:val="1026"/>
         </w:numPr>
         <w:pStyle w:val="Compact"/>
       </w:pPr>
@@ -1844,24 +2839,24 @@
           <wp:inline>
             <wp:extent cx="5334000" cy="2770203"/>
             <wp:effectExtent b="0" l="0" r="0" t="0"/>
-            <wp:docPr descr="Book Graph" title="a simple authoring graph" id="34" name="Picture"/>
+            <wp:docPr descr="Book Graph" title="a simple authoring graph" id="40" name="Picture"/>
             <a:graphic>
               <a:graphicData uri="http://schemas.openxmlformats.org/drawingml/2006/picture">
                 <pic:pic>
                   <pic:nvPicPr>
-                    <pic:cNvPr descr="images/book-graph.svg" id="35" name="Picture"/>
+                    <pic:cNvPr descr="images/book-graph.svg" id="41" name="Picture"/>
                     <pic:cNvPicPr>
                       <a:picLocks noChangeArrowheads="1" noChangeAspect="1"/>
                     </pic:cNvPicPr>
                   </pic:nvPicPr>
                   <pic:blipFill>
-                    <a:blip r:embed="rId36">
+                    <a:blip r:embed="rId42">
                       <a:extLst>
                         <a:ext uri="{28A0092B-C50C-407E-A947-70E740481C1C}">
                           <a14:useLocalDpi xmlns:a14="http://schemas.microsoft.com/office/drawing/2010/main" val="0"/>
                         </a:ext>
                         <a:ext uri="{96DAC541-7B7A-43D3-8B79-37D633B846F1}">
-                          <asvg:svgBlip xmlns:asvg="http://schemas.microsoft.com/office/drawing/2016/SVG/main" r:embed="rId33"/>
+                          <asvg:svgBlip xmlns:asvg="http://schemas.microsoft.com/office/drawing/2016/SVG/main" r:embed="rId39"/>
                         </a:ext>
                       </a:extLst>
                     </a:blip>
@@ -1903,7 +2898,7 @@
       <w:pPr>
         <w:numPr>
           <w:ilvl w:val="0"/>
-          <w:numId w:val="1022"/>
+          <w:numId w:val="1027"/>
         </w:numPr>
         <w:pStyle w:val="Compact"/>
       </w:pPr>
@@ -1930,7 +2925,7 @@
       <w:pPr>
         <w:numPr>
           <w:ilvl w:val="0"/>
-          <w:numId w:val="1022"/>
+          <w:numId w:val="1027"/>
         </w:numPr>
         <w:pStyle w:val="Compact"/>
       </w:pPr>
@@ -1985,7 +2980,7 @@
       <w:pPr>
         <w:numPr>
           <w:ilvl w:val="0"/>
-          <w:numId w:val="1022"/>
+          <w:numId w:val="1027"/>
         </w:numPr>
         <w:pStyle w:val="Compact"/>
       </w:pPr>
@@ -2201,7 +3196,7 @@
       <w:pPr>
         <w:numPr>
           <w:ilvl w:val="0"/>
-          <w:numId w:val="1023"/>
+          <w:numId w:val="1028"/>
         </w:numPr>
         <w:pStyle w:val="Compact"/>
       </w:pPr>
@@ -2414,7 +3409,7 @@
       <w:pPr>
         <w:numPr>
           <w:ilvl w:val="0"/>
-          <w:numId w:val="1024"/>
+          <w:numId w:val="1029"/>
         </w:numPr>
         <w:pStyle w:val="Compact"/>
       </w:pPr>
@@ -2807,8 +3802,8 @@
         </w:tc>
       </w:tr>
     </w:tbl>
-    <w:bookmarkEnd w:id="37"/>
-    <w:bookmarkStart w:id="42" w:name="example-notes-and-annotations"/>
+    <w:bookmarkEnd w:id="43"/>
+    <w:bookmarkStart w:id="48" w:name="example-notes-and-annotations"/>
     <w:p>
       <w:pPr>
         <w:pStyle w:val="Heading3"/>
@@ -2821,7 +3816,7 @@
       <w:pPr>
         <w:numPr>
           <w:ilvl w:val="0"/>
-          <w:numId w:val="1025"/>
+          <w:numId w:val="1030"/>
         </w:numPr>
         <w:pStyle w:val="Compact"/>
       </w:pPr>
@@ -2854,24 +3849,24 @@
           <wp:inline>
             <wp:extent cx="5334000" cy="2760728"/>
             <wp:effectExtent b="0" l="0" r="0" t="0"/>
-            <wp:docPr descr="Notes Graph" title="notes and annotations" id="39" name="Picture"/>
+            <wp:docPr descr="Notes Graph" title="notes and annotations" id="45" name="Picture"/>
             <a:graphic>
               <a:graphicData uri="http://schemas.openxmlformats.org/drawingml/2006/picture">
                 <pic:pic>
                   <pic:nvPicPr>
-                    <pic:cNvPr descr="images/text-annotation.svg" id="40" name="Picture"/>
+                    <pic:cNvPr descr="images/text-annotation.svg" id="46" name="Picture"/>
                     <pic:cNvPicPr>
                       <a:picLocks noChangeArrowheads="1" noChangeAspect="1"/>
                     </pic:cNvPicPr>
                   </pic:nvPicPr>
                   <pic:blipFill>
-                    <a:blip r:embed="rId41">
+                    <a:blip r:embed="rId47">
                       <a:extLst>
                         <a:ext uri="{28A0092B-C50C-407E-A947-70E740481C1C}">
                           <a14:useLocalDpi xmlns:a14="http://schemas.microsoft.com/office/drawing/2010/main" val="0"/>
                         </a:ext>
                         <a:ext uri="{96DAC541-7B7A-43D3-8B79-37D633B846F1}">
-                          <asvg:svgBlip xmlns:asvg="http://schemas.microsoft.com/office/drawing/2016/SVG/main" r:embed="rId38"/>
+                          <asvg:svgBlip xmlns:asvg="http://schemas.microsoft.com/office/drawing/2016/SVG/main" r:embed="rId44"/>
                         </a:ext>
                       </a:extLst>
                     </a:blip>
@@ -2913,7 +3908,7 @@
       <w:pPr>
         <w:numPr>
           <w:ilvl w:val="0"/>
-          <w:numId w:val="1026"/>
+          <w:numId w:val="1031"/>
         </w:numPr>
         <w:pStyle w:val="Compact"/>
       </w:pPr>
@@ -3116,7 +4111,7 @@
       <w:pPr>
         <w:numPr>
           <w:ilvl w:val="0"/>
-          <w:numId w:val="1027"/>
+          <w:numId w:val="1032"/>
         </w:numPr>
         <w:pStyle w:val="Compact"/>
       </w:pPr>
@@ -3183,7 +4178,7 @@
       <w:pPr>
         <w:numPr>
           <w:ilvl w:val="0"/>
-          <w:numId w:val="1027"/>
+          <w:numId w:val="1032"/>
         </w:numPr>
         <w:pStyle w:val="Compact"/>
       </w:pPr>
@@ -3364,8 +4359,8 @@
         </w:tc>
       </w:tr>
     </w:tbl>
-    <w:bookmarkEnd w:id="42"/>
-    <w:bookmarkStart w:id="47" w:name="ternary-relations"/>
+    <w:bookmarkEnd w:id="48"/>
+    <w:bookmarkStart w:id="53" w:name="ternary-relations"/>
     <w:p>
       <w:pPr>
         <w:pStyle w:val="Heading3"/>
@@ -3378,7 +4373,7 @@
       <w:pPr>
         <w:numPr>
           <w:ilvl w:val="0"/>
-          <w:numId w:val="1028"/>
+          <w:numId w:val="1033"/>
         </w:numPr>
         <w:pStyle w:val="Compact"/>
       </w:pPr>
@@ -3396,7 +4391,7 @@
       <w:pPr>
         <w:numPr>
           <w:ilvl w:val="0"/>
-          <w:numId w:val="1028"/>
+          <w:numId w:val="1033"/>
         </w:numPr>
         <w:pStyle w:val="Compact"/>
       </w:pPr>
@@ -3419,24 +4414,24 @@
           <wp:inline>
             <wp:extent cx="4219575" cy="2705100"/>
             <wp:effectExtent b="0" l="0" r="0" t="0"/>
-            <wp:docPr descr="Ternary Relations" title="supporting ternary relations" id="44" name="Picture"/>
+            <wp:docPr descr="Ternary Relations" title="supporting ternary relations" id="50" name="Picture"/>
             <a:graphic>
               <a:graphicData uri="http://schemas.openxmlformats.org/drawingml/2006/picture">
                 <pic:pic>
                   <pic:nvPicPr>
-                    <pic:cNvPr descr="images/ternary-relation.svg" id="45" name="Picture"/>
+                    <pic:cNvPr descr="images/ternary-relation.svg" id="51" name="Picture"/>
                     <pic:cNvPicPr>
                       <a:picLocks noChangeArrowheads="1" noChangeAspect="1"/>
                     </pic:cNvPicPr>
                   </pic:nvPicPr>
                   <pic:blipFill>
-                    <a:blip r:embed="rId46">
+                    <a:blip r:embed="rId52">
                       <a:extLst>
                         <a:ext uri="{28A0092B-C50C-407E-A947-70E740481C1C}">
                           <a14:useLocalDpi xmlns:a14="http://schemas.microsoft.com/office/drawing/2010/main" val="0"/>
                         </a:ext>
                         <a:ext uri="{96DAC541-7B7A-43D3-8B79-37D633B846F1}">
-                          <asvg:svgBlip xmlns:asvg="http://schemas.microsoft.com/office/drawing/2016/SVG/main" r:embed="rId43"/>
+                          <asvg:svgBlip xmlns:asvg="http://schemas.microsoft.com/office/drawing/2016/SVG/main" r:embed="rId49"/>
                         </a:ext>
                       </a:extLst>
                     </a:blip>
@@ -3478,7 +4473,7 @@
       <w:pPr>
         <w:numPr>
           <w:ilvl w:val="0"/>
-          <w:numId w:val="1029"/>
+          <w:numId w:val="1034"/>
         </w:numPr>
         <w:pStyle w:val="Compact"/>
       </w:pPr>
@@ -3535,7 +4530,7 @@
       <w:pPr>
         <w:numPr>
           <w:ilvl w:val="0"/>
-          <w:numId w:val="1029"/>
+          <w:numId w:val="1034"/>
         </w:numPr>
         <w:pStyle w:val="Compact"/>
       </w:pPr>
@@ -3583,7 +4578,7 @@
       <w:pPr>
         <w:numPr>
           <w:ilvl w:val="0"/>
-          <w:numId w:val="1029"/>
+          <w:numId w:val="1034"/>
         </w:numPr>
         <w:pStyle w:val="Compact"/>
       </w:pPr>
@@ -3597,9 +4592,9 @@
         <w:t xml:space="preserve">the same actor in different scenes, or the same location at different time codes.</w:t>
       </w:r>
     </w:p>
-    <w:bookmarkEnd w:id="47"/>
-    <w:bookmarkEnd w:id="48"/>
-    <w:bookmarkStart w:id="74" w:name="X8618f3316ecdb148ff6ecdd0d632cd5e904caed"/>
+    <w:bookmarkEnd w:id="53"/>
+    <w:bookmarkEnd w:id="54"/>
+    <w:bookmarkStart w:id="80" w:name="X8618f3316ecdb148ff6ecdd0d632cd5e904caed"/>
     <w:p>
       <w:pPr>
         <w:pStyle w:val="Heading2"/>
@@ -3608,7 +4603,7 @@
         <w:t xml:space="preserve">Desktop Use Cases and Examples - Re-modelling standard applications with SEN</w:t>
       </w:r>
     </w:p>
-    <w:bookmarkStart w:id="49" w:name="base-concepts"/>
+    <w:bookmarkStart w:id="55" w:name="base-concepts"/>
     <w:p>
       <w:pPr>
         <w:pStyle w:val="Heading3"/>
@@ -3621,7 +4616,7 @@
       <w:pPr>
         <w:numPr>
           <w:ilvl w:val="0"/>
-          <w:numId w:val="1030"/>
+          <w:numId w:val="1035"/>
         </w:numPr>
         <w:pStyle w:val="Compact"/>
       </w:pPr>
@@ -3633,7 +4628,7 @@
       <w:pPr>
         <w:numPr>
           <w:ilvl w:val="0"/>
-          <w:numId w:val="1030"/>
+          <w:numId w:val="1035"/>
         </w:numPr>
         <w:pStyle w:val="Compact"/>
       </w:pPr>
@@ -3645,7 +4640,7 @@
       <w:pPr>
         <w:numPr>
           <w:ilvl w:val="0"/>
-          <w:numId w:val="1030"/>
+          <w:numId w:val="1035"/>
         </w:numPr>
         <w:pStyle w:val="Compact"/>
       </w:pPr>
@@ -3681,7 +4676,7 @@
       <w:pPr>
         <w:numPr>
           <w:ilvl w:val="1"/>
-          <w:numId w:val="1031"/>
+          <w:numId w:val="1036"/>
         </w:numPr>
         <w:pStyle w:val="Compact"/>
       </w:pPr>
@@ -3713,8 +4708,8 @@
         <w:t xml:space="preserve">all targets of that relation in a separate window:</w:t>
       </w:r>
     </w:p>
-    <w:bookmarkEnd w:id="49"/>
-    <w:bookmarkStart w:id="54" w:name="X3f9509e5bf4b481dc76311344976c6e490be1d6"/>
+    <w:bookmarkEnd w:id="55"/>
+    <w:bookmarkStart w:id="60" w:name="X3f9509e5bf4b481dc76311344976c6e490be1d6"/>
     <w:p>
       <w:pPr>
         <w:pStyle w:val="Heading3"/>
@@ -3727,9 +4722,8 @@
       <w:pPr>
         <w:numPr>
           <w:ilvl w:val="0"/>
-          <w:numId w:val="1032"/>
-        </w:numPr>
-        <w:pStyle w:val="Compact"/>
+          <w:numId w:val="1037"/>
+        </w:numPr>
       </w:pPr>
       <w:r>
         <w:t xml:space="preserve">Because SEN is very user-centric and should not be limited to experts and knowledge workers, the standard file browser,</w:t>
@@ -3751,9 +4745,8 @@
       <w:pPr>
         <w:numPr>
           <w:ilvl w:val="0"/>
-          <w:numId w:val="1032"/>
-        </w:numPr>
-        <w:pStyle w:val="Compact"/>
+          <w:numId w:val="1037"/>
+        </w:numPr>
       </w:pPr>
       <w:r>
         <w:t xml:space="preserve">A special case is the display of all related files for a given relation - here, SEN uses a special</w:t>
@@ -3787,7 +4780,7 @@
       <w:pPr>
         <w:numPr>
           <w:ilvl w:val="1"/>
-          <w:numId w:val="1033"/>
+          <w:numId w:val="1038"/>
         </w:numPr>
         <w:pStyle w:val="Compact"/>
       </w:pPr>
@@ -3799,7 +4792,7 @@
       <w:pPr>
         <w:numPr>
           <w:ilvl w:val="1"/>
-          <w:numId w:val="1033"/>
+          <w:numId w:val="1038"/>
         </w:numPr>
         <w:pStyle w:val="Compact"/>
       </w:pPr>
@@ -3835,7 +4828,7 @@
       <w:pPr>
         <w:numPr>
           <w:ilvl w:val="1"/>
-          <w:numId w:val="1033"/>
+          <w:numId w:val="1038"/>
         </w:numPr>
         <w:pStyle w:val="Compact"/>
       </w:pPr>
@@ -3853,7 +4846,7 @@
       <w:pPr>
         <w:numPr>
           <w:ilvl w:val="1"/>
-          <w:numId w:val="1033"/>
+          <w:numId w:val="1038"/>
         </w:numPr>
         <w:pStyle w:val="Compact"/>
       </w:pPr>
@@ -3871,7 +4864,7 @@
       <w:pPr>
         <w:numPr>
           <w:ilvl w:val="1"/>
-          <w:numId w:val="1033"/>
+          <w:numId w:val="1038"/>
         </w:numPr>
         <w:pStyle w:val="Compact"/>
       </w:pPr>
@@ -3895,7 +4888,7 @@
       <w:pPr>
         <w:numPr>
           <w:ilvl w:val="1"/>
-          <w:numId w:val="1033"/>
+          <w:numId w:val="1038"/>
         </w:numPr>
         <w:pStyle w:val="Compact"/>
       </w:pPr>
@@ -3986,7 +4979,7 @@
       <w:pPr>
         <w:numPr>
           <w:ilvl w:val="1"/>
-          <w:numId w:val="1033"/>
+          <w:numId w:val="1038"/>
         </w:numPr>
         <w:pStyle w:val="Compact"/>
       </w:pPr>
@@ -4022,7 +5015,7 @@
       <w:pPr>
         <w:numPr>
           <w:ilvl w:val="1"/>
-          <w:numId w:val="1033"/>
+          <w:numId w:val="1038"/>
         </w:numPr>
         <w:pStyle w:val="Compact"/>
       </w:pPr>
@@ -4082,7 +5075,7 @@
       <w:pPr>
         <w:numPr>
           <w:ilvl w:val="1"/>
-          <w:numId w:val="1033"/>
+          <w:numId w:val="1038"/>
         </w:numPr>
         <w:pStyle w:val="Compact"/>
       </w:pPr>
@@ -4172,9 +5165,8 @@
       <w:pPr>
         <w:numPr>
           <w:ilvl w:val="0"/>
-          <w:numId w:val="1032"/>
-        </w:numPr>
-        <w:pStyle w:val="Compact"/>
+          <w:numId w:val="1037"/>
+        </w:numPr>
       </w:pPr>
       <w:r>
         <w:t xml:space="preserve">The figure below shows a simplified example of how users could navigate all references of a research paper or lecture</w:t>
@@ -4190,7 +5182,7 @@
       <w:pPr>
         <w:numPr>
           <w:ilvl w:val="0"/>
-          <w:numId w:val="1032"/>
+          <w:numId w:val="1037"/>
         </w:numPr>
         <w:pStyle w:val="CaptionedFigure"/>
       </w:pPr>
@@ -4199,24 +5191,24 @@
           <wp:inline>
             <wp:extent cx="5334000" cy="3149295"/>
             <wp:effectExtent b="0" l="0" r="0" t="0"/>
-            <wp:docPr descr="Relation Browser" title="browsing relation targets and their properties" id="51" name="Picture"/>
+            <wp:docPr descr="Relation Browser" title="browsing relation targets and their properties" id="57" name="Picture"/>
             <a:graphic>
               <a:graphicData uri="http://schemas.openxmlformats.org/drawingml/2006/picture">
                 <pic:pic>
                   <pic:nvPicPr>
-                    <pic:cNvPr descr="images/tracker-relations.svg" id="52" name="Picture"/>
+                    <pic:cNvPr descr="images/tracker-relations.svg" id="58" name="Picture"/>
                     <pic:cNvPicPr>
                       <a:picLocks noChangeArrowheads="1" noChangeAspect="1"/>
                     </pic:cNvPicPr>
                   </pic:nvPicPr>
                   <pic:blipFill>
-                    <a:blip r:embed="rId53">
+                    <a:blip r:embed="rId59">
                       <a:extLst>
                         <a:ext uri="{28A0092B-C50C-407E-A947-70E740481C1C}">
                           <a14:useLocalDpi xmlns:a14="http://schemas.microsoft.com/office/drawing/2010/main" val="0"/>
                         </a:ext>
                         <a:ext uri="{96DAC541-7B7A-43D3-8B79-37D633B846F1}">
-                          <asvg:svgBlip xmlns:asvg="http://schemas.microsoft.com/office/drawing/2016/SVG/main" r:embed="rId50"/>
+                          <asvg:svgBlip xmlns:asvg="http://schemas.microsoft.com/office/drawing/2016/SVG/main" r:embed="rId56"/>
                         </a:ext>
                       </a:extLst>
                     </a:blip>
@@ -4258,8 +5250,242 @@
         <w:t xml:space="preserve">Relation Browser</w:t>
       </w:r>
     </w:p>
-    <w:bookmarkEnd w:id="54"/>
-    <w:bookmarkStart w:id="59" w:name="calendar"/>
+    <w:p>
+      <w:pPr>
+        <w:numPr>
+          <w:ilvl w:val="0"/>
+          <w:numId w:val="1037"/>
+        </w:numPr>
+      </w:pPr>
+      <w:r>
+        <w:t xml:space="preserve">For ternary relations, we need to extend this concept and add another level, i.e. through a folder inside the virtual</w:t>
+      </w:r>
+      <w:r>
+        <w:t xml:space="preserve"> </w:t>
+      </w:r>
+      <w:r>
+        <w:t xml:space="preserve">folder, that holds all relation properties from the source entity to the 3rd entity involved in the relation.</w:t>
+      </w:r>
+    </w:p>
+    <w:p>
+      <w:pPr>
+        <w:numPr>
+          <w:ilvl w:val="1"/>
+          <w:numId w:val="1039"/>
+        </w:numPr>
+        <w:pStyle w:val="Compact"/>
+      </w:pPr>
+      <w:r>
+        <w:t xml:space="preserve">e.g., for references from an annotation to a paper that references another author in several ways and on several pages,</w:t>
+      </w:r>
+      <w:r>
+        <w:t xml:space="preserve"> </w:t>
+      </w:r>
+      <w:r>
+        <w:t xml:space="preserve">SEN would create a folder</w:t>
+      </w:r>
+      <w:r>
+        <w:t xml:space="preserve"> </w:t>
+      </w:r>
+      <w:r>
+        <w:t xml:space="preserve">“</w:t>
+      </w:r>
+      <w:r>
+        <w:t xml:space="preserve"> </w:t>
+      </w:r>
+      <w:r>
+        <w:t xml:space="preserve">Relations to</w:t>
+      </w:r>
+      <w:r>
+        <w:t xml:space="preserve"> </w:t>
+      </w:r>
+      <w:r>
+        <w:t xml:space="preserve">”</w:t>
+      </w:r>
+      <w:r>
+        <w:t xml:space="preserve"> </w:t>
+      </w:r>
+      <w:r>
+        <w:t xml:space="preserve">inside the virtual folder</w:t>
+      </w:r>
+      <w:r>
+        <w:t xml:space="preserve"> </w:t>
+      </w:r>
+      <w:r>
+        <w:t xml:space="preserve">“</w:t>
+      </w:r>
+      <w:r>
+        <w:t xml:space="preserve"> </w:t>
+      </w:r>
+      <w:r>
+        <w:t xml:space="preserve">relations to</w:t>
+      </w:r>
+      <w:r>
+        <w:t xml:space="preserve"> </w:t>
+      </w:r>
+      <w:r>
+        <w:t xml:space="preserve">”</w:t>
+      </w:r>
+      <w:r>
+        <w:t xml:space="preserve">.</w:t>
+      </w:r>
+    </w:p>
+    <w:p>
+      <w:pPr>
+        <w:numPr>
+          <w:ilvl w:val="1"/>
+          <w:numId w:val="1039"/>
+        </w:numPr>
+        <w:pStyle w:val="Compact"/>
+      </w:pPr>
+      <w:r>
+        <w:t xml:space="preserve">this nested folder would then hold all references with label and page number as file attributes, shown in columns</w:t>
+      </w:r>
+      <w:r>
+        <w:t xml:space="preserve"> </w:t>
+      </w:r>
+      <w:r>
+        <w:t xml:space="preserve">(without actual file types or targets, since the file (type) will always be the relation source, and the target is</w:t>
+      </w:r>
+      <w:r>
+        <w:t xml:space="preserve"> </w:t>
+      </w:r>
+      <w:r>
+        <w:t xml:space="preserve">always the third entity involved), e.g.:</w:t>
+      </w:r>
+    </w:p>
+    <w:tbl>
+      <w:tblPr>
+        <w:tblStyle w:val="Table"/>
+        <w:tblW w:type="auto" w:w="0"/>
+        <w:tblLook w:firstRow="1" w:lastRow="0" w:firstColumn="0" w:lastColumn="0" w:noHBand="0" w:noVBand="0" w:val="0020"/>
+      </w:tblPr>
+      <w:tblGrid>
+        <w:gridCol w:w="3960"/>
+        <w:gridCol w:w="3960"/>
+      </w:tblGrid>
+      <w:tr>
+        <w:trPr>
+          <w:tblHeader w:val="true"/>
+        </w:trPr>
+        <w:tc>
+          <w:tcPr/>
+          <w:p>
+            <w:pPr>
+              <w:pStyle w:val="Compact"/>
+              <w:jc w:val="left"/>
+            </w:pPr>
+            <w:r>
+              <w:t xml:space="preserve">Label</w:t>
+            </w:r>
+          </w:p>
+        </w:tc>
+        <w:tc>
+          <w:tcPr/>
+          <w:p>
+            <w:pPr>
+              <w:pStyle w:val="Compact"/>
+              <w:jc w:val="left"/>
+            </w:pPr>
+            <w:r>
+              <w:t xml:space="preserve">Page</w:t>
+            </w:r>
+          </w:p>
+        </w:tc>
+      </w:tr>
+      <w:tr>
+        <w:tc>
+          <w:tcPr/>
+          <w:p>
+            <w:pPr>
+              <w:pStyle w:val="Compact"/>
+              <w:jc w:val="left"/>
+            </w:pPr>
+            <w:r>
+              <w:t xml:space="preserve">quotes</w:t>
+            </w:r>
+          </w:p>
+        </w:tc>
+        <w:tc>
+          <w:tcPr/>
+          <w:p>
+            <w:pPr>
+              <w:pStyle w:val="Compact"/>
+              <w:jc w:val="left"/>
+            </w:pPr>
+            <w:r>
+              <w:t xml:space="preserve">2</w:t>
+            </w:r>
+          </w:p>
+        </w:tc>
+      </w:tr>
+      <w:tr>
+        <w:tc>
+          <w:tcPr/>
+          <w:p>
+            <w:pPr>
+              <w:pStyle w:val="Compact"/>
+              <w:jc w:val="left"/>
+            </w:pPr>
+            <w:r>
+              <w:t xml:space="preserve">references</w:t>
+            </w:r>
+          </w:p>
+        </w:tc>
+        <w:tc>
+          <w:tcPr/>
+          <w:p>
+            <w:pPr>
+              <w:pStyle w:val="Compact"/>
+              <w:jc w:val="left"/>
+            </w:pPr>
+            <w:r>
+              <w:t xml:space="preserve">4</w:t>
+            </w:r>
+          </w:p>
+        </w:tc>
+      </w:tr>
+      <w:tr>
+        <w:tc>
+          <w:tcPr/>
+          <w:p>
+            <w:pPr>
+              <w:pStyle w:val="Compact"/>
+              <w:jc w:val="left"/>
+            </w:pPr>
+            <w:r>
+              <w:t xml:space="preserve">associates</w:t>
+            </w:r>
+          </w:p>
+        </w:tc>
+        <w:tc>
+          <w:tcPr/>
+          <w:p>
+            <w:pPr>
+              <w:pStyle w:val="Compact"/>
+              <w:jc w:val="left"/>
+            </w:pPr>
+            <w:r>
+              <w:t xml:space="preserve">7</w:t>
+            </w:r>
+          </w:p>
+        </w:tc>
+      </w:tr>
+    </w:tbl>
+    <w:p>
+      <w:pPr>
+        <w:numPr>
+          <w:ilvl w:val="0"/>
+          <w:numId w:val="1040"/>
+        </w:numPr>
+        <w:pStyle w:val="Compact"/>
+      </w:pPr>
+      <w:r>
+        <w:t xml:space="preserve">[[Fig]].{14}.{13}.{This table illustrates a nested folder showing all outgoing links and properties of a ternary relation.}</w:t>
+      </w:r>
+    </w:p>
+    <w:bookmarkEnd w:id="60"/>
+    <w:bookmarkStart w:id="65" w:name="calendar"/>
     <w:p>
       <w:pPr>
         <w:pStyle w:val="Heading3"/>
@@ -4272,7 +5498,7 @@
       <w:pPr>
         <w:numPr>
           <w:ilvl w:val="0"/>
-          <w:numId w:val="1034"/>
+          <w:numId w:val="1041"/>
         </w:numPr>
         <w:pStyle w:val="Compact"/>
       </w:pPr>
@@ -4284,7 +5510,7 @@
       <w:pPr>
         <w:numPr>
           <w:ilvl w:val="0"/>
-          <w:numId w:val="1034"/>
+          <w:numId w:val="1041"/>
         </w:numPr>
         <w:pStyle w:val="Compact"/>
       </w:pPr>
@@ -4314,7 +5540,7 @@
       <w:pPr>
         <w:numPr>
           <w:ilvl w:val="1"/>
-          <w:numId w:val="1035"/>
+          <w:numId w:val="1042"/>
         </w:numPr>
         <w:pStyle w:val="Compact"/>
       </w:pPr>
@@ -4344,7 +5570,7 @@
       <w:pPr>
         <w:numPr>
           <w:ilvl w:val="0"/>
-          <w:numId w:val="1034"/>
+          <w:numId w:val="1041"/>
         </w:numPr>
         <w:pStyle w:val="CaptionedFigure"/>
       </w:pPr>
@@ -4353,24 +5579,24 @@
           <wp:inline>
             <wp:extent cx="5334000" cy="2538747"/>
             <wp:effectExtent b="0" l="0" r="0" t="0"/>
-            <wp:docPr descr="Calendar Event Browser" title="browsing calendar entries" id="56" name="Picture"/>
+            <wp:docPr descr="Calendar Event Browser" title="browsing calendar entries" id="62" name="Picture"/>
             <a:graphic>
               <a:graphicData uri="http://schemas.openxmlformats.org/drawingml/2006/picture">
                 <pic:pic>
                   <pic:nvPicPr>
-                    <pic:cNvPr descr="images/calendar-browser.svg" id="57" name="Picture"/>
+                    <pic:cNvPr descr="images/calendar-browser.svg" id="63" name="Picture"/>
                     <pic:cNvPicPr>
                       <a:picLocks noChangeArrowheads="1" noChangeAspect="1"/>
                     </pic:cNvPicPr>
                   </pic:nvPicPr>
                   <pic:blipFill>
-                    <a:blip r:embed="rId58">
+                    <a:blip r:embed="rId64">
                       <a:extLst>
                         <a:ext uri="{28A0092B-C50C-407E-A947-70E740481C1C}">
                           <a14:useLocalDpi xmlns:a14="http://schemas.microsoft.com/office/drawing/2010/main" val="0"/>
                         </a:ext>
                         <a:ext uri="{96DAC541-7B7A-43D3-8B79-37D633B846F1}">
-                          <asvg:svgBlip xmlns:asvg="http://schemas.microsoft.com/office/drawing/2016/SVG/main" r:embed="rId55"/>
+                          <asvg:svgBlip xmlns:asvg="http://schemas.microsoft.com/office/drawing/2016/SVG/main" r:embed="rId61"/>
                         </a:ext>
                       </a:extLst>
                     </a:blip>
@@ -4412,8 +5638,8 @@
         <w:t xml:space="preserve">Calendar Event Browser</w:t>
       </w:r>
     </w:p>
-    <w:bookmarkEnd w:id="59"/>
-    <w:bookmarkStart w:id="60" w:name="e-mail"/>
+    <w:bookmarkEnd w:id="65"/>
+    <w:bookmarkStart w:id="66" w:name="e-mail"/>
     <w:p>
       <w:pPr>
         <w:pStyle w:val="Heading3"/>
@@ -4422,8 +5648,8 @@
         <w:t xml:space="preserve">E-Mail</w:t>
       </w:r>
     </w:p>
-    <w:bookmarkEnd w:id="60"/>
-    <w:bookmarkStart w:id="68" w:name="Xa2c87a544cf47e8c39fbecbb781ec174495b7f6"/>
+    <w:bookmarkEnd w:id="66"/>
+    <w:bookmarkStart w:id="74" w:name="Xa2c87a544cf47e8c39fbecbb781ec174495b7f6"/>
     <w:p>
       <w:pPr>
         <w:pStyle w:val="Heading3"/>
@@ -4436,8 +5662,9 @@
       <w:pPr>
         <w:numPr>
           <w:ilvl w:val="0"/>
-          <w:numId w:val="1036"/>
-        </w:numPr>
+          <w:numId w:val="1043"/>
+        </w:numPr>
+        <w:pStyle w:val="Compact"/>
       </w:pPr>
       <w:r>
         <w:t xml:space="preserve">Simple but Semantic</w:t>
@@ -4447,8 +5674,9 @@
       <w:pPr>
         <w:numPr>
           <w:ilvl w:val="0"/>
-          <w:numId w:val="1036"/>
-        </w:numPr>
+          <w:numId w:val="1043"/>
+        </w:numPr>
+        <w:pStyle w:val="Compact"/>
       </w:pPr>
       <w:r>
         <w:t xml:space="preserve">also suitable for story writing: characters, locations and story arch as (self-)references</w:t>
@@ -4458,8 +5686,9 @@
       <w:pPr>
         <w:numPr>
           <w:ilvl w:val="0"/>
-          <w:numId w:val="1036"/>
-        </w:numPr>
+          <w:numId w:val="1043"/>
+        </w:numPr>
+        <w:pStyle w:val="Compact"/>
       </w:pPr>
       <w:r>
         <w:t xml:space="preserve">Features and Use Cases - Authoring system (Relation Views for self-relations (structure, internal links to entities in the text) and external references)</w:t>
@@ -4469,8 +5698,9 @@
       <w:pPr>
         <w:numPr>
           <w:ilvl w:val="0"/>
-          <w:numId w:val="1036"/>
-        </w:numPr>
+          <w:numId w:val="1043"/>
+        </w:numPr>
+        <w:pStyle w:val="Compact"/>
       </w:pPr>
       <w:r>
         <w:t xml:space="preserve">Prototype Concept:</w:t>
@@ -4483,18 +5713,18 @@
           <wp:inline>
             <wp:extent cx="5334000" cy="2798089"/>
             <wp:effectExtent b="0" l="0" r="0" t="0"/>
-            <wp:docPr descr="Semantic Editor" title="semantic editor with NER built-in" id="62" name="Picture"/>
+            <wp:docPr descr="Semantic Editor" title="semantic editor with NER built-in" id="68" name="Picture"/>
             <a:graphic>
               <a:graphicData uri="http://schemas.openxmlformats.org/drawingml/2006/picture">
                 <pic:pic>
                   <pic:nvPicPr>
-                    <pic:cNvPr descr="images/editor-ner.png" id="63" name="Picture"/>
+                    <pic:cNvPr descr="images/editor-ner.png" id="69" name="Picture"/>
                     <pic:cNvPicPr>
                       <a:picLocks noChangeArrowheads="1" noChangeAspect="1"/>
                     </pic:cNvPicPr>
                   </pic:nvPicPr>
                   <pic:blipFill>
-                    <a:blip r:embed="rId61"/>
+                    <a:blip r:embed="rId67"/>
                     <a:stretch>
                       <a:fillRect/>
                     </a:stretch>
@@ -4525,11 +5755,12 @@
       <w:pPr>
         <w:numPr>
           <w:ilvl w:val="0"/>
-          <w:numId w:val="1036"/>
-        </w:numPr>
-      </w:pPr>
-      <w:r>
-        <w:t xml:space="preserve">in the file-browser, all extracted entities can be browsed by navigating the file’s relations:</w:t>
+          <w:numId w:val="1043"/>
+        </w:numPr>
+        <w:pStyle w:val="Compact"/>
+      </w:pPr>
+      <w:r>
+        <w:t xml:space="preserve">as outlined above, all extracted entities can also be browsed by navigating the text file’s relations in the file browser:</w:t>
       </w:r>
       <w:r>
         <w:t xml:space="preserve"> </w:t>
@@ -4539,24 +5770,24 @@
           <wp:inline>
             <wp:extent cx="5334000" cy="2142527"/>
             <wp:effectExtent b="0" l="0" r="0" t="0"/>
-            <wp:docPr descr="Browsing Relations" title="navigating document relations in the file browser" id="65" name="Picture"/>
+            <wp:docPr descr="Browsing Relations" title="navigating document relations in the file browser" id="71" name="Picture"/>
             <a:graphic>
               <a:graphicData uri="http://schemas.openxmlformats.org/drawingml/2006/picture">
                 <pic:pic>
                   <pic:nvPicPr>
-                    <pic:cNvPr descr="images/file-browser-relations.svg" id="66" name="Picture"/>
+                    <pic:cNvPr descr="images/file-browser-relations.svg" id="72" name="Picture"/>
                     <pic:cNvPicPr>
                       <a:picLocks noChangeArrowheads="1" noChangeAspect="1"/>
                     </pic:cNvPicPr>
                   </pic:nvPicPr>
                   <pic:blipFill>
-                    <a:blip r:embed="rId67">
+                    <a:blip r:embed="rId73">
                       <a:extLst>
                         <a:ext uri="{28A0092B-C50C-407E-A947-70E740481C1C}">
                           <a14:useLocalDpi xmlns:a14="http://schemas.microsoft.com/office/drawing/2010/main" val="0"/>
                         </a:ext>
                         <a:ext uri="{96DAC541-7B7A-43D3-8B79-37D633B846F1}">
-                          <asvg:svgBlip xmlns:asvg="http://schemas.microsoft.com/office/drawing/2016/SVG/main" r:embed="rId64"/>
+                          <asvg:svgBlip xmlns:asvg="http://schemas.microsoft.com/office/drawing/2016/SVG/main" r:embed="rId70"/>
                         </a:ext>
                       </a:extLst>
                     </a:blip>
@@ -4586,8 +5817,26 @@
         </w:drawing>
       </w:r>
     </w:p>
-    <w:bookmarkEnd w:id="68"/>
-    <w:bookmarkStart w:id="73" w:name="extending-a-code-editor-into-an-ide"/>
+    <w:p>
+      <w:pPr>
+        <w:numPr>
+          <w:ilvl w:val="1"/>
+          <w:numId w:val="1044"/>
+        </w:numPr>
+        <w:pStyle w:val="Compact"/>
+      </w:pPr>
+      <w:r>
+        <w:t xml:space="preserve">for ternary relations, as mentioned above, we need to extend this concept and add another level, i.e. a folder, to</w:t>
+      </w:r>
+      <w:r>
+        <w:t xml:space="preserve"> </w:t>
+      </w:r>
+      <w:r>
+        <w:t xml:space="preserve">hold all relation properties to the 3rd entity involved in the relation:</w:t>
+      </w:r>
+    </w:p>
+    <w:bookmarkEnd w:id="74"/>
+    <w:bookmarkStart w:id="79" w:name="extending-a-code-editor-into-an-ide"/>
     <w:p>
       <w:pPr>
         <w:pStyle w:val="Heading3"/>
@@ -4600,7 +5849,7 @@
       <w:pPr>
         <w:numPr>
           <w:ilvl w:val="0"/>
-          <w:numId w:val="1037"/>
+          <w:numId w:val="1045"/>
         </w:numPr>
         <w:pStyle w:val="Compact"/>
       </w:pPr>
@@ -4612,7 +5861,7 @@
       <w:pPr>
         <w:numPr>
           <w:ilvl w:val="0"/>
-          <w:numId w:val="1037"/>
+          <w:numId w:val="1045"/>
         </w:numPr>
         <w:pStyle w:val="Compact"/>
       </w:pPr>
@@ -4624,7 +5873,7 @@
       <w:pPr>
         <w:numPr>
           <w:ilvl w:val="0"/>
-          <w:numId w:val="1037"/>
+          <w:numId w:val="1045"/>
         </w:numPr>
         <w:pStyle w:val="Compact"/>
       </w:pPr>
@@ -4636,7 +5885,7 @@
       <w:pPr>
         <w:numPr>
           <w:ilvl w:val="0"/>
-          <w:numId w:val="1037"/>
+          <w:numId w:val="1045"/>
         </w:numPr>
         <w:pStyle w:val="Compact"/>
       </w:pPr>
@@ -4648,7 +5897,7 @@
       <w:pPr>
         <w:numPr>
           <w:ilvl w:val="0"/>
-          <w:numId w:val="1037"/>
+          <w:numId w:val="1045"/>
         </w:numPr>
         <w:pStyle w:val="Compact"/>
       </w:pPr>
@@ -4665,24 +5914,24 @@
           <wp:inline>
             <wp:extent cx="5334000" cy="2701977"/>
             <wp:effectExtent b="0" l="0" r="0" t="0"/>
-            <wp:docPr descr="SEN-IDE" title="an IDE utilising the SEN API" id="70" name="Picture"/>
+            <wp:docPr descr="SEN-IDE" title="an IDE utilising the SEN API" id="76" name="Picture"/>
             <a:graphic>
               <a:graphicData uri="http://schemas.openxmlformats.org/drawingml/2006/picture">
                 <pic:pic>
                   <pic:nvPicPr>
-                    <pic:cNvPr descr="images/sen-ide.svg" id="71" name="Picture"/>
+                    <pic:cNvPr descr="images/sen-ide.svg" id="77" name="Picture"/>
                     <pic:cNvPicPr>
                       <a:picLocks noChangeArrowheads="1" noChangeAspect="1"/>
                     </pic:cNvPicPr>
                   </pic:nvPicPr>
                   <pic:blipFill>
-                    <a:blip r:embed="rId72">
+                    <a:blip r:embed="rId78">
                       <a:extLst>
                         <a:ext uri="{28A0092B-C50C-407E-A947-70E740481C1C}">
                           <a14:useLocalDpi xmlns:a14="http://schemas.microsoft.com/office/drawing/2010/main" val="0"/>
                         </a:ext>
                         <a:ext uri="{96DAC541-7B7A-43D3-8B79-37D633B846F1}">
-                          <asvg:svgBlip xmlns:asvg="http://schemas.microsoft.com/office/drawing/2016/SVG/main" r:embed="rId69"/>
+                          <asvg:svgBlip xmlns:asvg="http://schemas.microsoft.com/office/drawing/2016/SVG/main" r:embed="rId75"/>
                         </a:ext>
                       </a:extLst>
                     </a:blip>
@@ -4720,9 +5969,9 @@
         <w:t xml:space="preserve">SEN-IDE</w:t>
       </w:r>
     </w:p>
-    <w:bookmarkEnd w:id="73"/>
-    <w:bookmarkEnd w:id="74"/>
-    <w:bookmarkStart w:id="75" w:name="outlook-ongoing-and-future-work"/>
+    <w:bookmarkEnd w:id="79"/>
+    <w:bookmarkEnd w:id="80"/>
+    <w:bookmarkStart w:id="81" w:name="outlook-ongoing-and-future-work"/>
     <w:p>
       <w:pPr>
         <w:pStyle w:val="Heading2"/>
@@ -4735,7 +5984,7 @@
       <w:pPr>
         <w:numPr>
           <w:ilvl w:val="0"/>
-          <w:numId w:val="1038"/>
+          <w:numId w:val="1046"/>
         </w:numPr>
         <w:pStyle w:val="Compact"/>
       </w:pPr>
@@ -4747,7 +5996,7 @@
       <w:pPr>
         <w:numPr>
           <w:ilvl w:val="0"/>
-          <w:numId w:val="1038"/>
+          <w:numId w:val="1046"/>
         </w:numPr>
         <w:pStyle w:val="Compact"/>
       </w:pPr>
@@ -4777,7 +6026,7 @@
       <w:pPr>
         <w:numPr>
           <w:ilvl w:val="0"/>
-          <w:numId w:val="1038"/>
+          <w:numId w:val="1046"/>
         </w:numPr>
         <w:pStyle w:val="Compact"/>
       </w:pPr>
@@ -4789,7 +6038,7 @@
       <w:pPr>
         <w:numPr>
           <w:ilvl w:val="0"/>
-          <w:numId w:val="1038"/>
+          <w:numId w:val="1046"/>
         </w:numPr>
         <w:pStyle w:val="Compact"/>
       </w:pPr>
@@ -4801,7 +6050,7 @@
       <w:pPr>
         <w:numPr>
           <w:ilvl w:val="1"/>
-          <w:numId w:val="1039"/>
+          <w:numId w:val="1047"/>
         </w:numPr>
         <w:pStyle w:val="Compact"/>
       </w:pPr>
@@ -4809,8 +6058,8 @@
         <w:t xml:space="preserve">rich Tracker views, e.g. 2d-axis view for arranging items on a timeline, or by proximity etc.</w:t>
       </w:r>
     </w:p>
-    <w:bookmarkEnd w:id="75"/>
-    <w:bookmarkStart w:id="76" w:name="references"/>
+    <w:bookmarkEnd w:id="81"/>
+    <w:bookmarkStart w:id="82" w:name="references"/>
     <w:p>
       <w:pPr>
         <w:pStyle w:val="Heading2"/>
@@ -4823,8 +6072,21 @@
       <w:pPr>
         <w:numPr>
           <w:ilvl w:val="0"/>
-          <w:numId w:val="1040"/>
-        </w:numPr>
+          <w:numId w:val="1048"/>
+        </w:numPr>
+        <w:pStyle w:val="Compact"/>
+      </w:pPr>
+      <w:r>
+        <w:t xml:space="preserve">Access Co., Ltd. (n.d.). The Be Book—System Overview—The Application Kit. Retrieved September 28, 2022, from https://www.haiku-os.org/legacy-docs/bebook/TheApplicationKit_Scripting.html</w:t>
+      </w:r>
+    </w:p>
+    <w:p>
+      <w:pPr>
+        <w:numPr>
+          <w:ilvl w:val="0"/>
+          <w:numId w:val="1048"/>
+        </w:numPr>
+        <w:pStyle w:val="Compact"/>
       </w:pPr>
       <w:r>
         <w:t xml:space="preserve">Alexander Obenauer. (2021, August 21). The Graph OS. The Lab Notes. https://alexanderobenauer.com/labnotes/014/</w:t>
@@ -4834,8 +6096,9 @@
       <w:pPr>
         <w:numPr>
           <w:ilvl w:val="0"/>
-          <w:numId w:val="1040"/>
-        </w:numPr>
+          <w:numId w:val="1048"/>
+        </w:numPr>
+        <w:pStyle w:val="Compact"/>
       </w:pPr>
       <w:r>
         <w:t xml:space="preserve">Ames, A., Maltzahn, C., Bobb, N., Miller, E. L., Brandt, S. A., Neeman, A., Hiatt, A., &amp; Tuteja, D. (2005). Richer File System Metadata Using Links and Attributes. 22nd IEEE / 13th NASA Goddard Conference on Mass Storage Systems and Technologies (MSST’05), 49–60. https://doi.org/10.1109/MSST.2005.28</w:t>
@@ -4845,8 +6108,9 @@
       <w:pPr>
         <w:numPr>
           <w:ilvl w:val="0"/>
-          <w:numId w:val="1040"/>
-        </w:numPr>
+          <w:numId w:val="1048"/>
+        </w:numPr>
+        <w:pStyle w:val="Compact"/>
       </w:pPr>
       <w:r>
         <w:t xml:space="preserve">Berman, J. J. (2022). Classification made relevant how scientists build and use classifications and ontologies. Academic Press.</w:t>
@@ -4856,8 +6120,21 @@
       <w:pPr>
         <w:numPr>
           <w:ilvl w:val="0"/>
-          <w:numId w:val="1040"/>
-        </w:numPr>
+          <w:numId w:val="1048"/>
+        </w:numPr>
+        <w:pStyle w:val="Compact"/>
+      </w:pPr>
+      <w:r>
+        <w:t xml:space="preserve">Bushnell, T. (2015, March 8). Towards a New Strategy of OS Design, an architectural overview by Thomas Bushnell, BSG. https://www.gnu.org/software/hurd/hurd-paper.html#design</w:t>
+      </w:r>
+    </w:p>
+    <w:p>
+      <w:pPr>
+        <w:numPr>
+          <w:ilvl w:val="0"/>
+          <w:numId w:val="1048"/>
+        </w:numPr>
+        <w:pStyle w:val="Compact"/>
       </w:pPr>
       <w:r>
         <w:t xml:space="preserve">Dan McCreary. (2022, April 7). Personal Knowledge Graphs. Towards Data Science. https://towardsdatascience.com/personal-knowledge-graphs-9a23a0b099af</w:t>
@@ -4867,8 +6144,9 @@
       <w:pPr>
         <w:numPr>
           <w:ilvl w:val="0"/>
-          <w:numId w:val="1040"/>
-        </w:numPr>
+          <w:numId w:val="1048"/>
+        </w:numPr>
+        <w:pStyle w:val="Compact"/>
       </w:pPr>
       <w:r>
         <w:t xml:space="preserve">Gifford, D. K., Jouvelot, P., Sheldon, M. A., &amp; O’Toole, J. W. (1991). Semantic file systems. Proceedings of the Thirteenth ACM Symposium on Operating Systems Principles - SOSP ’91, 16–25. https://doi.org/10.1145/121132.121138</w:t>
@@ -4878,30 +6156,33 @@
       <w:pPr>
         <w:numPr>
           <w:ilvl w:val="0"/>
-          <w:numId w:val="1040"/>
-        </w:numPr>
-      </w:pPr>
-      <w:r>
-        <w:t xml:space="preserve">Google. (2007, February 13). Haiku: The Operating System. https://www.youtube.com/watch?v=LxAQxGQB1A8</w:t>
-      </w:r>
-    </w:p>
-    <w:p>
-      <w:pPr>
-        <w:numPr>
-          <w:ilvl w:val="0"/>
-          <w:numId w:val="1040"/>
-        </w:numPr>
-      </w:pPr>
-      <w:r>
-        <w:t xml:space="preserve">Haiku, V. (2022). The Haiku Book: Messaging Foundations. Retrieved September 25, 2022, from https://www.haiku-os.org/docs/api/app_messaging.html</w:t>
-      </w:r>
-    </w:p>
-    <w:p>
-      <w:pPr>
-        <w:numPr>
-          <w:ilvl w:val="0"/>
-          <w:numId w:val="1040"/>
-        </w:numPr>
+          <w:numId w:val="1048"/>
+        </w:numPr>
+        <w:pStyle w:val="Compact"/>
+      </w:pPr>
+      <w:r>
+        <w:t xml:space="preserve">Google (Director). (2007, February 13). Haiku: The Operating System. https://www.youtube.com/watch?v=LxAQxGQB1A8</w:t>
+      </w:r>
+    </w:p>
+    <w:p>
+      <w:pPr>
+        <w:numPr>
+          <w:ilvl w:val="0"/>
+          <w:numId w:val="1048"/>
+        </w:numPr>
+        <w:pStyle w:val="Compact"/>
+      </w:pPr>
+      <w:r>
+        <w:t xml:space="preserve">Haiku, V. (2022, September 12). The Haiku Book: Messaging Foundations. https://www.haiku-os.org/docs/api/app_messaging.html</w:t>
+      </w:r>
+    </w:p>
+    <w:p>
+      <w:pPr>
+        <w:numPr>
+          <w:ilvl w:val="0"/>
+          <w:numId w:val="1048"/>
+        </w:numPr>
+        <w:pStyle w:val="Compact"/>
       </w:pPr>
       <w:r>
         <w:t xml:space="preserve">Humdinger, B. (2009a). Attributes (Haiku User Guide). https://www.haiku-os.org/docs/userguide/en/attributes.html</w:t>
@@ -4911,8 +6192,9 @@
       <w:pPr>
         <w:numPr>
           <w:ilvl w:val="0"/>
-          <w:numId w:val="1040"/>
-        </w:numPr>
+          <w:numId w:val="1048"/>
+        </w:numPr>
+        <w:pStyle w:val="Compact"/>
       </w:pPr>
       <w:r>
         <w:t xml:space="preserve">Humdinger, B. (2009b). Haiku Filetypes (Userguide). The Haiku Foundation. https://www.haiku-os.org/docs/userguide/en/filetypes.html</w:t>
@@ -4922,8 +6204,33 @@
       <w:pPr>
         <w:numPr>
           <w:ilvl w:val="0"/>
-          <w:numId w:val="1040"/>
-        </w:numPr>
+          <w:numId w:val="1048"/>
+        </w:numPr>
+        <w:pStyle w:val="Compact"/>
+      </w:pPr>
+      <w:r>
+        <w:t xml:space="preserve">Humdinger, B. (2019). Workshop: Filetypes, Attributes, Index and Queries. https://www.haiku-os.org/docs/userguide/en/workshop-filetypes+attributes.html</w:t>
+      </w:r>
+    </w:p>
+    <w:p>
+      <w:pPr>
+        <w:numPr>
+          <w:ilvl w:val="0"/>
+          <w:numId w:val="1048"/>
+        </w:numPr>
+        <w:pStyle w:val="Compact"/>
+      </w:pPr>
+      <w:r>
+        <w:t xml:space="preserve">Matuschak, A. (n.d.). Evergreen Notes. Andy’s Working Notes. https://notes.andymatuschak.org/z4SDCZQeRo4xFEQ8H4qrSqd68ucpgE6LU155C</w:t>
+      </w:r>
+    </w:p>
+    <w:p>
+      <w:pPr>
+        <w:numPr>
+          <w:ilvl w:val="0"/>
+          <w:numId w:val="1048"/>
+        </w:numPr>
+        <w:pStyle w:val="Compact"/>
       </w:pPr>
       <w:r>
         <w:t xml:space="preserve">Melnikov, A. (2022). IANA Media Types. Internet Assigned Numbers Authority. https://www.iana.org/assignments/media-types/media-types.xhtml</w:t>
@@ -4933,30 +6240,21 @@
       <w:pPr>
         <w:numPr>
           <w:ilvl w:val="0"/>
-          <w:numId w:val="1040"/>
-        </w:numPr>
-      </w:pPr>
-      <w:r>
-        <w:t xml:space="preserve">Matuschak, A. (n.d.). Evergreen Notes. Andy’s Working Notes. https://notes.andymatuschak.org/z4SDCZQeRo4xFEQ8H4qrSqd68ucpgE6LU155C</w:t>
-      </w:r>
-    </w:p>
-    <w:p>
-      <w:pPr>
-        <w:numPr>
-          <w:ilvl w:val="0"/>
-          <w:numId w:val="1040"/>
-        </w:numPr>
-      </w:pPr>
-      <w:r>
-        <w:t xml:space="preserve">MIME types (IANA media types). (2022). Mozilla Foundation. https://developer.mozilla.org/en-US/docs/Web/HTTP/Basics_of_HTTP/MIME_types</w:t>
-      </w:r>
-    </w:p>
-    <w:p>
-      <w:pPr>
-        <w:numPr>
-          <w:ilvl w:val="0"/>
-          <w:numId w:val="1040"/>
-        </w:numPr>
+          <w:numId w:val="1048"/>
+        </w:numPr>
+        <w:pStyle w:val="Compact"/>
+      </w:pPr>
+      <w:r>
+        <w:t xml:space="preserve">Revol, F. (n.d.). Haiku, a desktop you can still learn from. 19.</w:t>
+      </w:r>
+    </w:p>
+    <w:p>
+      <w:pPr>
+        <w:numPr>
+          <w:ilvl w:val="0"/>
+          <w:numId w:val="1048"/>
+        </w:numPr>
+        <w:pStyle w:val="Compact"/>
       </w:pPr>
       <w:r>
         <w:t xml:space="preserve">Revol, F. (2017, February 7). Haiku, a desktop you can still learn from. https://archive.fosdem.org/2017/schedule/event/desktops_haiku_desktop_still_learn_from/attachments/slides/1826/export/events/attachments/desktops_haiku_desktop_still_learn_from/slides/1826/FR_FOSDEM2017_Haiku.pdf</w:t>
@@ -4966,8 +6264,33 @@
       <w:pPr>
         <w:numPr>
           <w:ilvl w:val="0"/>
-          <w:numId w:val="1040"/>
-        </w:numPr>
+          <w:numId w:val="1048"/>
+        </w:numPr>
+        <w:pStyle w:val="Compact"/>
+      </w:pPr>
+      <w:r>
+        <w:t xml:space="preserve">schema.org, V. (2022a, March 17). Data Model—Schema.org. https://schema.org/docs/datamodel.html</w:t>
+      </w:r>
+    </w:p>
+    <w:p>
+      <w:pPr>
+        <w:numPr>
+          <w:ilvl w:val="0"/>
+          <w:numId w:val="1048"/>
+        </w:numPr>
+        <w:pStyle w:val="Compact"/>
+      </w:pPr>
+      <w:r>
+        <w:t xml:space="preserve">schema.org, V. (2022b, March 17). Schema.org—Schemas—Schema.org. https://schema.org/docs/schemas.html</w:t>
+      </w:r>
+    </w:p>
+    <w:p>
+      <w:pPr>
+        <w:numPr>
+          <w:ilvl w:val="0"/>
+          <w:numId w:val="1048"/>
+        </w:numPr>
+        <w:pStyle w:val="Compact"/>
       </w:pPr>
       <w:r>
         <w:t xml:space="preserve">Silverston, L. (2020, November 18). Zen and the Art of Data Maintenance: Data ’Mine’ing and Universal Data Semantics. The Data Administration Newsletter. https://tdan.com/zen-and-the-art-of-data-maintenance-data-mineing-and-universal-data-semantics/27543</w:t>
@@ -4977,8 +6300,9 @@
       <w:pPr>
         <w:numPr>
           <w:ilvl w:val="0"/>
-          <w:numId w:val="1040"/>
-        </w:numPr>
+          <w:numId w:val="1048"/>
+        </w:numPr>
+        <w:pStyle w:val="Compact"/>
       </w:pPr>
       <w:r>
         <w:t xml:space="preserve">Sporny, M. (2020, July 16). JSON-LD 1.1. https://www.w3.org/TR/json-ld/</w:t>
@@ -4988,8 +6312,9 @@
       <w:pPr>
         <w:numPr>
           <w:ilvl w:val="0"/>
-          <w:numId w:val="1040"/>
-        </w:numPr>
+          <w:numId w:val="1048"/>
+        </w:numPr>
+        <w:pStyle w:val="Compact"/>
       </w:pPr>
       <w:r>
         <w:t xml:space="preserve">Telburt, J. (2022, February 16). Data Speaks for Itself: Data Littering. The Data Administration Newsletter. https://tdan.com/data-speaks-for-itself-data-littering/29122</w:t>
@@ -4999,8 +6324,21 @@
       <w:pPr>
         <w:numPr>
           <w:ilvl w:val="0"/>
-          <w:numId w:val="1040"/>
-        </w:numPr>
+          <w:numId w:val="1048"/>
+        </w:numPr>
+        <w:pStyle w:val="Compact"/>
+      </w:pPr>
+      <w:r>
+        <w:t xml:space="preserve">Various. (2022). MIME types (IANA media types). Mozilla Foundation. https://developer.mozilla.org/en-US/docs/Web/HTTP/Basics_of_HTTP/MIME_types</w:t>
+      </w:r>
+    </w:p>
+    <w:p>
+      <w:pPr>
+        <w:numPr>
+          <w:ilvl w:val="0"/>
+          <w:numId w:val="1048"/>
+        </w:numPr>
+        <w:pStyle w:val="Compact"/>
       </w:pPr>
       <w:r>
         <w:t xml:space="preserve">Vef, M.-A., Steiner, R., Salkhordeh, R., Steinkamp, J., Vennetier, F., Smigielski, J.-F., &amp; Brinkmann, A. (2020). DelveFS - An Event-Driven Semantic File System for Object Stores. 2020 IEEE International Conference on Cluster Computing (CLUSTER), 35–46. https://doi.org/10.1109/CLUSTER49012.2020.00014</w:t>
@@ -5010,14 +6348,15 @@
       <w:pPr>
         <w:numPr>
           <w:ilvl w:val="0"/>
-          <w:numId w:val="1040"/>
-        </w:numPr>
+          <w:numId w:val="1048"/>
+        </w:numPr>
+        <w:pStyle w:val="Compact"/>
       </w:pPr>
       <w:r>
         <w:t xml:space="preserve">W3C. (n.d.). WebAnnotation Home. WebAnnotation: Retrieved September 21, 2022, from http://webannotation.org/</w:t>
       </w:r>
     </w:p>
-    <w:bookmarkEnd w:id="76"/>
+    <w:bookmarkEnd w:id="82"/>
     <w:sectPr/>
   </w:body>
 </w:document>
@@ -5298,6 +6637,9 @@
     <w:abstractNumId w:val="991"/>
   </w:num>
   <w:num w:numId="1004">
+    <w:abstractNumId w:val="991"/>
+  </w:num>
+  <w:num w:numId="1005">
     <w:abstractNumId w:val="99411"/>
     <w:lvlOverride w:ilvl="0">
       <w:startOverride w:val="1"/>
@@ -5326,9 +6668,6 @@
     <w:lvlOverride w:ilvl="8">
       <w:startOverride w:val="1"/>
     </w:lvlOverride>
-  </w:num>
-  <w:num w:numId="1005">
-    <w:abstractNumId w:val="991"/>
   </w:num>
   <w:num w:numId="1006">
     <w:abstractNumId w:val="991"/>
@@ -5433,6 +6772,30 @@
     <w:abstractNumId w:val="991"/>
   </w:num>
   <w:num w:numId="1040">
+    <w:abstractNumId w:val="991"/>
+  </w:num>
+  <w:num w:numId="1041">
+    <w:abstractNumId w:val="991"/>
+  </w:num>
+  <w:num w:numId="1042">
+    <w:abstractNumId w:val="991"/>
+  </w:num>
+  <w:num w:numId="1043">
+    <w:abstractNumId w:val="991"/>
+  </w:num>
+  <w:num w:numId="1044">
+    <w:abstractNumId w:val="991"/>
+  </w:num>
+  <w:num w:numId="1045">
+    <w:abstractNumId w:val="991"/>
+  </w:num>
+  <w:num w:numId="1046">
+    <w:abstractNumId w:val="991"/>
+  </w:num>
+  <w:num w:numId="1047">
+    <w:abstractNumId w:val="991"/>
+  </w:num>
+  <w:num w:numId="1048">
     <w:abstractNumId w:val="991"/>
   </w:num>
 </w:numbering>

</xml_diff>

<commit_message>
add data-centric manifesto, extend SEN and other sections
</commit_message>
<xml_diff>
--- a/output/Extending the Desktop into a Personal Knowledge Graph with SEN.docx
+++ b/output/Extending the Desktop into a Personal Knowledge Graph with SEN.docx
@@ -106,7 +106,7 @@
         <w:t xml:space="preserve"> </w:t>
       </w:r>
       <w:r>
-        <w:t xml:space="preserve">labelled connections on the surface.</w:t>
+        <w:t xml:space="preserve">labeled connections on the surface.</w:t>
       </w:r>
     </w:p>
     <w:p>
@@ -118,7 +118,7 @@
         <w:pStyle w:val="Compact"/>
       </w:pPr>
       <w:r>
-        <w:t xml:space="preserve">Also, not everything can or should be captured in note-taking applications and handled via cloud services, as sophisticated as they may have become.</w:t>
+        <w:t xml:space="preserve">Also, not everything can or should be captured in note-taking applications and handled via cloud services, as sophisticated as they may have become:</w:t>
       </w:r>
     </w:p>
     <w:p>
@@ -136,7 +136,7 @@
         <w:t xml:space="preserve"> </w:t>
       </w:r>
       <w:r>
-        <w:t xml:space="preserve">the data mey become inaccessible or unusable, at least connections and navigation are then lost.</w:t>
+        <w:t xml:space="preserve">the data may become inaccessible or unusable, at least connections and navigation are then lost.</w:t>
       </w:r>
     </w:p>
     <w:p>
@@ -178,7 +178,7 @@
         <w:t xml:space="preserve"> </w:t>
       </w:r>
       <w:r>
-        <w:t xml:space="preserve">ebooks, papers or other media, possibly restricted or private sources, and personal artifacts like project notes, ideas, concepts, or drafts.</w:t>
+        <w:t xml:space="preserve">e-books, papers or other media, possibly restricted or private sources, and personal artifacts like project notes, ideas, concepts, or drafts.</w:t>
       </w:r>
     </w:p>
     <w:p>
@@ -238,8 +238,101 @@
         <w:t xml:space="preserve">information, understand its connections, make them visible to the user and allow to navigate and query it.</w:t>
       </w:r>
     </w:p>
+    <w:p>
+      <w:pPr>
+        <w:numPr>
+          <w:ilvl w:val="0"/>
+          <w:numId w:val="1001"/>
+        </w:numPr>
+        <w:pStyle w:val="Compact"/>
+      </w:pPr>
+      <w:r>
+        <w:t xml:space="preserve">this requires an environment that puts</w:t>
+      </w:r>
+      <w:r>
+        <w:t xml:space="preserve"> </w:t>
+      </w:r>
+      <w:r>
+        <w:rPr>
+          <w:iCs/>
+          <w:i/>
+        </w:rPr>
+        <w:t xml:space="preserve">data</w:t>
+      </w:r>
+      <w:r>
+        <w:t xml:space="preserve"> </w:t>
+      </w:r>
+      <w:r>
+        <w:t xml:space="preserve">in a universal format at the center and lets applications access it via interfaces, which is also the approach championed by the</w:t>
+      </w:r>
+      <w:r>
+        <w:t xml:space="preserve"> </w:t>
+      </w:r>
+      <w:r>
+        <w:t xml:space="preserve">“</w:t>
+      </w:r>
+      <w:r>
+        <w:t xml:space="preserve">Data-Centric Manifesto</w:t>
+      </w:r>
+      <w:r>
+        <w:t xml:space="preserve">”</w:t>
+      </w:r>
+      <w:r>
+        <w:t xml:space="preserve"> </w:t>
+      </w:r>
+      <w:r>
+        <w:t xml:space="preserve">(Data-Centric Manifesto, n.d.), noting that:</w:t>
+      </w:r>
+    </w:p>
+    <w:p>
+      <w:pPr>
+        <w:pStyle w:val="BlockText"/>
+      </w:pPr>
+      <w:r>
+        <w:t xml:space="preserve">Data today is trapped in enterprise applications and web platforms.[…] The remedy is to flip this on its head. Data is the center of the universe; applications are ephemeral.</w:t>
+      </w:r>
+    </w:p>
+    <w:p>
+      <w:pPr>
+        <w:pStyle w:val="FirstParagraph"/>
+      </w:pPr>
+      <w:r>
+        <w:t xml:space="preserve">The manifesto lists several core principles, including the use of open standards, self-describing data, and having applications act as</w:t>
+      </w:r>
+      <w:r>
+        <w:t xml:space="preserve"> </w:t>
+      </w:r>
+      <w:r>
+        <w:t xml:space="preserve">“</w:t>
+      </w:r>
+      <w:r>
+        <w:t xml:space="preserve">visitors</w:t>
+      </w:r>
+      <w:r>
+        <w:t xml:space="preserve">”</w:t>
+      </w:r>
+      <w:r>
+        <w:t xml:space="preserve">, concluding that:</w:t>
+      </w:r>
+    </w:p>
+    <w:p>
+      <w:pPr>
+        <w:pStyle w:val="BlockText"/>
+      </w:pPr>
+      <w:r>
+        <w:t xml:space="preserve">The data landscape becomes an onion-like structure with raw or semi-processed data (think of a data lake or a triple store) and an ontology (think high-level data model) to interpret it and a guard (a layer that authorizes use and prevents bad things from happening to the data).</w:t>
+      </w:r>
+    </w:p>
+    <w:p>
+      <w:pPr>
+        <w:pStyle w:val="FirstParagraph"/>
+      </w:pPr>
+      <w:r>
+        <w:t xml:space="preserve">The next sections will illustrate how these pillars of a data-centric and user focused, open information space can be realized as extensions to an existing desktop operating system with a semantic extensions to an existing, modern file system and API.</w:t>
+      </w:r>
+    </w:p>
     <w:bookmarkEnd w:id="20"/>
-    <w:bookmarkStart w:id="22" w:name="X558bff0f62863f34fac60cb2517c2d79da2b05a"/>
+    <w:bookmarkStart w:id="24" w:name="X558bff0f62863f34fac60cb2517c2d79da2b05a"/>
     <w:p>
       <w:pPr>
         <w:pStyle w:val="Heading2"/>
@@ -256,6 +349,15 @@
         <w:t xml:space="preserve">Wise up your Workspace - Why a Personal Knowledge Graph should live in your personal desktop system</w:t>
       </w:r>
     </w:p>
+    <w:bookmarkStart w:id="21" w:name="goals-and-problems-addressed"/>
+    <w:p>
+      <w:pPr>
+        <w:pStyle w:val="Heading3"/>
+      </w:pPr>
+      <w:r>
+        <w:t xml:space="preserve">Goals and Problems Addressed</w:t>
+      </w:r>
+    </w:p>
     <w:p>
       <w:pPr>
         <w:numPr>
@@ -265,13 +367,7 @@
         <w:pStyle w:val="Compact"/>
       </w:pPr>
       <w:r>
-        <w:t xml:space="preserve">The most natural and feasible way to implement such a system would be to utilize a modern OS that provides a semantic</w:t>
-      </w:r>
-      <w:r>
-        <w:t xml:space="preserve"> </w:t>
-      </w:r>
-      <w:r>
-        <w:t xml:space="preserve">filesystem, with attributes and relations built-in.</w:t>
+        <w:t xml:space="preserve">The most natural and feasible way to implement such a system would be to utilize a modern OS that provides a semantic file system, with attributes and relations built-in.</w:t>
       </w:r>
     </w:p>
     <w:p>
@@ -283,7 +379,7 @@
         <w:pStyle w:val="Compact"/>
       </w:pPr>
       <w:r>
-        <w:t xml:space="preserve">Although many modern filesystems now support custom attributes as key/value pairs (</w:t>
+        <w:t xml:space="preserve">Although many modern file systems now support custom attributes as key/value pairs (</w:t>
       </w:r>
       <w:r>
         <w:t xml:space="preserve">“</w:t>
@@ -464,7 +560,7 @@
         <w:pStyle w:val="Compact"/>
       </w:pPr>
       <w:r>
-        <w:t xml:space="preserve">Instead of implementing query support and native support for relations beyond simple links directly in the filesystem layer,</w:t>
+        <w:t xml:space="preserve">Instead of implementing query support and native support for relations beyond simple links directly in the file system layer,</w:t>
       </w:r>
       <w:r>
         <w:t xml:space="preserve"> </w:t>
@@ -539,11 +635,21 @@
         <w:t xml:space="preserve">and operates daily, built on a file system that supports semantic queries or can be extended with minimum overhead.</w:t>
       </w:r>
     </w:p>
-    <w:p>
-      <w:pPr>
-        <w:numPr>
-          <w:ilvl w:val="0"/>
-          <w:numId w:val="1003"/>
+    <w:bookmarkEnd w:id="21"/>
+    <w:bookmarkStart w:id="23" w:name="a-possible-solution-sen"/>
+    <w:p>
+      <w:pPr>
+        <w:pStyle w:val="Heading3"/>
+      </w:pPr>
+      <w:r>
+        <w:t xml:space="preserve">A possible Solution: SEN</w:t>
+      </w:r>
+    </w:p>
+    <w:p>
+      <w:pPr>
+        <w:numPr>
+          <w:ilvl w:val="0"/>
+          <w:numId w:val="1005"/>
         </w:numPr>
         <w:pStyle w:val="Compact"/>
       </w:pPr>
@@ -571,7 +677,7 @@
       <w:r>
         <w:t xml:space="preserve"> </w:t>
       </w:r>
-      <w:hyperlink r:id="rId21"/>
+      <w:hyperlink r:id="rId22"/>
       <w:r>
         <w:t xml:space="preserve">. Files naturally represent entities, as the</w:t>
       </w:r>
@@ -579,7 +685,7 @@
         <w:t xml:space="preserve"> </w:t>
       </w:r>
       <w:r>
-        <w:t xml:space="preserve">type system is based on MIME types, properties of entities are stored in custom filesystem attributes, only relations</w:t>
+        <w:t xml:space="preserve">type system is based on MIME types, properties of entities are stored in custom file system attributes, only relations</w:t>
       </w:r>
       <w:r>
         <w:t xml:space="preserve"> </w:t>
@@ -598,7 +704,7 @@
       <w:pPr>
         <w:numPr>
           <w:ilvl w:val="0"/>
-          <w:numId w:val="1003"/>
+          <w:numId w:val="1005"/>
         </w:numPr>
         <w:pStyle w:val="Compact"/>
       </w:pPr>
@@ -616,7 +722,7 @@
       <w:pPr>
         <w:numPr>
           <w:ilvl w:val="0"/>
-          <w:numId w:val="1003"/>
+          <w:numId w:val="1005"/>
         </w:numPr>
         <w:pStyle w:val="Compact"/>
       </w:pPr>
@@ -640,7 +746,7 @@
       <w:pPr>
         <w:numPr>
           <w:ilvl w:val="0"/>
-          <w:numId w:val="1003"/>
+          <w:numId w:val="1005"/>
         </w:numPr>
         <w:pStyle w:val="Compact"/>
       </w:pPr>
@@ -654,8 +760,9 @@
         <w:t xml:space="preserve">real time. They are stored in separate attributes as a map of relation property key/values for each relation.</w:t>
       </w:r>
     </w:p>
-    <w:bookmarkEnd w:id="22"/>
-    <w:bookmarkStart w:id="26" w:name="X1d487602dbfc3bea2a485e10ad64f2eff313ae5"/>
+    <w:bookmarkEnd w:id="23"/>
+    <w:bookmarkEnd w:id="24"/>
+    <w:bookmarkStart w:id="28" w:name="X1d487602dbfc3bea2a485e10ad64f2eff313ae5"/>
     <w:p>
       <w:pPr>
         <w:pStyle w:val="Heading2"/>
@@ -664,7 +771,7 @@
         <w:t xml:space="preserve">How to Build it: The Pillars of the Proposed Solution</w:t>
       </w:r>
     </w:p>
-    <w:bookmarkStart w:id="23" w:name="design-philosophy-and-core-principles"/>
+    <w:bookmarkStart w:id="25" w:name="design-philosophy-and-core-principles"/>
     <w:p>
       <w:pPr>
         <w:pStyle w:val="Heading3"/>
@@ -677,7 +784,7 @@
       <w:pPr>
         <w:numPr>
           <w:ilvl w:val="0"/>
-          <w:numId w:val="1005"/>
+          <w:numId w:val="1006"/>
         </w:numPr>
         <w:pStyle w:val="Compact"/>
       </w:pPr>
@@ -699,7 +806,7 @@
       <w:pPr>
         <w:numPr>
           <w:ilvl w:val="0"/>
-          <w:numId w:val="1005"/>
+          <w:numId w:val="1006"/>
         </w:numPr>
         <w:pStyle w:val="Compact"/>
       </w:pPr>
@@ -721,7 +828,7 @@
       <w:pPr>
         <w:numPr>
           <w:ilvl w:val="0"/>
-          <w:numId w:val="1005"/>
+          <w:numId w:val="1006"/>
         </w:numPr>
         <w:pStyle w:val="Compact"/>
       </w:pPr>
@@ -743,7 +850,7 @@
       <w:pPr>
         <w:numPr>
           <w:ilvl w:val="0"/>
-          <w:numId w:val="1005"/>
+          <w:numId w:val="1006"/>
         </w:numPr>
         <w:pStyle w:val="Compact"/>
       </w:pPr>
@@ -761,8 +868,8 @@
         <w:t xml:space="preserve">system should be open for extension, but personal data is kept private and does not leave the personal system: extension through plugins (e.g., for extracting attributes and entities from files), for importing data (e.g., ontologies or individual entities from schema.org), and for exchanging data where explicitly requested (linked data between users).</w:t>
       </w:r>
     </w:p>
-    <w:bookmarkEnd w:id="23"/>
-    <w:bookmarkStart w:id="24" w:name="X0c0852df9f5b074af908037b0f0d4b18454c32b"/>
+    <w:bookmarkEnd w:id="25"/>
+    <w:bookmarkStart w:id="26" w:name="X0c0852df9f5b074af908037b0f0d4b18454c32b"/>
     <w:p>
       <w:pPr>
         <w:pStyle w:val="Heading3"/>
@@ -775,7 +882,7 @@
       <w:pPr>
         <w:numPr>
           <w:ilvl w:val="0"/>
-          <w:numId w:val="1006"/>
+          <w:numId w:val="1007"/>
         </w:numPr>
         <w:pStyle w:val="Compact"/>
       </w:pPr>
@@ -793,129 +900,6 @@
       </w:r>
       <w:r>
         <w:t xml:space="preserve">form of NEPOMUK (Bernardi et al., 2011), an ambitious EU funded research project.</w:t>
-      </w:r>
-    </w:p>
-    <w:p>
-      <w:pPr>
-        <w:numPr>
-          <w:ilvl w:val="1"/>
-          <w:numId w:val="1007"/>
-        </w:numPr>
-        <w:pStyle w:val="Compact"/>
-      </w:pPr>
-      <w:r>
-        <w:t xml:space="preserve">Over the course of the project lifetime, however, it quickly became a problem to use a full-fledged database and full-blown</w:t>
-      </w:r>
-      <w:r>
-        <w:t xml:space="preserve"> </w:t>
-      </w:r>
-      <w:r>
-        <w:t xml:space="preserve">standards like RDF even for simple files and metadata, and so a new generation of KDE search was realized (KDE’s Next Generation Semantic Search, 2014):</w:t>
-      </w:r>
-      <w:r>
-        <w:t xml:space="preserve"> </w:t>
-      </w:r>
-      <w:r>
-        <w:t xml:space="preserve">&gt; Instead of having a single RDF-based database for all information, Semantic Search now provides separate data stores</w:t>
-      </w:r>
-      <w:r>
-        <w:t xml:space="preserve"> </w:t>
-      </w:r>
-      <w:r>
-        <w:t xml:space="preserve">&gt; and search interfaces. This allows it to store and search each type of content in an optimal way.</w:t>
-      </w:r>
-    </w:p>
-    <w:p>
-      <w:pPr>
-        <w:numPr>
-          <w:ilvl w:val="1"/>
-          <w:numId w:val="1007"/>
-        </w:numPr>
-        <w:pStyle w:val="Compact"/>
-      </w:pPr>
-      <w:r>
-        <w:t xml:space="preserve">The latest incarnation follows a more lightweight and flexible architecture and uses a file indexing and search framework</w:t>
-      </w:r>
-      <w:r>
-        <w:t xml:space="preserve"> </w:t>
-      </w:r>
-      <w:r>
-        <w:t xml:space="preserve">called</w:t>
-      </w:r>
-      <w:r>
-        <w:t xml:space="preserve"> </w:t>
-      </w:r>
-      <w:r>
-        <w:t xml:space="preserve">“</w:t>
-      </w:r>
-      <w:r>
-        <w:t xml:space="preserve">Baloo</w:t>
-      </w:r>
-      <w:r>
-        <w:t xml:space="preserve">”</w:t>
-      </w:r>
-      <w:r>
-        <w:t xml:space="preserve"> </w:t>
-      </w:r>
-      <w:r>
-        <w:t xml:space="preserve">(Baloo - KDE Community Wiki, 2022)</w:t>
-      </w:r>
-      <w:r>
-        <w:t xml:space="preserve"> </w:t>
-      </w:r>
-      <w:r>
-        <w:t xml:space="preserve">“</w:t>
-      </w:r>
-      <w:r>
-        <w:t xml:space="preserve">with a focus on providing a very small memory footprint along with extremely fast searching.</w:t>
-      </w:r>
-      <w:r>
-        <w:t xml:space="preserve">”</w:t>
-      </w:r>
-      <w:r>
-        <w:t xml:space="preserve">,</w:t>
-      </w:r>
-      <w:r>
-        <w:t xml:space="preserve"> </w:t>
-      </w:r>
-      <w:r>
-        <w:t xml:space="preserve">indicating and fixing one of the major obstacles of semantic desktop adoption of previous efforts.</w:t>
-      </w:r>
-    </w:p>
-    <w:p>
-      <w:pPr>
-        <w:numPr>
-          <w:ilvl w:val="0"/>
-          <w:numId w:val="1006"/>
-        </w:numPr>
-        <w:pStyle w:val="Compact"/>
-      </w:pPr>
-      <w:r>
-        <w:t xml:space="preserve">Similar approaches were also tried in mainstream OS’s but failed, e.g., Microsoft’s WinFS (LSoft Technologies Inc., 2022) -</w:t>
-      </w:r>
-      <w:r>
-        <w:t xml:space="preserve"> </w:t>
-      </w:r>
-      <w:r>
-        <w:t xml:space="preserve">see also a critical but insightful discussion in (Orlowski, 2002) by the developers of the more successful and actually</w:t>
-      </w:r>
-      <w:r>
-        <w:t xml:space="preserve"> </w:t>
-      </w:r>
-      <w:r>
-        <w:t xml:space="preserve">fully realised BeOS File System BFS, which is detailed in the next section.</w:t>
-      </w:r>
-    </w:p>
-    <w:p>
-      <w:pPr>
-        <w:numPr>
-          <w:ilvl w:val="0"/>
-          <w:numId w:val="1006"/>
-        </w:numPr>
-        <w:pStyle w:val="Compact"/>
-      </w:pPr>
-      <w:r>
-        <w:t xml:space="preserve">To summarize, problems with current solutions can be roughly divided into the following categories:</w:t>
       </w:r>
     </w:p>
     <w:p>
@@ -927,6 +911,129 @@
         <w:pStyle w:val="Compact"/>
       </w:pPr>
       <w:r>
+        <w:t xml:space="preserve">Over the course of the project lifetime, however, it quickly became a problem to use a full-fledged database and full-blown</w:t>
+      </w:r>
+      <w:r>
+        <w:t xml:space="preserve"> </w:t>
+      </w:r>
+      <w:r>
+        <w:t xml:space="preserve">standards like RDF even for simple files and metadata, and so a new generation of KDE search was realized (KDE’s Next Generation Semantic Search, 2014):</w:t>
+      </w:r>
+      <w:r>
+        <w:t xml:space="preserve"> </w:t>
+      </w:r>
+      <w:r>
+        <w:t xml:space="preserve">&gt; Instead of having a single RDF-based database for all information, Semantic Search now provides separate data stores</w:t>
+      </w:r>
+      <w:r>
+        <w:t xml:space="preserve"> </w:t>
+      </w:r>
+      <w:r>
+        <w:t xml:space="preserve">&gt; and search interfaces. This allows it to store and search each type of content in an optimal way.</w:t>
+      </w:r>
+    </w:p>
+    <w:p>
+      <w:pPr>
+        <w:numPr>
+          <w:ilvl w:val="1"/>
+          <w:numId w:val="1008"/>
+        </w:numPr>
+        <w:pStyle w:val="Compact"/>
+      </w:pPr>
+      <w:r>
+        <w:t xml:space="preserve">The latest incarnation follows a more lightweight and flexible architecture and uses a file indexing and search framework</w:t>
+      </w:r>
+      <w:r>
+        <w:t xml:space="preserve"> </w:t>
+      </w:r>
+      <w:r>
+        <w:t xml:space="preserve">called</w:t>
+      </w:r>
+      <w:r>
+        <w:t xml:space="preserve"> </w:t>
+      </w:r>
+      <w:r>
+        <w:t xml:space="preserve">“</w:t>
+      </w:r>
+      <w:r>
+        <w:t xml:space="preserve">Baloo</w:t>
+      </w:r>
+      <w:r>
+        <w:t xml:space="preserve">”</w:t>
+      </w:r>
+      <w:r>
+        <w:t xml:space="preserve"> </w:t>
+      </w:r>
+      <w:r>
+        <w:t xml:space="preserve">(Baloo - KDE Community Wiki, 2022)</w:t>
+      </w:r>
+      <w:r>
+        <w:t xml:space="preserve"> </w:t>
+      </w:r>
+      <w:r>
+        <w:t xml:space="preserve">“</w:t>
+      </w:r>
+      <w:r>
+        <w:t xml:space="preserve">with a focus on providing a very small memory footprint along with extremely fast searching.</w:t>
+      </w:r>
+      <w:r>
+        <w:t xml:space="preserve">”</w:t>
+      </w:r>
+      <w:r>
+        <w:t xml:space="preserve">,</w:t>
+      </w:r>
+      <w:r>
+        <w:t xml:space="preserve"> </w:t>
+      </w:r>
+      <w:r>
+        <w:t xml:space="preserve">indicating and fixing one of the major obstacles of semantic desktop adoption of previous efforts.</w:t>
+      </w:r>
+    </w:p>
+    <w:p>
+      <w:pPr>
+        <w:numPr>
+          <w:ilvl w:val="0"/>
+          <w:numId w:val="1007"/>
+        </w:numPr>
+        <w:pStyle w:val="Compact"/>
+      </w:pPr>
+      <w:r>
+        <w:t xml:space="preserve">Similar approaches were also tried in mainstream OS’s but failed, e.g., Microsoft’s WinFS (LSoft Technologies Inc., 2022) -</w:t>
+      </w:r>
+      <w:r>
+        <w:t xml:space="preserve"> </w:t>
+      </w:r>
+      <w:r>
+        <w:t xml:space="preserve">see also a critical but insightful discussion in (Orlowski, 2002) by the developers of the more successful and actually</w:t>
+      </w:r>
+      <w:r>
+        <w:t xml:space="preserve"> </w:t>
+      </w:r>
+      <w:r>
+        <w:t xml:space="preserve">fully realised BeOS File System BFS, which is detailed in the next section.</w:t>
+      </w:r>
+    </w:p>
+    <w:p>
+      <w:pPr>
+        <w:numPr>
+          <w:ilvl w:val="0"/>
+          <w:numId w:val="1007"/>
+        </w:numPr>
+        <w:pStyle w:val="Compact"/>
+      </w:pPr>
+      <w:r>
+        <w:t xml:space="preserve">To summarize, problems with current solutions can be roughly divided into the following categories:</w:t>
+      </w:r>
+    </w:p>
+    <w:p>
+      <w:pPr>
+        <w:numPr>
+          <w:ilvl w:val="1"/>
+          <w:numId w:val="1009"/>
+        </w:numPr>
+        <w:pStyle w:val="Compact"/>
+      </w:pPr>
+      <w:r>
         <w:rPr>
           <w:iCs/>
           <w:i/>
@@ -977,7 +1084,7 @@
       <w:pPr>
         <w:numPr>
           <w:ilvl w:val="1"/>
-          <w:numId w:val="1008"/>
+          <w:numId w:val="1009"/>
         </w:numPr>
         <w:pStyle w:val="Compact"/>
       </w:pPr>
@@ -1017,7 +1124,7 @@
       <w:pPr>
         <w:numPr>
           <w:ilvl w:val="1"/>
-          <w:numId w:val="1008"/>
+          <w:numId w:val="1009"/>
         </w:numPr>
         <w:pStyle w:val="Compact"/>
       </w:pPr>
@@ -1051,7 +1158,7 @@
       <w:pPr>
         <w:numPr>
           <w:ilvl w:val="1"/>
-          <w:numId w:val="1008"/>
+          <w:numId w:val="1009"/>
         </w:numPr>
         <w:pStyle w:val="Compact"/>
       </w:pPr>
@@ -1087,8 +1194,8 @@
         <w:t xml:space="preserve">should be supported in a simple and intuitive way.</w:t>
       </w:r>
     </w:p>
-    <w:bookmarkEnd w:id="24"/>
-    <w:bookmarkStart w:id="25" w:name="beos---the-first-semantic-desktop-os"/>
+    <w:bookmarkEnd w:id="26"/>
+    <w:bookmarkStart w:id="27" w:name="beos---the-first-semantic-desktop-os"/>
     <w:p>
       <w:pPr>
         <w:pStyle w:val="Heading3"/>
@@ -1101,7 +1208,7 @@
       <w:pPr>
         <w:numPr>
           <w:ilvl w:val="0"/>
-          <w:numId w:val="1009"/>
+          <w:numId w:val="1010"/>
         </w:numPr>
         <w:pStyle w:val="Compact"/>
       </w:pPr>
@@ -1113,7 +1220,7 @@
       <w:pPr>
         <w:numPr>
           <w:ilvl w:val="0"/>
-          <w:numId w:val="1009"/>
+          <w:numId w:val="1010"/>
         </w:numPr>
         <w:pStyle w:val="Compact"/>
       </w:pPr>
@@ -1125,7 +1232,7 @@
       <w:pPr>
         <w:numPr>
           <w:ilvl w:val="0"/>
-          <w:numId w:val="1009"/>
+          <w:numId w:val="1010"/>
         </w:numPr>
         <w:pStyle w:val="Compact"/>
       </w:pPr>
@@ -1137,7 +1244,7 @@
       <w:pPr>
         <w:numPr>
           <w:ilvl w:val="0"/>
-          <w:numId w:val="1009"/>
+          <w:numId w:val="1010"/>
         </w:numPr>
         <w:pStyle w:val="Compact"/>
       </w:pPr>
@@ -1149,7 +1256,7 @@
       <w:pPr>
         <w:numPr>
           <w:ilvl w:val="0"/>
-          <w:numId w:val="1009"/>
+          <w:numId w:val="1010"/>
         </w:numPr>
         <w:pStyle w:val="Compact"/>
       </w:pPr>
@@ -1161,7 +1268,7 @@
       <w:pPr>
         <w:numPr>
           <w:ilvl w:val="0"/>
-          <w:numId w:val="1009"/>
+          <w:numId w:val="1010"/>
         </w:numPr>
         <w:pStyle w:val="Compact"/>
       </w:pPr>
@@ -1223,9 +1330,9 @@
         <w:t xml:space="preserve">&gt; references to, or be referenced by, any other thing.</w:t>
       </w:r>
     </w:p>
-    <w:bookmarkEnd w:id="25"/>
-    <w:bookmarkEnd w:id="26"/>
-    <w:bookmarkStart w:id="54" w:name="X3290e34828dd7663d4aaec316aa67ced6cbb7d6"/>
+    <w:bookmarkEnd w:id="27"/>
+    <w:bookmarkEnd w:id="28"/>
+    <w:bookmarkStart w:id="56" w:name="X3290e34828dd7663d4aaec316aa67ced6cbb7d6"/>
     <w:p>
       <w:pPr>
         <w:pStyle w:val="Heading2"/>
@@ -1238,7 +1345,7 @@
       <w:pPr>
         <w:numPr>
           <w:ilvl w:val="0"/>
-          <w:numId w:val="1010"/>
+          <w:numId w:val="1011"/>
         </w:numPr>
         <w:pStyle w:val="Compact"/>
       </w:pPr>
@@ -1250,7 +1357,7 @@
       <w:pPr>
         <w:numPr>
           <w:ilvl w:val="0"/>
-          <w:numId w:val="1010"/>
+          <w:numId w:val="1011"/>
         </w:numPr>
         <w:pStyle w:val="Compact"/>
       </w:pPr>
@@ -1264,7 +1371,7 @@
         <w:t xml:space="preserve">the concept of relations was deliberately omitted completely.</w:t>
       </w:r>
     </w:p>
-    <w:bookmarkStart w:id="27" w:name="X2b4ec292cff56f8479ccbef6a9920c8b5d9564d"/>
+    <w:bookmarkStart w:id="29" w:name="X2b4ec292cff56f8479ccbef6a9920c8b5d9564d"/>
     <w:p>
       <w:pPr>
         <w:pStyle w:val="Heading3"/>
@@ -1277,7 +1384,7 @@
       <w:pPr>
         <w:numPr>
           <w:ilvl w:val="0"/>
-          <w:numId w:val="1011"/>
+          <w:numId w:val="1012"/>
         </w:numPr>
         <w:pStyle w:val="Compact"/>
       </w:pPr>
@@ -1289,7 +1396,7 @@
       <w:pPr>
         <w:numPr>
           <w:ilvl w:val="0"/>
-          <w:numId w:val="1011"/>
+          <w:numId w:val="1012"/>
         </w:numPr>
         <w:pStyle w:val="Compact"/>
       </w:pPr>
@@ -1301,7 +1408,7 @@
       <w:pPr>
         <w:numPr>
           <w:ilvl w:val="0"/>
-          <w:numId w:val="1011"/>
+          <w:numId w:val="1012"/>
         </w:numPr>
         <w:pStyle w:val="Compact"/>
       </w:pPr>
@@ -1319,60 +1426,12 @@
       <w:pPr>
         <w:numPr>
           <w:ilvl w:val="0"/>
-          <w:numId w:val="1011"/>
+          <w:numId w:val="1012"/>
         </w:numPr>
         <w:pStyle w:val="Compact"/>
       </w:pPr>
       <w:r>
         <w:t xml:space="preserve">components used by SEN:</w:t>
-      </w:r>
-    </w:p>
-    <w:p>
-      <w:pPr>
-        <w:numPr>
-          <w:ilvl w:val="1"/>
-          <w:numId w:val="1012"/>
-        </w:numPr>
-        <w:pStyle w:val="Compact"/>
-      </w:pPr>
-      <w:r>
-        <w:t xml:space="preserve">Tracker</w:t>
-      </w:r>
-    </w:p>
-    <w:p>
-      <w:pPr>
-        <w:numPr>
-          <w:ilvl w:val="1"/>
-          <w:numId w:val="1012"/>
-        </w:numPr>
-        <w:pStyle w:val="Compact"/>
-      </w:pPr>
-      <w:r>
-        <w:t xml:space="preserve">FileTypes</w:t>
-      </w:r>
-    </w:p>
-    <w:p>
-      <w:pPr>
-        <w:numPr>
-          <w:ilvl w:val="1"/>
-          <w:numId w:val="1012"/>
-        </w:numPr>
-        <w:pStyle w:val="Compact"/>
-      </w:pPr>
-      <w:r>
-        <w:t xml:space="preserve">Filesystem API</w:t>
-      </w:r>
-    </w:p>
-    <w:p>
-      <w:pPr>
-        <w:numPr>
-          <w:ilvl w:val="0"/>
-          <w:numId w:val="1011"/>
-        </w:numPr>
-        <w:pStyle w:val="Compact"/>
-      </w:pPr>
-      <w:r>
-        <w:t xml:space="preserve">mapping SEN concepts</w:t>
       </w:r>
     </w:p>
     <w:p>
@@ -1384,7 +1443,7 @@
         <w:pStyle w:val="Compact"/>
       </w:pPr>
       <w:r>
-        <w:t xml:space="preserve">File types</w:t>
+        <w:t xml:space="preserve">Tracker</w:t>
       </w:r>
     </w:p>
     <w:p>
@@ -1396,7 +1455,7 @@
         <w:pStyle w:val="Compact"/>
       </w:pPr>
       <w:r>
-        <w:t xml:space="preserve">Attributes</w:t>
+        <w:t xml:space="preserve">FileTypes</w:t>
       </w:r>
     </w:p>
     <w:p>
@@ -1408,6 +1467,54 @@
         <w:pStyle w:val="Compact"/>
       </w:pPr>
       <w:r>
+        <w:t xml:space="preserve">Filesystem API</w:t>
+      </w:r>
+    </w:p>
+    <w:p>
+      <w:pPr>
+        <w:numPr>
+          <w:ilvl w:val="0"/>
+          <w:numId w:val="1012"/>
+        </w:numPr>
+        <w:pStyle w:val="Compact"/>
+      </w:pPr>
+      <w:r>
+        <w:t xml:space="preserve">mapping SEN concepts</w:t>
+      </w:r>
+    </w:p>
+    <w:p>
+      <w:pPr>
+        <w:numPr>
+          <w:ilvl w:val="1"/>
+          <w:numId w:val="1014"/>
+        </w:numPr>
+        <w:pStyle w:val="Compact"/>
+      </w:pPr>
+      <w:r>
+        <w:t xml:space="preserve">File types</w:t>
+      </w:r>
+    </w:p>
+    <w:p>
+      <w:pPr>
+        <w:numPr>
+          <w:ilvl w:val="1"/>
+          <w:numId w:val="1014"/>
+        </w:numPr>
+        <w:pStyle w:val="Compact"/>
+      </w:pPr>
+      <w:r>
+        <w:t xml:space="preserve">Attributes</w:t>
+      </w:r>
+    </w:p>
+    <w:p>
+      <w:pPr>
+        <w:numPr>
+          <w:ilvl w:val="1"/>
+          <w:numId w:val="1014"/>
+        </w:numPr>
+        <w:pStyle w:val="Compact"/>
+      </w:pPr>
+      <w:r>
         <w:t xml:space="preserve">Queries</w:t>
       </w:r>
     </w:p>
@@ -1415,7 +1522,7 @@
       <w:pPr>
         <w:numPr>
           <w:ilvl w:val="0"/>
-          <w:numId w:val="1011"/>
+          <w:numId w:val="1012"/>
         </w:numPr>
         <w:pStyle w:val="Compact"/>
       </w:pPr>
@@ -1423,8 +1530,8 @@
         <w:t xml:space="preserve">picks up concepts from BeOS for filesystem based metadata handling and search</w:t>
       </w:r>
     </w:p>
-    <w:bookmarkEnd w:id="27"/>
-    <w:bookmarkStart w:id="32" w:name="basic-architecture"/>
+    <w:bookmarkEnd w:id="29"/>
+    <w:bookmarkStart w:id="34" w:name="basic-architecture"/>
     <w:p>
       <w:pPr>
         <w:pStyle w:val="Heading3"/>
@@ -1437,7 +1544,7 @@
       <w:pPr>
         <w:numPr>
           <w:ilvl w:val="0"/>
-          <w:numId w:val="1014"/>
+          <w:numId w:val="1015"/>
         </w:numPr>
       </w:pPr>
       <w:r>
@@ -1493,24 +1600,24 @@
           <wp:inline>
             <wp:extent cx="5334000" cy="3192000"/>
             <wp:effectExtent b="0" l="0" r="0" t="0"/>
-            <wp:docPr descr="SEN-Haiku Integration" title="simple overview on integration of SEN into Haiku" id="29" name="Picture"/>
+            <wp:docPr descr="SEN-Haiku Integration" title="simple overview on integration of SEN into Haiku" id="31" name="Picture"/>
             <a:graphic>
               <a:graphicData uri="http://schemas.openxmlformats.org/drawingml/2006/picture">
                 <pic:pic>
                   <pic:nvPicPr>
-                    <pic:cNvPr descr="images/sen-os-app-integration.svg" id="30" name="Picture"/>
+                    <pic:cNvPr descr="images/sen-os-app-integration.svg" id="32" name="Picture"/>
                     <pic:cNvPicPr>
                       <a:picLocks noChangeArrowheads="1" noChangeAspect="1"/>
                     </pic:cNvPicPr>
                   </pic:nvPicPr>
                   <pic:blipFill>
-                    <a:blip r:embed="rId31">
+                    <a:blip r:embed="rId33">
                       <a:extLst>
                         <a:ext uri="{28A0092B-C50C-407E-A947-70E740481C1C}">
                           <a14:useLocalDpi xmlns:a14="http://schemas.microsoft.com/office/drawing/2010/main" val="0"/>
                         </a:ext>
                         <a:ext uri="{96DAC541-7B7A-43D3-8B79-37D633B846F1}">
-                          <asvg:svgBlip xmlns:asvg="http://schemas.microsoft.com/office/drawing/2016/SVG/main" r:embed="rId28"/>
+                          <asvg:svgBlip xmlns:asvg="http://schemas.microsoft.com/office/drawing/2016/SVG/main" r:embed="rId30"/>
                         </a:ext>
                       </a:extLst>
                     </a:blip>
@@ -1544,7 +1651,7 @@
       <w:pPr>
         <w:numPr>
           <w:ilvl w:val="0"/>
-          <w:numId w:val="1014"/>
+          <w:numId w:val="1015"/>
         </w:numPr>
       </w:pPr>
       <w:r>
@@ -1569,8 +1676,8 @@
         <w:t xml:space="preserve">in Haiku)</w:t>
       </w:r>
     </w:p>
-    <w:bookmarkEnd w:id="32"/>
-    <w:bookmarkStart w:id="33" w:name="relations---the-missing-link"/>
+    <w:bookmarkEnd w:id="34"/>
+    <w:bookmarkStart w:id="35" w:name="relations---the-missing-link"/>
     <w:p>
       <w:pPr>
         <w:pStyle w:val="Heading3"/>
@@ -1583,7 +1690,7 @@
       <w:pPr>
         <w:numPr>
           <w:ilvl w:val="0"/>
-          <w:numId w:val="1015"/>
+          <w:numId w:val="1016"/>
         </w:numPr>
         <w:pStyle w:val="Compact"/>
       </w:pPr>
@@ -1595,7 +1702,7 @@
       <w:pPr>
         <w:numPr>
           <w:ilvl w:val="1"/>
-          <w:numId w:val="1016"/>
+          <w:numId w:val="1017"/>
         </w:numPr>
         <w:pStyle w:val="Compact"/>
       </w:pPr>
@@ -1613,7 +1720,7 @@
       <w:pPr>
         <w:numPr>
           <w:ilvl w:val="1"/>
-          <w:numId w:val="1016"/>
+          <w:numId w:val="1017"/>
         </w:numPr>
         <w:pStyle w:val="Compact"/>
       </w:pPr>
@@ -1631,7 +1738,7 @@
       <w:pPr>
         <w:numPr>
           <w:ilvl w:val="1"/>
-          <w:numId w:val="1016"/>
+          <w:numId w:val="1017"/>
         </w:numPr>
         <w:pStyle w:val="Compact"/>
       </w:pPr>
@@ -1696,8 +1803,8 @@
         <w:t xml:space="preserve">type in Haiku)</w:t>
       </w:r>
     </w:p>
-    <w:bookmarkEnd w:id="33"/>
-    <w:bookmarkStart w:id="34" w:name="queries---resolving-relations"/>
+    <w:bookmarkEnd w:id="35"/>
+    <w:bookmarkStart w:id="36" w:name="queries---resolving-relations"/>
     <w:p>
       <w:pPr>
         <w:pStyle w:val="Heading3"/>
@@ -1710,7 +1817,7 @@
       <w:pPr>
         <w:numPr>
           <w:ilvl w:val="0"/>
-          <w:numId w:val="1017"/>
+          <w:numId w:val="1018"/>
         </w:numPr>
         <w:pStyle w:val="Compact"/>
       </w:pPr>
@@ -1752,129 +1859,6 @@
       </w:r>
       <w:r>
         <w:t xml:space="preserve">of the relation source.</w:t>
-      </w:r>
-    </w:p>
-    <w:p>
-      <w:pPr>
-        <w:numPr>
-          <w:ilvl w:val="1"/>
-          <w:numId w:val="1018"/>
-        </w:numPr>
-        <w:pStyle w:val="Compact"/>
-      </w:pPr>
-      <w:r>
-        <w:t xml:space="preserve">e.g. for resolving all relations of type</w:t>
-      </w:r>
-      <w:r>
-        <w:t xml:space="preserve"> </w:t>
-      </w:r>
-      <w:r>
-        <w:rPr>
-          <w:rStyle w:val="VerbatimChar"/>
-        </w:rPr>
-        <w:t xml:space="preserve">contributesTo</w:t>
-      </w:r>
-      <w:r>
-        <w:t xml:space="preserve"> </w:t>
-      </w:r>
-      <w:r>
-        <w:t xml:space="preserve">of a file entity with</w:t>
-      </w:r>
-      <w:r>
-        <w:t xml:space="preserve"> </w:t>
-      </w:r>
-      <w:r>
-        <w:rPr>
-          <w:rStyle w:val="VerbatimChar"/>
-        </w:rPr>
-        <w:t xml:space="preserve">SEN_ID</w:t>
-      </w:r>
-      <w:r>
-        <w:t xml:space="preserve"> </w:t>
-      </w:r>
-      <w:r>
-        <w:t xml:space="preserve">of</w:t>
-      </w:r>
-      <w:r>
-        <w:t xml:space="preserve"> </w:t>
-      </w:r>
-      <w:r>
-        <w:rPr>
-          <w:rStyle w:val="VerbatimChar"/>
-        </w:rPr>
-        <w:t xml:space="preserve">0815</w:t>
-      </w:r>
-      <w:r>
-        <w:t xml:space="preserve">, the SEN server</w:t>
-      </w:r>
-      <w:r>
-        <w:t xml:space="preserve"> </w:t>
-      </w:r>
-      <w:r>
-        <w:t xml:space="preserve">executes a native filesystem query using the Haiku filesystem API to find all files with a</w:t>
-      </w:r>
-      <w:r>
-        <w:t xml:space="preserve"> </w:t>
-      </w:r>
-      <w:r>
-        <w:rPr>
-          <w:rStyle w:val="VerbatimChar"/>
-        </w:rPr>
-        <w:t xml:space="preserve">SEN_REL_TARGETS</w:t>
-      </w:r>
-      <w:r>
-        <w:t xml:space="preserve"> </w:t>
-      </w:r>
-      <w:r>
-        <w:t xml:space="preserve">attribute</w:t>
-      </w:r>
-      <w:r>
-        <w:t xml:space="preserve"> </w:t>
-      </w:r>
-      <w:r>
-        <w:t xml:space="preserve">containing the String</w:t>
-      </w:r>
-      <w:r>
-        <w:t xml:space="preserve"> </w:t>
-      </w:r>
-      <w:r>
-        <w:rPr>
-          <w:rStyle w:val="VerbatimChar"/>
-        </w:rPr>
-        <w:t xml:space="preserve">0815</w:t>
-      </w:r>
-      <w:r>
-        <w:t xml:space="preserve">, where multiple targets are simply comma-separated.</w:t>
-      </w:r>
-    </w:p>
-    <w:p>
-      <w:pPr>
-        <w:numPr>
-          <w:ilvl w:val="0"/>
-          <w:numId w:val="1017"/>
-        </w:numPr>
-        <w:pStyle w:val="Compact"/>
-      </w:pPr>
-      <w:r>
-        <w:t xml:space="preserve">There is also a simple Query UI that allows users to enter queries through a search field and specify various options</w:t>
-      </w:r>
-      <w:r>
-        <w:t xml:space="preserve"> </w:t>
-      </w:r>
-      <w:r>
-        <w:t xml:space="preserve">to narrow down the query.</w:t>
-      </w:r>
-    </w:p>
-    <w:p>
-      <w:pPr>
-        <w:numPr>
-          <w:ilvl w:val="0"/>
-          <w:numId w:val="1017"/>
-        </w:numPr>
-        <w:pStyle w:val="Compact"/>
-      </w:pPr>
-      <w:r>
-        <w:t xml:space="preserve">For better performance, attributes need to be indexed, so they can be found through queries.</w:t>
       </w:r>
     </w:p>
     <w:p>
@@ -1886,6 +1870,129 @@
         <w:pStyle w:val="Compact"/>
       </w:pPr>
       <w:r>
+        <w:t xml:space="preserve">e.g. for resolving all relations of type</w:t>
+      </w:r>
+      <w:r>
+        <w:t xml:space="preserve"> </w:t>
+      </w:r>
+      <w:r>
+        <w:rPr>
+          <w:rStyle w:val="VerbatimChar"/>
+        </w:rPr>
+        <w:t xml:space="preserve">contributesTo</w:t>
+      </w:r>
+      <w:r>
+        <w:t xml:space="preserve"> </w:t>
+      </w:r>
+      <w:r>
+        <w:t xml:space="preserve">of a file entity with</w:t>
+      </w:r>
+      <w:r>
+        <w:t xml:space="preserve"> </w:t>
+      </w:r>
+      <w:r>
+        <w:rPr>
+          <w:rStyle w:val="VerbatimChar"/>
+        </w:rPr>
+        <w:t xml:space="preserve">SEN_ID</w:t>
+      </w:r>
+      <w:r>
+        <w:t xml:space="preserve"> </w:t>
+      </w:r>
+      <w:r>
+        <w:t xml:space="preserve">of</w:t>
+      </w:r>
+      <w:r>
+        <w:t xml:space="preserve"> </w:t>
+      </w:r>
+      <w:r>
+        <w:rPr>
+          <w:rStyle w:val="VerbatimChar"/>
+        </w:rPr>
+        <w:t xml:space="preserve">0815</w:t>
+      </w:r>
+      <w:r>
+        <w:t xml:space="preserve">, the SEN server</w:t>
+      </w:r>
+      <w:r>
+        <w:t xml:space="preserve"> </w:t>
+      </w:r>
+      <w:r>
+        <w:t xml:space="preserve">executes a native filesystem query using the Haiku filesystem API to find all files with a</w:t>
+      </w:r>
+      <w:r>
+        <w:t xml:space="preserve"> </w:t>
+      </w:r>
+      <w:r>
+        <w:rPr>
+          <w:rStyle w:val="VerbatimChar"/>
+        </w:rPr>
+        <w:t xml:space="preserve">SEN_REL_TARGETS</w:t>
+      </w:r>
+      <w:r>
+        <w:t xml:space="preserve"> </w:t>
+      </w:r>
+      <w:r>
+        <w:t xml:space="preserve">attribute</w:t>
+      </w:r>
+      <w:r>
+        <w:t xml:space="preserve"> </w:t>
+      </w:r>
+      <w:r>
+        <w:t xml:space="preserve">containing the String</w:t>
+      </w:r>
+      <w:r>
+        <w:t xml:space="preserve"> </w:t>
+      </w:r>
+      <w:r>
+        <w:rPr>
+          <w:rStyle w:val="VerbatimChar"/>
+        </w:rPr>
+        <w:t xml:space="preserve">0815</w:t>
+      </w:r>
+      <w:r>
+        <w:t xml:space="preserve">, where multiple targets are simply comma-separated.</w:t>
+      </w:r>
+    </w:p>
+    <w:p>
+      <w:pPr>
+        <w:numPr>
+          <w:ilvl w:val="0"/>
+          <w:numId w:val="1018"/>
+        </w:numPr>
+        <w:pStyle w:val="Compact"/>
+      </w:pPr>
+      <w:r>
+        <w:t xml:space="preserve">There is also a simple Query UI that allows users to enter queries through a search field and specify various options</w:t>
+      </w:r>
+      <w:r>
+        <w:t xml:space="preserve"> </w:t>
+      </w:r>
+      <w:r>
+        <w:t xml:space="preserve">to narrow down the query.</w:t>
+      </w:r>
+    </w:p>
+    <w:p>
+      <w:pPr>
+        <w:numPr>
+          <w:ilvl w:val="0"/>
+          <w:numId w:val="1018"/>
+        </w:numPr>
+        <w:pStyle w:val="Compact"/>
+      </w:pPr>
+      <w:r>
+        <w:t xml:space="preserve">For better performance, attributes need to be indexed, so they can be found through queries.</w:t>
+      </w:r>
+    </w:p>
+    <w:p>
+      <w:pPr>
+        <w:numPr>
+          <w:ilvl w:val="1"/>
+          <w:numId w:val="1020"/>
+        </w:numPr>
+        <w:pStyle w:val="Compact"/>
+      </w:pPr>
+      <w:r>
         <w:t xml:space="preserve">SEN only indices the</w:t>
       </w:r>
       <w:r>
@@ -1929,7 +2036,7 @@
       <w:pPr>
         <w:numPr>
           <w:ilvl w:val="1"/>
-          <w:numId w:val="1019"/>
+          <w:numId w:val="1020"/>
         </w:numPr>
         <w:pStyle w:val="Compact"/>
       </w:pPr>
@@ -1967,8 +2074,8 @@
         <w:t xml:space="preserve">efficient naming scheme and structure for attribute values, as detailed below).</w:t>
       </w:r>
     </w:p>
-    <w:bookmarkEnd w:id="34"/>
-    <w:bookmarkStart w:id="38" w:name="X184f3310ddaf22c0c8c2996a143d967cfebb1e6"/>
+    <w:bookmarkEnd w:id="36"/>
+    <w:bookmarkStart w:id="40" w:name="X184f3310ddaf22c0c8c2996a143d967cfebb1e6"/>
     <w:p>
       <w:pPr>
         <w:pStyle w:val="Heading3"/>
@@ -1981,7 +2088,7 @@
       <w:pPr>
         <w:numPr>
           <w:ilvl w:val="0"/>
-          <w:numId w:val="1020"/>
+          <w:numId w:val="1021"/>
         </w:numPr>
         <w:pStyle w:val="Compact"/>
       </w:pPr>
@@ -1999,7 +2106,7 @@
       <w:pPr>
         <w:numPr>
           <w:ilvl w:val="0"/>
-          <w:numId w:val="1020"/>
+          <w:numId w:val="1021"/>
         </w:numPr>
         <w:pStyle w:val="Compact"/>
       </w:pPr>
@@ -2021,7 +2128,7 @@
       <w:pPr>
         <w:numPr>
           <w:ilvl w:val="1"/>
-          <w:numId w:val="1021"/>
+          <w:numId w:val="1022"/>
         </w:numPr>
         <w:pStyle w:val="Compact"/>
       </w:pPr>
@@ -2059,145 +2166,145 @@
       <w:pPr>
         <w:numPr>
           <w:ilvl w:val="2"/>
+          <w:numId w:val="1023"/>
+        </w:numPr>
+        <w:pStyle w:val="Compact"/>
+      </w:pPr>
+      <w:r>
+        <w:t xml:space="preserve">Configuration is already handled through a well-defined OS file attribute</w:t>
+      </w:r>
+      <w:r>
+        <w:t xml:space="preserve"> </w:t>
+      </w:r>
+      <w:r>
+        <w:rPr>
+          <w:rStyle w:val="VerbatimChar"/>
+        </w:rPr>
+        <w:t xml:space="preserve">BEOS:TYPE</w:t>
+      </w:r>
+      <w:r>
+        <w:t xml:space="preserve"> </w:t>
+      </w:r>
+      <w:r>
+        <w:t xml:space="preserve">and a user-facing</w:t>
+      </w:r>
+      <w:r>
+        <w:t xml:space="preserve"> </w:t>
+      </w:r>
+      <w:r>
+        <w:t xml:space="preserve">settings application</w:t>
+      </w:r>
+    </w:p>
+    <w:p>
+      <w:pPr>
+        <w:numPr>
+          <w:ilvl w:val="2"/>
+          <w:numId w:val="1023"/>
+        </w:numPr>
+        <w:pStyle w:val="Compact"/>
+      </w:pPr>
+      <w:r>
+        <w:t xml:space="preserve">The OS natively uses standard MIME types (MIME Types (IANA Media Types), 2022) for identifying the file types, as</w:t>
+      </w:r>
+      <w:r>
+        <w:t xml:space="preserve"> </w:t>
+      </w:r>
+      <w:r>
+        <w:t xml:space="preserve">described in Humdinger, B. (2009b).</w:t>
+      </w:r>
+    </w:p>
+    <w:p>
+      <w:pPr>
+        <w:numPr>
+          <w:ilvl w:val="2"/>
+          <w:numId w:val="1023"/>
+        </w:numPr>
+        <w:pStyle w:val="Compact"/>
+      </w:pPr>
+      <w:r>
+        <w:t xml:space="preserve">File name extensions as used in other operating systems are purely optional in Haiku, as the OS uses a MIME database</w:t>
+      </w:r>
+      <w:r>
+        <w:t xml:space="preserve"> </w:t>
+      </w:r>
+      <w:r>
+        <w:t xml:space="preserve">and checks the file’s type attribute for a match.</w:t>
+      </w:r>
+    </w:p>
+    <w:p>
+      <w:pPr>
+        <w:numPr>
+          <w:ilvl w:val="2"/>
+          <w:numId w:val="1023"/>
+        </w:numPr>
+        <w:pStyle w:val="Compact"/>
+      </w:pPr>
+      <w:r>
+        <w:t xml:space="preserve">The file type is detected by inspecting the file itself, using MIME type sniffing, e.g. parsing magic byes.</w:t>
+      </w:r>
+      <w:r>
+        <w:t xml:space="preserve"> </w:t>
+      </w:r>
+      <w:r>
+        <w:t xml:space="preserve">Extensions are only a fallback, if all else fails.</w:t>
+      </w:r>
+    </w:p>
+    <w:p>
+      <w:pPr>
+        <w:numPr>
+          <w:ilvl w:val="2"/>
+          <w:numId w:val="1023"/>
+        </w:numPr>
+        <w:pStyle w:val="Compact"/>
+      </w:pPr>
+      <w:r>
+        <w:t xml:space="preserve">File attributes map to our Entity properties, see Humdinger, B. (2009a) for details and illustrations on how</w:t>
+      </w:r>
+      <w:r>
+        <w:t xml:space="preserve"> </w:t>
+      </w:r>
+      <w:r>
+        <w:t xml:space="preserve">this is realised in Haiku.</w:t>
+      </w:r>
+    </w:p>
+    <w:p>
+      <w:pPr>
+        <w:numPr>
+          <w:ilvl w:val="2"/>
+          <w:numId w:val="1023"/>
+        </w:numPr>
+        <w:pStyle w:val="Compact"/>
+      </w:pPr>
+      <w:r>
+        <w:t xml:space="preserve">(Melnikov, 2022) defines all officially registered MIME types, which provide a wide variety of media types</w:t>
+      </w:r>
+      <w:r>
+        <w:t xml:space="preserve"> </w:t>
+      </w:r>
+      <w:r>
+        <w:t xml:space="preserve">(and hence entity classes), but for desktop use, custom entity types can be defined as valid MIME types using the</w:t>
+      </w:r>
+      <w:r>
+        <w:t xml:space="preserve"> </w:t>
+      </w:r>
+      <w:r>
+        <w:rPr>
+          <w:rStyle w:val="VerbatimChar"/>
+        </w:rPr>
+        <w:t xml:space="preserve">application/vnd.</w:t>
+      </w:r>
+      <w:r>
+        <w:t xml:space="preserve"> </w:t>
+      </w:r>
+      <w:r>
+        <w:t xml:space="preserve">namespace.</w:t>
+      </w:r>
+    </w:p>
+    <w:p>
+      <w:pPr>
+        <w:numPr>
+          <w:ilvl w:val="1"/>
           <w:numId w:val="1022"/>
-        </w:numPr>
-        <w:pStyle w:val="Compact"/>
-      </w:pPr>
-      <w:r>
-        <w:t xml:space="preserve">Configuration is already handled through a well-defined OS file attribute</w:t>
-      </w:r>
-      <w:r>
-        <w:t xml:space="preserve"> </w:t>
-      </w:r>
-      <w:r>
-        <w:rPr>
-          <w:rStyle w:val="VerbatimChar"/>
-        </w:rPr>
-        <w:t xml:space="preserve">BEOS:TYPE</w:t>
-      </w:r>
-      <w:r>
-        <w:t xml:space="preserve"> </w:t>
-      </w:r>
-      <w:r>
-        <w:t xml:space="preserve">and a user-facing</w:t>
-      </w:r>
-      <w:r>
-        <w:t xml:space="preserve"> </w:t>
-      </w:r>
-      <w:r>
-        <w:t xml:space="preserve">settings application</w:t>
-      </w:r>
-    </w:p>
-    <w:p>
-      <w:pPr>
-        <w:numPr>
-          <w:ilvl w:val="2"/>
-          <w:numId w:val="1022"/>
-        </w:numPr>
-        <w:pStyle w:val="Compact"/>
-      </w:pPr>
-      <w:r>
-        <w:t xml:space="preserve">The OS natively uses standard MIME types (MIME Types (IANA Media Types), 2022) for identifying the file types, as</w:t>
-      </w:r>
-      <w:r>
-        <w:t xml:space="preserve"> </w:t>
-      </w:r>
-      <w:r>
-        <w:t xml:space="preserve">described in Humdinger, B. (2009b).</w:t>
-      </w:r>
-    </w:p>
-    <w:p>
-      <w:pPr>
-        <w:numPr>
-          <w:ilvl w:val="2"/>
-          <w:numId w:val="1022"/>
-        </w:numPr>
-        <w:pStyle w:val="Compact"/>
-      </w:pPr>
-      <w:r>
-        <w:t xml:space="preserve">File name extensions as used in other operating systems are purely optional in Haiku, as the OS uses a MIME database</w:t>
-      </w:r>
-      <w:r>
-        <w:t xml:space="preserve"> </w:t>
-      </w:r>
-      <w:r>
-        <w:t xml:space="preserve">and checks the file’s type attribute for a match.</w:t>
-      </w:r>
-    </w:p>
-    <w:p>
-      <w:pPr>
-        <w:numPr>
-          <w:ilvl w:val="2"/>
-          <w:numId w:val="1022"/>
-        </w:numPr>
-        <w:pStyle w:val="Compact"/>
-      </w:pPr>
-      <w:r>
-        <w:t xml:space="preserve">The file type is detected by inspecting the file itself, using MIME type sniffing, e.g. parsing magic byes.</w:t>
-      </w:r>
-      <w:r>
-        <w:t xml:space="preserve"> </w:t>
-      </w:r>
-      <w:r>
-        <w:t xml:space="preserve">Extensions are only a fallback, if all else fails.</w:t>
-      </w:r>
-    </w:p>
-    <w:p>
-      <w:pPr>
-        <w:numPr>
-          <w:ilvl w:val="2"/>
-          <w:numId w:val="1022"/>
-        </w:numPr>
-        <w:pStyle w:val="Compact"/>
-      </w:pPr>
-      <w:r>
-        <w:t xml:space="preserve">File attributes map to our Entity properties, see Humdinger, B. (2009a) for details and illustrations on how</w:t>
-      </w:r>
-      <w:r>
-        <w:t xml:space="preserve"> </w:t>
-      </w:r>
-      <w:r>
-        <w:t xml:space="preserve">this is realised in Haiku.</w:t>
-      </w:r>
-    </w:p>
-    <w:p>
-      <w:pPr>
-        <w:numPr>
-          <w:ilvl w:val="2"/>
-          <w:numId w:val="1022"/>
-        </w:numPr>
-        <w:pStyle w:val="Compact"/>
-      </w:pPr>
-      <w:r>
-        <w:t xml:space="preserve">(Melnikov, 2022) defines all officially registered MIME types, which provide a wide variety of media types</w:t>
-      </w:r>
-      <w:r>
-        <w:t xml:space="preserve"> </w:t>
-      </w:r>
-      <w:r>
-        <w:t xml:space="preserve">(and hence entity classes), but for desktop use, custom entity types can be defined as valid MIME types using the</w:t>
-      </w:r>
-      <w:r>
-        <w:t xml:space="preserve"> </w:t>
-      </w:r>
-      <w:r>
-        <w:rPr>
-          <w:rStyle w:val="VerbatimChar"/>
-        </w:rPr>
-        <w:t xml:space="preserve">application/vnd.</w:t>
-      </w:r>
-      <w:r>
-        <w:t xml:space="preserve"> </w:t>
-      </w:r>
-      <w:r>
-        <w:t xml:space="preserve">namespace.</w:t>
-      </w:r>
-    </w:p>
-    <w:p>
-      <w:pPr>
-        <w:numPr>
-          <w:ilvl w:val="1"/>
-          <w:numId w:val="1021"/>
         </w:numPr>
         <w:pStyle w:val="Compact"/>
       </w:pPr>
@@ -2237,7 +2344,7 @@
       <w:pPr>
         <w:numPr>
           <w:ilvl w:val="1"/>
-          <w:numId w:val="1021"/>
+          <w:numId w:val="1022"/>
         </w:numPr>
         <w:pStyle w:val="Compact"/>
       </w:pPr>
@@ -2382,7 +2489,7 @@
       <w:pPr>
         <w:numPr>
           <w:ilvl w:val="1"/>
-          <w:numId w:val="1021"/>
+          <w:numId w:val="1022"/>
         </w:numPr>
         <w:pStyle w:val="Compact"/>
       </w:pPr>
@@ -2392,7 +2499,7 @@
       <w:r>
         <w:t xml:space="preserve"> </w:t>
       </w:r>
-      <w:hyperlink r:id="rId35">
+      <w:hyperlink r:id="rId37">
         <w:r>
           <w:rPr>
             <w:rStyle w:val="Hyperlink"/>
@@ -2445,7 +2552,7 @@
       <w:r>
         <w:t xml:space="preserve"> </w:t>
       </w:r>
-      <w:hyperlink r:id="rId36">
+      <w:hyperlink r:id="rId38">
         <w:r>
           <w:rPr>
             <w:rStyle w:val="Hyperlink"/>
@@ -2464,7 +2571,7 @@
       <w:pPr>
         <w:numPr>
           <w:ilvl w:val="1"/>
-          <w:numId w:val="1021"/>
+          <w:numId w:val="1022"/>
         </w:numPr>
         <w:pStyle w:val="Compact"/>
       </w:pPr>
@@ -2474,7 +2581,7 @@
       <w:r>
         <w:t xml:space="preserve"> </w:t>
       </w:r>
-      <w:hyperlink r:id="rId37">
+      <w:hyperlink r:id="rId39">
         <w:r>
           <w:rPr>
             <w:rStyle w:val="Hyperlink"/>
@@ -2493,7 +2600,7 @@
       <w:pPr>
         <w:numPr>
           <w:ilvl w:val="0"/>
-          <w:numId w:val="1020"/>
+          <w:numId w:val="1021"/>
         </w:numPr>
         <w:pStyle w:val="Compact"/>
       </w:pPr>
@@ -2511,7 +2618,7 @@
       <w:pPr>
         <w:numPr>
           <w:ilvl w:val="0"/>
-          <w:numId w:val="1020"/>
+          <w:numId w:val="1021"/>
         </w:numPr>
         <w:pStyle w:val="Compact"/>
       </w:pPr>
@@ -2529,7 +2636,7 @@
       <w:pPr>
         <w:numPr>
           <w:ilvl w:val="1"/>
-          <w:numId w:val="1023"/>
+          <w:numId w:val="1024"/>
         </w:numPr>
         <w:pStyle w:val="Compact"/>
       </w:pPr>
@@ -2547,7 +2654,7 @@
       <w:pPr>
         <w:numPr>
           <w:ilvl w:val="1"/>
-          <w:numId w:val="1023"/>
+          <w:numId w:val="1024"/>
         </w:numPr>
         <w:pStyle w:val="Compact"/>
       </w:pPr>
@@ -2559,7 +2666,7 @@
       <w:pPr>
         <w:numPr>
           <w:ilvl w:val="2"/>
-          <w:numId w:val="1024"/>
+          <w:numId w:val="1025"/>
         </w:numPr>
         <w:pStyle w:val="Compact"/>
       </w:pPr>
@@ -2571,7 +2678,7 @@
       <w:pPr>
         <w:numPr>
           <w:ilvl w:val="2"/>
-          <w:numId w:val="1024"/>
+          <w:numId w:val="1025"/>
         </w:numPr>
         <w:pStyle w:val="Compact"/>
       </w:pPr>
@@ -2579,8 +2686,8 @@
         <w:t xml:space="preserve">references to other text files, people, locations, concepts or media sources (like books, movies, or songs).</w:t>
       </w:r>
     </w:p>
-    <w:bookmarkEnd w:id="38"/>
-    <w:bookmarkStart w:id="43" w:name="example-pkg-books-authors-and-publishers"/>
+    <w:bookmarkEnd w:id="40"/>
+    <w:bookmarkStart w:id="45" w:name="example-pkg-books-authors-and-publishers"/>
     <w:p>
       <w:pPr>
         <w:pStyle w:val="Heading3"/>
@@ -2593,7 +2700,7 @@
       <w:pPr>
         <w:numPr>
           <w:ilvl w:val="0"/>
-          <w:numId w:val="1025"/>
+          <w:numId w:val="1026"/>
         </w:numPr>
         <w:pStyle w:val="Compact"/>
       </w:pPr>
@@ -2644,7 +2751,7 @@
       <w:pPr>
         <w:numPr>
           <w:ilvl w:val="0"/>
-          <w:numId w:val="1025"/>
+          <w:numId w:val="1026"/>
         </w:numPr>
         <w:pStyle w:val="Compact"/>
       </w:pPr>
@@ -2717,7 +2824,7 @@
       <w:pPr>
         <w:numPr>
           <w:ilvl w:val="0"/>
-          <w:numId w:val="1025"/>
+          <w:numId w:val="1026"/>
         </w:numPr>
         <w:pStyle w:val="Compact"/>
       </w:pPr>
@@ -2729,7 +2836,7 @@
       <w:pPr>
         <w:numPr>
           <w:ilvl w:val="0"/>
-          <w:numId w:val="1025"/>
+          <w:numId w:val="1026"/>
         </w:numPr>
         <w:pStyle w:val="Compact"/>
       </w:pPr>
@@ -2747,7 +2854,7 @@
       <w:pPr>
         <w:numPr>
           <w:ilvl w:val="1"/>
-          <w:numId w:val="1026"/>
+          <w:numId w:val="1027"/>
         </w:numPr>
         <w:pStyle w:val="Compact"/>
       </w:pPr>
@@ -2771,7 +2878,7 @@
       <w:pPr>
         <w:numPr>
           <w:ilvl w:val="1"/>
-          <w:numId w:val="1026"/>
+          <w:numId w:val="1027"/>
         </w:numPr>
         <w:pStyle w:val="Compact"/>
       </w:pPr>
@@ -2801,7 +2908,7 @@
       <w:pPr>
         <w:numPr>
           <w:ilvl w:val="1"/>
-          <w:numId w:val="1026"/>
+          <w:numId w:val="1027"/>
         </w:numPr>
         <w:pStyle w:val="Compact"/>
       </w:pPr>
@@ -2839,24 +2946,24 @@
           <wp:inline>
             <wp:extent cx="5334000" cy="2770203"/>
             <wp:effectExtent b="0" l="0" r="0" t="0"/>
-            <wp:docPr descr="Book Graph" title="a simple authoring graph" id="40" name="Picture"/>
+            <wp:docPr descr="Book Graph" title="a simple authoring graph" id="42" name="Picture"/>
             <a:graphic>
               <a:graphicData uri="http://schemas.openxmlformats.org/drawingml/2006/picture">
                 <pic:pic>
                   <pic:nvPicPr>
-                    <pic:cNvPr descr="images/book-graph.svg" id="41" name="Picture"/>
+                    <pic:cNvPr descr="images/book-graph.svg" id="43" name="Picture"/>
                     <pic:cNvPicPr>
                       <a:picLocks noChangeArrowheads="1" noChangeAspect="1"/>
                     </pic:cNvPicPr>
                   </pic:nvPicPr>
                   <pic:blipFill>
-                    <a:blip r:embed="rId42">
+                    <a:blip r:embed="rId44">
                       <a:extLst>
                         <a:ext uri="{28A0092B-C50C-407E-A947-70E740481C1C}">
                           <a14:useLocalDpi xmlns:a14="http://schemas.microsoft.com/office/drawing/2010/main" val="0"/>
                         </a:ext>
                         <a:ext uri="{96DAC541-7B7A-43D3-8B79-37D633B846F1}">
-                          <asvg:svgBlip xmlns:asvg="http://schemas.microsoft.com/office/drawing/2016/SVG/main" r:embed="rId39"/>
+                          <asvg:svgBlip xmlns:asvg="http://schemas.microsoft.com/office/drawing/2016/SVG/main" r:embed="rId41"/>
                         </a:ext>
                       </a:extLst>
                     </a:blip>
@@ -2898,7 +3005,7 @@
       <w:pPr>
         <w:numPr>
           <w:ilvl w:val="0"/>
-          <w:numId w:val="1027"/>
+          <w:numId w:val="1028"/>
         </w:numPr>
         <w:pStyle w:val="Compact"/>
       </w:pPr>
@@ -2925,7 +3032,7 @@
       <w:pPr>
         <w:numPr>
           <w:ilvl w:val="0"/>
-          <w:numId w:val="1027"/>
+          <w:numId w:val="1028"/>
         </w:numPr>
         <w:pStyle w:val="Compact"/>
       </w:pPr>
@@ -2980,7 +3087,7 @@
       <w:pPr>
         <w:numPr>
           <w:ilvl w:val="0"/>
-          <w:numId w:val="1027"/>
+          <w:numId w:val="1028"/>
         </w:numPr>
         <w:pStyle w:val="Compact"/>
       </w:pPr>
@@ -3196,7 +3303,7 @@
       <w:pPr>
         <w:numPr>
           <w:ilvl w:val="0"/>
-          <w:numId w:val="1028"/>
+          <w:numId w:val="1029"/>
         </w:numPr>
         <w:pStyle w:val="Compact"/>
       </w:pPr>
@@ -3409,7 +3516,7 @@
       <w:pPr>
         <w:numPr>
           <w:ilvl w:val="0"/>
-          <w:numId w:val="1029"/>
+          <w:numId w:val="1030"/>
         </w:numPr>
         <w:pStyle w:val="Compact"/>
       </w:pPr>
@@ -3802,8 +3909,8 @@
         </w:tc>
       </w:tr>
     </w:tbl>
-    <w:bookmarkEnd w:id="43"/>
-    <w:bookmarkStart w:id="48" w:name="example-notes-and-annotations"/>
+    <w:bookmarkEnd w:id="45"/>
+    <w:bookmarkStart w:id="50" w:name="example-notes-and-annotations"/>
     <w:p>
       <w:pPr>
         <w:pStyle w:val="Heading3"/>
@@ -3816,7 +3923,7 @@
       <w:pPr>
         <w:numPr>
           <w:ilvl w:val="0"/>
-          <w:numId w:val="1030"/>
+          <w:numId w:val="1031"/>
         </w:numPr>
         <w:pStyle w:val="Compact"/>
       </w:pPr>
@@ -3849,24 +3956,24 @@
           <wp:inline>
             <wp:extent cx="5334000" cy="2760728"/>
             <wp:effectExtent b="0" l="0" r="0" t="0"/>
-            <wp:docPr descr="Notes Graph" title="notes and annotations" id="45" name="Picture"/>
+            <wp:docPr descr="Notes Graph" title="notes and annotations" id="47" name="Picture"/>
             <a:graphic>
               <a:graphicData uri="http://schemas.openxmlformats.org/drawingml/2006/picture">
                 <pic:pic>
                   <pic:nvPicPr>
-                    <pic:cNvPr descr="images/text-annotation.svg" id="46" name="Picture"/>
+                    <pic:cNvPr descr="images/text-annotation.svg" id="48" name="Picture"/>
                     <pic:cNvPicPr>
                       <a:picLocks noChangeArrowheads="1" noChangeAspect="1"/>
                     </pic:cNvPicPr>
                   </pic:nvPicPr>
                   <pic:blipFill>
-                    <a:blip r:embed="rId47">
+                    <a:blip r:embed="rId49">
                       <a:extLst>
                         <a:ext uri="{28A0092B-C50C-407E-A947-70E740481C1C}">
                           <a14:useLocalDpi xmlns:a14="http://schemas.microsoft.com/office/drawing/2010/main" val="0"/>
                         </a:ext>
                         <a:ext uri="{96DAC541-7B7A-43D3-8B79-37D633B846F1}">
-                          <asvg:svgBlip xmlns:asvg="http://schemas.microsoft.com/office/drawing/2016/SVG/main" r:embed="rId44"/>
+                          <asvg:svgBlip xmlns:asvg="http://schemas.microsoft.com/office/drawing/2016/SVG/main" r:embed="rId46"/>
                         </a:ext>
                       </a:extLst>
                     </a:blip>
@@ -3908,7 +4015,7 @@
       <w:pPr>
         <w:numPr>
           <w:ilvl w:val="0"/>
-          <w:numId w:val="1031"/>
+          <w:numId w:val="1032"/>
         </w:numPr>
         <w:pStyle w:val="Compact"/>
       </w:pPr>
@@ -4111,7 +4218,7 @@
       <w:pPr>
         <w:numPr>
           <w:ilvl w:val="0"/>
-          <w:numId w:val="1032"/>
+          <w:numId w:val="1033"/>
         </w:numPr>
         <w:pStyle w:val="Compact"/>
       </w:pPr>
@@ -4178,7 +4285,7 @@
       <w:pPr>
         <w:numPr>
           <w:ilvl w:val="0"/>
-          <w:numId w:val="1032"/>
+          <w:numId w:val="1033"/>
         </w:numPr>
         <w:pStyle w:val="Compact"/>
       </w:pPr>
@@ -4359,8 +4466,8 @@
         </w:tc>
       </w:tr>
     </w:tbl>
-    <w:bookmarkEnd w:id="48"/>
-    <w:bookmarkStart w:id="53" w:name="ternary-relations"/>
+    <w:bookmarkEnd w:id="50"/>
+    <w:bookmarkStart w:id="55" w:name="ternary-relations"/>
     <w:p>
       <w:pPr>
         <w:pStyle w:val="Heading3"/>
@@ -4373,7 +4480,7 @@
       <w:pPr>
         <w:numPr>
           <w:ilvl w:val="0"/>
-          <w:numId w:val="1033"/>
+          <w:numId w:val="1034"/>
         </w:numPr>
         <w:pStyle w:val="Compact"/>
       </w:pPr>
@@ -4391,7 +4498,7 @@
       <w:pPr>
         <w:numPr>
           <w:ilvl w:val="0"/>
-          <w:numId w:val="1033"/>
+          <w:numId w:val="1034"/>
         </w:numPr>
         <w:pStyle w:val="Compact"/>
       </w:pPr>
@@ -4414,24 +4521,24 @@
           <wp:inline>
             <wp:extent cx="4219575" cy="2705100"/>
             <wp:effectExtent b="0" l="0" r="0" t="0"/>
-            <wp:docPr descr="Ternary Relations" title="supporting ternary relations" id="50" name="Picture"/>
+            <wp:docPr descr="Ternary Relations" title="supporting ternary relations" id="52" name="Picture"/>
             <a:graphic>
               <a:graphicData uri="http://schemas.openxmlformats.org/drawingml/2006/picture">
                 <pic:pic>
                   <pic:nvPicPr>
-                    <pic:cNvPr descr="images/ternary-relation.svg" id="51" name="Picture"/>
+                    <pic:cNvPr descr="images/ternary-relation.svg" id="53" name="Picture"/>
                     <pic:cNvPicPr>
                       <a:picLocks noChangeArrowheads="1" noChangeAspect="1"/>
                     </pic:cNvPicPr>
                   </pic:nvPicPr>
                   <pic:blipFill>
-                    <a:blip r:embed="rId52">
+                    <a:blip r:embed="rId54">
                       <a:extLst>
                         <a:ext uri="{28A0092B-C50C-407E-A947-70E740481C1C}">
                           <a14:useLocalDpi xmlns:a14="http://schemas.microsoft.com/office/drawing/2010/main" val="0"/>
                         </a:ext>
                         <a:ext uri="{96DAC541-7B7A-43D3-8B79-37D633B846F1}">
-                          <asvg:svgBlip xmlns:asvg="http://schemas.microsoft.com/office/drawing/2016/SVG/main" r:embed="rId49"/>
+                          <asvg:svgBlip xmlns:asvg="http://schemas.microsoft.com/office/drawing/2016/SVG/main" r:embed="rId51"/>
                         </a:ext>
                       </a:extLst>
                     </a:blip>
@@ -4473,7 +4580,7 @@
       <w:pPr>
         <w:numPr>
           <w:ilvl w:val="0"/>
-          <w:numId w:val="1034"/>
+          <w:numId w:val="1035"/>
         </w:numPr>
         <w:pStyle w:val="Compact"/>
       </w:pPr>
@@ -4530,7 +4637,7 @@
       <w:pPr>
         <w:numPr>
           <w:ilvl w:val="0"/>
-          <w:numId w:val="1034"/>
+          <w:numId w:val="1035"/>
         </w:numPr>
         <w:pStyle w:val="Compact"/>
       </w:pPr>
@@ -4578,7 +4685,7 @@
       <w:pPr>
         <w:numPr>
           <w:ilvl w:val="0"/>
-          <w:numId w:val="1034"/>
+          <w:numId w:val="1035"/>
         </w:numPr>
         <w:pStyle w:val="Compact"/>
       </w:pPr>
@@ -4592,9 +4699,9 @@
         <w:t xml:space="preserve">the same actor in different scenes, or the same location at different time codes.</w:t>
       </w:r>
     </w:p>
-    <w:bookmarkEnd w:id="53"/>
-    <w:bookmarkEnd w:id="54"/>
-    <w:bookmarkStart w:id="80" w:name="X8618f3316ecdb148ff6ecdd0d632cd5e904caed"/>
+    <w:bookmarkEnd w:id="55"/>
+    <w:bookmarkEnd w:id="56"/>
+    <w:bookmarkStart w:id="82" w:name="X8618f3316ecdb148ff6ecdd0d632cd5e904caed"/>
     <w:p>
       <w:pPr>
         <w:pStyle w:val="Heading2"/>
@@ -4603,7 +4710,7 @@
         <w:t xml:space="preserve">Desktop Use Cases and Examples - Re-modelling standard applications with SEN</w:t>
       </w:r>
     </w:p>
-    <w:bookmarkStart w:id="55" w:name="base-concepts"/>
+    <w:bookmarkStart w:id="57" w:name="base-concepts"/>
     <w:p>
       <w:pPr>
         <w:pStyle w:val="Heading3"/>
@@ -4616,7 +4723,7 @@
       <w:pPr>
         <w:numPr>
           <w:ilvl w:val="0"/>
-          <w:numId w:val="1035"/>
+          <w:numId w:val="1036"/>
         </w:numPr>
         <w:pStyle w:val="Compact"/>
       </w:pPr>
@@ -4628,7 +4735,7 @@
       <w:pPr>
         <w:numPr>
           <w:ilvl w:val="0"/>
-          <w:numId w:val="1035"/>
+          <w:numId w:val="1036"/>
         </w:numPr>
         <w:pStyle w:val="Compact"/>
       </w:pPr>
@@ -4640,7 +4747,7 @@
       <w:pPr>
         <w:numPr>
           <w:ilvl w:val="0"/>
-          <w:numId w:val="1035"/>
+          <w:numId w:val="1036"/>
         </w:numPr>
         <w:pStyle w:val="Compact"/>
       </w:pPr>
@@ -4676,7 +4783,7 @@
       <w:pPr>
         <w:numPr>
           <w:ilvl w:val="1"/>
-          <w:numId w:val="1036"/>
+          <w:numId w:val="1037"/>
         </w:numPr>
         <w:pStyle w:val="Compact"/>
       </w:pPr>
@@ -4708,8 +4815,8 @@
         <w:t xml:space="preserve">all targets of that relation in a separate window:</w:t>
       </w:r>
     </w:p>
-    <w:bookmarkEnd w:id="55"/>
-    <w:bookmarkStart w:id="60" w:name="X3f9509e5bf4b481dc76311344976c6e490be1d6"/>
+    <w:bookmarkEnd w:id="57"/>
+    <w:bookmarkStart w:id="62" w:name="X3f9509e5bf4b481dc76311344976c6e490be1d6"/>
     <w:p>
       <w:pPr>
         <w:pStyle w:val="Heading3"/>
@@ -4722,7 +4829,7 @@
       <w:pPr>
         <w:numPr>
           <w:ilvl w:val="0"/>
-          <w:numId w:val="1037"/>
+          <w:numId w:val="1038"/>
         </w:numPr>
       </w:pPr>
       <w:r>
@@ -4745,7 +4852,7 @@
       <w:pPr>
         <w:numPr>
           <w:ilvl w:val="0"/>
-          <w:numId w:val="1037"/>
+          <w:numId w:val="1038"/>
         </w:numPr>
       </w:pPr>
       <w:r>
@@ -4780,7 +4887,7 @@
       <w:pPr>
         <w:numPr>
           <w:ilvl w:val="1"/>
-          <w:numId w:val="1038"/>
+          <w:numId w:val="1039"/>
         </w:numPr>
         <w:pStyle w:val="Compact"/>
       </w:pPr>
@@ -4792,7 +4899,7 @@
       <w:pPr>
         <w:numPr>
           <w:ilvl w:val="1"/>
-          <w:numId w:val="1038"/>
+          <w:numId w:val="1039"/>
         </w:numPr>
         <w:pStyle w:val="Compact"/>
       </w:pPr>
@@ -4828,7 +4935,7 @@
       <w:pPr>
         <w:numPr>
           <w:ilvl w:val="1"/>
-          <w:numId w:val="1038"/>
+          <w:numId w:val="1039"/>
         </w:numPr>
         <w:pStyle w:val="Compact"/>
       </w:pPr>
@@ -4846,7 +4953,7 @@
       <w:pPr>
         <w:numPr>
           <w:ilvl w:val="1"/>
-          <w:numId w:val="1038"/>
+          <w:numId w:val="1039"/>
         </w:numPr>
         <w:pStyle w:val="Compact"/>
       </w:pPr>
@@ -4864,7 +4971,7 @@
       <w:pPr>
         <w:numPr>
           <w:ilvl w:val="1"/>
-          <w:numId w:val="1038"/>
+          <w:numId w:val="1039"/>
         </w:numPr>
         <w:pStyle w:val="Compact"/>
       </w:pPr>
@@ -4888,7 +4995,7 @@
       <w:pPr>
         <w:numPr>
           <w:ilvl w:val="1"/>
-          <w:numId w:val="1038"/>
+          <w:numId w:val="1039"/>
         </w:numPr>
         <w:pStyle w:val="Compact"/>
       </w:pPr>
@@ -4979,210 +5086,210 @@
       <w:pPr>
         <w:numPr>
           <w:ilvl w:val="1"/>
+          <w:numId w:val="1039"/>
+        </w:numPr>
+        <w:pStyle w:val="Compact"/>
+      </w:pPr>
+      <w:r>
+        <w:t xml:space="preserve">this kind of</w:t>
+      </w:r>
+      <w:r>
+        <w:t xml:space="preserve"> </w:t>
+      </w:r>
+      <w:r>
+        <w:t xml:space="preserve">“</w:t>
+      </w:r>
+      <w:r>
+        <w:t xml:space="preserve">deep linking</w:t>
+      </w:r>
+      <w:r>
+        <w:t xml:space="preserve">”</w:t>
+      </w:r>
+      <w:r>
+        <w:t xml:space="preserve"> </w:t>
+      </w:r>
+      <w:r>
+        <w:t xml:space="preserve">is supported through the extended scripting functionality in Haiku, which provides</w:t>
+      </w:r>
+      <w:r>
+        <w:t xml:space="preserve"> </w:t>
+      </w:r>
+      <w:r>
+        <w:t xml:space="preserve">a message-based extension mechanism for controlling various aspects of the system itself, and applications.</w:t>
+      </w:r>
+    </w:p>
+    <w:p>
+      <w:pPr>
+        <w:numPr>
+          <w:ilvl w:val="1"/>
+          <w:numId w:val="1039"/>
+        </w:numPr>
+        <w:pStyle w:val="Compact"/>
+      </w:pPr>
+      <w:r>
+        <w:t xml:space="preserve">there are well-defined standard Messages for simple operations like</w:t>
+      </w:r>
+      <w:r>
+        <w:t xml:space="preserve"> </w:t>
+      </w:r>
+      <w:r>
+        <w:rPr>
+          <w:rStyle w:val="VerbatimChar"/>
+        </w:rPr>
+        <w:t xml:space="preserve">OPEN</w:t>
+      </w:r>
+      <w:r>
+        <w:t xml:space="preserve"> </w:t>
+      </w:r>
+      <w:r>
+        <w:t xml:space="preserve">or</w:t>
+      </w:r>
+      <w:r>
+        <w:t xml:space="preserve"> </w:t>
+      </w:r>
+      <w:r>
+        <w:rPr>
+          <w:rStyle w:val="VerbatimChar"/>
+        </w:rPr>
+        <w:t xml:space="preserve">CLOSE</w:t>
+      </w:r>
+      <w:r>
+        <w:t xml:space="preserve">, but applications can support</w:t>
+      </w:r>
+      <w:r>
+        <w:t xml:space="preserve"> </w:t>
+      </w:r>
+      <w:r>
+        <w:t xml:space="preserve">any kind of custom messages, which can then be bundled in the form of</w:t>
+      </w:r>
+      <w:r>
+        <w:t xml:space="preserve"> </w:t>
+      </w:r>
+      <w:r>
+        <w:t xml:space="preserve">“</w:t>
+      </w:r>
+      <w:r>
+        <w:t xml:space="preserve">scripting suites</w:t>
+      </w:r>
+      <w:r>
+        <w:t xml:space="preserve">”</w:t>
+      </w:r>
+      <w:r>
+        <w:t xml:space="preserve">.</w:t>
+      </w:r>
+    </w:p>
+    <w:p>
+      <w:pPr>
+        <w:numPr>
+          <w:ilvl w:val="1"/>
+          <w:numId w:val="1039"/>
+        </w:numPr>
+        <w:pStyle w:val="Compact"/>
+      </w:pPr>
+      <w:r>
+        <w:t xml:space="preserve">to support the kind of navigation above, the standard PDF viewer needs to be extended to support opening a file</w:t>
+      </w:r>
+      <w:r>
+        <w:t xml:space="preserve"> </w:t>
+      </w:r>
+      <w:r>
+        <w:t xml:space="preserve">on a given page (e.g., by adding a property</w:t>
+      </w:r>
+      <w:r>
+        <w:t xml:space="preserve"> </w:t>
+      </w:r>
+      <w:r>
+        <w:rPr>
+          <w:rStyle w:val="VerbatimChar"/>
+        </w:rPr>
+        <w:t xml:space="preserve">page</w:t>
+      </w:r>
+      <w:r>
+        <w:t xml:space="preserve"> </w:t>
+      </w:r>
+      <w:r>
+        <w:t xml:space="preserve">to the standard</w:t>
+      </w:r>
+      <w:r>
+        <w:t xml:space="preserve"> </w:t>
+      </w:r>
+      <w:r>
+        <w:rPr>
+          <w:rStyle w:val="VerbatimChar"/>
+        </w:rPr>
+        <w:t xml:space="preserve">OPEN</w:t>
+      </w:r>
+      <w:r>
+        <w:t xml:space="preserve"> </w:t>
+      </w:r>
+      <w:r>
+        <w:t xml:space="preserve">message already supported), or the</w:t>
+      </w:r>
+      <w:r>
+        <w:t xml:space="preserve"> </w:t>
+      </w:r>
+      <w:r>
+        <w:t xml:space="preserve">web browser needs to support WebAnnotations and a way to show them for a given URL in a similar way, e.g.,</w:t>
+      </w:r>
+      <w:r>
+        <w:t xml:space="preserve"> </w:t>
+      </w:r>
+      <w:r>
+        <w:t xml:space="preserve">using an additional attribute like</w:t>
+      </w:r>
+      <w:r>
+        <w:t xml:space="preserve"> </w:t>
+      </w:r>
+      <w:r>
+        <w:rPr>
+          <w:rStyle w:val="VerbatimChar"/>
+        </w:rPr>
+        <w:t xml:space="preserve">annotation</w:t>
+      </w:r>
+      <w:r>
+        <w:t xml:space="preserve"> </w:t>
+      </w:r>
+      <w:r>
+        <w:t xml:space="preserve">for the</w:t>
+      </w:r>
+      <w:r>
+        <w:t xml:space="preserve"> </w:t>
+      </w:r>
+      <w:r>
+        <w:rPr>
+          <w:rStyle w:val="VerbatimChar"/>
+        </w:rPr>
+        <w:t xml:space="preserve">OPEN</w:t>
+      </w:r>
+      <w:r>
+        <w:t xml:space="preserve"> </w:t>
+      </w:r>
+      <w:r>
+        <w:t xml:space="preserve">message.</w:t>
+      </w:r>
+    </w:p>
+    <w:p>
+      <w:pPr>
+        <w:numPr>
+          <w:ilvl w:val="0"/>
           <w:numId w:val="1038"/>
         </w:numPr>
-        <w:pStyle w:val="Compact"/>
-      </w:pPr>
-      <w:r>
-        <w:t xml:space="preserve">this kind of</w:t>
-      </w:r>
-      <w:r>
-        <w:t xml:space="preserve"> </w:t>
-      </w:r>
-      <w:r>
-        <w:t xml:space="preserve">“</w:t>
-      </w:r>
-      <w:r>
-        <w:t xml:space="preserve">desktop deep linking</w:t>
-      </w:r>
-      <w:r>
-        <w:t xml:space="preserve">”</w:t>
-      </w:r>
-      <w:r>
-        <w:t xml:space="preserve"> </w:t>
-      </w:r>
-      <w:r>
-        <w:t xml:space="preserve">is supported through the extended scripting functionality in Haiku, which provides</w:t>
-      </w:r>
-      <w:r>
-        <w:t xml:space="preserve"> </w:t>
-      </w:r>
-      <w:r>
-        <w:t xml:space="preserve">a message-based extension mechanism for controlling various aspects of the system itself, and applications.</w:t>
-      </w:r>
-    </w:p>
-    <w:p>
-      <w:pPr>
-        <w:numPr>
-          <w:ilvl w:val="1"/>
+      </w:pPr>
+      <w:r>
+        <w:t xml:space="preserve">The figure below shows a simplified example of how users could navigate all references of a research paper or lecture</w:t>
+      </w:r>
+      <w:r>
+        <w:t xml:space="preserve"> </w:t>
+      </w:r>
+      <w:r>
+        <w:t xml:space="preserve">note, stored as different file types to represent related entities like web pages, PDF documents, books, or video presentations:</w:t>
+      </w:r>
+    </w:p>
+    <w:p>
+      <w:pPr>
+        <w:numPr>
+          <w:ilvl w:val="0"/>
           <w:numId w:val="1038"/>
-        </w:numPr>
-        <w:pStyle w:val="Compact"/>
-      </w:pPr>
-      <w:r>
-        <w:t xml:space="preserve">there are well-defined standard Messages for simple operations like</w:t>
-      </w:r>
-      <w:r>
-        <w:t xml:space="preserve"> </w:t>
-      </w:r>
-      <w:r>
-        <w:rPr>
-          <w:rStyle w:val="VerbatimChar"/>
-        </w:rPr>
-        <w:t xml:space="preserve">OPEN</w:t>
-      </w:r>
-      <w:r>
-        <w:t xml:space="preserve"> </w:t>
-      </w:r>
-      <w:r>
-        <w:t xml:space="preserve">or</w:t>
-      </w:r>
-      <w:r>
-        <w:t xml:space="preserve"> </w:t>
-      </w:r>
-      <w:r>
-        <w:rPr>
-          <w:rStyle w:val="VerbatimChar"/>
-        </w:rPr>
-        <w:t xml:space="preserve">CLOSE</w:t>
-      </w:r>
-      <w:r>
-        <w:t xml:space="preserve">, but applications can support</w:t>
-      </w:r>
-      <w:r>
-        <w:t xml:space="preserve"> </w:t>
-      </w:r>
-      <w:r>
-        <w:t xml:space="preserve">any kind of custom messages, which can then be bundled in the form of</w:t>
-      </w:r>
-      <w:r>
-        <w:t xml:space="preserve"> </w:t>
-      </w:r>
-      <w:r>
-        <w:t xml:space="preserve">“</w:t>
-      </w:r>
-      <w:r>
-        <w:t xml:space="preserve">scripting suites</w:t>
-      </w:r>
-      <w:r>
-        <w:t xml:space="preserve">”</w:t>
-      </w:r>
-      <w:r>
-        <w:t xml:space="preserve">.</w:t>
-      </w:r>
-    </w:p>
-    <w:p>
-      <w:pPr>
-        <w:numPr>
-          <w:ilvl w:val="1"/>
-          <w:numId w:val="1038"/>
-        </w:numPr>
-        <w:pStyle w:val="Compact"/>
-      </w:pPr>
-      <w:r>
-        <w:t xml:space="preserve">to support the kind of navigation above, the standard PDF viewer needs to be extended to support opening a file</w:t>
-      </w:r>
-      <w:r>
-        <w:t xml:space="preserve"> </w:t>
-      </w:r>
-      <w:r>
-        <w:t xml:space="preserve">on a given page (e.g., by adding a property</w:t>
-      </w:r>
-      <w:r>
-        <w:t xml:space="preserve"> </w:t>
-      </w:r>
-      <w:r>
-        <w:rPr>
-          <w:rStyle w:val="VerbatimChar"/>
-        </w:rPr>
-        <w:t xml:space="preserve">page</w:t>
-      </w:r>
-      <w:r>
-        <w:t xml:space="preserve"> </w:t>
-      </w:r>
-      <w:r>
-        <w:t xml:space="preserve">to the standard</w:t>
-      </w:r>
-      <w:r>
-        <w:t xml:space="preserve"> </w:t>
-      </w:r>
-      <w:r>
-        <w:rPr>
-          <w:rStyle w:val="VerbatimChar"/>
-        </w:rPr>
-        <w:t xml:space="preserve">OPEN</w:t>
-      </w:r>
-      <w:r>
-        <w:t xml:space="preserve"> </w:t>
-      </w:r>
-      <w:r>
-        <w:t xml:space="preserve">message already supported), or the</w:t>
-      </w:r>
-      <w:r>
-        <w:t xml:space="preserve"> </w:t>
-      </w:r>
-      <w:r>
-        <w:t xml:space="preserve">web browser needs to support WebAnnotations and a way to show them for a given URL in a similar way, e.g.,</w:t>
-      </w:r>
-      <w:r>
-        <w:t xml:space="preserve"> </w:t>
-      </w:r>
-      <w:r>
-        <w:t xml:space="preserve">using an additional attribute like</w:t>
-      </w:r>
-      <w:r>
-        <w:t xml:space="preserve"> </w:t>
-      </w:r>
-      <w:r>
-        <w:rPr>
-          <w:rStyle w:val="VerbatimChar"/>
-        </w:rPr>
-        <w:t xml:space="preserve">annotation</w:t>
-      </w:r>
-      <w:r>
-        <w:t xml:space="preserve"> </w:t>
-      </w:r>
-      <w:r>
-        <w:t xml:space="preserve">for the</w:t>
-      </w:r>
-      <w:r>
-        <w:t xml:space="preserve"> </w:t>
-      </w:r>
-      <w:r>
-        <w:rPr>
-          <w:rStyle w:val="VerbatimChar"/>
-        </w:rPr>
-        <w:t xml:space="preserve">OPEN</w:t>
-      </w:r>
-      <w:r>
-        <w:t xml:space="preserve"> </w:t>
-      </w:r>
-      <w:r>
-        <w:t xml:space="preserve">message.</w:t>
-      </w:r>
-    </w:p>
-    <w:p>
-      <w:pPr>
-        <w:numPr>
-          <w:ilvl w:val="0"/>
-          <w:numId w:val="1037"/>
-        </w:numPr>
-      </w:pPr>
-      <w:r>
-        <w:t xml:space="preserve">The figure below shows a simplified example of how users could navigate all references of a research paper or lecture</w:t>
-      </w:r>
-      <w:r>
-        <w:t xml:space="preserve"> </w:t>
-      </w:r>
-      <w:r>
-        <w:t xml:space="preserve">note, stored as different file types to represent related entities like web pages, PDF documents, books, or video presentations:</w:t>
-      </w:r>
-    </w:p>
-    <w:p>
-      <w:pPr>
-        <w:numPr>
-          <w:ilvl w:val="0"/>
-          <w:numId w:val="1037"/>
         </w:numPr>
         <w:pStyle w:val="CaptionedFigure"/>
       </w:pPr>
@@ -5191,24 +5298,24 @@
           <wp:inline>
             <wp:extent cx="5334000" cy="3149295"/>
             <wp:effectExtent b="0" l="0" r="0" t="0"/>
-            <wp:docPr descr="Relation Browser" title="browsing relation targets and their properties" id="57" name="Picture"/>
+            <wp:docPr descr="Relation Browser" title="browsing relation targets and their properties" id="59" name="Picture"/>
             <a:graphic>
               <a:graphicData uri="http://schemas.openxmlformats.org/drawingml/2006/picture">
                 <pic:pic>
                   <pic:nvPicPr>
-                    <pic:cNvPr descr="images/tracker-relations.svg" id="58" name="Picture"/>
+                    <pic:cNvPr descr="images/tracker-relations.svg" id="60" name="Picture"/>
                     <pic:cNvPicPr>
                       <a:picLocks noChangeArrowheads="1" noChangeAspect="1"/>
                     </pic:cNvPicPr>
                   </pic:nvPicPr>
                   <pic:blipFill>
-                    <a:blip r:embed="rId59">
+                    <a:blip r:embed="rId61">
                       <a:extLst>
                         <a:ext uri="{28A0092B-C50C-407E-A947-70E740481C1C}">
                           <a14:useLocalDpi xmlns:a14="http://schemas.microsoft.com/office/drawing/2010/main" val="0"/>
                         </a:ext>
                         <a:ext uri="{96DAC541-7B7A-43D3-8B79-37D633B846F1}">
-                          <asvg:svgBlip xmlns:asvg="http://schemas.microsoft.com/office/drawing/2016/SVG/main" r:embed="rId56"/>
+                          <asvg:svgBlip xmlns:asvg="http://schemas.microsoft.com/office/drawing/2016/SVG/main" r:embed="rId58"/>
                         </a:ext>
                       </a:extLst>
                     </a:blip>
@@ -5254,7 +5361,7 @@
       <w:pPr>
         <w:numPr>
           <w:ilvl w:val="0"/>
-          <w:numId w:val="1037"/>
+          <w:numId w:val="1038"/>
         </w:numPr>
       </w:pPr>
       <w:r>
@@ -5271,7 +5378,7 @@
       <w:pPr>
         <w:numPr>
           <w:ilvl w:val="1"/>
-          <w:numId w:val="1039"/>
+          <w:numId w:val="1040"/>
         </w:numPr>
         <w:pStyle w:val="Compact"/>
       </w:pPr>
@@ -5291,13 +5398,33 @@
         <w:t xml:space="preserve">“</w:t>
       </w:r>
       <w:r>
-        <w:t xml:space="preserve"> </w:t>
-      </w:r>
-      <w:r>
-        <w:t xml:space="preserve">Relations to</w:t>
-      </w:r>
-      <w:r>
-        <w:t xml:space="preserve"> </w:t>
+        <w:t xml:space="preserve">Relations of</w:t>
+      </w:r>
+      <w:r>
+        <w:t xml:space="preserve"> </w:t>
+      </w:r>
+      <w:r>
+        <w:rPr>
+          <w:iCs/>
+          <w:i/>
+        </w:rPr>
+        <w:t xml:space="preserve">Paper</w:t>
+      </w:r>
+      <w:r>
+        <w:t xml:space="preserve"> </w:t>
+      </w:r>
+      <w:r>
+        <w:t xml:space="preserve">to</w:t>
+      </w:r>
+      <w:r>
+        <w:t xml:space="preserve"> </w:t>
+      </w:r>
+      <w:r>
+        <w:rPr>
+          <w:iCs/>
+          <w:i/>
+        </w:rPr>
+        <w:t xml:space="preserve">Author</w:t>
       </w:r>
       <w:r>
         <w:t xml:space="preserve">”</w:t>
@@ -5315,6 +5442,13 @@
         <w:t xml:space="preserve">“</w:t>
       </w:r>
       <w:r>
+        <w:rPr>
+          <w:iCs/>
+          <w:i/>
+        </w:rPr>
+        <w:t xml:space="preserve">Annotation</w:t>
+      </w:r>
+      <w:r>
         <w:t xml:space="preserve"> </w:t>
       </w:r>
       <w:r>
@@ -5324,6 +5458,13 @@
         <w:t xml:space="preserve"> </w:t>
       </w:r>
       <w:r>
+        <w:rPr>
+          <w:iCs/>
+          <w:i/>
+        </w:rPr>
+        <w:t xml:space="preserve">Paper</w:t>
+      </w:r>
+      <w:r>
         <w:t xml:space="preserve">”</w:t>
       </w:r>
       <w:r>
@@ -5334,7 +5475,7 @@
       <w:pPr>
         <w:numPr>
           <w:ilvl w:val="1"/>
-          <w:numId w:val="1039"/>
+          <w:numId w:val="1040"/>
         </w:numPr>
         <w:pStyle w:val="Compact"/>
       </w:pPr>
@@ -5476,7 +5617,7 @@
       <w:pPr>
         <w:numPr>
           <w:ilvl w:val="0"/>
-          <w:numId w:val="1040"/>
+          <w:numId w:val="1041"/>
         </w:numPr>
         <w:pStyle w:val="Compact"/>
       </w:pPr>
@@ -5484,8 +5625,16 @@
         <w:t xml:space="preserve">[[Fig]].{14}.{13}.{This table illustrates a nested folder showing all outgoing links and properties of a ternary relation.}</w:t>
       </w:r>
     </w:p>
-    <w:bookmarkEnd w:id="60"/>
-    <w:bookmarkStart w:id="65" w:name="calendar"/>
+    <w:p>
+      <w:pPr>
+        <w:pStyle w:val="FirstParagraph"/>
+      </w:pPr>
+      <w:r>
+        <w:t xml:space="preserve">This navigation can be extended along the chain of relations, so users can navigate relations of a file in a relation targets view to another view showing relations of that file.</w:t>
+      </w:r>
+    </w:p>
+    <w:bookmarkEnd w:id="62"/>
+    <w:bookmarkStart w:id="67" w:name="calendar"/>
     <w:p>
       <w:pPr>
         <w:pStyle w:val="Heading3"/>
@@ -5498,7 +5647,7 @@
       <w:pPr>
         <w:numPr>
           <w:ilvl w:val="0"/>
-          <w:numId w:val="1041"/>
+          <w:numId w:val="1042"/>
         </w:numPr>
         <w:pStyle w:val="Compact"/>
       </w:pPr>
@@ -5510,7 +5659,7 @@
       <w:pPr>
         <w:numPr>
           <w:ilvl w:val="0"/>
-          <w:numId w:val="1041"/>
+          <w:numId w:val="1042"/>
         </w:numPr>
         <w:pStyle w:val="Compact"/>
       </w:pPr>
@@ -5540,37 +5689,37 @@
       <w:pPr>
         <w:numPr>
           <w:ilvl w:val="1"/>
+          <w:numId w:val="1043"/>
+        </w:numPr>
+        <w:pStyle w:val="Compact"/>
+      </w:pPr>
+      <w:r>
+        <w:t xml:space="preserve">clicking on a</w:t>
+      </w:r>
+      <w:r>
+        <w:t xml:space="preserve"> </w:t>
+      </w:r>
+      <w:r>
+        <w:t xml:space="preserve">“</w:t>
+      </w:r>
+      <w:r>
+        <w:t xml:space="preserve">calendar</w:t>
+      </w:r>
+      <w:r>
+        <w:t xml:space="preserve">”</w:t>
+      </w:r>
+      <w:r>
+        <w:t xml:space="preserve"> </w:t>
+      </w:r>
+      <w:r>
+        <w:t xml:space="preserve">icon in the desk bar (application launcher and info panel) would open a Tracker window with all event files having an event date of today.</w:t>
+      </w:r>
+    </w:p>
+    <w:p>
+      <w:pPr>
+        <w:numPr>
+          <w:ilvl w:val="0"/>
           <w:numId w:val="1042"/>
-        </w:numPr>
-        <w:pStyle w:val="Compact"/>
-      </w:pPr>
-      <w:r>
-        <w:t xml:space="preserve">clicking on a</w:t>
-      </w:r>
-      <w:r>
-        <w:t xml:space="preserve"> </w:t>
-      </w:r>
-      <w:r>
-        <w:t xml:space="preserve">“</w:t>
-      </w:r>
-      <w:r>
-        <w:t xml:space="preserve">calendar</w:t>
-      </w:r>
-      <w:r>
-        <w:t xml:space="preserve">”</w:t>
-      </w:r>
-      <w:r>
-        <w:t xml:space="preserve"> </w:t>
-      </w:r>
-      <w:r>
-        <w:t xml:space="preserve">icon in the desk bar (application launcher and info panel) would open a Tracker window with all event files having an event date of today.</w:t>
-      </w:r>
-    </w:p>
-    <w:p>
-      <w:pPr>
-        <w:numPr>
-          <w:ilvl w:val="0"/>
-          <w:numId w:val="1041"/>
         </w:numPr>
         <w:pStyle w:val="CaptionedFigure"/>
       </w:pPr>
@@ -5579,24 +5728,24 @@
           <wp:inline>
             <wp:extent cx="5334000" cy="2538747"/>
             <wp:effectExtent b="0" l="0" r="0" t="0"/>
-            <wp:docPr descr="Calendar Event Browser" title="browsing calendar entries" id="62" name="Picture"/>
+            <wp:docPr descr="Calendar Event Browser" title="browsing calendar entries" id="64" name="Picture"/>
             <a:graphic>
               <a:graphicData uri="http://schemas.openxmlformats.org/drawingml/2006/picture">
                 <pic:pic>
                   <pic:nvPicPr>
-                    <pic:cNvPr descr="images/calendar-browser.svg" id="63" name="Picture"/>
+                    <pic:cNvPr descr="images/calendar-browser.svg" id="65" name="Picture"/>
                     <pic:cNvPicPr>
                       <a:picLocks noChangeArrowheads="1" noChangeAspect="1"/>
                     </pic:cNvPicPr>
                   </pic:nvPicPr>
                   <pic:blipFill>
-                    <a:blip r:embed="rId64">
+                    <a:blip r:embed="rId66">
                       <a:extLst>
                         <a:ext uri="{28A0092B-C50C-407E-A947-70E740481C1C}">
                           <a14:useLocalDpi xmlns:a14="http://schemas.microsoft.com/office/drawing/2010/main" val="0"/>
                         </a:ext>
                         <a:ext uri="{96DAC541-7B7A-43D3-8B79-37D633B846F1}">
-                          <asvg:svgBlip xmlns:asvg="http://schemas.microsoft.com/office/drawing/2016/SVG/main" r:embed="rId61"/>
+                          <asvg:svgBlip xmlns:asvg="http://schemas.microsoft.com/office/drawing/2016/SVG/main" r:embed="rId63"/>
                         </a:ext>
                       </a:extLst>
                     </a:blip>
@@ -5638,8 +5787,8 @@
         <w:t xml:space="preserve">Calendar Event Browser</w:t>
       </w:r>
     </w:p>
-    <w:bookmarkEnd w:id="65"/>
-    <w:bookmarkStart w:id="66" w:name="e-mail"/>
+    <w:bookmarkEnd w:id="67"/>
+    <w:bookmarkStart w:id="68" w:name="e-mail"/>
     <w:p>
       <w:pPr>
         <w:pStyle w:val="Heading3"/>
@@ -5648,8 +5797,8 @@
         <w:t xml:space="preserve">E-Mail</w:t>
       </w:r>
     </w:p>
-    <w:bookmarkEnd w:id="66"/>
-    <w:bookmarkStart w:id="74" w:name="Xa2c87a544cf47e8c39fbecbb781ec174495b7f6"/>
+    <w:bookmarkEnd w:id="68"/>
+    <w:bookmarkStart w:id="76" w:name="Xa2c87a544cf47e8c39fbecbb781ec174495b7f6"/>
     <w:p>
       <w:pPr>
         <w:pStyle w:val="Heading3"/>
@@ -5662,19 +5811,31 @@
       <w:pPr>
         <w:numPr>
           <w:ilvl w:val="0"/>
-          <w:numId w:val="1043"/>
-        </w:numPr>
-        <w:pStyle w:val="Compact"/>
-      </w:pPr>
-      <w:r>
-        <w:t xml:space="preserve">Simple but Semantic</w:t>
-      </w:r>
-    </w:p>
-    <w:p>
-      <w:pPr>
-        <w:numPr>
-          <w:ilvl w:val="0"/>
-          <w:numId w:val="1043"/>
+          <w:numId w:val="1044"/>
+        </w:numPr>
+        <w:pStyle w:val="Compact"/>
+      </w:pPr>
+      <w:r>
+        <w:t xml:space="preserve">simple but semantic linked notes stored as actual searchable text files with metadata and references in filesystem attributes</w:t>
+      </w:r>
+    </w:p>
+    <w:p>
+      <w:pPr>
+        <w:numPr>
+          <w:ilvl w:val="0"/>
+          <w:numId w:val="1044"/>
+        </w:numPr>
+        <w:pStyle w:val="Compact"/>
+      </w:pPr>
+      <w:r>
+        <w:t xml:space="preserve">shows the powerfully simple and well integrated approach of SEN, unlike proprietary note taking systems that lock data in custom formats or even use a database, like MacOS Notes, the bundled notes app, making it hard for users to easily access and backup their data (Horowitz, 2020)</w:t>
+      </w:r>
+    </w:p>
+    <w:p>
+      <w:pPr>
+        <w:numPr>
+          <w:ilvl w:val="0"/>
+          <w:numId w:val="1044"/>
         </w:numPr>
         <w:pStyle w:val="Compact"/>
       </w:pPr>
@@ -5686,7 +5847,7 @@
       <w:pPr>
         <w:numPr>
           <w:ilvl w:val="0"/>
-          <w:numId w:val="1043"/>
+          <w:numId w:val="1044"/>
         </w:numPr>
         <w:pStyle w:val="Compact"/>
       </w:pPr>
@@ -5698,7 +5859,7 @@
       <w:pPr>
         <w:numPr>
           <w:ilvl w:val="0"/>
-          <w:numId w:val="1043"/>
+          <w:numId w:val="1044"/>
         </w:numPr>
         <w:pStyle w:val="Compact"/>
       </w:pPr>
@@ -5713,18 +5874,18 @@
           <wp:inline>
             <wp:extent cx="5334000" cy="2798089"/>
             <wp:effectExtent b="0" l="0" r="0" t="0"/>
-            <wp:docPr descr="Semantic Editor" title="semantic editor with NER built-in" id="68" name="Picture"/>
+            <wp:docPr descr="Semantic Editor" title="semantic editor with NER built-in" id="70" name="Picture"/>
             <a:graphic>
               <a:graphicData uri="http://schemas.openxmlformats.org/drawingml/2006/picture">
                 <pic:pic>
                   <pic:nvPicPr>
-                    <pic:cNvPr descr="images/editor-ner.png" id="69" name="Picture"/>
+                    <pic:cNvPr descr="images/editor-ner.png" id="71" name="Picture"/>
                     <pic:cNvPicPr>
                       <a:picLocks noChangeArrowheads="1" noChangeAspect="1"/>
                     </pic:cNvPicPr>
                   </pic:nvPicPr>
                   <pic:blipFill>
-                    <a:blip r:embed="rId67"/>
+                    <a:blip r:embed="rId69"/>
                     <a:stretch>
                       <a:fillRect/>
                     </a:stretch>
@@ -5755,7 +5916,7 @@
       <w:pPr>
         <w:numPr>
           <w:ilvl w:val="0"/>
-          <w:numId w:val="1043"/>
+          <w:numId w:val="1044"/>
         </w:numPr>
         <w:pStyle w:val="Compact"/>
       </w:pPr>
@@ -5770,24 +5931,24 @@
           <wp:inline>
             <wp:extent cx="5334000" cy="2142527"/>
             <wp:effectExtent b="0" l="0" r="0" t="0"/>
-            <wp:docPr descr="Browsing Relations" title="navigating document relations in the file browser" id="71" name="Picture"/>
+            <wp:docPr descr="Browsing Relations" title="navigating document relations in the file browser" id="73" name="Picture"/>
             <a:graphic>
               <a:graphicData uri="http://schemas.openxmlformats.org/drawingml/2006/picture">
                 <pic:pic>
                   <pic:nvPicPr>
-                    <pic:cNvPr descr="images/file-browser-relations.svg" id="72" name="Picture"/>
+                    <pic:cNvPr descr="images/file-browser-relations.svg" id="74" name="Picture"/>
                     <pic:cNvPicPr>
                       <a:picLocks noChangeArrowheads="1" noChangeAspect="1"/>
                     </pic:cNvPicPr>
                   </pic:nvPicPr>
                   <pic:blipFill>
-                    <a:blip r:embed="rId73">
+                    <a:blip r:embed="rId75">
                       <a:extLst>
                         <a:ext uri="{28A0092B-C50C-407E-A947-70E740481C1C}">
                           <a14:useLocalDpi xmlns:a14="http://schemas.microsoft.com/office/drawing/2010/main" val="0"/>
                         </a:ext>
                         <a:ext uri="{96DAC541-7B7A-43D3-8B79-37D633B846F1}">
-                          <asvg:svgBlip xmlns:asvg="http://schemas.microsoft.com/office/drawing/2016/SVG/main" r:embed="rId70"/>
+                          <asvg:svgBlip xmlns:asvg="http://schemas.microsoft.com/office/drawing/2016/SVG/main" r:embed="rId72"/>
                         </a:ext>
                       </a:extLst>
                     </a:blip>
@@ -5817,26 +5978,8 @@
         </w:drawing>
       </w:r>
     </w:p>
-    <w:p>
-      <w:pPr>
-        <w:numPr>
-          <w:ilvl w:val="1"/>
-          <w:numId w:val="1044"/>
-        </w:numPr>
-        <w:pStyle w:val="Compact"/>
-      </w:pPr>
-      <w:r>
-        <w:t xml:space="preserve">for ternary relations, as mentioned above, we need to extend this concept and add another level, i.e. a folder, to</w:t>
-      </w:r>
-      <w:r>
-        <w:t xml:space="preserve"> </w:t>
-      </w:r>
-      <w:r>
-        <w:t xml:space="preserve">hold all relation properties to the 3rd entity involved in the relation:</w:t>
-      </w:r>
-    </w:p>
-    <w:bookmarkEnd w:id="74"/>
-    <w:bookmarkStart w:id="79" w:name="extending-a-code-editor-into-an-ide"/>
+    <w:bookmarkEnd w:id="76"/>
+    <w:bookmarkStart w:id="81" w:name="extending-a-code-editor-into-an-ide"/>
     <w:p>
       <w:pPr>
         <w:pStyle w:val="Heading3"/>
@@ -5890,7 +6033,7 @@
         <w:pStyle w:val="Compact"/>
       </w:pPr>
       <w:r>
-        <w:t xml:space="preserve">can be realised on top of existing application(s) using SEN API, or even (more as a showcase) using the SEN enabled file browser.</w:t>
+        <w:t xml:space="preserve">can be realised on top of existing application(s) using SEN API, or even (more as a showcase but still a valid use case) using the SEN enabled file browser.</w:t>
       </w:r>
     </w:p>
     <w:p>
@@ -5914,24 +6057,24 @@
           <wp:inline>
             <wp:extent cx="5334000" cy="2701977"/>
             <wp:effectExtent b="0" l="0" r="0" t="0"/>
-            <wp:docPr descr="SEN-IDE" title="an IDE utilising the SEN API" id="76" name="Picture"/>
+            <wp:docPr descr="SEN-IDE" title="an IDE utilising the SEN API" id="78" name="Picture"/>
             <a:graphic>
               <a:graphicData uri="http://schemas.openxmlformats.org/drawingml/2006/picture">
                 <pic:pic>
                   <pic:nvPicPr>
-                    <pic:cNvPr descr="images/sen-ide.svg" id="77" name="Picture"/>
+                    <pic:cNvPr descr="images/sen-ide.svg" id="79" name="Picture"/>
                     <pic:cNvPicPr>
                       <a:picLocks noChangeArrowheads="1" noChangeAspect="1"/>
                     </pic:cNvPicPr>
                   </pic:nvPicPr>
                   <pic:blipFill>
-                    <a:blip r:embed="rId78">
+                    <a:blip r:embed="rId80">
                       <a:extLst>
                         <a:ext uri="{28A0092B-C50C-407E-A947-70E740481C1C}">
                           <a14:useLocalDpi xmlns:a14="http://schemas.microsoft.com/office/drawing/2010/main" val="0"/>
                         </a:ext>
                         <a:ext uri="{96DAC541-7B7A-43D3-8B79-37D633B846F1}">
-                          <asvg:svgBlip xmlns:asvg="http://schemas.microsoft.com/office/drawing/2016/SVG/main" r:embed="rId75"/>
+                          <asvg:svgBlip xmlns:asvg="http://schemas.microsoft.com/office/drawing/2016/SVG/main" r:embed="rId77"/>
                         </a:ext>
                       </a:extLst>
                     </a:blip>
@@ -5969,9 +6112,9 @@
         <w:t xml:space="preserve">SEN-IDE</w:t>
       </w:r>
     </w:p>
-    <w:bookmarkEnd w:id="79"/>
-    <w:bookmarkEnd w:id="80"/>
-    <w:bookmarkStart w:id="81" w:name="outlook-ongoing-and-future-work"/>
+    <w:bookmarkEnd w:id="81"/>
+    <w:bookmarkEnd w:id="82"/>
+    <w:bookmarkStart w:id="87" w:name="outlook-ongoing-and-future-work"/>
     <w:p>
       <w:pPr>
         <w:pStyle w:val="Heading2"/>
@@ -5980,6 +6123,25 @@
         <w:t xml:space="preserve">Outlook, Ongoing and Future Work</w:t>
       </w:r>
     </w:p>
+    <w:bookmarkStart w:id="83" w:name="Xd36296fdbeaae5b4a88872f63ed515e00bab94c"/>
+    <w:p>
+      <w:pPr>
+        <w:pStyle w:val="Heading3"/>
+      </w:pPr>
+      <w:r>
+        <w:t xml:space="preserve">Integrating Information Extraction and Document Analysis</w:t>
+      </w:r>
+    </w:p>
+    <w:bookmarkEnd w:id="83"/>
+    <w:bookmarkStart w:id="84" w:name="dynamic-relations"/>
+    <w:p>
+      <w:pPr>
+        <w:pStyle w:val="Heading3"/>
+      </w:pPr>
+      <w:r>
+        <w:t xml:space="preserve">Dynamic Relations</w:t>
+      </w:r>
+    </w:p>
     <w:p>
       <w:pPr>
         <w:numPr>
@@ -5989,19 +6151,7 @@
         <w:pStyle w:val="Compact"/>
       </w:pPr>
       <w:r>
-        <w:t xml:space="preserve">Integrating Information Extraction and Document Analysis</w:t>
-      </w:r>
-    </w:p>
-    <w:p>
-      <w:pPr>
-        <w:numPr>
-          <w:ilvl w:val="0"/>
-          <w:numId w:val="1046"/>
-        </w:numPr>
-        <w:pStyle w:val="Compact"/>
-      </w:pPr>
-      <w:r>
-        <w:t xml:space="preserve">Building Dynamic Relations: lazily evaluated when user navigates them, used for expensive and volatile relations e.g. for</w:t>
+        <w:t xml:space="preserve">lazily evaluated when user navigates them, used for expensive and volatile relations e.g. for</w:t>
       </w:r>
       <w:r>
         <w:t xml:space="preserve"> </w:t>
@@ -6022,13 +6172,11 @@
         <w:t xml:space="preserve">files</w:t>
       </w:r>
     </w:p>
-    <w:p>
-      <w:pPr>
-        <w:numPr>
-          <w:ilvl w:val="0"/>
-          <w:numId w:val="1046"/>
-        </w:numPr>
-        <w:pStyle w:val="Compact"/>
+    <w:bookmarkEnd w:id="84"/>
+    <w:bookmarkStart w:id="85" w:name="X3008569adf9c01e8d67b1bdacb0ba8ad425fe72"/>
+    <w:p>
+      <w:pPr>
+        <w:pStyle w:val="Heading3"/>
       </w:pPr>
       <w:r>
         <w:t xml:space="preserve">Rules and Inference of Relations and Attributes</w:t>
@@ -6038,28 +6186,81 @@
       <w:pPr>
         <w:numPr>
           <w:ilvl w:val="0"/>
-          <w:numId w:val="1046"/>
-        </w:numPr>
-        <w:pStyle w:val="Compact"/>
-      </w:pPr>
-      <w:r>
-        <w:t xml:space="preserve">Further Desktop Extensions:</w:t>
-      </w:r>
-    </w:p>
-    <w:p>
-      <w:pPr>
-        <w:numPr>
-          <w:ilvl w:val="1"/>
           <w:numId w:val="1047"/>
         </w:numPr>
         <w:pStyle w:val="Compact"/>
       </w:pPr>
       <w:r>
+        <w:t xml:space="preserve">text based rules language where axioms are stored in simple text files as part of SEN configuration</w:t>
+      </w:r>
+    </w:p>
+    <w:p>
+      <w:pPr>
+        <w:numPr>
+          <w:ilvl w:val="0"/>
+          <w:numId w:val="1047"/>
+        </w:numPr>
+        <w:pStyle w:val="Compact"/>
+      </w:pPr>
+      <w:r>
+        <w:t xml:space="preserve">lazy evaluation like for dynamic relations above</w:t>
+      </w:r>
+    </w:p>
+    <w:bookmarkEnd w:id="85"/>
+    <w:bookmarkStart w:id="86" w:name="more-semantic-tracker-extensions"/>
+    <w:p>
+      <w:pPr>
+        <w:pStyle w:val="Heading3"/>
+      </w:pPr>
+      <w:r>
+        <w:t xml:space="preserve">More Semantic Tracker Extensions</w:t>
+      </w:r>
+    </w:p>
+    <w:p>
+      <w:pPr>
+        <w:numPr>
+          <w:ilvl w:val="0"/>
+          <w:numId w:val="1048"/>
+        </w:numPr>
+        <w:pStyle w:val="Compact"/>
+      </w:pPr>
+      <w:r>
         <w:t xml:space="preserve">rich Tracker views, e.g. 2d-axis view for arranging items on a timeline, or by proximity etc.</w:t>
       </w:r>
     </w:p>
-    <w:bookmarkEnd w:id="81"/>
-    <w:bookmarkStart w:id="82" w:name="references"/>
+    <w:p>
+      <w:pPr>
+        <w:numPr>
+          <w:ilvl w:val="0"/>
+          <w:numId w:val="1048"/>
+        </w:numPr>
+        <w:pStyle w:val="Compact"/>
+      </w:pPr>
+      <w:r>
+        <w:t xml:space="preserve">Actions to operate on Entities beyond simple viewing and navigation: not strictly part of SEN or semantic extensions, but useful e.g. for calendar appointments or E-Mails (</w:t>
+      </w:r>
+      <w:r>
+        <w:rPr>
+          <w:rStyle w:val="VerbatimChar"/>
+        </w:rPr>
+        <w:t xml:space="preserve">Reply</w:t>
+      </w:r>
+      <w:r>
+        <w:t xml:space="preserve">) or contacts (</w:t>
+      </w:r>
+      <w:r>
+        <w:rPr>
+          <w:rStyle w:val="VerbatimChar"/>
+        </w:rPr>
+        <w:t xml:space="preserve">Call</w:t>
+      </w:r>
+      <w:r>
+        <w:t xml:space="preserve">)</w:t>
+      </w:r>
+    </w:p>
+    <w:bookmarkEnd w:id="86"/>
+    <w:bookmarkEnd w:id="87"/>
+    <w:bookmarkStart w:id="88" w:name="references"/>
     <w:p>
       <w:pPr>
         <w:pStyle w:val="Heading2"/>
@@ -6072,7 +6273,7 @@
       <w:pPr>
         <w:numPr>
           <w:ilvl w:val="0"/>
-          <w:numId w:val="1048"/>
+          <w:numId w:val="1049"/>
         </w:numPr>
         <w:pStyle w:val="Compact"/>
       </w:pPr>
@@ -6084,7 +6285,7 @@
       <w:pPr>
         <w:numPr>
           <w:ilvl w:val="0"/>
-          <w:numId w:val="1048"/>
+          <w:numId w:val="1049"/>
         </w:numPr>
         <w:pStyle w:val="Compact"/>
       </w:pPr>
@@ -6096,7 +6297,7 @@
       <w:pPr>
         <w:numPr>
           <w:ilvl w:val="0"/>
-          <w:numId w:val="1048"/>
+          <w:numId w:val="1049"/>
         </w:numPr>
         <w:pStyle w:val="Compact"/>
       </w:pPr>
@@ -6108,7 +6309,31 @@
       <w:pPr>
         <w:numPr>
           <w:ilvl w:val="0"/>
-          <w:numId w:val="1048"/>
+          <w:numId w:val="1049"/>
+        </w:numPr>
+        <w:pStyle w:val="Compact"/>
+      </w:pPr>
+      <w:r>
+        <w:t xml:space="preserve">Atomgraph HQ, V. (n.d.). LinkedDataHub v3—About LinkedDataHub. LinkedDataHub. Retrieved September 29, 2022, from https://atomgraph.github.io/LinkedDataHub/linkeddatahub/docs/about/</w:t>
+      </w:r>
+    </w:p>
+    <w:p>
+      <w:pPr>
+        <w:numPr>
+          <w:ilvl w:val="0"/>
+          <w:numId w:val="1049"/>
+        </w:numPr>
+        <w:pStyle w:val="Compact"/>
+      </w:pPr>
+      <w:r>
+        <w:t xml:space="preserve">Baloo—KDE Community Wiki. (2022, January 29). https://community.kde.org/Baloo</w:t>
+      </w:r>
+    </w:p>
+    <w:p>
+      <w:pPr>
+        <w:numPr>
+          <w:ilvl w:val="0"/>
+          <w:numId w:val="1049"/>
         </w:numPr>
         <w:pStyle w:val="Compact"/>
       </w:pPr>
@@ -6120,7 +6345,31 @@
       <w:pPr>
         <w:numPr>
           <w:ilvl w:val="0"/>
-          <w:numId w:val="1048"/>
+          <w:numId w:val="1049"/>
+        </w:numPr>
+        <w:pStyle w:val="Compact"/>
+      </w:pPr>
+      <w:r>
+        <w:t xml:space="preserve">Bernardi, A., Grimnes, G., Groza, T., &amp; Scerri, S. (2011). The NEPOMUK Semantic Desktop (pp. 255–273). https://doi.org/10.1007/978-3-642-19510-5_13</w:t>
+      </w:r>
+    </w:p>
+    <w:p>
+      <w:pPr>
+        <w:numPr>
+          <w:ilvl w:val="0"/>
+          <w:numId w:val="1049"/>
+        </w:numPr>
+        <w:pStyle w:val="Compact"/>
+      </w:pPr>
+      <w:r>
+        <w:t xml:space="preserve">Bhihe, C. (2022). Cbhihe/findxattr [Shell]. https://github.com/Cbhihe/findxattr (Original work published 2022)</w:t>
+      </w:r>
+    </w:p>
+    <w:p>
+      <w:pPr>
+        <w:numPr>
+          <w:ilvl w:val="0"/>
+          <w:numId w:val="1049"/>
         </w:numPr>
         <w:pStyle w:val="Compact"/>
       </w:pPr>
@@ -6132,7 +6381,7 @@
       <w:pPr>
         <w:numPr>
           <w:ilvl w:val="0"/>
-          <w:numId w:val="1048"/>
+          <w:numId w:val="1049"/>
         </w:numPr>
         <w:pStyle w:val="Compact"/>
       </w:pPr>
@@ -6144,7 +6393,31 @@
       <w:pPr>
         <w:numPr>
           <w:ilvl w:val="0"/>
-          <w:numId w:val="1048"/>
+          <w:numId w:val="1049"/>
+        </w:numPr>
+        <w:pStyle w:val="Compact"/>
+      </w:pPr>
+      <w:r>
+        <w:t xml:space="preserve">Dragan, L., Handschuh, S., &amp; Decker, S. (2011). The semantic desktop at work: Interlinking notes (p. 24). https://doi.org/10.1145/2063518.2063521</w:t>
+      </w:r>
+    </w:p>
+    <w:p>
+      <w:pPr>
+        <w:numPr>
+          <w:ilvl w:val="0"/>
+          <w:numId w:val="1049"/>
+        </w:numPr>
+        <w:pStyle w:val="Compact"/>
+      </w:pPr>
+      <w:r>
+        <w:t xml:space="preserve">foambubble, V. (2022). Foam. Foam. https://foambubble.github.io/foam/</w:t>
+      </w:r>
+    </w:p>
+    <w:p>
+      <w:pPr>
+        <w:numPr>
+          <w:ilvl w:val="0"/>
+          <w:numId w:val="1049"/>
         </w:numPr>
         <w:pStyle w:val="Compact"/>
       </w:pPr>
@@ -6156,7 +6429,7 @@
       <w:pPr>
         <w:numPr>
           <w:ilvl w:val="0"/>
-          <w:numId w:val="1048"/>
+          <w:numId w:val="1049"/>
         </w:numPr>
         <w:pStyle w:val="Compact"/>
       </w:pPr>
@@ -6168,7 +6441,7 @@
       <w:pPr>
         <w:numPr>
           <w:ilvl w:val="0"/>
-          <w:numId w:val="1048"/>
+          <w:numId w:val="1049"/>
         </w:numPr>
         <w:pStyle w:val="Compact"/>
       </w:pPr>
@@ -6180,7 +6453,19 @@
       <w:pPr>
         <w:numPr>
           <w:ilvl w:val="0"/>
-          <w:numId w:val="1048"/>
+          <w:numId w:val="1049"/>
+        </w:numPr>
+        <w:pStyle w:val="Compact"/>
+      </w:pPr>
+      <w:r>
+        <w:t xml:space="preserve">Horowitz, P. (2020, January 15). Where are Notes Stored on Mac? OS X Daily. https://osxdaily.com/2020/01/15/where-notes-stored-locally-mac/</w:t>
+      </w:r>
+    </w:p>
+    <w:p>
+      <w:pPr>
+        <w:numPr>
+          <w:ilvl w:val="0"/>
+          <w:numId w:val="1049"/>
         </w:numPr>
         <w:pStyle w:val="Compact"/>
       </w:pPr>
@@ -6192,7 +6477,7 @@
       <w:pPr>
         <w:numPr>
           <w:ilvl w:val="0"/>
-          <w:numId w:val="1048"/>
+          <w:numId w:val="1049"/>
         </w:numPr>
         <w:pStyle w:val="Compact"/>
       </w:pPr>
@@ -6204,7 +6489,7 @@
       <w:pPr>
         <w:numPr>
           <w:ilvl w:val="0"/>
-          <w:numId w:val="1048"/>
+          <w:numId w:val="1049"/>
         </w:numPr>
         <w:pStyle w:val="Compact"/>
       </w:pPr>
@@ -6216,7 +6501,31 @@
       <w:pPr>
         <w:numPr>
           <w:ilvl w:val="0"/>
-          <w:numId w:val="1048"/>
+          <w:numId w:val="1049"/>
+        </w:numPr>
+        <w:pStyle w:val="Compact"/>
+      </w:pPr>
+      <w:r>
+        <w:t xml:space="preserve">KDE’s Next Generation Semantic Search. (2014, February 24). KDE.News. https://dot.kde.org/2014/02/24/kdes-next-generation-semantic-search</w:t>
+      </w:r>
+    </w:p>
+    <w:p>
+      <w:pPr>
+        <w:numPr>
+          <w:ilvl w:val="0"/>
+          <w:numId w:val="1049"/>
+        </w:numPr>
+        <w:pStyle w:val="Compact"/>
+      </w:pPr>
+      <w:r>
+        <w:t xml:space="preserve">LSoft Technologies Inc. (2022). WinFS Overview—NTFS.com. WinFS Overview. https://www.ntfs.com/winfs_basics.htm</w:t>
+      </w:r>
+    </w:p>
+    <w:p>
+      <w:pPr>
+        <w:numPr>
+          <w:ilvl w:val="0"/>
+          <w:numId w:val="1049"/>
         </w:numPr>
         <w:pStyle w:val="Compact"/>
       </w:pPr>
@@ -6228,7 +6537,7 @@
       <w:pPr>
         <w:numPr>
           <w:ilvl w:val="0"/>
-          <w:numId w:val="1048"/>
+          <w:numId w:val="1049"/>
         </w:numPr>
         <w:pStyle w:val="Compact"/>
       </w:pPr>
@@ -6240,7 +6549,43 @@
       <w:pPr>
         <w:numPr>
           <w:ilvl w:val="0"/>
-          <w:numId w:val="1048"/>
+          <w:numId w:val="1049"/>
+        </w:numPr>
+        <w:pStyle w:val="Compact"/>
+      </w:pPr>
+      <w:r>
+        <w:t xml:space="preserve">Nagarjuna, G. (2013, July 14). GNOWSYS - GNU Project—Free Software Foundation. https://www.gnu.org/software/gnowsys/</w:t>
+      </w:r>
+    </w:p>
+    <w:p>
+      <w:pPr>
+        <w:numPr>
+          <w:ilvl w:val="0"/>
+          <w:numId w:val="1049"/>
+        </w:numPr>
+        <w:pStyle w:val="Compact"/>
+      </w:pPr>
+      <w:r>
+        <w:t xml:space="preserve">Orlowski, A. (2002, March 29). Windows on a database – sliced and diced by BeOS vets. https://www.theregister.com/2002/03/29/windows_on_a_database_sliced/</w:t>
+      </w:r>
+    </w:p>
+    <w:p>
+      <w:pPr>
+        <w:numPr>
+          <w:ilvl w:val="0"/>
+          <w:numId w:val="1049"/>
+        </w:numPr>
+        <w:pStyle w:val="Compact"/>
+      </w:pPr>
+      <w:r>
+        <w:t xml:space="preserve">Pinheiro, E. (2020, January 9). BeOS: The Alternate Universe’s Mac OS X. Hackaday. https://hackaday.com/2020/01/09/beos-the-alternate-universes-mac-os-x/</w:t>
+      </w:r>
+    </w:p>
+    <w:p>
+      <w:pPr>
+        <w:numPr>
+          <w:ilvl w:val="0"/>
+          <w:numId w:val="1049"/>
         </w:numPr>
         <w:pStyle w:val="Compact"/>
       </w:pPr>
@@ -6252,7 +6597,7 @@
       <w:pPr>
         <w:numPr>
           <w:ilvl w:val="0"/>
-          <w:numId w:val="1048"/>
+          <w:numId w:val="1049"/>
         </w:numPr>
         <w:pStyle w:val="Compact"/>
       </w:pPr>
@@ -6264,7 +6609,19 @@
       <w:pPr>
         <w:numPr>
           <w:ilvl w:val="0"/>
-          <w:numId w:val="1048"/>
+          <w:numId w:val="1049"/>
+        </w:numPr>
+        <w:pStyle w:val="Compact"/>
+      </w:pPr>
+      <w:r>
+        <w:t xml:space="preserve">Sauermann, L., Kiesel, M., Schumacher, K., &amp; Bernardi, A. (2009). Semantic Desktop. In A. Blumauer &amp; T. Pellegrini (Eds.), Social Semantic Web (pp. 337–362). Springer Berlin Heidelberg. https://doi.org/10.1007/978-3-540-72216-8_17</w:t>
+      </w:r>
+    </w:p>
+    <w:p>
+      <w:pPr>
+        <w:numPr>
+          <w:ilvl w:val="0"/>
+          <w:numId w:val="1049"/>
         </w:numPr>
         <w:pStyle w:val="Compact"/>
       </w:pPr>
@@ -6276,7 +6633,7 @@
       <w:pPr>
         <w:numPr>
           <w:ilvl w:val="0"/>
-          <w:numId w:val="1048"/>
+          <w:numId w:val="1049"/>
         </w:numPr>
         <w:pStyle w:val="Compact"/>
       </w:pPr>
@@ -6288,7 +6645,19 @@
       <w:pPr>
         <w:numPr>
           <w:ilvl w:val="0"/>
-          <w:numId w:val="1048"/>
+          <w:numId w:val="1049"/>
+        </w:numPr>
+        <w:pStyle w:val="Compact"/>
+      </w:pPr>
+      <w:r>
+        <w:t xml:space="preserve">Schmidt, J. F. K. (2018). Niklas Luhmann’s Card Index: The Fabrication of Serendipity. Sociologica, Vol 12, 53-60 Pages. https://doi.org/10.6092/ISSN.1971-8853/8350</w:t>
+      </w:r>
+    </w:p>
+    <w:p>
+      <w:pPr>
+        <w:numPr>
+          <w:ilvl w:val="0"/>
+          <w:numId w:val="1049"/>
         </w:numPr>
         <w:pStyle w:val="Compact"/>
       </w:pPr>
@@ -6300,7 +6669,7 @@
       <w:pPr>
         <w:numPr>
           <w:ilvl w:val="0"/>
-          <w:numId w:val="1048"/>
+          <w:numId w:val="1049"/>
         </w:numPr>
         <w:pStyle w:val="Compact"/>
       </w:pPr>
@@ -6312,7 +6681,7 @@
       <w:pPr>
         <w:numPr>
           <w:ilvl w:val="0"/>
-          <w:numId w:val="1048"/>
+          <w:numId w:val="1049"/>
         </w:numPr>
         <w:pStyle w:val="Compact"/>
       </w:pPr>
@@ -6324,7 +6693,7 @@
       <w:pPr>
         <w:numPr>
           <w:ilvl w:val="0"/>
-          <w:numId w:val="1048"/>
+          <w:numId w:val="1049"/>
         </w:numPr>
         <w:pStyle w:val="Compact"/>
       </w:pPr>
@@ -6336,7 +6705,7 @@
       <w:pPr>
         <w:numPr>
           <w:ilvl w:val="0"/>
-          <w:numId w:val="1048"/>
+          <w:numId w:val="1049"/>
         </w:numPr>
         <w:pStyle w:val="Compact"/>
       </w:pPr>
@@ -6348,7 +6717,7 @@
       <w:pPr>
         <w:numPr>
           <w:ilvl w:val="0"/>
-          <w:numId w:val="1048"/>
+          <w:numId w:val="1049"/>
         </w:numPr>
         <w:pStyle w:val="Compact"/>
       </w:pPr>
@@ -6356,7 +6725,19 @@
         <w:t xml:space="preserve">W3C. (n.d.). WebAnnotation Home. WebAnnotation: Retrieved September 21, 2022, from http://webannotation.org/</w:t>
       </w:r>
     </w:p>
-    <w:bookmarkEnd w:id="82"/>
+    <w:p>
+      <w:pPr>
+        <w:numPr>
+          <w:ilvl w:val="0"/>
+          <w:numId w:val="1049"/>
+        </w:numPr>
+        <w:pStyle w:val="Compact"/>
+      </w:pPr>
+      <w:r>
+        <w:t xml:space="preserve">Wikidata. (2019, December 30). https://www.wikidata.org/wiki/Wikidata:Main_Page</w:t>
+      </w:r>
+    </w:p>
+    <w:bookmarkEnd w:id="88"/>
     <w:sectPr/>
   </w:body>
 </w:document>
@@ -6640,6 +7021,9 @@
     <w:abstractNumId w:val="991"/>
   </w:num>
   <w:num w:numId="1005">
+    <w:abstractNumId w:val="991"/>
+  </w:num>
+  <w:num w:numId="1006">
     <w:abstractNumId w:val="99411"/>
     <w:lvlOverride w:ilvl="0">
       <w:startOverride w:val="1"/>
@@ -6668,9 +7052,6 @@
     <w:lvlOverride w:ilvl="8">
       <w:startOverride w:val="1"/>
     </w:lvlOverride>
-  </w:num>
-  <w:num w:numId="1006">
-    <w:abstractNumId w:val="991"/>
   </w:num>
   <w:num w:numId="1007">
     <w:abstractNumId w:val="991"/>
@@ -6796,6 +7177,9 @@
     <w:abstractNumId w:val="991"/>
   </w:num>
   <w:num w:numId="1048">
+    <w:abstractNumId w:val="991"/>
+  </w:num>
+  <w:num w:numId="1049">
     <w:abstractNumId w:val="991"/>
   </w:num>
 </w:numbering>

</xml_diff>

<commit_message>
add section on desktop concepts, more references, and extended architecture section
</commit_message>
<xml_diff>
--- a/output/Extending the Desktop into a Personal Knowledge Graph with SEN.docx
+++ b/output/Extending the Desktop into a Personal Knowledge Graph with SEN.docx
@@ -1362,13 +1362,7 @@
         <w:pStyle w:val="Compact"/>
       </w:pPr>
       <w:r>
-        <w:t xml:space="preserve">However, to keep the system and API design simple and efficient, a necessity in the time of its making (late 1990s),</w:t>
-      </w:r>
-      <w:r>
-        <w:t xml:space="preserve"> </w:t>
-      </w:r>
-      <w:r>
-        <w:t xml:space="preserve">the concept of relations was deliberately omitted completely.</w:t>
+        <w:t xml:space="preserve">However, to keep the system and API design simple and efficient, a necessity in the time of its making (late 1990s), the concept of relations was deliberately omitted completely.</w:t>
       </w:r>
     </w:p>
     <w:bookmarkStart w:id="29" w:name="X2b4ec292cff56f8479ccbef6a9920c8b5d9564d"/>
@@ -1479,7 +1473,7 @@
         <w:pStyle w:val="Compact"/>
       </w:pPr>
       <w:r>
-        <w:t xml:space="preserve">mapping SEN concepts</w:t>
+        <w:t xml:space="preserve">mapping SEN concepts to file system and operating system API’s:</w:t>
       </w:r>
     </w:p>
     <w:p>
@@ -1515,7 +1509,19 @@
         <w:pStyle w:val="Compact"/>
       </w:pPr>
       <w:r>
-        <w:t xml:space="preserve">Queries</w:t>
+        <w:t xml:space="preserve">Relations -&gt; attributes</w:t>
+      </w:r>
+    </w:p>
+    <w:p>
+      <w:pPr>
+        <w:numPr>
+          <w:ilvl w:val="1"/>
+          <w:numId w:val="1014"/>
+        </w:numPr>
+        <w:pStyle w:val="Compact"/>
+      </w:pPr>
+      <w:r>
+        <w:t xml:space="preserve">Queries - enriched, results in file browser window, like for normal queries</w:t>
       </w:r>
     </w:p>
     <w:p>
@@ -1676,6 +1682,43 @@
         <w:t xml:space="preserve">in Haiku)</w:t>
       </w:r>
     </w:p>
+    <w:p>
+      <w:pPr>
+        <w:numPr>
+          <w:ilvl w:val="0"/>
+          <w:numId w:val="1015"/>
+        </w:numPr>
+      </w:pPr>
+      <w:r>
+        <w:t xml:space="preserve">loosely coupled architecture using existing external tools (this can be even simple self-written scripts) for metadata and relation extraction, and the file system attributes as standardised data format, with minimal adaptations where needed for SEN to work (e.g. common attribute names or storing values in BMessage form, which could also be translated by SEN on demand)</w:t>
+      </w:r>
+    </w:p>
+    <w:p>
+      <w:pPr>
+        <w:numPr>
+          <w:ilvl w:val="0"/>
+          <w:numId w:val="1015"/>
+        </w:numPr>
+      </w:pPr>
+      <w:r>
+        <w:t xml:space="preserve">by building on standard operating system semantics (specifically, POSIX) and advanced but standardised file system concepts, SEN can make use of the pipes&amp;filters pattern first popularised already in 1976 by (Kernighan &amp; Plauger, 1976), where tools are designed to perform a single purpose well but also implement standard interfaces for seamless interoperability, chaining simple commands together to perform more complex tasks (then using UNIX</w:t>
+      </w:r>
+      <w:r>
+        <w:t xml:space="preserve"> </w:t>
+      </w:r>
+      <w:r>
+        <w:t xml:space="preserve">“</w:t>
+      </w:r>
+      <w:r>
+        <w:t xml:space="preserve">pipes</w:t>
+      </w:r>
+      <w:r>
+        <w:t xml:space="preserve">”</w:t>
+      </w:r>
+      <w:r>
+        <w:t xml:space="preserve">, but in this context, on a higher level through file attributes, scripting and messaging).</w:t>
+      </w:r>
+    </w:p>
     <w:bookmarkEnd w:id="34"/>
     <w:bookmarkStart w:id="35" w:name="relations---the-missing-link"/>
     <w:p>
@@ -2093,13 +2136,7 @@
         <w:pStyle w:val="Compact"/>
       </w:pPr>
       <w:r>
-        <w:t xml:space="preserve">SEN realizes a simple form of ontologies through only using file system semantics and the OS filesystem API, adding</w:t>
-      </w:r>
-      <w:r>
-        <w:t xml:space="preserve"> </w:t>
-      </w:r>
-      <w:r>
-        <w:t xml:space="preserve">support for configuration, management and navigation of relations with a custom API on top.</w:t>
+        <w:t xml:space="preserve">SEN realizes a simple form of ontologies through only using file system semantics and the OS file system API, adding support for configuring, managing and navigating relations with a custom API on top.</w:t>
       </w:r>
     </w:p>
     <w:p>
@@ -2204,13 +2241,7 @@
         <w:pStyle w:val="Compact"/>
       </w:pPr>
       <w:r>
-        <w:t xml:space="preserve">The OS natively uses standard MIME types (MIME Types (IANA Media Types), 2022) for identifying the file types, as</w:t>
-      </w:r>
-      <w:r>
-        <w:t xml:space="preserve"> </w:t>
-      </w:r>
-      <w:r>
-        <w:t xml:space="preserve">described in Humdinger, B. (2009b).</w:t>
+        <w:t xml:space="preserve">The OS uses standard MIME types (MIME Types (IANA Media Types), 2022) for identifying file types, as described in Humdinger, B. (2009b).</w:t>
       </w:r>
     </w:p>
     <w:p>
@@ -4485,13 +4516,20 @@
         <w:pStyle w:val="Compact"/>
       </w:pPr>
       <w:r>
-        <w:t xml:space="preserve">A special case but also an important use case is the support for ternary relations, that is when 3 entities are</w:t>
-      </w:r>
-      <w:r>
-        <w:t xml:space="preserve"> </w:t>
-      </w:r>
-      <w:r>
-        <w:t xml:space="preserve">part of a relation.</w:t>
+        <w:t xml:space="preserve">A special relationship type that is nevertheless encountered in many use cases is the support for</w:t>
+      </w:r>
+      <w:r>
+        <w:t xml:space="preserve"> </w:t>
+      </w:r>
+      <w:r>
+        <w:rPr>
+          <w:iCs/>
+          <w:i/>
+        </w:rPr>
+        <w:t xml:space="preserve">ternary relations</w:t>
+      </w:r>
+      <w:r>
+        <w:t xml:space="preserve">, i.e. when 3 entities are part of a relation.</w:t>
       </w:r>
     </w:p>
     <w:p>
@@ -4503,13 +4541,55 @@
         <w:pStyle w:val="Compact"/>
       </w:pPr>
       <w:r>
-        <w:t xml:space="preserve">An example would be, extending the notes example above, relations between notes on a movie referencing actors</w:t>
-      </w:r>
-      <w:r>
-        <w:t xml:space="preserve"> </w:t>
-      </w:r>
-      <w:r>
-        <w:t xml:space="preserve">that appear in certain scenes, or locations on specific time codes:</w:t>
+        <w:t xml:space="preserve">An example would be, extending the notes example above, relations between</w:t>
+      </w:r>
+      <w:r>
+        <w:t xml:space="preserve"> </w:t>
+      </w:r>
+      <w:r>
+        <w:rPr>
+          <w:iCs/>
+          <w:i/>
+        </w:rPr>
+        <w:t xml:space="preserve">notes</w:t>
+      </w:r>
+      <w:r>
+        <w:t xml:space="preserve"> </w:t>
+      </w:r>
+      <w:r>
+        <w:t xml:space="preserve">on a</w:t>
+      </w:r>
+      <w:r>
+        <w:t xml:space="preserve"> </w:t>
+      </w:r>
+      <w:r>
+        <w:rPr>
+          <w:iCs/>
+          <w:i/>
+        </w:rPr>
+        <w:t xml:space="preserve">movie</w:t>
+      </w:r>
+      <w:r>
+        <w:t xml:space="preserve"> </w:t>
+      </w:r>
+      <w:r>
+        <w:t xml:space="preserve">referencing</w:t>
+      </w:r>
+      <w:r>
+        <w:t xml:space="preserve"> </w:t>
+      </w:r>
+      <w:r>
+        <w:rPr>
+          <w:iCs/>
+          <w:i/>
+        </w:rPr>
+        <w:t xml:space="preserve">actors</w:t>
+      </w:r>
+      <w:r>
+        <w:t xml:space="preserve"> </w:t>
+      </w:r>
+      <w:r>
+        <w:t xml:space="preserve">that appear in certain scenes; or book notes referencing locations on specific pages:</w:t>
       </w:r>
     </w:p>
     <w:p>
@@ -4710,13 +4790,37 @@
         <w:t xml:space="preserve">Desktop Use Cases and Examples - Re-modelling standard applications with SEN</w:t>
       </w:r>
     </w:p>
-    <w:bookmarkStart w:id="57" w:name="base-concepts"/>
+    <w:p>
+      <w:pPr>
+        <w:pStyle w:val="FirstParagraph"/>
+      </w:pPr>
+      <w:r>
+        <w:t xml:space="preserve">SEN maps common and well established desktop principles to semantic concepts, acting as an</w:t>
+      </w:r>
+      <w:r>
+        <w:t xml:space="preserve"> </w:t>
+      </w:r>
+      <w:r>
+        <w:rPr>
+          <w:iCs/>
+          <w:i/>
+        </w:rPr>
+        <w:t xml:space="preserve">Extension</w:t>
+      </w:r>
+      <w:r>
+        <w:t xml:space="preserve"> </w:t>
+      </w:r>
+      <w:r>
+        <w:t xml:space="preserve">to a well known environment users are familiar with. Only when necessary, metaphors are stretched to support functionality that is not part of existing desktop operating systems. This way, the barrier to entry is lowered as much as possible, and users can adopt semantic concepts and use cases for working with personal knowledge graphs gradually and more easily.</w:t>
+      </w:r>
+    </w:p>
+    <w:bookmarkStart w:id="57" w:name="basic-concepts"/>
     <w:p>
       <w:pPr>
         <w:pStyle w:val="Heading3"/>
       </w:pPr>
       <w:r>
-        <w:t xml:space="preserve">Base Concepts</w:t>
+        <w:t xml:space="preserve">Basic Concepts</w:t>
       </w:r>
     </w:p>
     <w:p>
@@ -4728,7 +4832,36 @@
         <w:pStyle w:val="Compact"/>
       </w:pPr>
       <w:r>
-        <w:t xml:space="preserve">Files as Entities</w:t>
+        <w:t xml:space="preserve">As established above, semantic</w:t>
+      </w:r>
+      <w:r>
+        <w:t xml:space="preserve"> </w:t>
+      </w:r>
+      <w:r>
+        <w:rPr>
+          <w:iCs/>
+          <w:i/>
+        </w:rPr>
+        <w:t xml:space="preserve">Entities</w:t>
+      </w:r>
+      <w:r>
+        <w:t xml:space="preserve"> </w:t>
+      </w:r>
+      <w:r>
+        <w:t xml:space="preserve">can be simply represented as</w:t>
+      </w:r>
+      <w:r>
+        <w:t xml:space="preserve"> </w:t>
+      </w:r>
+      <w:r>
+        <w:rPr>
+          <w:iCs/>
+          <w:i/>
+        </w:rPr>
+        <w:t xml:space="preserve">files</w:t>
+      </w:r>
+      <w:r>
+        <w:t xml:space="preserve">, with a meaningful icon representing the real world (or virtual) object. This allows users to directly map their mental model of things to desktop objects and interact or manipulate them in a direct and intuitive manner.</w:t>
       </w:r>
     </w:p>
     <w:p>
@@ -4740,25 +4873,33 @@
         <w:pStyle w:val="Compact"/>
       </w:pPr>
       <w:r>
-        <w:t xml:space="preserve">Relations grouped by role (Attendee, Contributor) or relation label (attendedBy, contributedBy)</w:t>
-      </w:r>
-    </w:p>
-    <w:p>
-      <w:pPr>
-        <w:numPr>
-          <w:ilvl w:val="0"/>
-          <w:numId w:val="1036"/>
-        </w:numPr>
-        <w:pStyle w:val="Compact"/>
-      </w:pPr>
-      <w:r>
-        <w:t xml:space="preserve">UI: in Haiku (as in BeOS), it is a common desktop metaphor to have clickable menus, e.g. clicking on a folder item</w:t>
-      </w:r>
-      <w:r>
-        <w:t xml:space="preserve"> </w:t>
-      </w:r>
-      <w:r>
-        <w:t xml:space="preserve">in the</w:t>
+        <w:rPr>
+          <w:iCs/>
+          <w:i/>
+        </w:rPr>
+        <w:t xml:space="preserve">Entities</w:t>
+      </w:r>
+      <w:r>
+        <w:t xml:space="preserve"> </w:t>
+      </w:r>
+      <w:r>
+        <w:t xml:space="preserve">do not have to actually</w:t>
+      </w:r>
+      <w:r>
+        <w:t xml:space="preserve"> </w:t>
+      </w:r>
+      <w:r>
+        <w:rPr>
+          <w:iCs/>
+          <w:i/>
+        </w:rPr>
+        <w:t xml:space="preserve">contain</w:t>
+      </w:r>
+      <w:r>
+        <w:t xml:space="preserve"> </w:t>
+      </w:r>
+      <w:r>
+        <w:t xml:space="preserve">the represented object’s data, they can just act as a placeholder (or</w:t>
       </w:r>
       <w:r>
         <w:t xml:space="preserve"> </w:t>
@@ -4767,16 +4908,13 @@
         <w:t xml:space="preserve">“</w:t>
       </w:r>
       <w:r>
-        <w:t xml:space="preserve">Copy</w:t>
+        <w:t xml:space="preserve">proxy</w:t>
       </w:r>
       <w:r>
         <w:t xml:space="preserve">”</w:t>
       </w:r>
       <w:r>
-        <w:t xml:space="preserve"> </w:t>
-      </w:r>
-      <w:r>
-        <w:t xml:space="preserve">menu will open that folder in a new window.</w:t>
+        <w:t xml:space="preserve">), possibly - but not necessarily - pointing to the actual object, as required. This allows to build knowledge graphs from a meta level, describing things and relations between them, but keeping resource usage modest, without requiring to replicate all data on the user’s desktop. This also allows bridging local and remote locations, e.g. referencing files on a network drive, or pointing to internet resources.</w:t>
       </w:r>
     </w:p>
     <w:p>
@@ -4788,6 +4926,322 @@
         <w:pStyle w:val="Compact"/>
       </w:pPr>
       <w:r>
+        <w:t xml:space="preserve">An interesting project in this regard is the</w:t>
+      </w:r>
+      <w:r>
+        <w:t xml:space="preserve"> </w:t>
+      </w:r>
+      <w:r>
+        <w:rPr>
+          <w:iCs/>
+          <w:i/>
+        </w:rPr>
+        <w:t xml:space="preserve">Interplanetary File System</w:t>
+      </w:r>
+      <w:r>
+        <w:t xml:space="preserve"> </w:t>
+      </w:r>
+      <w:r>
+        <w:t xml:space="preserve">(IPFS), see (IPFS Powers the Distributed Web, 2022) and (Ludington, 2022), which provides stable and cryptographically verified, trusted resource locators that don’t break when files move (but stay unchanged). This would allow users to globally and reliably reference external objects, and relations would be stable even when the personal knowledge graph is moved or shared, or when external objects move to another location.</w:t>
+      </w:r>
+    </w:p>
+    <w:p>
+      <w:pPr>
+        <w:numPr>
+          <w:ilvl w:val="0"/>
+          <w:numId w:val="1036"/>
+        </w:numPr>
+        <w:pStyle w:val="Compact"/>
+      </w:pPr>
+      <w:r>
+        <w:rPr>
+          <w:iCs/>
+          <w:i/>
+        </w:rPr>
+        <w:t xml:space="preserve">Relations</w:t>
+      </w:r>
+      <w:r>
+        <w:t xml:space="preserve"> </w:t>
+      </w:r>
+      <w:r>
+        <w:t xml:space="preserve">are stored as properties in file system attributes, where they are not directly visible, but they can be resolved and displayed in different ways using the SEN API by supporting applications like the file browser Tracker, or simply by using command line tools that interact via messaging. The SEN API implements various filters and mutations for all common use cases and provides applications with the needed projection model.</w:t>
+      </w:r>
+    </w:p>
+    <w:p>
+      <w:pPr>
+        <w:numPr>
+          <w:ilvl w:val="0"/>
+          <w:numId w:val="1036"/>
+        </w:numPr>
+        <w:pStyle w:val="Compact"/>
+      </w:pPr>
+      <w:r>
+        <w:t xml:space="preserve">for convenient user interaction, relation targets can be either grouped by Entity</w:t>
+      </w:r>
+      <w:r>
+        <w:t xml:space="preserve"> </w:t>
+      </w:r>
+      <w:r>
+        <w:rPr>
+          <w:iCs/>
+          <w:i/>
+        </w:rPr>
+        <w:t xml:space="preserve">type</w:t>
+      </w:r>
+      <w:r>
+        <w:t xml:space="preserve"> </w:t>
+      </w:r>
+      <w:r>
+        <w:t xml:space="preserve">(like</w:t>
+      </w:r>
+      <w:r>
+        <w:t xml:space="preserve"> </w:t>
+      </w:r>
+      <w:r>
+        <w:rPr>
+          <w:rStyle w:val="VerbatimChar"/>
+        </w:rPr>
+        <w:t xml:space="preserve">Author</w:t>
+      </w:r>
+      <w:r>
+        <w:t xml:space="preserve">,</w:t>
+      </w:r>
+      <w:r>
+        <w:t xml:space="preserve"> </w:t>
+      </w:r>
+      <w:r>
+        <w:rPr>
+          <w:rStyle w:val="VerbatimChar"/>
+        </w:rPr>
+        <w:t xml:space="preserve">Book</w:t>
+      </w:r>
+      <w:r>
+        <w:t xml:space="preserve">,</w:t>
+      </w:r>
+      <w:r>
+        <w:t xml:space="preserve"> </w:t>
+      </w:r>
+      <w:r>
+        <w:rPr>
+          <w:rStyle w:val="VerbatimChar"/>
+        </w:rPr>
+        <w:t xml:space="preserve">Movie</w:t>
+      </w:r>
+      <w:r>
+        <w:t xml:space="preserve">,</w:t>
+      </w:r>
+      <w:r>
+        <w:t xml:space="preserve"> </w:t>
+      </w:r>
+      <w:r>
+        <w:rPr>
+          <w:rStyle w:val="VerbatimChar"/>
+        </w:rPr>
+        <w:t xml:space="preserve">Person</w:t>
+      </w:r>
+      <w:r>
+        <w:t xml:space="preserve">),</w:t>
+      </w:r>
+      <w:r>
+        <w:t xml:space="preserve"> </w:t>
+      </w:r>
+      <w:r>
+        <w:rPr>
+          <w:iCs/>
+          <w:i/>
+        </w:rPr>
+        <w:t xml:space="preserve">role</w:t>
+      </w:r>
+      <w:r>
+        <w:t xml:space="preserve"> </w:t>
+      </w:r>
+      <w:r>
+        <w:t xml:space="preserve">(like</w:t>
+      </w:r>
+      <w:r>
+        <w:t xml:space="preserve"> </w:t>
+      </w:r>
+      <w:r>
+        <w:rPr>
+          <w:rStyle w:val="VerbatimChar"/>
+        </w:rPr>
+        <w:t xml:space="preserve">Attendee</w:t>
+      </w:r>
+      <w:r>
+        <w:t xml:space="preserve">,</w:t>
+      </w:r>
+      <w:r>
+        <w:t xml:space="preserve"> </w:t>
+      </w:r>
+      <w:r>
+        <w:rPr>
+          <w:rStyle w:val="VerbatimChar"/>
+        </w:rPr>
+        <w:t xml:space="preserve">Contributor</w:t>
+      </w:r>
+      <w:r>
+        <w:t xml:space="preserve">,</w:t>
+      </w:r>
+      <w:r>
+        <w:t xml:space="preserve"> </w:t>
+      </w:r>
+      <w:r>
+        <w:rPr>
+          <w:rStyle w:val="VerbatimChar"/>
+        </w:rPr>
+        <w:t xml:space="preserve">Publisher</w:t>
+      </w:r>
+      <w:r>
+        <w:t xml:space="preserve">,</w:t>
+      </w:r>
+      <w:r>
+        <w:t xml:space="preserve"> </w:t>
+      </w:r>
+      <w:r>
+        <w:rPr>
+          <w:rStyle w:val="VerbatimChar"/>
+        </w:rPr>
+        <w:t xml:space="preserve">Reviewer</w:t>
+      </w:r>
+      <w:r>
+        <w:t xml:space="preserve">) or</w:t>
+      </w:r>
+      <w:r>
+        <w:t xml:space="preserve"> </w:t>
+      </w:r>
+      <w:r>
+        <w:rPr>
+          <w:iCs/>
+          <w:i/>
+        </w:rPr>
+        <w:t xml:space="preserve">label</w:t>
+      </w:r>
+      <w:r>
+        <w:t xml:space="preserve"> </w:t>
+      </w:r>
+      <w:r>
+        <w:t xml:space="preserve">(like</w:t>
+      </w:r>
+      <w:r>
+        <w:t xml:space="preserve"> </w:t>
+      </w:r>
+      <w:r>
+        <w:rPr>
+          <w:rStyle w:val="VerbatimChar"/>
+        </w:rPr>
+        <w:t xml:space="preserve">attendedBy</w:t>
+      </w:r>
+      <w:r>
+        <w:t xml:space="preserve">,</w:t>
+      </w:r>
+      <w:r>
+        <w:t xml:space="preserve"> </w:t>
+      </w:r>
+      <w:r>
+        <w:rPr>
+          <w:rStyle w:val="VerbatimChar"/>
+        </w:rPr>
+        <w:t xml:space="preserve">contributesTo</w:t>
+      </w:r>
+      <w:r>
+        <w:t xml:space="preserve">,</w:t>
+      </w:r>
+      <w:r>
+        <w:t xml:space="preserve"> </w:t>
+      </w:r>
+      <w:r>
+        <w:rPr>
+          <w:rStyle w:val="VerbatimChar"/>
+        </w:rPr>
+        <w:t xml:space="preserve">cites</w:t>
+      </w:r>
+      <w:r>
+        <w:t xml:space="preserve">).</w:t>
+      </w:r>
+    </w:p>
+    <w:p>
+      <w:pPr>
+        <w:numPr>
+          <w:ilvl w:val="0"/>
+          <w:numId w:val="1036"/>
+        </w:numPr>
+        <w:pStyle w:val="Compact"/>
+      </w:pPr>
+      <w:r>
+        <w:rPr>
+          <w:iCs/>
+          <w:i/>
+        </w:rPr>
+        <w:t xml:space="preserve">Context</w:t>
+      </w:r>
+      <w:r>
+        <w:t xml:space="preserve">, another core semantic concept, is mapped to</w:t>
+      </w:r>
+      <w:r>
+        <w:t xml:space="preserve"> </w:t>
+      </w:r>
+      <w:r>
+        <w:rPr>
+          <w:iCs/>
+          <w:i/>
+        </w:rPr>
+        <w:t xml:space="preserve">Folders</w:t>
+      </w:r>
+      <w:r>
+        <w:t xml:space="preserve">, so users can organize their data in several project related personal knowledge graphs that live in separate folders and contain only project-related entities and relations.</w:t>
+      </w:r>
+    </w:p>
+    <w:p>
+      <w:pPr>
+        <w:numPr>
+          <w:ilvl w:val="1"/>
+          <w:numId w:val="1038"/>
+        </w:numPr>
+        <w:pStyle w:val="Compact"/>
+      </w:pPr>
+      <w:r>
+        <w:t xml:space="preserve">this mapping is not enforced and completely arbitrary (SEN adheres to file system semantics where possible, and users are free to manage their files as needed, also depending on the use case and experience), but serves as a sensible convention, so related files are grouped together and can also be easily shared or backed up and restored on a different system, or exported and imported between installations and versions.</w:t>
+      </w:r>
+    </w:p>
+    <w:p>
+      <w:pPr>
+        <w:numPr>
+          <w:ilvl w:val="0"/>
+          <w:numId w:val="1036"/>
+        </w:numPr>
+        <w:pStyle w:val="Compact"/>
+      </w:pPr>
+      <w:r>
+        <w:t xml:space="preserve">UI: in Haiku (as in BeOS), it is a common desktop metaphor to have clickable menus, e.g. clicking on a folder item in the</w:t>
+      </w:r>
+      <w:r>
+        <w:t xml:space="preserve"> </w:t>
+      </w:r>
+      <w:r>
+        <w:t xml:space="preserve">“</w:t>
+      </w:r>
+      <w:r>
+        <w:t xml:space="preserve">Copy</w:t>
+      </w:r>
+      <w:r>
+        <w:t xml:space="preserve">”</w:t>
+      </w:r>
+      <w:r>
+        <w:t xml:space="preserve"> </w:t>
+      </w:r>
+      <w:r>
+        <w:t xml:space="preserve">menu will open that folder in a new window.</w:t>
+      </w:r>
+    </w:p>
+    <w:p>
+      <w:pPr>
+        <w:numPr>
+          <w:ilvl w:val="0"/>
+          <w:numId w:val="1036"/>
+        </w:numPr>
+        <w:pStyle w:val="Compact"/>
+      </w:pPr>
+      <w:r>
         <w:t xml:space="preserve">The same metaphor is used for navigating relations: clicking on a sub menu in the</w:t>
       </w:r>
       <w:r>
@@ -4813,6 +5267,45 @@
       </w:r>
       <w:r>
         <w:t xml:space="preserve">all targets of that relation in a separate window:</w:t>
+      </w:r>
+      <w:r>
+        <w:t xml:space="preserve"> </w:t>
+      </w:r>
+      <w:r>
+        <w:t xml:space="preserve">&lt;</w:t>
+      </w:r>
+      <w:r>
+        <w:t xml:space="preserve">&gt;</w:t>
+      </w:r>
+    </w:p>
+    <w:p>
+      <w:pPr>
+        <w:numPr>
+          <w:ilvl w:val="0"/>
+          <w:numId w:val="1036"/>
+        </w:numPr>
+        <w:pStyle w:val="Compact"/>
+      </w:pPr>
+      <w:r>
+        <w:t xml:space="preserve">just like the standard file browser offers a flow-like navigation through the entire file system by providing infinitely nested menus for folders and their contents, it is even possible to provide an endless path through all relations and their targets (</w:t>
+      </w:r>
+      <w:r>
+        <w:t xml:space="preserve">“</w:t>
+      </w:r>
+      <w:r>
+        <w:t xml:space="preserve">SEN mode</w:t>
+      </w:r>
+      <w:r>
+        <w:t xml:space="preserve">”</w:t>
+      </w:r>
+      <w:r>
+        <w:t xml:space="preserve">), if so desired.</w:t>
+      </w:r>
+      <w:r>
+        <w:t xml:space="preserve"> </w:t>
+      </w:r>
+      <w:r>
+        <w:t xml:space="preserve">&lt;&lt;TODO: screenshot BeOS file navigation vs. SEN mode concept&gt;&gt;</w:t>
       </w:r>
     </w:p>
     <w:bookmarkEnd w:id="57"/>
@@ -4829,178 +5322,11 @@
       <w:pPr>
         <w:numPr>
           <w:ilvl w:val="0"/>
-          <w:numId w:val="1038"/>
+          <w:numId w:val="1039"/>
         </w:numPr>
       </w:pPr>
       <w:r>
         <w:t xml:space="preserve">Because SEN is very user-centric and should not be limited to experts and knowledge workers, the standard file browser,</w:t>
-      </w:r>
-      <w:r>
-        <w:t xml:space="preserve"> </w:t>
-      </w:r>
-      <w:r>
-        <w:t xml:space="preserve">Tracker, is extended (with minimal modifications) so that relations are visible in the context menu, and users can</w:t>
-      </w:r>
-      <w:r>
-        <w:t xml:space="preserve"> </w:t>
-      </w:r>
-      <w:r>
-        <w:t xml:space="preserve">open related files just as they would with normal files, but with some added functionality to support semantic relations.</w:t>
-      </w:r>
-    </w:p>
-    <w:p>
-      <w:pPr>
-        <w:numPr>
-          <w:ilvl w:val="0"/>
-          <w:numId w:val="1038"/>
-        </w:numPr>
-      </w:pPr>
-      <w:r>
-        <w:t xml:space="preserve">A special case is the display of all related files for a given relation - here, SEN uses a special</w:t>
-      </w:r>
-      <w:r>
-        <w:t xml:space="preserve"> </w:t>
-      </w:r>
-      <w:r>
-        <w:t xml:space="preserve">“</w:t>
-      </w:r>
-      <w:r>
-        <w:t xml:space="preserve">virtual</w:t>
-      </w:r>
-      <w:r>
-        <w:t xml:space="preserve">”</w:t>
-      </w:r>
-      <w:r>
-        <w:t xml:space="preserve"> </w:t>
-      </w:r>
-      <w:r>
-        <w:t xml:space="preserve">folder</w:t>
-      </w:r>
-      <w:r>
-        <w:t xml:space="preserve"> </w:t>
-      </w:r>
-      <w:r>
-        <w:t xml:space="preserve">(similar to dynamic queries !!ref) to hold relation targets:</w:t>
-      </w:r>
-    </w:p>
-    <w:p>
-      <w:pPr>
-        <w:numPr>
-          <w:ilvl w:val="1"/>
-          <w:numId w:val="1039"/>
-        </w:numPr>
-        <w:pStyle w:val="Compact"/>
-      </w:pPr>
-      <w:r>
-        <w:t xml:space="preserve">Since also menus (holding sub menus) can be invoked in Haiku, users are accustomed to this behavior.</w:t>
-      </w:r>
-    </w:p>
-    <w:p>
-      <w:pPr>
-        <w:numPr>
-          <w:ilvl w:val="1"/>
-          <w:numId w:val="1039"/>
-        </w:numPr>
-        <w:pStyle w:val="Compact"/>
-      </w:pPr>
-      <w:r>
-        <w:t xml:space="preserve">When invoking a</w:t>
-      </w:r>
-      <w:r>
-        <w:t xml:space="preserve"> </w:t>
-      </w:r>
-      <w:r>
-        <w:t xml:space="preserve">“</w:t>
-      </w:r>
-      <w:r>
-        <w:t xml:space="preserve">related entities</w:t>
-      </w:r>
-      <w:r>
-        <w:t xml:space="preserve">”</w:t>
-      </w:r>
-      <w:r>
-        <w:t xml:space="preserve"> </w:t>
-      </w:r>
-      <w:r>
-        <w:t xml:space="preserve">menu, the adapted Tracker calls the SEN API to create and return a reference to</w:t>
-      </w:r>
-      <w:r>
-        <w:t xml:space="preserve"> </w:t>
-      </w:r>
-      <w:r>
-        <w:t xml:space="preserve">a special, temporary folder holding all targets of the selected relation.</w:t>
-      </w:r>
-    </w:p>
-    <w:p>
-      <w:pPr>
-        <w:numPr>
-          <w:ilvl w:val="1"/>
-          <w:numId w:val="1039"/>
-        </w:numPr>
-        <w:pStyle w:val="Compact"/>
-      </w:pPr>
-      <w:r>
-        <w:t xml:space="preserve">These targets are symbolic links acting as placeholders for the related files. SEN stores relation properties</w:t>
-      </w:r>
-      <w:r>
-        <w:t xml:space="preserve"> </w:t>
-      </w:r>
-      <w:r>
-        <w:t xml:space="preserve">as filesystem attributes in these links.</w:t>
-      </w:r>
-    </w:p>
-    <w:p>
-      <w:pPr>
-        <w:numPr>
-          <w:ilvl w:val="1"/>
-          <w:numId w:val="1039"/>
-        </w:numPr>
-        <w:pStyle w:val="Compact"/>
-      </w:pPr>
-      <w:r>
-        <w:t xml:space="preserve">The folder is configured to show all relation property attributes, so that the user can view and handle them just</w:t>
-      </w:r>
-      <w:r>
-        <w:t xml:space="preserve"> </w:t>
-      </w:r>
-      <w:r>
-        <w:t xml:space="preserve">like normal file properties, rearranging and sorting them as needed.</w:t>
-      </w:r>
-    </w:p>
-    <w:p>
-      <w:pPr>
-        <w:numPr>
-          <w:ilvl w:val="1"/>
-          <w:numId w:val="1039"/>
-        </w:numPr>
-        <w:pStyle w:val="Compact"/>
-      </w:pPr>
-      <w:r>
-        <w:t xml:space="preserve">relation properties may be in any format that is best suited for the purpose, from different data types (names,</w:t>
-      </w:r>
-      <w:r>
-        <w:t xml:space="preserve"> </w:t>
-      </w:r>
-      <w:r>
-        <w:t xml:space="preserve">numbers or dates) to individual representations like JSON-LD for WebAnnotations (attached to web links) or</w:t>
-      </w:r>
-      <w:r>
-        <w:t xml:space="preserve"> </w:t>
-      </w:r>
-      <w:r>
-        <w:t xml:space="preserve">time codes for referencing a specific section in a video.</w:t>
-      </w:r>
-    </w:p>
-    <w:p>
-      <w:pPr>
-        <w:numPr>
-          <w:ilvl w:val="1"/>
-          <w:numId w:val="1039"/>
-        </w:numPr>
-        <w:pStyle w:val="Compact"/>
-      </w:pPr>
-      <w:r>
-        <w:t xml:space="preserve">these semantically enriched relation properties can then be used to</w:t>
       </w:r>
       <w:r>
         <w:t xml:space="preserve"> </w:t>
@@ -5010,6 +5336,168 @@
           <w:iCs/>
           <w:i/>
         </w:rPr>
+        <w:t xml:space="preserve">Tracker</w:t>
+      </w:r>
+      <w:r>
+        <w:t xml:space="preserve">, is extended (with minimal modifications) so that relations are visible in the context menu, and users can open related files just as they would with normal files, but with some added functionality to support semantic relations.</w:t>
+      </w:r>
+    </w:p>
+    <w:p>
+      <w:pPr>
+        <w:numPr>
+          <w:ilvl w:val="0"/>
+          <w:numId w:val="1039"/>
+        </w:numPr>
+      </w:pPr>
+      <w:r>
+        <w:t xml:space="preserve">A special case is the display of all related files for a given relation - here, SEN uses a special</w:t>
+      </w:r>
+      <w:r>
+        <w:t xml:space="preserve"> </w:t>
+      </w:r>
+      <w:r>
+        <w:t xml:space="preserve">“</w:t>
+      </w:r>
+      <w:r>
+        <w:t xml:space="preserve">virtual</w:t>
+      </w:r>
+      <w:r>
+        <w:t xml:space="preserve">”</w:t>
+      </w:r>
+      <w:r>
+        <w:t xml:space="preserve"> </w:t>
+      </w:r>
+      <w:r>
+        <w:t xml:space="preserve">folder (similar to dynamic queries !!ref) to hold relation targets:</w:t>
+      </w:r>
+    </w:p>
+    <w:p>
+      <w:pPr>
+        <w:numPr>
+          <w:ilvl w:val="1"/>
+          <w:numId w:val="1040"/>
+        </w:numPr>
+        <w:pStyle w:val="Compact"/>
+      </w:pPr>
+      <w:r>
+        <w:t xml:space="preserve">Since also menus (holding sub menus) can be invoked in Haiku, users are accustomed to this behavior.</w:t>
+      </w:r>
+    </w:p>
+    <w:p>
+      <w:pPr>
+        <w:numPr>
+          <w:ilvl w:val="1"/>
+          <w:numId w:val="1040"/>
+        </w:numPr>
+        <w:pStyle w:val="Compact"/>
+      </w:pPr>
+      <w:r>
+        <w:t xml:space="preserve">When invoking a</w:t>
+      </w:r>
+      <w:r>
+        <w:t xml:space="preserve"> </w:t>
+      </w:r>
+      <w:r>
+        <w:t xml:space="preserve">“</w:t>
+      </w:r>
+      <w:r>
+        <w:t xml:space="preserve">related entities</w:t>
+      </w:r>
+      <w:r>
+        <w:t xml:space="preserve">”</w:t>
+      </w:r>
+      <w:r>
+        <w:t xml:space="preserve"> </w:t>
+      </w:r>
+      <w:r>
+        <w:t xml:space="preserve">menu, the adapted Tracker calls the SEN API to create and return a reference to</w:t>
+      </w:r>
+      <w:r>
+        <w:t xml:space="preserve"> </w:t>
+      </w:r>
+      <w:r>
+        <w:t xml:space="preserve">a special, temporary folder holding all targets of the selected relation.</w:t>
+      </w:r>
+    </w:p>
+    <w:p>
+      <w:pPr>
+        <w:numPr>
+          <w:ilvl w:val="1"/>
+          <w:numId w:val="1040"/>
+        </w:numPr>
+        <w:pStyle w:val="Compact"/>
+      </w:pPr>
+      <w:r>
+        <w:t xml:space="preserve">These targets are symbolic links acting as placeholders for the related files. SEN stores relation properties</w:t>
+      </w:r>
+      <w:r>
+        <w:t xml:space="preserve"> </w:t>
+      </w:r>
+      <w:r>
+        <w:t xml:space="preserve">as filesystem attributes in these links.</w:t>
+      </w:r>
+    </w:p>
+    <w:p>
+      <w:pPr>
+        <w:numPr>
+          <w:ilvl w:val="1"/>
+          <w:numId w:val="1040"/>
+        </w:numPr>
+        <w:pStyle w:val="Compact"/>
+      </w:pPr>
+      <w:r>
+        <w:t xml:space="preserve">The folder is configured to show all relation property attributes, so that the user can view and handle them just</w:t>
+      </w:r>
+      <w:r>
+        <w:t xml:space="preserve"> </w:t>
+      </w:r>
+      <w:r>
+        <w:t xml:space="preserve">like normal file properties, rearranging and sorting them as needed.</w:t>
+      </w:r>
+    </w:p>
+    <w:p>
+      <w:pPr>
+        <w:numPr>
+          <w:ilvl w:val="1"/>
+          <w:numId w:val="1040"/>
+        </w:numPr>
+        <w:pStyle w:val="Compact"/>
+      </w:pPr>
+      <w:r>
+        <w:t xml:space="preserve">relation properties may be in any format that is best suited for the purpose, from different data types (names,</w:t>
+      </w:r>
+      <w:r>
+        <w:t xml:space="preserve"> </w:t>
+      </w:r>
+      <w:r>
+        <w:t xml:space="preserve">numbers or dates) to individual representations like JSON-LD for WebAnnotations (attached to web links) or</w:t>
+      </w:r>
+      <w:r>
+        <w:t xml:space="preserve"> </w:t>
+      </w:r>
+      <w:r>
+        <w:t xml:space="preserve">time codes for referencing a specific section in a video.</w:t>
+      </w:r>
+    </w:p>
+    <w:p>
+      <w:pPr>
+        <w:numPr>
+          <w:ilvl w:val="1"/>
+          <w:numId w:val="1040"/>
+        </w:numPr>
+        <w:pStyle w:val="Compact"/>
+      </w:pPr>
+      <w:r>
+        <w:t xml:space="preserve">these semantically enriched relation properties can then be used to</w:t>
+      </w:r>
+      <w:r>
+        <w:t xml:space="preserve"> </w:t>
+      </w:r>
+      <w:r>
+        <w:rPr>
+          <w:iCs/>
+          <w:i/>
+        </w:rPr>
         <w:t xml:space="preserve">navigate</w:t>
       </w:r>
       <w:r>
@@ -5086,210 +5574,210 @@
       <w:pPr>
         <w:numPr>
           <w:ilvl w:val="1"/>
+          <w:numId w:val="1040"/>
+        </w:numPr>
+        <w:pStyle w:val="Compact"/>
+      </w:pPr>
+      <w:r>
+        <w:t xml:space="preserve">this kind of</w:t>
+      </w:r>
+      <w:r>
+        <w:t xml:space="preserve"> </w:t>
+      </w:r>
+      <w:r>
+        <w:t xml:space="preserve">“</w:t>
+      </w:r>
+      <w:r>
+        <w:t xml:space="preserve">deep linking</w:t>
+      </w:r>
+      <w:r>
+        <w:t xml:space="preserve">”</w:t>
+      </w:r>
+      <w:r>
+        <w:t xml:space="preserve"> </w:t>
+      </w:r>
+      <w:r>
+        <w:t xml:space="preserve">is supported through the extended scripting functionality in Haiku, which provides</w:t>
+      </w:r>
+      <w:r>
+        <w:t xml:space="preserve"> </w:t>
+      </w:r>
+      <w:r>
+        <w:t xml:space="preserve">a message-based extension mechanism for controlling various aspects of the system itself, and applications.</w:t>
+      </w:r>
+    </w:p>
+    <w:p>
+      <w:pPr>
+        <w:numPr>
+          <w:ilvl w:val="1"/>
+          <w:numId w:val="1040"/>
+        </w:numPr>
+        <w:pStyle w:val="Compact"/>
+      </w:pPr>
+      <w:r>
+        <w:t xml:space="preserve">there are well-defined standard Messages for simple operations like</w:t>
+      </w:r>
+      <w:r>
+        <w:t xml:space="preserve"> </w:t>
+      </w:r>
+      <w:r>
+        <w:rPr>
+          <w:rStyle w:val="VerbatimChar"/>
+        </w:rPr>
+        <w:t xml:space="preserve">OPEN</w:t>
+      </w:r>
+      <w:r>
+        <w:t xml:space="preserve"> </w:t>
+      </w:r>
+      <w:r>
+        <w:t xml:space="preserve">or</w:t>
+      </w:r>
+      <w:r>
+        <w:t xml:space="preserve"> </w:t>
+      </w:r>
+      <w:r>
+        <w:rPr>
+          <w:rStyle w:val="VerbatimChar"/>
+        </w:rPr>
+        <w:t xml:space="preserve">CLOSE</w:t>
+      </w:r>
+      <w:r>
+        <w:t xml:space="preserve">, but applications can support</w:t>
+      </w:r>
+      <w:r>
+        <w:t xml:space="preserve"> </w:t>
+      </w:r>
+      <w:r>
+        <w:t xml:space="preserve">any kind of custom messages, which can then be bundled in the form of</w:t>
+      </w:r>
+      <w:r>
+        <w:t xml:space="preserve"> </w:t>
+      </w:r>
+      <w:r>
+        <w:t xml:space="preserve">“</w:t>
+      </w:r>
+      <w:r>
+        <w:t xml:space="preserve">scripting suites</w:t>
+      </w:r>
+      <w:r>
+        <w:t xml:space="preserve">”</w:t>
+      </w:r>
+      <w:r>
+        <w:t xml:space="preserve">.</w:t>
+      </w:r>
+    </w:p>
+    <w:p>
+      <w:pPr>
+        <w:numPr>
+          <w:ilvl w:val="1"/>
+          <w:numId w:val="1040"/>
+        </w:numPr>
+        <w:pStyle w:val="Compact"/>
+      </w:pPr>
+      <w:r>
+        <w:t xml:space="preserve">to support the kind of navigation above, the standard PDF viewer needs to be extended to support opening a file</w:t>
+      </w:r>
+      <w:r>
+        <w:t xml:space="preserve"> </w:t>
+      </w:r>
+      <w:r>
+        <w:t xml:space="preserve">on a given page (e.g., by adding a property</w:t>
+      </w:r>
+      <w:r>
+        <w:t xml:space="preserve"> </w:t>
+      </w:r>
+      <w:r>
+        <w:rPr>
+          <w:rStyle w:val="VerbatimChar"/>
+        </w:rPr>
+        <w:t xml:space="preserve">page</w:t>
+      </w:r>
+      <w:r>
+        <w:t xml:space="preserve"> </w:t>
+      </w:r>
+      <w:r>
+        <w:t xml:space="preserve">to the standard</w:t>
+      </w:r>
+      <w:r>
+        <w:t xml:space="preserve"> </w:t>
+      </w:r>
+      <w:r>
+        <w:rPr>
+          <w:rStyle w:val="VerbatimChar"/>
+        </w:rPr>
+        <w:t xml:space="preserve">OPEN</w:t>
+      </w:r>
+      <w:r>
+        <w:t xml:space="preserve"> </w:t>
+      </w:r>
+      <w:r>
+        <w:t xml:space="preserve">message already supported), or the</w:t>
+      </w:r>
+      <w:r>
+        <w:t xml:space="preserve"> </w:t>
+      </w:r>
+      <w:r>
+        <w:t xml:space="preserve">web browser needs to support WebAnnotations and a way to show them for a given URL in a similar way, e.g.,</w:t>
+      </w:r>
+      <w:r>
+        <w:t xml:space="preserve"> </w:t>
+      </w:r>
+      <w:r>
+        <w:t xml:space="preserve">using an additional attribute like</w:t>
+      </w:r>
+      <w:r>
+        <w:t xml:space="preserve"> </w:t>
+      </w:r>
+      <w:r>
+        <w:rPr>
+          <w:rStyle w:val="VerbatimChar"/>
+        </w:rPr>
+        <w:t xml:space="preserve">annotation</w:t>
+      </w:r>
+      <w:r>
+        <w:t xml:space="preserve"> </w:t>
+      </w:r>
+      <w:r>
+        <w:t xml:space="preserve">for the</w:t>
+      </w:r>
+      <w:r>
+        <w:t xml:space="preserve"> </w:t>
+      </w:r>
+      <w:r>
+        <w:rPr>
+          <w:rStyle w:val="VerbatimChar"/>
+        </w:rPr>
+        <w:t xml:space="preserve">OPEN</w:t>
+      </w:r>
+      <w:r>
+        <w:t xml:space="preserve"> </w:t>
+      </w:r>
+      <w:r>
+        <w:t xml:space="preserve">message.</w:t>
+      </w:r>
+    </w:p>
+    <w:p>
+      <w:pPr>
+        <w:numPr>
+          <w:ilvl w:val="0"/>
           <w:numId w:val="1039"/>
         </w:numPr>
-        <w:pStyle w:val="Compact"/>
-      </w:pPr>
-      <w:r>
-        <w:t xml:space="preserve">this kind of</w:t>
-      </w:r>
-      <w:r>
-        <w:t xml:space="preserve"> </w:t>
-      </w:r>
-      <w:r>
-        <w:t xml:space="preserve">“</w:t>
-      </w:r>
-      <w:r>
-        <w:t xml:space="preserve">deep linking</w:t>
-      </w:r>
-      <w:r>
-        <w:t xml:space="preserve">”</w:t>
-      </w:r>
-      <w:r>
-        <w:t xml:space="preserve"> </w:t>
-      </w:r>
-      <w:r>
-        <w:t xml:space="preserve">is supported through the extended scripting functionality in Haiku, which provides</w:t>
-      </w:r>
-      <w:r>
-        <w:t xml:space="preserve"> </w:t>
-      </w:r>
-      <w:r>
-        <w:t xml:space="preserve">a message-based extension mechanism for controlling various aspects of the system itself, and applications.</w:t>
-      </w:r>
-    </w:p>
-    <w:p>
-      <w:pPr>
-        <w:numPr>
-          <w:ilvl w:val="1"/>
+      </w:pPr>
+      <w:r>
+        <w:t xml:space="preserve">The figure below shows a simplified example of how users could navigate all references of a research paper or lecture</w:t>
+      </w:r>
+      <w:r>
+        <w:t xml:space="preserve"> </w:t>
+      </w:r>
+      <w:r>
+        <w:t xml:space="preserve">note, stored as different file types to represent related entities like web pages, PDF documents, books, or video presentations:</w:t>
+      </w:r>
+    </w:p>
+    <w:p>
+      <w:pPr>
+        <w:numPr>
+          <w:ilvl w:val="0"/>
           <w:numId w:val="1039"/>
-        </w:numPr>
-        <w:pStyle w:val="Compact"/>
-      </w:pPr>
-      <w:r>
-        <w:t xml:space="preserve">there are well-defined standard Messages for simple operations like</w:t>
-      </w:r>
-      <w:r>
-        <w:t xml:space="preserve"> </w:t>
-      </w:r>
-      <w:r>
-        <w:rPr>
-          <w:rStyle w:val="VerbatimChar"/>
-        </w:rPr>
-        <w:t xml:space="preserve">OPEN</w:t>
-      </w:r>
-      <w:r>
-        <w:t xml:space="preserve"> </w:t>
-      </w:r>
-      <w:r>
-        <w:t xml:space="preserve">or</w:t>
-      </w:r>
-      <w:r>
-        <w:t xml:space="preserve"> </w:t>
-      </w:r>
-      <w:r>
-        <w:rPr>
-          <w:rStyle w:val="VerbatimChar"/>
-        </w:rPr>
-        <w:t xml:space="preserve">CLOSE</w:t>
-      </w:r>
-      <w:r>
-        <w:t xml:space="preserve">, but applications can support</w:t>
-      </w:r>
-      <w:r>
-        <w:t xml:space="preserve"> </w:t>
-      </w:r>
-      <w:r>
-        <w:t xml:space="preserve">any kind of custom messages, which can then be bundled in the form of</w:t>
-      </w:r>
-      <w:r>
-        <w:t xml:space="preserve"> </w:t>
-      </w:r>
-      <w:r>
-        <w:t xml:space="preserve">“</w:t>
-      </w:r>
-      <w:r>
-        <w:t xml:space="preserve">scripting suites</w:t>
-      </w:r>
-      <w:r>
-        <w:t xml:space="preserve">”</w:t>
-      </w:r>
-      <w:r>
-        <w:t xml:space="preserve">.</w:t>
-      </w:r>
-    </w:p>
-    <w:p>
-      <w:pPr>
-        <w:numPr>
-          <w:ilvl w:val="1"/>
-          <w:numId w:val="1039"/>
-        </w:numPr>
-        <w:pStyle w:val="Compact"/>
-      </w:pPr>
-      <w:r>
-        <w:t xml:space="preserve">to support the kind of navigation above, the standard PDF viewer needs to be extended to support opening a file</w:t>
-      </w:r>
-      <w:r>
-        <w:t xml:space="preserve"> </w:t>
-      </w:r>
-      <w:r>
-        <w:t xml:space="preserve">on a given page (e.g., by adding a property</w:t>
-      </w:r>
-      <w:r>
-        <w:t xml:space="preserve"> </w:t>
-      </w:r>
-      <w:r>
-        <w:rPr>
-          <w:rStyle w:val="VerbatimChar"/>
-        </w:rPr>
-        <w:t xml:space="preserve">page</w:t>
-      </w:r>
-      <w:r>
-        <w:t xml:space="preserve"> </w:t>
-      </w:r>
-      <w:r>
-        <w:t xml:space="preserve">to the standard</w:t>
-      </w:r>
-      <w:r>
-        <w:t xml:space="preserve"> </w:t>
-      </w:r>
-      <w:r>
-        <w:rPr>
-          <w:rStyle w:val="VerbatimChar"/>
-        </w:rPr>
-        <w:t xml:space="preserve">OPEN</w:t>
-      </w:r>
-      <w:r>
-        <w:t xml:space="preserve"> </w:t>
-      </w:r>
-      <w:r>
-        <w:t xml:space="preserve">message already supported), or the</w:t>
-      </w:r>
-      <w:r>
-        <w:t xml:space="preserve"> </w:t>
-      </w:r>
-      <w:r>
-        <w:t xml:space="preserve">web browser needs to support WebAnnotations and a way to show them for a given URL in a similar way, e.g.,</w:t>
-      </w:r>
-      <w:r>
-        <w:t xml:space="preserve"> </w:t>
-      </w:r>
-      <w:r>
-        <w:t xml:space="preserve">using an additional attribute like</w:t>
-      </w:r>
-      <w:r>
-        <w:t xml:space="preserve"> </w:t>
-      </w:r>
-      <w:r>
-        <w:rPr>
-          <w:rStyle w:val="VerbatimChar"/>
-        </w:rPr>
-        <w:t xml:space="preserve">annotation</w:t>
-      </w:r>
-      <w:r>
-        <w:t xml:space="preserve"> </w:t>
-      </w:r>
-      <w:r>
-        <w:t xml:space="preserve">for the</w:t>
-      </w:r>
-      <w:r>
-        <w:t xml:space="preserve"> </w:t>
-      </w:r>
-      <w:r>
-        <w:rPr>
-          <w:rStyle w:val="VerbatimChar"/>
-        </w:rPr>
-        <w:t xml:space="preserve">OPEN</w:t>
-      </w:r>
-      <w:r>
-        <w:t xml:space="preserve"> </w:t>
-      </w:r>
-      <w:r>
-        <w:t xml:space="preserve">message.</w:t>
-      </w:r>
-    </w:p>
-    <w:p>
-      <w:pPr>
-        <w:numPr>
-          <w:ilvl w:val="0"/>
-          <w:numId w:val="1038"/>
-        </w:numPr>
-      </w:pPr>
-      <w:r>
-        <w:t xml:space="preserve">The figure below shows a simplified example of how users could navigate all references of a research paper or lecture</w:t>
-      </w:r>
-      <w:r>
-        <w:t xml:space="preserve"> </w:t>
-      </w:r>
-      <w:r>
-        <w:t xml:space="preserve">note, stored as different file types to represent related entities like web pages, PDF documents, books, or video presentations:</w:t>
-      </w:r>
-    </w:p>
-    <w:p>
-      <w:pPr>
-        <w:numPr>
-          <w:ilvl w:val="0"/>
-          <w:numId w:val="1038"/>
         </w:numPr>
         <w:pStyle w:val="CaptionedFigure"/>
       </w:pPr>
@@ -5361,7 +5849,7 @@
       <w:pPr>
         <w:numPr>
           <w:ilvl w:val="0"/>
-          <w:numId w:val="1038"/>
+          <w:numId w:val="1039"/>
         </w:numPr>
       </w:pPr>
       <w:r>
@@ -5378,7 +5866,7 @@
       <w:pPr>
         <w:numPr>
           <w:ilvl w:val="1"/>
-          <w:numId w:val="1040"/>
+          <w:numId w:val="1041"/>
         </w:numPr>
         <w:pStyle w:val="Compact"/>
       </w:pPr>
@@ -5475,7 +5963,7 @@
       <w:pPr>
         <w:numPr>
           <w:ilvl w:val="1"/>
-          <w:numId w:val="1040"/>
+          <w:numId w:val="1041"/>
         </w:numPr>
         <w:pStyle w:val="Compact"/>
       </w:pPr>
@@ -5617,7 +6105,7 @@
       <w:pPr>
         <w:numPr>
           <w:ilvl w:val="0"/>
-          <w:numId w:val="1041"/>
+          <w:numId w:val="1042"/>
         </w:numPr>
         <w:pStyle w:val="Compact"/>
       </w:pPr>
@@ -5647,7 +6135,7 @@
       <w:pPr>
         <w:numPr>
           <w:ilvl w:val="0"/>
-          <w:numId w:val="1042"/>
+          <w:numId w:val="1043"/>
         </w:numPr>
         <w:pStyle w:val="Compact"/>
       </w:pPr>
@@ -5659,7 +6147,7 @@
       <w:pPr>
         <w:numPr>
           <w:ilvl w:val="0"/>
-          <w:numId w:val="1042"/>
+          <w:numId w:val="1043"/>
         </w:numPr>
         <w:pStyle w:val="Compact"/>
       </w:pPr>
@@ -5689,37 +6177,37 @@
       <w:pPr>
         <w:numPr>
           <w:ilvl w:val="1"/>
+          <w:numId w:val="1044"/>
+        </w:numPr>
+        <w:pStyle w:val="Compact"/>
+      </w:pPr>
+      <w:r>
+        <w:t xml:space="preserve">clicking on a</w:t>
+      </w:r>
+      <w:r>
+        <w:t xml:space="preserve"> </w:t>
+      </w:r>
+      <w:r>
+        <w:t xml:space="preserve">“</w:t>
+      </w:r>
+      <w:r>
+        <w:t xml:space="preserve">calendar</w:t>
+      </w:r>
+      <w:r>
+        <w:t xml:space="preserve">”</w:t>
+      </w:r>
+      <w:r>
+        <w:t xml:space="preserve"> </w:t>
+      </w:r>
+      <w:r>
+        <w:t xml:space="preserve">icon in the desk bar (application launcher and info panel) would open a Tracker window with all event files having an event date of today.</w:t>
+      </w:r>
+    </w:p>
+    <w:p>
+      <w:pPr>
+        <w:numPr>
+          <w:ilvl w:val="0"/>
           <w:numId w:val="1043"/>
-        </w:numPr>
-        <w:pStyle w:val="Compact"/>
-      </w:pPr>
-      <w:r>
-        <w:t xml:space="preserve">clicking on a</w:t>
-      </w:r>
-      <w:r>
-        <w:t xml:space="preserve"> </w:t>
-      </w:r>
-      <w:r>
-        <w:t xml:space="preserve">“</w:t>
-      </w:r>
-      <w:r>
-        <w:t xml:space="preserve">calendar</w:t>
-      </w:r>
-      <w:r>
-        <w:t xml:space="preserve">”</w:t>
-      </w:r>
-      <w:r>
-        <w:t xml:space="preserve"> </w:t>
-      </w:r>
-      <w:r>
-        <w:t xml:space="preserve">icon in the desk bar (application launcher and info panel) would open a Tracker window with all event files having an event date of today.</w:t>
-      </w:r>
-    </w:p>
-    <w:p>
-      <w:pPr>
-        <w:numPr>
-          <w:ilvl w:val="0"/>
-          <w:numId w:val="1042"/>
         </w:numPr>
         <w:pStyle w:val="CaptionedFigure"/>
       </w:pPr>
@@ -5811,7 +6299,7 @@
       <w:pPr>
         <w:numPr>
           <w:ilvl w:val="0"/>
-          <w:numId w:val="1044"/>
+          <w:numId w:val="1045"/>
         </w:numPr>
         <w:pStyle w:val="Compact"/>
       </w:pPr>
@@ -5823,7 +6311,7 @@
       <w:pPr>
         <w:numPr>
           <w:ilvl w:val="0"/>
-          <w:numId w:val="1044"/>
+          <w:numId w:val="1045"/>
         </w:numPr>
         <w:pStyle w:val="Compact"/>
       </w:pPr>
@@ -5835,7 +6323,7 @@
       <w:pPr>
         <w:numPr>
           <w:ilvl w:val="0"/>
-          <w:numId w:val="1044"/>
+          <w:numId w:val="1045"/>
         </w:numPr>
         <w:pStyle w:val="Compact"/>
       </w:pPr>
@@ -5847,7 +6335,7 @@
       <w:pPr>
         <w:numPr>
           <w:ilvl w:val="0"/>
-          <w:numId w:val="1044"/>
+          <w:numId w:val="1045"/>
         </w:numPr>
         <w:pStyle w:val="Compact"/>
       </w:pPr>
@@ -5859,7 +6347,7 @@
       <w:pPr>
         <w:numPr>
           <w:ilvl w:val="0"/>
-          <w:numId w:val="1044"/>
+          <w:numId w:val="1045"/>
         </w:numPr>
         <w:pStyle w:val="Compact"/>
       </w:pPr>
@@ -5916,7 +6404,7 @@
       <w:pPr>
         <w:numPr>
           <w:ilvl w:val="0"/>
-          <w:numId w:val="1044"/>
+          <w:numId w:val="1045"/>
         </w:numPr>
         <w:pStyle w:val="Compact"/>
       </w:pPr>
@@ -5992,7 +6480,7 @@
       <w:pPr>
         <w:numPr>
           <w:ilvl w:val="0"/>
-          <w:numId w:val="1045"/>
+          <w:numId w:val="1046"/>
         </w:numPr>
         <w:pStyle w:val="Compact"/>
       </w:pPr>
@@ -6004,7 +6492,7 @@
       <w:pPr>
         <w:numPr>
           <w:ilvl w:val="0"/>
-          <w:numId w:val="1045"/>
+          <w:numId w:val="1046"/>
         </w:numPr>
         <w:pStyle w:val="Compact"/>
       </w:pPr>
@@ -6016,7 +6504,7 @@
       <w:pPr>
         <w:numPr>
           <w:ilvl w:val="0"/>
-          <w:numId w:val="1045"/>
+          <w:numId w:val="1046"/>
         </w:numPr>
         <w:pStyle w:val="Compact"/>
       </w:pPr>
@@ -6028,7 +6516,7 @@
       <w:pPr>
         <w:numPr>
           <w:ilvl w:val="0"/>
-          <w:numId w:val="1045"/>
+          <w:numId w:val="1046"/>
         </w:numPr>
         <w:pStyle w:val="Compact"/>
       </w:pPr>
@@ -6040,7 +6528,7 @@
       <w:pPr>
         <w:numPr>
           <w:ilvl w:val="0"/>
-          <w:numId w:val="1045"/>
+          <w:numId w:val="1046"/>
         </w:numPr>
         <w:pStyle w:val="Compact"/>
       </w:pPr>
@@ -6114,7 +6602,7 @@
     </w:p>
     <w:bookmarkEnd w:id="81"/>
     <w:bookmarkEnd w:id="82"/>
-    <w:bookmarkStart w:id="87" w:name="outlook-ongoing-and-future-work"/>
+    <w:bookmarkStart w:id="88" w:name="outlook-ongoing-and-future-work"/>
     <w:p>
       <w:pPr>
         <w:pStyle w:val="Heading2"/>
@@ -6123,17 +6611,109 @@
         <w:t xml:space="preserve">Outlook, Ongoing and Future Work</w:t>
       </w:r>
     </w:p>
-    <w:bookmarkStart w:id="83" w:name="Xd36296fdbeaae5b4a88872f63ed515e00bab94c"/>
+    <w:bookmarkStart w:id="83" w:name="using-existing-ontologies"/>
     <w:p>
       <w:pPr>
         <w:pStyle w:val="Heading3"/>
       </w:pPr>
       <w:r>
+        <w:t xml:space="preserve">Using Existing Ontologies</w:t>
+      </w:r>
+    </w:p>
+    <w:p>
+      <w:pPr>
+        <w:pStyle w:val="FirstParagraph"/>
+      </w:pPr>
+      <w:r>
+        <w:t xml:space="preserve">Although SEN is targeted at everyday desktop users (with some inclination towards information structuring and modeling), the goal is to integrate external ontologies from various domains to avoid having to reinvent the wheel, as there are already a lot of well established and proven ontologies that could act as a solid foundation for a lot of use cases where SEN could build upon.</w:t>
+      </w:r>
+    </w:p>
+    <w:p>
+      <w:pPr>
+        <w:pStyle w:val="BodyText"/>
+      </w:pPr>
+      <w:r>
+        <w:t xml:space="preserve">This would not only keep SEN consistent with the semantic ecosystem, avoiding a lock-in to yet another specialised solution, but also ease the burden on users or developers to create all the needed types, properties and relations for the desired use cases, and add mappings to the file system, as described above.</w:t>
+      </w:r>
+    </w:p>
+    <w:p>
+      <w:pPr>
+        <w:pStyle w:val="BodyText"/>
+      </w:pPr>
+      <w:r>
+        <w:t xml:space="preserve">SEN is completely agnostic to external ontology formats, but it might not be necessary to draw in all the dependencies and effort of full OWL and RDF support, but start with simpler solutions like OTTR (Skjæveland, 2021), or use import scripts like Wikidata import tools (Wikidata, 2019) and adapt them to create file types, properties and relations as needed by SEN.</w:t>
+      </w:r>
+    </w:p>
+    <w:bookmarkEnd w:id="83"/>
+    <w:bookmarkStart w:id="84" w:name="Xd36296fdbeaae5b4a88872f63ed515e00bab94c"/>
+    <w:p>
+      <w:pPr>
+        <w:pStyle w:val="Heading3"/>
+      </w:pPr>
+      <w:r>
         <w:t xml:space="preserve">Integrating Information Extraction and Document Analysis</w:t>
       </w:r>
     </w:p>
-    <w:bookmarkEnd w:id="83"/>
-    <w:bookmarkStart w:id="84" w:name="dynamic-relations"/>
+    <w:p>
+      <w:pPr>
+        <w:pStyle w:val="FirstParagraph"/>
+      </w:pPr>
+      <w:r>
+        <w:t xml:space="preserve">Since SEN acts as a background daemon, providing semantic services to the operating system and API, it is highly decoupled from information storage and retrieval, and how attributes or even relations are extracted and managed.</w:t>
+      </w:r>
+      <w:r>
+        <w:t xml:space="preserve"> </w:t>
+      </w:r>
+      <w:r>
+        <w:t xml:space="preserve">This allows for a powerful and very flexible integration with a vast array of existing, mature and open-source tools well known and widely popular in the semantic and document analysis domain.</w:t>
+      </w:r>
+    </w:p>
+    <w:p>
+      <w:pPr>
+        <w:pStyle w:val="BodyText"/>
+      </w:pPr>
+      <w:r>
+        <w:t xml:space="preserve">Since Haiku comes pre-installed with Python, all the popular document analysis tools can be readily used to extract information from documents of all formats.</w:t>
+      </w:r>
+      <w:r>
+        <w:t xml:space="preserve"> </w:t>
+      </w:r>
+      <w:r>
+        <w:t xml:space="preserve">These can be combined through scripting to store extracted information in the form required by SEN, namely file attributes in the format defined by SEN.</w:t>
+      </w:r>
+      <w:r>
+        <w:t xml:space="preserve"> </w:t>
+      </w:r>
+      <w:r>
+        <w:t xml:space="preserve">Once the information is available in this normalised format, it can be transparently accessed by the system or other applications through the SEN API.</w:t>
+      </w:r>
+    </w:p>
+    <w:p>
+      <w:pPr>
+        <w:pStyle w:val="BodyText"/>
+      </w:pPr>
+      <w:r>
+        <w:t xml:space="preserve">Applications range from simple metadata extraction (like author, keywords, page count from documents, or image metadata from EXIF/IPTC information, or audio/video metadata like bitrate, format, subtitle information, length or even language) to more advanced document understanding and classification, extracting semantic information through sentiment analysis, specific information from invoices, references to people, organisations, locations or dates, etc.</w:t>
+      </w:r>
+    </w:p>
+    <w:p>
+      <w:pPr>
+        <w:pStyle w:val="BodyText"/>
+      </w:pPr>
+      <w:r>
+        <w:t xml:space="preserve">Tools are of varying complexity, depending on the task, starting with single-purpose tools like pdfplumber (Singer-Vine, 2015/2022), which provides extensive metadata-extraction like author, creation date, or page count, to detailed structural information like tables and images, but also references (useful for extracting relations) and annotations.</w:t>
+      </w:r>
+    </w:p>
+    <w:p>
+      <w:pPr>
+        <w:pStyle w:val="BodyText"/>
+      </w:pPr>
+      <w:r>
+        <w:t xml:space="preserve">Advanced solutions combine several tools into tool chains and provide integrated solutions like (DocQuery, 2022/2022) using powerful document classification systems like Donut (Kim et al., 2022), which can also be used stand-alone.</w:t>
+      </w:r>
+    </w:p>
+    <w:bookmarkEnd w:id="84"/>
+    <w:bookmarkStart w:id="85" w:name="dynamic-relations"/>
     <w:p>
       <w:pPr>
         <w:pStyle w:val="Heading3"/>
@@ -6146,7 +6726,7 @@
       <w:pPr>
         <w:numPr>
           <w:ilvl w:val="0"/>
-          <w:numId w:val="1046"/>
+          <w:numId w:val="1047"/>
         </w:numPr>
         <w:pStyle w:val="Compact"/>
       </w:pPr>
@@ -6172,8 +6752,8 @@
         <w:t xml:space="preserve">files</w:t>
       </w:r>
     </w:p>
-    <w:bookmarkEnd w:id="84"/>
-    <w:bookmarkStart w:id="85" w:name="X3008569adf9c01e8d67b1bdacb0ba8ad425fe72"/>
+    <w:bookmarkEnd w:id="85"/>
+    <w:bookmarkStart w:id="86" w:name="X3008569adf9c01e8d67b1bdacb0ba8ad425fe72"/>
     <w:p>
       <w:pPr>
         <w:pStyle w:val="Heading3"/>
@@ -6186,7 +6766,7 @@
       <w:pPr>
         <w:numPr>
           <w:ilvl w:val="0"/>
-          <w:numId w:val="1047"/>
+          <w:numId w:val="1048"/>
         </w:numPr>
         <w:pStyle w:val="Compact"/>
       </w:pPr>
@@ -6198,7 +6778,7 @@
       <w:pPr>
         <w:numPr>
           <w:ilvl w:val="0"/>
-          <w:numId w:val="1047"/>
+          <w:numId w:val="1048"/>
         </w:numPr>
         <w:pStyle w:val="Compact"/>
       </w:pPr>
@@ -6206,8 +6786,8 @@
         <w:t xml:space="preserve">lazy evaluation like for dynamic relations above</w:t>
       </w:r>
     </w:p>
-    <w:bookmarkEnd w:id="85"/>
-    <w:bookmarkStart w:id="86" w:name="more-semantic-tracker-extensions"/>
+    <w:bookmarkEnd w:id="86"/>
+    <w:bookmarkStart w:id="87" w:name="more-semantic-tracker-extensions"/>
     <w:p>
       <w:pPr>
         <w:pStyle w:val="Heading3"/>
@@ -6220,7 +6800,7 @@
       <w:pPr>
         <w:numPr>
           <w:ilvl w:val="0"/>
-          <w:numId w:val="1048"/>
+          <w:numId w:val="1049"/>
         </w:numPr>
         <w:pStyle w:val="Compact"/>
       </w:pPr>
@@ -6232,7 +6812,7 @@
       <w:pPr>
         <w:numPr>
           <w:ilvl w:val="0"/>
-          <w:numId w:val="1048"/>
+          <w:numId w:val="1049"/>
         </w:numPr>
         <w:pStyle w:val="Compact"/>
       </w:pPr>
@@ -6258,9 +6838,9 @@
         <w:t xml:space="preserve">)</w:t>
       </w:r>
     </w:p>
-    <w:bookmarkEnd w:id="86"/>
     <w:bookmarkEnd w:id="87"/>
-    <w:bookmarkStart w:id="88" w:name="references"/>
+    <w:bookmarkEnd w:id="88"/>
+    <w:bookmarkStart w:id="89" w:name="references"/>
     <w:p>
       <w:pPr>
         <w:pStyle w:val="Heading2"/>
@@ -6273,7 +6853,7 @@
       <w:pPr>
         <w:numPr>
           <w:ilvl w:val="0"/>
-          <w:numId w:val="1049"/>
+          <w:numId w:val="1050"/>
         </w:numPr>
         <w:pStyle w:val="Compact"/>
       </w:pPr>
@@ -6285,7 +6865,7 @@
       <w:pPr>
         <w:numPr>
           <w:ilvl w:val="0"/>
-          <w:numId w:val="1049"/>
+          <w:numId w:val="1050"/>
         </w:numPr>
         <w:pStyle w:val="Compact"/>
       </w:pPr>
@@ -6297,7 +6877,7 @@
       <w:pPr>
         <w:numPr>
           <w:ilvl w:val="0"/>
-          <w:numId w:val="1049"/>
+          <w:numId w:val="1050"/>
         </w:numPr>
         <w:pStyle w:val="Compact"/>
       </w:pPr>
@@ -6309,7 +6889,7 @@
       <w:pPr>
         <w:numPr>
           <w:ilvl w:val="0"/>
-          <w:numId w:val="1049"/>
+          <w:numId w:val="1050"/>
         </w:numPr>
         <w:pStyle w:val="Compact"/>
       </w:pPr>
@@ -6321,7 +6901,7 @@
       <w:pPr>
         <w:numPr>
           <w:ilvl w:val="0"/>
-          <w:numId w:val="1049"/>
+          <w:numId w:val="1050"/>
         </w:numPr>
         <w:pStyle w:val="Compact"/>
       </w:pPr>
@@ -6333,7 +6913,7 @@
       <w:pPr>
         <w:numPr>
           <w:ilvl w:val="0"/>
-          <w:numId w:val="1049"/>
+          <w:numId w:val="1050"/>
         </w:numPr>
         <w:pStyle w:val="Compact"/>
       </w:pPr>
@@ -6345,7 +6925,7 @@
       <w:pPr>
         <w:numPr>
           <w:ilvl w:val="0"/>
-          <w:numId w:val="1049"/>
+          <w:numId w:val="1050"/>
         </w:numPr>
         <w:pStyle w:val="Compact"/>
       </w:pPr>
@@ -6357,7 +6937,7 @@
       <w:pPr>
         <w:numPr>
           <w:ilvl w:val="0"/>
-          <w:numId w:val="1049"/>
+          <w:numId w:val="1050"/>
         </w:numPr>
         <w:pStyle w:val="Compact"/>
       </w:pPr>
@@ -6369,7 +6949,7 @@
       <w:pPr>
         <w:numPr>
           <w:ilvl w:val="0"/>
-          <w:numId w:val="1049"/>
+          <w:numId w:val="1050"/>
         </w:numPr>
         <w:pStyle w:val="Compact"/>
       </w:pPr>
@@ -6381,7 +6961,7 @@
       <w:pPr>
         <w:numPr>
           <w:ilvl w:val="0"/>
-          <w:numId w:val="1049"/>
+          <w:numId w:val="1050"/>
         </w:numPr>
         <w:pStyle w:val="Compact"/>
       </w:pPr>
@@ -6393,7 +6973,31 @@
       <w:pPr>
         <w:numPr>
           <w:ilvl w:val="0"/>
-          <w:numId w:val="1049"/>
+          <w:numId w:val="1050"/>
+        </w:numPr>
+        <w:pStyle w:val="Compact"/>
+      </w:pPr>
+      <w:r>
+        <w:t xml:space="preserve">Data-Centric Manifesto. (n.d.). Retrieved October 15, 2022, from http://www.datacentricmanifesto.org/</w:t>
+      </w:r>
+    </w:p>
+    <w:p>
+      <w:pPr>
+        <w:numPr>
+          <w:ilvl w:val="0"/>
+          <w:numId w:val="1050"/>
+        </w:numPr>
+        <w:pStyle w:val="Compact"/>
+      </w:pPr>
+      <w:r>
+        <w:t xml:space="preserve">DocQuery: Document Query Engine Powered by Large Language Models. (2022). [Python]. impira. https://github.com/impira/docquery (Original work published 2022)</w:t>
+      </w:r>
+    </w:p>
+    <w:p>
+      <w:pPr>
+        <w:numPr>
+          <w:ilvl w:val="0"/>
+          <w:numId w:val="1050"/>
         </w:numPr>
         <w:pStyle w:val="Compact"/>
       </w:pPr>
@@ -6405,7 +7009,7 @@
       <w:pPr>
         <w:numPr>
           <w:ilvl w:val="0"/>
-          <w:numId w:val="1049"/>
+          <w:numId w:val="1050"/>
         </w:numPr>
         <w:pStyle w:val="Compact"/>
       </w:pPr>
@@ -6417,7 +7021,7 @@
       <w:pPr>
         <w:numPr>
           <w:ilvl w:val="0"/>
-          <w:numId w:val="1049"/>
+          <w:numId w:val="1050"/>
         </w:numPr>
         <w:pStyle w:val="Compact"/>
       </w:pPr>
@@ -6429,7 +7033,7 @@
       <w:pPr>
         <w:numPr>
           <w:ilvl w:val="0"/>
-          <w:numId w:val="1049"/>
+          <w:numId w:val="1050"/>
         </w:numPr>
         <w:pStyle w:val="Compact"/>
       </w:pPr>
@@ -6441,7 +7045,7 @@
       <w:pPr>
         <w:numPr>
           <w:ilvl w:val="0"/>
-          <w:numId w:val="1049"/>
+          <w:numId w:val="1050"/>
         </w:numPr>
         <w:pStyle w:val="Compact"/>
       </w:pPr>
@@ -6453,7 +7057,7 @@
       <w:pPr>
         <w:numPr>
           <w:ilvl w:val="0"/>
-          <w:numId w:val="1049"/>
+          <w:numId w:val="1050"/>
         </w:numPr>
         <w:pStyle w:val="Compact"/>
       </w:pPr>
@@ -6465,7 +7069,7 @@
       <w:pPr>
         <w:numPr>
           <w:ilvl w:val="0"/>
-          <w:numId w:val="1049"/>
+          <w:numId w:val="1050"/>
         </w:numPr>
         <w:pStyle w:val="Compact"/>
       </w:pPr>
@@ -6477,7 +7081,7 @@
       <w:pPr>
         <w:numPr>
           <w:ilvl w:val="0"/>
-          <w:numId w:val="1049"/>
+          <w:numId w:val="1050"/>
         </w:numPr>
         <w:pStyle w:val="Compact"/>
       </w:pPr>
@@ -6489,7 +7093,7 @@
       <w:pPr>
         <w:numPr>
           <w:ilvl w:val="0"/>
-          <w:numId w:val="1049"/>
+          <w:numId w:val="1050"/>
         </w:numPr>
         <w:pStyle w:val="Compact"/>
       </w:pPr>
@@ -6501,7 +7105,19 @@
       <w:pPr>
         <w:numPr>
           <w:ilvl w:val="0"/>
-          <w:numId w:val="1049"/>
+          <w:numId w:val="1050"/>
+        </w:numPr>
+        <w:pStyle w:val="Compact"/>
+      </w:pPr>
+      <w:r>
+        <w:t xml:space="preserve">IPFS Powers the Distributed Web. (2022). https://ipfs.tech/</w:t>
+      </w:r>
+    </w:p>
+    <w:p>
+      <w:pPr>
+        <w:numPr>
+          <w:ilvl w:val="0"/>
+          <w:numId w:val="1050"/>
         </w:numPr>
         <w:pStyle w:val="Compact"/>
       </w:pPr>
@@ -6513,7 +7129,31 @@
       <w:pPr>
         <w:numPr>
           <w:ilvl w:val="0"/>
-          <w:numId w:val="1049"/>
+          <w:numId w:val="1050"/>
+        </w:numPr>
+        <w:pStyle w:val="Compact"/>
+      </w:pPr>
+      <w:r>
+        <w:t xml:space="preserve">Kernighan, B. W., &amp; Plauger, P. J. (1976). Software tools. Addison-Wesley Pub. Co.</w:t>
+      </w:r>
+    </w:p>
+    <w:p>
+      <w:pPr>
+        <w:numPr>
+          <w:ilvl w:val="0"/>
+          <w:numId w:val="1050"/>
+        </w:numPr>
+        <w:pStyle w:val="Compact"/>
+      </w:pPr>
+      <w:r>
+        <w:t xml:space="preserve">Kim, G., Hong, T., Yim, M., Nam, J., Park, J., Yim, J., Hwang, W., Yun, S., Han, D., &amp; Park, S. (2022). OCR-free Document Understanding Transformer (arXiv:2111.15664). arXiv. http://arxiv.org/abs/2111.15664</w:t>
+      </w:r>
+    </w:p>
+    <w:p>
+      <w:pPr>
+        <w:numPr>
+          <w:ilvl w:val="0"/>
+          <w:numId w:val="1050"/>
         </w:numPr>
         <w:pStyle w:val="Compact"/>
       </w:pPr>
@@ -6525,7 +7165,19 @@
       <w:pPr>
         <w:numPr>
           <w:ilvl w:val="0"/>
-          <w:numId w:val="1049"/>
+          <w:numId w:val="1050"/>
+        </w:numPr>
+        <w:pStyle w:val="Compact"/>
+      </w:pPr>
+      <w:r>
+        <w:t xml:space="preserve">Ludington, J. (2022, October 25). Devs: It’s Time to Consider IPFS as an Alternative to HTTP. The New Stack. https://thenewstack.io/devs-its-time-to-consider-ipfs-as-an-alternative-to-http/</w:t>
+      </w:r>
+    </w:p>
+    <w:p>
+      <w:pPr>
+        <w:numPr>
+          <w:ilvl w:val="0"/>
+          <w:numId w:val="1050"/>
         </w:numPr>
         <w:pStyle w:val="Compact"/>
       </w:pPr>
@@ -6537,7 +7189,7 @@
       <w:pPr>
         <w:numPr>
           <w:ilvl w:val="0"/>
-          <w:numId w:val="1049"/>
+          <w:numId w:val="1050"/>
         </w:numPr>
         <w:pStyle w:val="Compact"/>
       </w:pPr>
@@ -6549,7 +7201,7 @@
       <w:pPr>
         <w:numPr>
           <w:ilvl w:val="0"/>
-          <w:numId w:val="1049"/>
+          <w:numId w:val="1050"/>
         </w:numPr>
         <w:pStyle w:val="Compact"/>
       </w:pPr>
@@ -6561,7 +7213,7 @@
       <w:pPr>
         <w:numPr>
           <w:ilvl w:val="0"/>
-          <w:numId w:val="1049"/>
+          <w:numId w:val="1050"/>
         </w:numPr>
         <w:pStyle w:val="Compact"/>
       </w:pPr>
@@ -6573,7 +7225,7 @@
       <w:pPr>
         <w:numPr>
           <w:ilvl w:val="0"/>
-          <w:numId w:val="1049"/>
+          <w:numId w:val="1050"/>
         </w:numPr>
         <w:pStyle w:val="Compact"/>
       </w:pPr>
@@ -6585,7 +7237,7 @@
       <w:pPr>
         <w:numPr>
           <w:ilvl w:val="0"/>
-          <w:numId w:val="1049"/>
+          <w:numId w:val="1050"/>
         </w:numPr>
         <w:pStyle w:val="Compact"/>
       </w:pPr>
@@ -6597,7 +7249,7 @@
       <w:pPr>
         <w:numPr>
           <w:ilvl w:val="0"/>
-          <w:numId w:val="1049"/>
+          <w:numId w:val="1050"/>
         </w:numPr>
         <w:pStyle w:val="Compact"/>
       </w:pPr>
@@ -6609,7 +7261,7 @@
       <w:pPr>
         <w:numPr>
           <w:ilvl w:val="0"/>
-          <w:numId w:val="1049"/>
+          <w:numId w:val="1050"/>
         </w:numPr>
         <w:pStyle w:val="Compact"/>
       </w:pPr>
@@ -6621,7 +7273,7 @@
       <w:pPr>
         <w:numPr>
           <w:ilvl w:val="0"/>
-          <w:numId w:val="1049"/>
+          <w:numId w:val="1050"/>
         </w:numPr>
         <w:pStyle w:val="Compact"/>
       </w:pPr>
@@ -6633,7 +7285,7 @@
       <w:pPr>
         <w:numPr>
           <w:ilvl w:val="0"/>
-          <w:numId w:val="1049"/>
+          <w:numId w:val="1050"/>
         </w:numPr>
         <w:pStyle w:val="Compact"/>
       </w:pPr>
@@ -6645,7 +7297,7 @@
       <w:pPr>
         <w:numPr>
           <w:ilvl w:val="0"/>
-          <w:numId w:val="1049"/>
+          <w:numId w:val="1050"/>
         </w:numPr>
         <w:pStyle w:val="Compact"/>
       </w:pPr>
@@ -6657,7 +7309,7 @@
       <w:pPr>
         <w:numPr>
           <w:ilvl w:val="0"/>
-          <w:numId w:val="1049"/>
+          <w:numId w:val="1050"/>
         </w:numPr>
         <w:pStyle w:val="Compact"/>
       </w:pPr>
@@ -6669,7 +7321,31 @@
       <w:pPr>
         <w:numPr>
           <w:ilvl w:val="0"/>
-          <w:numId w:val="1049"/>
+          <w:numId w:val="1050"/>
+        </w:numPr>
+        <w:pStyle w:val="Compact"/>
+      </w:pPr>
+      <w:r>
+        <w:t xml:space="preserve">Singer-Vine, J. (2022). Pdfplumber [Python]. https://github.com/jsvine/pdfplumber (Original work published 2015)</w:t>
+      </w:r>
+    </w:p>
+    <w:p>
+      <w:pPr>
+        <w:numPr>
+          <w:ilvl w:val="0"/>
+          <w:numId w:val="1050"/>
+        </w:numPr>
+        <w:pStyle w:val="Compact"/>
+      </w:pPr>
+      <w:r>
+        <w:t xml:space="preserve">Skjæveland, M. (2021). The OTTR Template Library. Advances in Pattern-Based Ontology Engineering, 51.</w:t>
+      </w:r>
+    </w:p>
+    <w:p>
+      <w:pPr>
+        <w:numPr>
+          <w:ilvl w:val="0"/>
+          <w:numId w:val="1050"/>
         </w:numPr>
         <w:pStyle w:val="Compact"/>
       </w:pPr>
@@ -6681,7 +7357,7 @@
       <w:pPr>
         <w:numPr>
           <w:ilvl w:val="0"/>
-          <w:numId w:val="1049"/>
+          <w:numId w:val="1050"/>
         </w:numPr>
         <w:pStyle w:val="Compact"/>
       </w:pPr>
@@ -6693,7 +7369,7 @@
       <w:pPr>
         <w:numPr>
           <w:ilvl w:val="0"/>
-          <w:numId w:val="1049"/>
+          <w:numId w:val="1050"/>
         </w:numPr>
         <w:pStyle w:val="Compact"/>
       </w:pPr>
@@ -6705,7 +7381,7 @@
       <w:pPr>
         <w:numPr>
           <w:ilvl w:val="0"/>
-          <w:numId w:val="1049"/>
+          <w:numId w:val="1050"/>
         </w:numPr>
         <w:pStyle w:val="Compact"/>
       </w:pPr>
@@ -6717,7 +7393,7 @@
       <w:pPr>
         <w:numPr>
           <w:ilvl w:val="0"/>
-          <w:numId w:val="1049"/>
+          <w:numId w:val="1050"/>
         </w:numPr>
         <w:pStyle w:val="Compact"/>
       </w:pPr>
@@ -6729,15 +7405,15 @@
       <w:pPr>
         <w:numPr>
           <w:ilvl w:val="0"/>
-          <w:numId w:val="1049"/>
-        </w:numPr>
-        <w:pStyle w:val="Compact"/>
-      </w:pPr>
-      <w:r>
-        <w:t xml:space="preserve">Wikidata. (2019, December 30). https://www.wikidata.org/wiki/Wikidata:Main_Page</w:t>
-      </w:r>
-    </w:p>
-    <w:bookmarkEnd w:id="88"/>
+          <w:numId w:val="1050"/>
+        </w:numPr>
+        <w:pStyle w:val="Compact"/>
+      </w:pPr>
+      <w:r>
+        <w:t xml:space="preserve">Wikidata. (2019, December 30). https://www.wikidata.org/wiki/Wikidata:Main_Pag* e</w:t>
+      </w:r>
+    </w:p>
+    <w:bookmarkEnd w:id="89"/>
     <w:sectPr/>
   </w:body>
 </w:document>
@@ -7180,6 +7856,9 @@
     <w:abstractNumId w:val="991"/>
   </w:num>
   <w:num w:numId="1049">
+    <w:abstractNumId w:val="991"/>
+  </w:num>
+  <w:num w:numId="1050">
     <w:abstractNumId w:val="991"/>
   </w:num>
 </w:numbering>

</xml_diff>